<commit_message>
add favicon icon, change the values of the used hyperparameters in the selected LogisticRegression() classification model in the favor of test accuracy, modify css styling
</commit_message>
<xml_diff>
--- a/Project3_Report.docx
+++ b/Project3_Report.docx
@@ -70,6 +70,714 @@
         </w:rPr>
         <w:t>Barış Kaplan</w:t>
       </w:r>
+    </w:p>
+    <w:p>
+      <w:pPr>
+        <w:rPr>
+          <w:rFonts w:ascii="Times New Roman" w:hAnsi="Times New Roman" w:cs="Times New Roman"/>
+          <w:lang w:val="tr-TR"/>
+        </w:rPr>
+      </w:pPr>
+      <w:proofErr w:type="spellStart"/>
+      <w:r>
+        <w:rPr>
+          <w:rFonts w:ascii="Times New Roman" w:hAnsi="Times New Roman" w:cs="Times New Roman"/>
+          <w:b/>
+          <w:bCs/>
+          <w:lang w:val="tr-TR"/>
+        </w:rPr>
+        <w:t>Matriculation</w:t>
+      </w:r>
+      <w:proofErr w:type="spellEnd"/>
+      <w:r>
+        <w:rPr>
+          <w:rFonts w:ascii="Times New Roman" w:hAnsi="Times New Roman" w:cs="Times New Roman"/>
+          <w:b/>
+          <w:bCs/>
+          <w:lang w:val="tr-TR"/>
+        </w:rPr>
+        <w:t xml:space="preserve"> </w:t>
+      </w:r>
+      <w:proofErr w:type="spellStart"/>
+      <w:r>
+        <w:rPr>
+          <w:rFonts w:ascii="Times New Roman" w:hAnsi="Times New Roman" w:cs="Times New Roman"/>
+          <w:b/>
+          <w:bCs/>
+          <w:lang w:val="tr-TR"/>
+        </w:rPr>
+        <w:t>Number</w:t>
+      </w:r>
+      <w:proofErr w:type="spellEnd"/>
+      <w:r>
+        <w:rPr>
+          <w:rFonts w:ascii="Times New Roman" w:hAnsi="Times New Roman" w:cs="Times New Roman"/>
+          <w:b/>
+          <w:bCs/>
+          <w:lang w:val="tr-TR"/>
+        </w:rPr>
+        <w:t>:</w:t>
+      </w:r>
+      <w:r>
+        <w:rPr>
+          <w:rFonts w:ascii="Times New Roman" w:hAnsi="Times New Roman" w:cs="Times New Roman"/>
+          <w:lang w:val="tr-TR"/>
+        </w:rPr>
+        <w:t xml:space="preserve"> 669584 </w:t>
+      </w:r>
+    </w:p>
+    <w:p>
+      <w:pPr>
+        <w:rPr>
+          <w:rFonts w:ascii="Times New Roman" w:hAnsi="Times New Roman" w:cs="Times New Roman"/>
+          <w:b/>
+          <w:bCs/>
+          <w:u w:val="single"/>
+          <w:lang w:val="tr-TR"/>
+        </w:rPr>
+      </w:pPr>
+      <w:proofErr w:type="spellStart"/>
+      <w:r>
+        <w:rPr>
+          <w:rFonts w:ascii="Times New Roman" w:hAnsi="Times New Roman" w:cs="Times New Roman"/>
+          <w:b/>
+          <w:bCs/>
+          <w:u w:val="single"/>
+          <w:lang w:val="tr-TR"/>
+        </w:rPr>
+        <w:t>Task</w:t>
+      </w:r>
+      <w:proofErr w:type="spellEnd"/>
+      <w:r>
+        <w:rPr>
+          <w:rFonts w:ascii="Times New Roman" w:hAnsi="Times New Roman" w:cs="Times New Roman"/>
+          <w:b/>
+          <w:bCs/>
+          <w:u w:val="single"/>
+          <w:lang w:val="tr-TR"/>
+        </w:rPr>
+        <w:t xml:space="preserve"> 1</w:t>
+      </w:r>
+      <w:r>
+        <w:rPr>
+          <w:rFonts w:ascii="Times New Roman" w:hAnsi="Times New Roman" w:cs="Times New Roman"/>
+          <w:b/>
+          <w:bCs/>
+          <w:u w:val="single"/>
+          <w:lang w:val="tr-TR"/>
+        </w:rPr>
+        <w:t>:</w:t>
+      </w:r>
+    </w:p>
+    <w:p>
+      <w:pPr>
+        <w:rPr>
+          <w:rFonts w:ascii="Times New Roman" w:hAnsi="Times New Roman" w:cs="Times New Roman"/>
+          <w:lang w:val="tr-TR"/>
+        </w:rPr>
+      </w:pPr>
+      <w:proofErr w:type="spellStart"/>
+      <w:r>
+        <w:rPr>
+          <w:rFonts w:ascii="Times New Roman" w:hAnsi="Times New Roman" w:cs="Times New Roman"/>
+          <w:b/>
+          <w:bCs/>
+          <w:lang w:val="tr-TR"/>
+        </w:rPr>
+        <w:t>Used</w:t>
+      </w:r>
+      <w:proofErr w:type="spellEnd"/>
+      <w:r>
+        <w:rPr>
+          <w:rFonts w:ascii="Times New Roman" w:hAnsi="Times New Roman" w:cs="Times New Roman"/>
+          <w:b/>
+          <w:bCs/>
+          <w:lang w:val="tr-TR"/>
+        </w:rPr>
+        <w:t xml:space="preserve"> </w:t>
+      </w:r>
+      <w:proofErr w:type="spellStart"/>
+      <w:r>
+        <w:rPr>
+          <w:rFonts w:ascii="Times New Roman" w:hAnsi="Times New Roman" w:cs="Times New Roman"/>
+          <w:b/>
+          <w:bCs/>
+          <w:lang w:val="tr-TR"/>
+        </w:rPr>
+        <w:t>Classi</w:t>
+      </w:r>
+      <w:r>
+        <w:rPr>
+          <w:rFonts w:ascii="Times New Roman" w:hAnsi="Times New Roman" w:cs="Times New Roman"/>
+          <w:b/>
+          <w:bCs/>
+          <w:lang w:val="tr-TR"/>
+        </w:rPr>
+        <w:t>fication</w:t>
+      </w:r>
+      <w:proofErr w:type="spellEnd"/>
+      <w:r>
+        <w:rPr>
+          <w:rFonts w:ascii="Times New Roman" w:hAnsi="Times New Roman" w:cs="Times New Roman"/>
+          <w:b/>
+          <w:bCs/>
+          <w:lang w:val="tr-TR"/>
+        </w:rPr>
+        <w:t xml:space="preserve"> Model</w:t>
+      </w:r>
+      <w:r>
+        <w:rPr>
+          <w:rFonts w:ascii="Times New Roman" w:hAnsi="Times New Roman" w:cs="Times New Roman"/>
+          <w:b/>
+          <w:bCs/>
+          <w:lang w:val="tr-TR"/>
+        </w:rPr>
+        <w:t>:</w:t>
+      </w:r>
+      <w:r>
+        <w:rPr>
+          <w:rFonts w:ascii="Times New Roman" w:hAnsi="Times New Roman" w:cs="Times New Roman"/>
+          <w:lang w:val="tr-TR"/>
+        </w:rPr>
+        <w:t xml:space="preserve"> </w:t>
+      </w:r>
+      <w:proofErr w:type="spellStart"/>
+      <w:r>
+        <w:rPr>
+          <w:rFonts w:ascii="Times New Roman" w:hAnsi="Times New Roman" w:cs="Times New Roman"/>
+          <w:lang w:val="tr-TR"/>
+        </w:rPr>
+        <w:t>Logistic</w:t>
+      </w:r>
+      <w:proofErr w:type="spellEnd"/>
+      <w:r>
+        <w:rPr>
+          <w:rFonts w:ascii="Times New Roman" w:hAnsi="Times New Roman" w:cs="Times New Roman"/>
+          <w:lang w:val="tr-TR"/>
+        </w:rPr>
+        <w:t xml:space="preserve"> </w:t>
+      </w:r>
+      <w:proofErr w:type="spellStart"/>
+      <w:r>
+        <w:rPr>
+          <w:rFonts w:ascii="Times New Roman" w:hAnsi="Times New Roman" w:cs="Times New Roman"/>
+          <w:lang w:val="tr-TR"/>
+        </w:rPr>
+        <w:t>Regression</w:t>
+      </w:r>
+      <w:proofErr w:type="spellEnd"/>
+    </w:p>
+    <w:p>
+      <w:pPr>
+        <w:rPr>
+          <w:rFonts w:ascii="Times New Roman" w:hAnsi="Times New Roman" w:cs="Times New Roman"/>
+          <w:lang w:val="tr-TR"/>
+        </w:rPr>
+      </w:pPr>
+      <w:proofErr w:type="spellStart"/>
+      <w:r>
+        <w:rPr>
+          <w:rFonts w:ascii="Times New Roman" w:hAnsi="Times New Roman" w:cs="Times New Roman"/>
+          <w:b/>
+          <w:bCs/>
+          <w:lang w:val="tr-TR"/>
+        </w:rPr>
+        <w:t>Classifier</w:t>
+      </w:r>
+      <w:proofErr w:type="spellEnd"/>
+      <w:r>
+        <w:rPr>
+          <w:rFonts w:ascii="Times New Roman" w:hAnsi="Times New Roman" w:cs="Times New Roman"/>
+          <w:b/>
+          <w:bCs/>
+          <w:lang w:val="tr-TR"/>
+        </w:rPr>
+        <w:t xml:space="preserve"> </w:t>
+      </w:r>
+      <w:proofErr w:type="spellStart"/>
+      <w:r>
+        <w:rPr>
+          <w:rFonts w:ascii="Times New Roman" w:hAnsi="Times New Roman" w:cs="Times New Roman"/>
+          <w:b/>
+          <w:bCs/>
+          <w:lang w:val="tr-TR"/>
+        </w:rPr>
+        <w:t>Baseline</w:t>
+      </w:r>
+      <w:proofErr w:type="spellEnd"/>
+      <w:r>
+        <w:rPr>
+          <w:rFonts w:ascii="Times New Roman" w:hAnsi="Times New Roman" w:cs="Times New Roman"/>
+          <w:b/>
+          <w:bCs/>
+          <w:lang w:val="tr-TR"/>
+        </w:rPr>
+        <w:t xml:space="preserve"> Test </w:t>
+      </w:r>
+      <w:proofErr w:type="spellStart"/>
+      <w:r>
+        <w:rPr>
+          <w:rFonts w:ascii="Times New Roman" w:hAnsi="Times New Roman" w:cs="Times New Roman"/>
+          <w:b/>
+          <w:bCs/>
+          <w:lang w:val="tr-TR"/>
+        </w:rPr>
+        <w:t>Accuracy</w:t>
+      </w:r>
+      <w:proofErr w:type="spellEnd"/>
+      <w:r>
+        <w:rPr>
+          <w:rFonts w:ascii="Times New Roman" w:hAnsi="Times New Roman" w:cs="Times New Roman"/>
+          <w:b/>
+          <w:bCs/>
+          <w:lang w:val="tr-TR"/>
+        </w:rPr>
+        <w:t xml:space="preserve"> </w:t>
+      </w:r>
+      <w:proofErr w:type="spellStart"/>
+      <w:r>
+        <w:rPr>
+          <w:rFonts w:ascii="Times New Roman" w:hAnsi="Times New Roman" w:cs="Times New Roman"/>
+          <w:b/>
+          <w:bCs/>
+          <w:lang w:val="tr-TR"/>
+        </w:rPr>
+        <w:t>Achieved</w:t>
+      </w:r>
+      <w:proofErr w:type="spellEnd"/>
+      <w:r>
+        <w:rPr>
+          <w:rFonts w:ascii="Times New Roman" w:hAnsi="Times New Roman" w:cs="Times New Roman"/>
+          <w:b/>
+          <w:bCs/>
+          <w:lang w:val="tr-TR"/>
+        </w:rPr>
+        <w:t xml:space="preserve">: </w:t>
+      </w:r>
+      <w:r>
+        <w:rPr>
+          <w:rFonts w:ascii="Times New Roman" w:hAnsi="Times New Roman" w:cs="Times New Roman"/>
+          <w:lang w:val="tr-TR"/>
+        </w:rPr>
+        <w:t>90.</w:t>
+      </w:r>
+      <w:r>
+        <w:rPr>
+          <w:rFonts w:ascii="Times New Roman" w:hAnsi="Times New Roman" w:cs="Times New Roman"/>
+          <w:lang w:val="tr-TR"/>
+        </w:rPr>
+        <w:t>55</w:t>
+      </w:r>
+      <w:r>
+        <w:rPr>
+          <w:rFonts w:ascii="Times New Roman" w:hAnsi="Times New Roman" w:cs="Times New Roman"/>
+          <w:lang w:val="tr-TR"/>
+        </w:rPr>
+        <w:t>%</w:t>
+      </w:r>
+    </w:p>
+    <w:p>
+      <w:pPr>
+        <w:shd w:val="clear" w:color="auto" w:fill="272822"/>
+        <w:spacing w:after="0" w:line="270" w:lineRule="atLeast"/>
+        <w:rPr>
+          <w:rFonts w:ascii="Menlo" w:eastAsia="Times New Roman" w:hAnsi="Menlo" w:cs="Menlo"/>
+          <w:color w:val="FD971F"/>
+          <w:kern w:val="0"/>
+          <w:sz w:val="18"/>
+          <w:szCs w:val="18"/>
+          <w:lang w:eastAsia="tr-TR"/>
+          <w14:ligatures w14:val="none"/>
+        </w:rPr>
+      </w:pPr>
+      <w:r>
+        <w:rPr>
+          <w:rFonts w:ascii="Menlo" w:eastAsia="Times New Roman" w:hAnsi="Menlo" w:cs="Menlo"/>
+          <w:color w:val="FF00FF"/>
+          <w:kern w:val="0"/>
+          <w:sz w:val="18"/>
+          <w:szCs w:val="18"/>
+          <w:lang w:eastAsia="tr-TR"/>
+          <w14:ligatures w14:val="none"/>
+        </w:rPr>
+        <w:t>self</w:t>
+      </w:r>
+      <w:r>
+        <w:rPr>
+          <w:rFonts w:ascii="Menlo" w:eastAsia="Times New Roman" w:hAnsi="Menlo" w:cs="Menlo"/>
+          <w:color w:val="F92672"/>
+          <w:kern w:val="0"/>
+          <w:sz w:val="18"/>
+          <w:szCs w:val="18"/>
+          <w:lang w:eastAsia="tr-TR"/>
+          <w14:ligatures w14:val="none"/>
+        </w:rPr>
+        <w:t>.</w:t>
+      </w:r>
+      <w:r>
+        <w:rPr>
+          <w:rFonts w:ascii="Menlo" w:eastAsia="Times New Roman" w:hAnsi="Menlo" w:cs="Menlo"/>
+          <w:color w:val="F8F8F2"/>
+          <w:kern w:val="0"/>
+          <w:sz w:val="18"/>
+          <w:szCs w:val="18"/>
+          <w:lang w:eastAsia="tr-TR"/>
+          <w14:ligatures w14:val="none"/>
+        </w:rPr>
+        <w:t xml:space="preserve">baseline_model </w:t>
+      </w:r>
+      <w:r>
+        <w:rPr>
+          <w:rFonts w:ascii="Menlo" w:eastAsia="Times New Roman" w:hAnsi="Menlo" w:cs="Menlo"/>
+          <w:color w:val="F92672"/>
+          <w:kern w:val="0"/>
+          <w:sz w:val="18"/>
+          <w:szCs w:val="18"/>
+          <w:lang w:eastAsia="tr-TR"/>
+          <w14:ligatures w14:val="none"/>
+        </w:rPr>
+        <w:t>=</w:t>
+      </w:r>
+      <w:r>
+        <w:rPr>
+          <w:rFonts w:ascii="Menlo" w:eastAsia="Times New Roman" w:hAnsi="Menlo" w:cs="Menlo"/>
+          <w:color w:val="F8F8F2"/>
+          <w:kern w:val="0"/>
+          <w:sz w:val="18"/>
+          <w:szCs w:val="18"/>
+          <w:lang w:eastAsia="tr-TR"/>
+          <w14:ligatures w14:val="none"/>
+        </w:rPr>
+        <w:t xml:space="preserve"> </w:t>
+      </w:r>
+      <w:r>
+        <w:rPr>
+          <w:rFonts w:ascii="Menlo" w:eastAsia="Times New Roman" w:hAnsi="Menlo" w:cs="Menlo"/>
+          <w:color w:val="66D9EF"/>
+          <w:kern w:val="0"/>
+          <w:sz w:val="18"/>
+          <w:szCs w:val="18"/>
+          <w:lang w:eastAsia="tr-TR"/>
+          <w14:ligatures w14:val="none"/>
+        </w:rPr>
+        <w:t>LogisticRegression</w:t>
+      </w:r>
+      <w:r>
+        <w:rPr>
+          <w:rFonts w:ascii="Menlo" w:eastAsia="Times New Roman" w:hAnsi="Menlo" w:cs="Menlo"/>
+          <w:color w:val="FD971F"/>
+          <w:kern w:val="0"/>
+          <w:sz w:val="18"/>
+          <w:szCs w:val="18"/>
+          <w:lang w:eastAsia="tr-TR"/>
+          <w14:ligatures w14:val="none"/>
+        </w:rPr>
+        <w:t>(</w:t>
+      </w:r>
+      <w:r>
+        <w:rPr>
+          <w:rFonts w:ascii="Menlo" w:eastAsia="Times New Roman" w:hAnsi="Menlo" w:cs="Menlo"/>
+          <w:i/>
+          <w:iCs/>
+          <w:color w:val="AA4926"/>
+          <w:kern w:val="0"/>
+          <w:sz w:val="18"/>
+          <w:szCs w:val="18"/>
+          <w:lang w:eastAsia="tr-TR"/>
+          <w14:ligatures w14:val="none"/>
+        </w:rPr>
+        <w:t>C</w:t>
+      </w:r>
+      <w:r>
+        <w:rPr>
+          <w:rFonts w:ascii="Menlo" w:eastAsia="Times New Roman" w:hAnsi="Menlo" w:cs="Menlo"/>
+          <w:color w:val="F92672"/>
+          <w:kern w:val="0"/>
+          <w:sz w:val="18"/>
+          <w:szCs w:val="18"/>
+          <w:lang w:eastAsia="tr-TR"/>
+          <w14:ligatures w14:val="none"/>
+        </w:rPr>
+        <w:t>=</w:t>
+      </w:r>
+      <w:r>
+        <w:rPr>
+          <w:rFonts w:ascii="Menlo" w:eastAsia="Times New Roman" w:hAnsi="Menlo" w:cs="Menlo"/>
+          <w:color w:val="AE81FF"/>
+          <w:kern w:val="0"/>
+          <w:sz w:val="18"/>
+          <w:szCs w:val="18"/>
+          <w:lang w:eastAsia="tr-TR"/>
+          <w14:ligatures w14:val="none"/>
+        </w:rPr>
+        <w:t>0.4</w:t>
+      </w:r>
+      <w:r>
+        <w:rPr>
+          <w:rFonts w:ascii="Menlo" w:eastAsia="Times New Roman" w:hAnsi="Menlo" w:cs="Menlo"/>
+          <w:color w:val="FD971F"/>
+          <w:kern w:val="0"/>
+          <w:sz w:val="18"/>
+          <w:szCs w:val="18"/>
+          <w:lang w:eastAsia="tr-TR"/>
+          <w14:ligatures w14:val="none"/>
+        </w:rPr>
+        <w:t>,</w:t>
+      </w:r>
+      <w:r>
+        <w:rPr>
+          <w:rFonts w:ascii="Menlo" w:eastAsia="Times New Roman" w:hAnsi="Menlo" w:cs="Menlo"/>
+          <w:color w:val="F8F8F2"/>
+          <w:kern w:val="0"/>
+          <w:sz w:val="18"/>
+          <w:szCs w:val="18"/>
+          <w:lang w:eastAsia="tr-TR"/>
+          <w14:ligatures w14:val="none"/>
+        </w:rPr>
+        <w:t xml:space="preserve"> </w:t>
+      </w:r>
+      <w:r>
+        <w:rPr>
+          <w:rFonts w:ascii="Menlo" w:eastAsia="Times New Roman" w:hAnsi="Menlo" w:cs="Menlo"/>
+          <w:i/>
+          <w:iCs/>
+          <w:color w:val="AA4926"/>
+          <w:kern w:val="0"/>
+          <w:sz w:val="18"/>
+          <w:szCs w:val="18"/>
+          <w:lang w:eastAsia="tr-TR"/>
+          <w14:ligatures w14:val="none"/>
+        </w:rPr>
+        <w:t>max_iter</w:t>
+      </w:r>
+      <w:r>
+        <w:rPr>
+          <w:rFonts w:ascii="Menlo" w:eastAsia="Times New Roman" w:hAnsi="Menlo" w:cs="Menlo"/>
+          <w:color w:val="F92672"/>
+          <w:kern w:val="0"/>
+          <w:sz w:val="18"/>
+          <w:szCs w:val="18"/>
+          <w:lang w:eastAsia="tr-TR"/>
+          <w14:ligatures w14:val="none"/>
+        </w:rPr>
+        <w:t>=</w:t>
+      </w:r>
+      <w:r>
+        <w:rPr>
+          <w:rFonts w:ascii="Menlo" w:eastAsia="Times New Roman" w:hAnsi="Menlo" w:cs="Menlo"/>
+          <w:color w:val="AE81FF"/>
+          <w:kern w:val="0"/>
+          <w:sz w:val="18"/>
+          <w:szCs w:val="18"/>
+          <w:lang w:eastAsia="tr-TR"/>
+          <w14:ligatures w14:val="none"/>
+        </w:rPr>
+        <w:t>200</w:t>
+      </w:r>
+      <w:r>
+        <w:rPr>
+          <w:rFonts w:ascii="Menlo" w:eastAsia="Times New Roman" w:hAnsi="Menlo" w:cs="Menlo"/>
+          <w:color w:val="FD971F"/>
+          <w:kern w:val="0"/>
+          <w:sz w:val="18"/>
+          <w:szCs w:val="18"/>
+          <w:lang w:eastAsia="tr-TR"/>
+          <w14:ligatures w14:val="none"/>
+        </w:rPr>
+        <w:t>)</w:t>
+      </w:r>
+    </w:p>
+    <w:p>
+      <w:pPr>
+        <w:rPr>
+          <w:rFonts w:ascii="Times New Roman" w:hAnsi="Times New Roman" w:cs="Times New Roman"/>
+          <w:b/>
+          <w:bCs/>
+          <w:lang w:val="tr-TR"/>
+        </w:rPr>
+      </w:pPr>
+    </w:p>
+    <w:p>
+      <w:pPr>
+        <w:rPr>
+          <w:rFonts w:ascii="Times New Roman" w:hAnsi="Times New Roman" w:cs="Times New Roman"/>
+          <w:b/>
+          <w:bCs/>
+          <w:u w:val="single"/>
+          <w:lang w:val="tr-TR"/>
+        </w:rPr>
+      </w:pPr>
+      <w:proofErr w:type="spellStart"/>
+      <w:r>
+        <w:rPr>
+          <w:rFonts w:ascii="Times New Roman" w:hAnsi="Times New Roman" w:cs="Times New Roman"/>
+          <w:b/>
+          <w:bCs/>
+          <w:u w:val="single"/>
+          <w:lang w:val="tr-TR"/>
+        </w:rPr>
+        <w:t>Task</w:t>
+      </w:r>
+      <w:proofErr w:type="spellEnd"/>
+      <w:r>
+        <w:rPr>
+          <w:rFonts w:ascii="Times New Roman" w:hAnsi="Times New Roman" w:cs="Times New Roman"/>
+          <w:b/>
+          <w:bCs/>
+          <w:u w:val="single"/>
+          <w:lang w:val="tr-TR"/>
+        </w:rPr>
+        <w:t xml:space="preserve"> 2: </w:t>
+      </w:r>
+    </w:p>
+    <w:p>
+      <w:pPr>
+        <w:rPr>
+          <w:rFonts w:ascii="Times New Roman" w:hAnsi="Times New Roman" w:cs="Times New Roman"/>
+          <w:lang w:val="tr-TR"/>
+        </w:rPr>
+      </w:pPr>
+      <w:proofErr w:type="spellStart"/>
+      <w:r>
+        <w:rPr>
+          <w:rFonts w:ascii="Times New Roman" w:hAnsi="Times New Roman" w:cs="Times New Roman"/>
+          <w:b/>
+          <w:bCs/>
+          <w:lang w:val="tr-TR"/>
+        </w:rPr>
+        <w:t>Simulated</w:t>
+      </w:r>
+      <w:proofErr w:type="spellEnd"/>
+      <w:r>
+        <w:rPr>
+          <w:rFonts w:ascii="Times New Roman" w:hAnsi="Times New Roman" w:cs="Times New Roman"/>
+          <w:b/>
+          <w:bCs/>
+          <w:lang w:val="tr-TR"/>
+        </w:rPr>
+        <w:t xml:space="preserve"> </w:t>
+      </w:r>
+      <w:proofErr w:type="spellStart"/>
+      <w:r>
+        <w:rPr>
+          <w:rFonts w:ascii="Times New Roman" w:hAnsi="Times New Roman" w:cs="Times New Roman"/>
+          <w:b/>
+          <w:bCs/>
+          <w:lang w:val="tr-TR"/>
+        </w:rPr>
+        <w:t>Expert</w:t>
+      </w:r>
+      <w:proofErr w:type="spellEnd"/>
+      <w:r>
+        <w:rPr>
+          <w:rFonts w:ascii="Times New Roman" w:hAnsi="Times New Roman" w:cs="Times New Roman"/>
+          <w:b/>
+          <w:bCs/>
+          <w:lang w:val="tr-TR"/>
+        </w:rPr>
+        <w:t xml:space="preserve"> Test </w:t>
+      </w:r>
+      <w:proofErr w:type="spellStart"/>
+      <w:r>
+        <w:rPr>
+          <w:rFonts w:ascii="Times New Roman" w:hAnsi="Times New Roman" w:cs="Times New Roman"/>
+          <w:b/>
+          <w:bCs/>
+          <w:lang w:val="tr-TR"/>
+        </w:rPr>
+        <w:t>Accuracy</w:t>
+      </w:r>
+      <w:proofErr w:type="spellEnd"/>
+      <w:r>
+        <w:rPr>
+          <w:rFonts w:ascii="Times New Roman" w:hAnsi="Times New Roman" w:cs="Times New Roman"/>
+          <w:b/>
+          <w:bCs/>
+          <w:lang w:val="tr-TR"/>
+        </w:rPr>
+        <w:t xml:space="preserve"> </w:t>
+      </w:r>
+      <w:proofErr w:type="spellStart"/>
+      <w:r>
+        <w:rPr>
+          <w:rFonts w:ascii="Times New Roman" w:hAnsi="Times New Roman" w:cs="Times New Roman"/>
+          <w:b/>
+          <w:bCs/>
+          <w:lang w:val="tr-TR"/>
+        </w:rPr>
+        <w:t>Achieved</w:t>
+      </w:r>
+      <w:proofErr w:type="spellEnd"/>
+      <w:r>
+        <w:rPr>
+          <w:rFonts w:ascii="Times New Roman" w:hAnsi="Times New Roman" w:cs="Times New Roman"/>
+          <w:b/>
+          <w:bCs/>
+          <w:lang w:val="tr-TR"/>
+        </w:rPr>
+        <w:t xml:space="preserve">: </w:t>
+      </w:r>
+      <w:r>
+        <w:rPr>
+          <w:rFonts w:ascii="Times New Roman" w:hAnsi="Times New Roman" w:cs="Times New Roman"/>
+          <w:lang w:val="tr-TR"/>
+        </w:rPr>
+        <w:t>89.46%</w:t>
+      </w:r>
+      <w:r>
+        <w:rPr>
+          <w:rFonts w:ascii="Times New Roman" w:hAnsi="Times New Roman" w:cs="Times New Roman"/>
+          <w:lang w:val="tr-TR"/>
+        </w:rPr>
+        <w:t xml:space="preserve"> (</w:t>
+      </w:r>
+      <w:proofErr w:type="spellStart"/>
+      <w:r>
+        <w:rPr>
+          <w:rFonts w:ascii="Times New Roman" w:hAnsi="Times New Roman" w:cs="Times New Roman"/>
+          <w:lang w:val="tr-TR"/>
+        </w:rPr>
+        <w:t>Specialized</w:t>
+      </w:r>
+      <w:proofErr w:type="spellEnd"/>
+      <w:r>
+        <w:rPr>
+          <w:rFonts w:ascii="Times New Roman" w:hAnsi="Times New Roman" w:cs="Times New Roman"/>
+          <w:lang w:val="tr-TR"/>
+        </w:rPr>
+        <w:t xml:space="preserve"> </w:t>
+      </w:r>
+      <w:proofErr w:type="spellStart"/>
+      <w:r>
+        <w:rPr>
+          <w:rFonts w:ascii="Times New Roman" w:hAnsi="Times New Roman" w:cs="Times New Roman"/>
+          <w:lang w:val="tr-TR"/>
+        </w:rPr>
+        <w:t>expertise</w:t>
+      </w:r>
+      <w:proofErr w:type="spellEnd"/>
+      <w:r>
+        <w:rPr>
+          <w:rFonts w:ascii="Times New Roman" w:hAnsi="Times New Roman" w:cs="Times New Roman"/>
+          <w:lang w:val="tr-TR"/>
+        </w:rPr>
+        <w:t xml:space="preserve"> </w:t>
+      </w:r>
+      <w:r>
+        <w:rPr>
+          <w:rFonts w:ascii="Times New Roman" w:hAnsi="Times New Roman" w:cs="Times New Roman"/>
+          <w:lang w:val="tr-TR"/>
+        </w:rPr>
+        <w:t>in Class 1 (Sports))</w:t>
+      </w:r>
+    </w:p>
+    <w:p>
+      <w:pPr>
+        <w:rPr>
+          <w:rFonts w:ascii="Times New Roman" w:hAnsi="Times New Roman" w:cs="Times New Roman"/>
+          <w:lang w:val="tr-TR"/>
+        </w:rPr>
+      </w:pPr>
     </w:p>
     <w:sectPr>
       <w:pgSz w:w="11906" w:h="16838"/>

</xml_diff>

<commit_message>
add true deferral and false deferral rate metrics
</commit_message>
<xml_diff>
--- a/Project3_Report.docx
+++ b/Project3_Report.docx
@@ -37,7 +37,27 @@
           <w:bCs/>
           <w:lang w:val="tr-TR"/>
         </w:rPr>
-        <w:t xml:space="preserve">Name – Surname: </w:t>
+        <w:t xml:space="preserve">Name – </w:t>
+      </w:r>
+      <w:proofErr w:type="spellStart"/>
+      <w:r>
+        <w:rPr>
+          <w:rFonts w:ascii="Times New Roman" w:hAnsi="Times New Roman" w:cs="Times New Roman"/>
+          <w:b/>
+          <w:bCs/>
+          <w:lang w:val="tr-TR"/>
+        </w:rPr>
+        <w:t>Surname</w:t>
+      </w:r>
+      <w:proofErr w:type="spellEnd"/>
+      <w:r>
+        <w:rPr>
+          <w:rFonts w:ascii="Times New Roman" w:hAnsi="Times New Roman" w:cs="Times New Roman"/>
+          <w:b/>
+          <w:bCs/>
+          <w:lang w:val="tr-TR"/>
+        </w:rPr>
+        <w:t xml:space="preserve">: </w:t>
       </w:r>
       <w:r>
         <w:rPr>
@@ -54,14 +74,45 @@
           <w:lang w:val="tr-TR"/>
         </w:rPr>
       </w:pPr>
-      <w:r>
-        <w:rPr>
-          <w:rFonts w:ascii="Times New Roman" w:hAnsi="Times New Roman" w:cs="Times New Roman"/>
-          <w:b/>
-          <w:bCs/>
-          <w:lang w:val="tr-TR"/>
-        </w:rPr>
-        <w:t>Matriculation Number:</w:t>
+      <w:proofErr w:type="spellStart"/>
+      <w:r>
+        <w:rPr>
+          <w:rFonts w:ascii="Times New Roman" w:hAnsi="Times New Roman" w:cs="Times New Roman"/>
+          <w:b/>
+          <w:bCs/>
+          <w:lang w:val="tr-TR"/>
+        </w:rPr>
+        <w:t>Matriculation</w:t>
+      </w:r>
+      <w:proofErr w:type="spellEnd"/>
+      <w:r>
+        <w:rPr>
+          <w:rFonts w:ascii="Times New Roman" w:hAnsi="Times New Roman" w:cs="Times New Roman"/>
+          <w:b/>
+          <w:bCs/>
+          <w:lang w:val="tr-TR"/>
+        </w:rPr>
+        <w:t xml:space="preserve"> </w:t>
+      </w:r>
+      <w:proofErr w:type="spellStart"/>
+      <w:r>
+        <w:rPr>
+          <w:rFonts w:ascii="Times New Roman" w:hAnsi="Times New Roman" w:cs="Times New Roman"/>
+          <w:b/>
+          <w:bCs/>
+          <w:lang w:val="tr-TR"/>
+        </w:rPr>
+        <w:t>Number</w:t>
+      </w:r>
+      <w:proofErr w:type="spellEnd"/>
+      <w:r>
+        <w:rPr>
+          <w:rFonts w:ascii="Times New Roman" w:hAnsi="Times New Roman" w:cs="Times New Roman"/>
+          <w:b/>
+          <w:bCs/>
+          <w:lang w:val="tr-TR"/>
+        </w:rPr>
+        <w:t>:</w:t>
       </w:r>
       <w:r>
         <w:rPr>
@@ -80,14 +131,185 @@
           <w:lang w:val="tr-TR"/>
         </w:rPr>
       </w:pPr>
-      <w:r>
-        <w:rPr>
-          <w:rFonts w:ascii="Times New Roman" w:hAnsi="Times New Roman" w:cs="Times New Roman"/>
-          <w:b/>
-          <w:bCs/>
-          <w:lang w:val="tr-TR"/>
-        </w:rPr>
-        <w:t xml:space="preserve">In this project, the following class mappings are used: </w:t>
+      <w:proofErr w:type="spellStart"/>
+      <w:r>
+        <w:rPr>
+          <w:rFonts w:ascii="Times New Roman" w:hAnsi="Times New Roman" w:cs="Times New Roman"/>
+          <w:b/>
+          <w:bCs/>
+          <w:lang w:val="tr-TR"/>
+        </w:rPr>
+        <w:t>In</w:t>
+      </w:r>
+      <w:proofErr w:type="spellEnd"/>
+      <w:r>
+        <w:rPr>
+          <w:rFonts w:ascii="Times New Roman" w:hAnsi="Times New Roman" w:cs="Times New Roman"/>
+          <w:b/>
+          <w:bCs/>
+          <w:lang w:val="tr-TR"/>
+        </w:rPr>
+        <w:t xml:space="preserve"> </w:t>
+      </w:r>
+      <w:proofErr w:type="spellStart"/>
+      <w:r>
+        <w:rPr>
+          <w:rFonts w:ascii="Times New Roman" w:hAnsi="Times New Roman" w:cs="Times New Roman"/>
+          <w:b/>
+          <w:bCs/>
+          <w:lang w:val="tr-TR"/>
+        </w:rPr>
+        <w:t>this</w:t>
+      </w:r>
+      <w:proofErr w:type="spellEnd"/>
+      <w:r>
+        <w:rPr>
+          <w:rFonts w:ascii="Times New Roman" w:hAnsi="Times New Roman" w:cs="Times New Roman"/>
+          <w:b/>
+          <w:bCs/>
+          <w:lang w:val="tr-TR"/>
+        </w:rPr>
+        <w:t xml:space="preserve"> </w:t>
+      </w:r>
+      <w:proofErr w:type="spellStart"/>
+      <w:r>
+        <w:rPr>
+          <w:rFonts w:ascii="Times New Roman" w:hAnsi="Times New Roman" w:cs="Times New Roman"/>
+          <w:b/>
+          <w:bCs/>
+          <w:lang w:val="tr-TR"/>
+        </w:rPr>
+        <w:t>project</w:t>
+      </w:r>
+      <w:proofErr w:type="spellEnd"/>
+      <w:r>
+        <w:rPr>
+          <w:rFonts w:ascii="Times New Roman" w:hAnsi="Times New Roman" w:cs="Times New Roman"/>
+          <w:b/>
+          <w:bCs/>
+          <w:lang w:val="tr-TR"/>
+        </w:rPr>
+        <w:t xml:space="preserve">, </w:t>
+      </w:r>
+      <w:proofErr w:type="spellStart"/>
+      <w:r>
+        <w:rPr>
+          <w:rFonts w:ascii="Times New Roman" w:hAnsi="Times New Roman" w:cs="Times New Roman"/>
+          <w:b/>
+          <w:bCs/>
+          <w:lang w:val="tr-TR"/>
+        </w:rPr>
+        <w:t>the</w:t>
+      </w:r>
+      <w:proofErr w:type="spellEnd"/>
+      <w:r>
+        <w:rPr>
+          <w:rFonts w:ascii="Times New Roman" w:hAnsi="Times New Roman" w:cs="Times New Roman"/>
+          <w:b/>
+          <w:bCs/>
+          <w:lang w:val="tr-TR"/>
+        </w:rPr>
+        <w:t xml:space="preserve"> </w:t>
+      </w:r>
+      <w:proofErr w:type="spellStart"/>
+      <w:r>
+        <w:rPr>
+          <w:rFonts w:ascii="Times New Roman" w:hAnsi="Times New Roman" w:cs="Times New Roman"/>
+          <w:b/>
+          <w:bCs/>
+          <w:lang w:val="tr-TR"/>
+        </w:rPr>
+        <w:t>following</w:t>
+      </w:r>
+      <w:proofErr w:type="spellEnd"/>
+      <w:r>
+        <w:rPr>
+          <w:rFonts w:ascii="Times New Roman" w:hAnsi="Times New Roman" w:cs="Times New Roman"/>
+          <w:b/>
+          <w:bCs/>
+          <w:lang w:val="tr-TR"/>
+        </w:rPr>
+        <w:t xml:space="preserve"> </w:t>
+      </w:r>
+      <w:proofErr w:type="spellStart"/>
+      <w:r>
+        <w:rPr>
+          <w:rFonts w:ascii="Times New Roman" w:hAnsi="Times New Roman" w:cs="Times New Roman"/>
+          <w:b/>
+          <w:bCs/>
+          <w:lang w:val="tr-TR"/>
+        </w:rPr>
+        <w:t>class</w:t>
+      </w:r>
+      <w:proofErr w:type="spellEnd"/>
+      <w:r>
+        <w:rPr>
+          <w:rFonts w:ascii="Times New Roman" w:hAnsi="Times New Roman" w:cs="Times New Roman"/>
+          <w:b/>
+          <w:bCs/>
+          <w:lang w:val="tr-TR"/>
+        </w:rPr>
+        <w:t xml:space="preserve"> </w:t>
+      </w:r>
+      <w:proofErr w:type="spellStart"/>
+      <w:r>
+        <w:rPr>
+          <w:rFonts w:ascii="Times New Roman" w:hAnsi="Times New Roman" w:cs="Times New Roman"/>
+          <w:b/>
+          <w:bCs/>
+          <w:lang w:val="tr-TR"/>
+        </w:rPr>
+        <w:t>mappings</w:t>
+      </w:r>
+      <w:proofErr w:type="spellEnd"/>
+      <w:r>
+        <w:rPr>
+          <w:rFonts w:ascii="Times New Roman" w:hAnsi="Times New Roman" w:cs="Times New Roman"/>
+          <w:b/>
+          <w:bCs/>
+          <w:lang w:val="tr-TR"/>
+        </w:rPr>
+        <w:t xml:space="preserve"> </w:t>
+      </w:r>
+      <w:proofErr w:type="spellStart"/>
+      <w:r>
+        <w:rPr>
+          <w:rFonts w:ascii="Times New Roman" w:hAnsi="Times New Roman" w:cs="Times New Roman"/>
+          <w:b/>
+          <w:bCs/>
+          <w:lang w:val="tr-TR"/>
+        </w:rPr>
+        <w:t>are</w:t>
+      </w:r>
+      <w:proofErr w:type="spellEnd"/>
+      <w:r>
+        <w:rPr>
+          <w:rFonts w:ascii="Times New Roman" w:hAnsi="Times New Roman" w:cs="Times New Roman"/>
+          <w:b/>
+          <w:bCs/>
+          <w:lang w:val="tr-TR"/>
+        </w:rPr>
+        <w:t xml:space="preserve"> </w:t>
+      </w:r>
+      <w:proofErr w:type="spellStart"/>
+      <w:r>
+        <w:rPr>
+          <w:rFonts w:ascii="Times New Roman" w:hAnsi="Times New Roman" w:cs="Times New Roman"/>
+          <w:b/>
+          <w:bCs/>
+          <w:lang w:val="tr-TR"/>
+        </w:rPr>
+        <w:t>used</w:t>
+      </w:r>
+      <w:proofErr w:type="spellEnd"/>
+      <w:r>
+        <w:rPr>
+          <w:rFonts w:ascii="Times New Roman" w:hAnsi="Times New Roman" w:cs="Times New Roman"/>
+          <w:b/>
+          <w:bCs/>
+          <w:lang w:val="tr-TR"/>
+        </w:rPr>
+        <w:t xml:space="preserve">: </w:t>
       </w:r>
     </w:p>
     <w:p>
@@ -262,6 +484,7 @@
           <w:lang w:val="tr-TR"/>
         </w:rPr>
       </w:pPr>
+      <w:proofErr w:type="spellStart"/>
       <w:r>
         <w:rPr>
           <w:rFonts w:ascii="Times New Roman" w:hAnsi="Times New Roman" w:cs="Times New Roman"/>
@@ -270,7 +493,18 @@
           <w:u w:val="single"/>
           <w:lang w:val="tr-TR"/>
         </w:rPr>
-        <w:t>Task 1</w:t>
+        <w:t>Task</w:t>
+      </w:r>
+      <w:proofErr w:type="spellEnd"/>
+      <w:r>
+        <w:rPr>
+          <w:rFonts w:ascii="Times New Roman" w:hAnsi="Times New Roman" w:cs="Times New Roman"/>
+          <w:b/>
+          <w:bCs/>
+          <w:u w:val="single"/>
+          <w:lang w:val="tr-TR"/>
+        </w:rPr>
+        <w:t xml:space="preserve"> 1</w:t>
       </w:r>
       <w:r>
         <w:rPr>
@@ -290,23 +524,54 @@
           <w:lang w:val="tr-TR"/>
         </w:rPr>
       </w:pPr>
-      <w:r>
-        <w:rPr>
-          <w:rFonts w:ascii="Times New Roman" w:hAnsi="Times New Roman" w:cs="Times New Roman"/>
-          <w:b/>
-          <w:bCs/>
-          <w:lang w:val="tr-TR"/>
-        </w:rPr>
-        <w:t>Used Classi</w:t>
-      </w:r>
-      <w:r>
-        <w:rPr>
-          <w:rFonts w:ascii="Times New Roman" w:hAnsi="Times New Roman" w:cs="Times New Roman"/>
-          <w:b/>
-          <w:bCs/>
-          <w:lang w:val="tr-TR"/>
-        </w:rPr>
-        <w:t>fication Model</w:t>
+      <w:proofErr w:type="spellStart"/>
+      <w:r>
+        <w:rPr>
+          <w:rFonts w:ascii="Times New Roman" w:hAnsi="Times New Roman" w:cs="Times New Roman"/>
+          <w:b/>
+          <w:bCs/>
+          <w:lang w:val="tr-TR"/>
+        </w:rPr>
+        <w:t>Used</w:t>
+      </w:r>
+      <w:proofErr w:type="spellEnd"/>
+      <w:r>
+        <w:rPr>
+          <w:rFonts w:ascii="Times New Roman" w:hAnsi="Times New Roman" w:cs="Times New Roman"/>
+          <w:b/>
+          <w:bCs/>
+          <w:lang w:val="tr-TR"/>
+        </w:rPr>
+        <w:t xml:space="preserve"> </w:t>
+      </w:r>
+      <w:proofErr w:type="spellStart"/>
+      <w:r>
+        <w:rPr>
+          <w:rFonts w:ascii="Times New Roman" w:hAnsi="Times New Roman" w:cs="Times New Roman"/>
+          <w:b/>
+          <w:bCs/>
+          <w:lang w:val="tr-TR"/>
+        </w:rPr>
+        <w:t>Classi</w:t>
+      </w:r>
+      <w:r>
+        <w:rPr>
+          <w:rFonts w:ascii="Times New Roman" w:hAnsi="Times New Roman" w:cs="Times New Roman"/>
+          <w:b/>
+          <w:bCs/>
+          <w:lang w:val="tr-TR"/>
+        </w:rPr>
+        <w:t>fication</w:t>
+      </w:r>
+      <w:proofErr w:type="spellEnd"/>
+      <w:r>
+        <w:rPr>
+          <w:rFonts w:ascii="Times New Roman" w:hAnsi="Times New Roman" w:cs="Times New Roman"/>
+          <w:b/>
+          <w:bCs/>
+          <w:lang w:val="tr-TR"/>
+        </w:rPr>
+        <w:t xml:space="preserve"> Model</w:t>
       </w:r>
       <w:r>
         <w:rPr>
@@ -322,8 +587,33 @@
           <w:rFonts w:ascii="Times New Roman" w:hAnsi="Times New Roman" w:cs="Times New Roman"/>
           <w:lang w:val="tr-TR"/>
         </w:rPr>
-        <w:t xml:space="preserve"> Logistic Regression</w:t>
-      </w:r>
+        <w:t xml:space="preserve"> </w:t>
+      </w:r>
+      <w:proofErr w:type="spellStart"/>
+      <w:r>
+        <w:rPr>
+          <w:rFonts w:ascii="Times New Roman" w:hAnsi="Times New Roman" w:cs="Times New Roman"/>
+          <w:lang w:val="tr-TR"/>
+        </w:rPr>
+        <w:t>Logistic</w:t>
+      </w:r>
+      <w:proofErr w:type="spellEnd"/>
+      <w:r>
+        <w:rPr>
+          <w:rFonts w:ascii="Times New Roman" w:hAnsi="Times New Roman" w:cs="Times New Roman"/>
+          <w:lang w:val="tr-TR"/>
+        </w:rPr>
+        <w:t xml:space="preserve"> </w:t>
+      </w:r>
+      <w:proofErr w:type="spellStart"/>
+      <w:r>
+        <w:rPr>
+          <w:rFonts w:ascii="Times New Roman" w:hAnsi="Times New Roman" w:cs="Times New Roman"/>
+          <w:lang w:val="tr-TR"/>
+        </w:rPr>
+        <w:t>Regression</w:t>
+      </w:r>
+      <w:proofErr w:type="spellEnd"/>
     </w:p>
     <w:p>
       <w:pPr>
@@ -332,14 +622,85 @@
           <w:lang w:val="tr-TR"/>
         </w:rPr>
       </w:pPr>
-      <w:r>
-        <w:rPr>
-          <w:rFonts w:ascii="Times New Roman" w:hAnsi="Times New Roman" w:cs="Times New Roman"/>
-          <w:b/>
-          <w:bCs/>
-          <w:lang w:val="tr-TR"/>
-        </w:rPr>
-        <w:t xml:space="preserve">Classifier Baseline Test Accuracy Achieved: </w:t>
+      <w:proofErr w:type="spellStart"/>
+      <w:r>
+        <w:rPr>
+          <w:rFonts w:ascii="Times New Roman" w:hAnsi="Times New Roman" w:cs="Times New Roman"/>
+          <w:b/>
+          <w:bCs/>
+          <w:lang w:val="tr-TR"/>
+        </w:rPr>
+        <w:t>Classifier</w:t>
+      </w:r>
+      <w:proofErr w:type="spellEnd"/>
+      <w:r>
+        <w:rPr>
+          <w:rFonts w:ascii="Times New Roman" w:hAnsi="Times New Roman" w:cs="Times New Roman"/>
+          <w:b/>
+          <w:bCs/>
+          <w:lang w:val="tr-TR"/>
+        </w:rPr>
+        <w:t xml:space="preserve"> </w:t>
+      </w:r>
+      <w:proofErr w:type="spellStart"/>
+      <w:r>
+        <w:rPr>
+          <w:rFonts w:ascii="Times New Roman" w:hAnsi="Times New Roman" w:cs="Times New Roman"/>
+          <w:b/>
+          <w:bCs/>
+          <w:lang w:val="tr-TR"/>
+        </w:rPr>
+        <w:t>Baseline</w:t>
+      </w:r>
+      <w:proofErr w:type="spellEnd"/>
+      <w:r>
+        <w:rPr>
+          <w:rFonts w:ascii="Times New Roman" w:hAnsi="Times New Roman" w:cs="Times New Roman"/>
+          <w:b/>
+          <w:bCs/>
+          <w:lang w:val="tr-TR"/>
+        </w:rPr>
+        <w:t xml:space="preserve"> Test </w:t>
+      </w:r>
+      <w:proofErr w:type="spellStart"/>
+      <w:r>
+        <w:rPr>
+          <w:rFonts w:ascii="Times New Roman" w:hAnsi="Times New Roman" w:cs="Times New Roman"/>
+          <w:b/>
+          <w:bCs/>
+          <w:lang w:val="tr-TR"/>
+        </w:rPr>
+        <w:t>Accuracy</w:t>
+      </w:r>
+      <w:proofErr w:type="spellEnd"/>
+      <w:r>
+        <w:rPr>
+          <w:rFonts w:ascii="Times New Roman" w:hAnsi="Times New Roman" w:cs="Times New Roman"/>
+          <w:b/>
+          <w:bCs/>
+          <w:lang w:val="tr-TR"/>
+        </w:rPr>
+        <w:t xml:space="preserve"> </w:t>
+      </w:r>
+      <w:proofErr w:type="spellStart"/>
+      <w:r>
+        <w:rPr>
+          <w:rFonts w:ascii="Times New Roman" w:hAnsi="Times New Roman" w:cs="Times New Roman"/>
+          <w:b/>
+          <w:bCs/>
+          <w:lang w:val="tr-TR"/>
+        </w:rPr>
+        <w:t>Achieved</w:t>
+      </w:r>
+      <w:proofErr w:type="spellEnd"/>
+      <w:r>
+        <w:rPr>
+          <w:rFonts w:ascii="Times New Roman" w:hAnsi="Times New Roman" w:cs="Times New Roman"/>
+          <w:b/>
+          <w:bCs/>
+          <w:lang w:val="tr-TR"/>
+        </w:rPr>
+        <w:t xml:space="preserve">: </w:t>
       </w:r>
       <w:r>
         <w:rPr>
@@ -2851,6 +3212,7 @@
           <w:lang w:val="tr-TR"/>
         </w:rPr>
       </w:pPr>
+      <w:proofErr w:type="spellStart"/>
       <w:r>
         <w:rPr>
           <w:rFonts w:ascii="Times New Roman" w:hAnsi="Times New Roman" w:cs="Times New Roman"/>
@@ -2859,7 +3221,18 @@
           <w:u w:val="single"/>
           <w:lang w:val="tr-TR"/>
         </w:rPr>
-        <w:t xml:space="preserve">Task 2: </w:t>
+        <w:t>Task</w:t>
+      </w:r>
+      <w:proofErr w:type="spellEnd"/>
+      <w:r>
+        <w:rPr>
+          <w:rFonts w:ascii="Times New Roman" w:hAnsi="Times New Roman" w:cs="Times New Roman"/>
+          <w:b/>
+          <w:bCs/>
+          <w:u w:val="single"/>
+          <w:lang w:val="tr-TR"/>
+        </w:rPr>
+        <w:t xml:space="preserve"> 2: </w:t>
       </w:r>
     </w:p>
     <w:p>
@@ -2869,14 +3242,35 @@
           <w:lang w:val="tr-TR"/>
         </w:rPr>
       </w:pPr>
-      <w:r>
-        <w:rPr>
-          <w:rFonts w:ascii="Times New Roman" w:hAnsi="Times New Roman" w:cs="Times New Roman"/>
-          <w:b/>
-          <w:bCs/>
-          <w:lang w:val="tr-TR"/>
-        </w:rPr>
-        <w:t>Simulated Expert</w:t>
+      <w:proofErr w:type="spellStart"/>
+      <w:r>
+        <w:rPr>
+          <w:rFonts w:ascii="Times New Roman" w:hAnsi="Times New Roman" w:cs="Times New Roman"/>
+          <w:b/>
+          <w:bCs/>
+          <w:lang w:val="tr-TR"/>
+        </w:rPr>
+        <w:t>Simulated</w:t>
+      </w:r>
+      <w:proofErr w:type="spellEnd"/>
+      <w:r>
+        <w:rPr>
+          <w:rFonts w:ascii="Times New Roman" w:hAnsi="Times New Roman" w:cs="Times New Roman"/>
+          <w:b/>
+          <w:bCs/>
+          <w:lang w:val="tr-TR"/>
+        </w:rPr>
+        <w:t xml:space="preserve"> </w:t>
+      </w:r>
+      <w:proofErr w:type="spellStart"/>
+      <w:r>
+        <w:rPr>
+          <w:rFonts w:ascii="Times New Roman" w:hAnsi="Times New Roman" w:cs="Times New Roman"/>
+          <w:b/>
+          <w:bCs/>
+          <w:lang w:val="tr-TR"/>
+        </w:rPr>
+        <w:t>Expert</w:t>
       </w:r>
       <w:r>
         <w:rPr>
@@ -2887,6 +3281,7 @@
         </w:rPr>
         <w:t>’s</w:t>
       </w:r>
+      <w:proofErr w:type="spellEnd"/>
       <w:r>
         <w:rPr>
           <w:rFonts w:ascii="Times New Roman" w:hAnsi="Times New Roman" w:cs="Times New Roman"/>
@@ -2896,23 +3291,65 @@
         </w:rPr>
         <w:t xml:space="preserve"> Test </w:t>
       </w:r>
-      <w:r>
-        <w:rPr>
-          <w:rFonts w:ascii="Times New Roman" w:hAnsi="Times New Roman" w:cs="Times New Roman"/>
-          <w:b/>
-          <w:bCs/>
-          <w:lang w:val="tr-TR"/>
-        </w:rPr>
-        <w:t xml:space="preserve">Dataset </w:t>
-      </w:r>
-      <w:r>
-        <w:rPr>
-          <w:rFonts w:ascii="Times New Roman" w:hAnsi="Times New Roman" w:cs="Times New Roman"/>
-          <w:b/>
-          <w:bCs/>
-          <w:lang w:val="tr-TR"/>
-        </w:rPr>
-        <w:t xml:space="preserve">Accuracy Achieved: </w:t>
+      <w:proofErr w:type="spellStart"/>
+      <w:r>
+        <w:rPr>
+          <w:rFonts w:ascii="Times New Roman" w:hAnsi="Times New Roman" w:cs="Times New Roman"/>
+          <w:b/>
+          <w:bCs/>
+          <w:lang w:val="tr-TR"/>
+        </w:rPr>
+        <w:t>Dataset</w:t>
+      </w:r>
+      <w:proofErr w:type="spellEnd"/>
+      <w:r>
+        <w:rPr>
+          <w:rFonts w:ascii="Times New Roman" w:hAnsi="Times New Roman" w:cs="Times New Roman"/>
+          <w:b/>
+          <w:bCs/>
+          <w:lang w:val="tr-TR"/>
+        </w:rPr>
+        <w:t xml:space="preserve"> </w:t>
+      </w:r>
+      <w:proofErr w:type="spellStart"/>
+      <w:r>
+        <w:rPr>
+          <w:rFonts w:ascii="Times New Roman" w:hAnsi="Times New Roman" w:cs="Times New Roman"/>
+          <w:b/>
+          <w:bCs/>
+          <w:lang w:val="tr-TR"/>
+        </w:rPr>
+        <w:t>Accuracy</w:t>
+      </w:r>
+      <w:proofErr w:type="spellEnd"/>
+      <w:r>
+        <w:rPr>
+          <w:rFonts w:ascii="Times New Roman" w:hAnsi="Times New Roman" w:cs="Times New Roman"/>
+          <w:b/>
+          <w:bCs/>
+          <w:lang w:val="tr-TR"/>
+        </w:rPr>
+        <w:t xml:space="preserve"> </w:t>
+      </w:r>
+      <w:proofErr w:type="spellStart"/>
+      <w:r>
+        <w:rPr>
+          <w:rFonts w:ascii="Times New Roman" w:hAnsi="Times New Roman" w:cs="Times New Roman"/>
+          <w:b/>
+          <w:bCs/>
+          <w:lang w:val="tr-TR"/>
+        </w:rPr>
+        <w:t>Achieved</w:t>
+      </w:r>
+      <w:proofErr w:type="spellEnd"/>
+      <w:r>
+        <w:rPr>
+          <w:rFonts w:ascii="Times New Roman" w:hAnsi="Times New Roman" w:cs="Times New Roman"/>
+          <w:b/>
+          <w:bCs/>
+          <w:lang w:val="tr-TR"/>
+        </w:rPr>
+        <w:t xml:space="preserve">: </w:t>
       </w:r>
       <w:r>
         <w:rPr>
@@ -2940,7 +3377,39 @@
           <w:rFonts w:ascii="Times New Roman" w:hAnsi="Times New Roman" w:cs="Times New Roman"/>
           <w:lang w:val="tr-TR"/>
         </w:rPr>
-        <w:t xml:space="preserve"> (Specialized expertise </w:t>
+        <w:t xml:space="preserve"> (</w:t>
+      </w:r>
+      <w:proofErr w:type="spellStart"/>
+      <w:r>
+        <w:rPr>
+          <w:rFonts w:ascii="Times New Roman" w:hAnsi="Times New Roman" w:cs="Times New Roman"/>
+          <w:lang w:val="tr-TR"/>
+        </w:rPr>
+        <w:t>Specialized</w:t>
+      </w:r>
+      <w:proofErr w:type="spellEnd"/>
+      <w:r>
+        <w:rPr>
+          <w:rFonts w:ascii="Times New Roman" w:hAnsi="Times New Roman" w:cs="Times New Roman"/>
+          <w:lang w:val="tr-TR"/>
+        </w:rPr>
+        <w:t xml:space="preserve"> </w:t>
+      </w:r>
+      <w:proofErr w:type="spellStart"/>
+      <w:r>
+        <w:rPr>
+          <w:rFonts w:ascii="Times New Roman" w:hAnsi="Times New Roman" w:cs="Times New Roman"/>
+          <w:lang w:val="tr-TR"/>
+        </w:rPr>
+        <w:t>expertise</w:t>
+      </w:r>
+      <w:proofErr w:type="spellEnd"/>
+      <w:r>
+        <w:rPr>
+          <w:rFonts w:ascii="Times New Roman" w:hAnsi="Times New Roman" w:cs="Times New Roman"/>
+          <w:lang w:val="tr-TR"/>
+        </w:rPr>
+        <w:t xml:space="preserve"> </w:t>
       </w:r>
       <w:r>
         <w:rPr>
@@ -5004,6 +5473,244 @@
     </w:p>
     <w:p>
       <w:pPr>
+        <w:jc w:val="both"/>
+        <w:rPr>
+          <w:rFonts w:ascii="Times New Roman" w:eastAsia="Times New Roman" w:hAnsi="Times New Roman" w:cs="Times New Roman"/>
+          <w:lang w:eastAsia="tr-TR"/>
+        </w:rPr>
+      </w:pPr>
+      <w:r>
+        <w:rPr>
+          <w:rFonts w:ascii="Times New Roman" w:eastAsia="Times New Roman" w:hAnsi="Times New Roman" w:cs="Times New Roman"/>
+          <w:b/>
+          <w:bCs/>
+          <w:lang w:eastAsia="tr-TR"/>
+        </w:rPr>
+        <w:t xml:space="preserve">1. Specific Domain Expertise: </w:t>
+      </w:r>
+      <w:r>
+        <w:rPr>
+          <w:rFonts w:ascii="Times New Roman" w:eastAsia="Times New Roman" w:hAnsi="Times New Roman" w:cs="Times New Roman"/>
+          <w:lang w:eastAsia="tr-TR"/>
+        </w:rPr>
+        <w:t>This simu</w:t>
+      </w:r>
+      <w:r>
+        <w:rPr>
+          <w:rFonts w:ascii="Times New Roman" w:eastAsia="Times New Roman" w:hAnsi="Times New Roman" w:cs="Times New Roman"/>
+          <w:lang w:eastAsia="tr-TR"/>
+        </w:rPr>
+        <w:t xml:space="preserve">lated expert </w:t>
+      </w:r>
+      <w:r>
+        <w:rPr>
+          <w:rFonts w:ascii="Times New Roman" w:eastAsia="Times New Roman" w:hAnsi="Times New Roman" w:cs="Times New Roman"/>
+          <w:lang w:eastAsia="tr-TR"/>
+        </w:rPr>
+        <w:t>exhibits</w:t>
+      </w:r>
+      <w:r>
+        <w:rPr>
+          <w:rFonts w:ascii="Times New Roman" w:eastAsia="Times New Roman" w:hAnsi="Times New Roman" w:cs="Times New Roman"/>
+          <w:lang w:eastAsia="tr-TR"/>
+        </w:rPr>
+        <w:t xml:space="preserve"> a deterministic behavior for Class 1, which is the “Sports” field. It </w:t>
+      </w:r>
+      <w:r>
+        <w:rPr>
+          <w:rFonts w:ascii="Times New Roman" w:eastAsia="Times New Roman" w:hAnsi="Times New Roman" w:cs="Times New Roman"/>
+          <w:lang w:eastAsia="tr-TR"/>
+        </w:rPr>
+        <w:t>suitably mimics the knowledge of real-world human experts who possess deep knowledge in a specific field</w:t>
+      </w:r>
+      <w:r>
+        <w:rPr>
+          <w:rFonts w:ascii="Times New Roman" w:eastAsia="Times New Roman" w:hAnsi="Times New Roman" w:cs="Times New Roman"/>
+          <w:lang w:eastAsia="tr-TR"/>
+        </w:rPr>
+        <w:t xml:space="preserve"> (Class 1: Sports)</w:t>
+      </w:r>
+      <w:r>
+        <w:rPr>
+          <w:rFonts w:ascii="Times New Roman" w:eastAsia="Times New Roman" w:hAnsi="Times New Roman" w:cs="Times New Roman"/>
+          <w:lang w:eastAsia="tr-TR"/>
+        </w:rPr>
+        <w:t xml:space="preserve">, instead of holding a generalized and/or broad expertise. </w:t>
+      </w:r>
+      <w:r>
+        <w:rPr>
+          <w:rFonts w:ascii="Times New Roman" w:eastAsia="Times New Roman" w:hAnsi="Times New Roman" w:cs="Times New Roman"/>
+          <w:lang w:eastAsia="tr-TR"/>
+        </w:rPr>
+        <w:t xml:space="preserve">Therefore, it will serve as a realistic and resource-efficient proxy </w:t>
+      </w:r>
+      <w:r>
+        <w:rPr>
+          <w:rFonts w:ascii="Times New Roman" w:eastAsia="Times New Roman" w:hAnsi="Times New Roman" w:cs="Times New Roman"/>
+          <w:lang w:eastAsia="tr-TR"/>
+        </w:rPr>
+        <w:t>substitute to evaluate cost-</w:t>
+      </w:r>
+      <w:r>
+        <w:rPr>
+          <w:rFonts w:ascii="Times New Roman" w:eastAsia="Times New Roman" w:hAnsi="Times New Roman" w:cs="Times New Roman"/>
+          <w:lang w:eastAsia="tr-TR"/>
+        </w:rPr>
+        <w:t>efficient</w:t>
+      </w:r>
+      <w:r>
+        <w:rPr>
+          <w:rFonts w:ascii="Times New Roman" w:eastAsia="Times New Roman" w:hAnsi="Times New Roman" w:cs="Times New Roman"/>
+          <w:lang w:eastAsia="tr-TR"/>
+        </w:rPr>
+        <w:t xml:space="preserve"> </w:t>
+      </w:r>
+      <w:r>
+        <w:rPr>
+          <w:rFonts w:ascii="Times New Roman" w:eastAsia="Times New Roman" w:hAnsi="Times New Roman" w:cs="Times New Roman"/>
+          <w:lang w:eastAsia="tr-TR"/>
+        </w:rPr>
+        <w:t xml:space="preserve">(efficient in terms of time, computational complexity, and financial budget) </w:t>
+      </w:r>
+      <w:r>
+        <w:rPr>
+          <w:rFonts w:ascii="Times New Roman" w:eastAsia="Times New Roman" w:hAnsi="Times New Roman" w:cs="Times New Roman"/>
+          <w:lang w:eastAsia="tr-TR"/>
+        </w:rPr>
+        <w:t xml:space="preserve">routing and decision delegation mechanisms within the learning-to-defer framework. </w:t>
+      </w:r>
+    </w:p>
+    <w:p>
+      <w:pPr>
+        <w:jc w:val="both"/>
+        <w:rPr>
+          <w:rFonts w:ascii="Times New Roman" w:eastAsia="Times New Roman" w:hAnsi="Times New Roman" w:cs="Times New Roman"/>
+          <w:lang w:eastAsia="tr-TR"/>
+        </w:rPr>
+      </w:pPr>
+      <w:r>
+        <w:rPr>
+          <w:rFonts w:ascii="Times New Roman" w:eastAsia="Times New Roman" w:hAnsi="Times New Roman" w:cs="Times New Roman"/>
+          <w:b/>
+          <w:bCs/>
+          <w:lang w:eastAsia="tr-TR"/>
+        </w:rPr>
+        <w:t>2.</w:t>
+      </w:r>
+      <w:r>
+        <w:rPr>
+          <w:rFonts w:ascii="Times New Roman" w:eastAsia="Times New Roman" w:hAnsi="Times New Roman" w:cs="Times New Roman"/>
+          <w:lang w:eastAsia="tr-TR"/>
+        </w:rPr>
+        <w:t xml:space="preserve"> </w:t>
+      </w:r>
+      <w:r>
+        <w:rPr>
+          <w:rFonts w:ascii="Times New Roman" w:eastAsia="Times New Roman" w:hAnsi="Times New Roman" w:cs="Times New Roman"/>
+          <w:b/>
+          <w:bCs/>
+          <w:lang w:eastAsia="tr-TR"/>
+        </w:rPr>
+        <w:t xml:space="preserve">High Accuracy Achieved on the Test Dataset: </w:t>
+      </w:r>
+      <w:r>
+        <w:rPr>
+          <w:rFonts w:ascii="Times New Roman" w:eastAsia="Times New Roman" w:hAnsi="Times New Roman" w:cs="Times New Roman"/>
+          <w:lang w:eastAsia="tr-TR"/>
+        </w:rPr>
+        <w:t>The simulated expert has achieved a high test dataset accuracy of “92.70%”</w:t>
+      </w:r>
+      <w:r>
+        <w:rPr>
+          <w:rFonts w:ascii="Times New Roman" w:eastAsia="Times New Roman" w:hAnsi="Times New Roman" w:cs="Times New Roman"/>
+          <w:lang w:eastAsia="tr-TR"/>
+        </w:rPr>
+        <w:t>, which means it is a highly reliable ground-truth substitute.</w:t>
+      </w:r>
+    </w:p>
+    <w:p>
+      <w:pPr>
+        <w:jc w:val="both"/>
+        <w:rPr>
+          <w:rFonts w:ascii="Times New Roman" w:eastAsia="Times New Roman" w:hAnsi="Times New Roman" w:cs="Times New Roman"/>
+          <w:lang w:eastAsia="tr-TR"/>
+        </w:rPr>
+      </w:pPr>
+      <w:r>
+        <w:rPr>
+          <w:rFonts w:ascii="Times New Roman" w:eastAsia="Times New Roman" w:hAnsi="Times New Roman" w:cs="Times New Roman"/>
+          <w:b/>
+          <w:bCs/>
+          <w:lang w:eastAsia="tr-TR"/>
+        </w:rPr>
+        <w:t>3. Significant Reduction of Time, Effort, and Cost Needed for Manual Data Labeling:</w:t>
+      </w:r>
+      <w:r>
+        <w:rPr>
+          <w:rFonts w:ascii="Times New Roman" w:eastAsia="Times New Roman" w:hAnsi="Times New Roman" w:cs="Times New Roman"/>
+          <w:lang w:eastAsia="tr-TR"/>
+        </w:rPr>
+        <w:t xml:space="preserve"> </w:t>
+      </w:r>
+      <w:r>
+        <w:rPr>
+          <w:rFonts w:ascii="Times New Roman" w:eastAsia="Times New Roman" w:hAnsi="Times New Roman" w:cs="Times New Roman"/>
+          <w:lang w:eastAsia="tr-TR"/>
+        </w:rPr>
+        <w:t>This simulated expert</w:t>
+      </w:r>
+      <w:r>
+        <w:rPr>
+          <w:rFonts w:ascii="Times New Roman" w:eastAsia="Times New Roman" w:hAnsi="Times New Roman" w:cs="Times New Roman"/>
+          <w:lang w:eastAsia="tr-TR"/>
+        </w:rPr>
+        <w:t xml:space="preserve"> can </w:t>
+      </w:r>
+      <w:r>
+        <w:rPr>
+          <w:rFonts w:ascii="Times New Roman" w:eastAsia="Times New Roman" w:hAnsi="Times New Roman" w:cs="Times New Roman"/>
+          <w:lang w:eastAsia="tr-TR"/>
+        </w:rPr>
+        <w:t>serve</w:t>
+      </w:r>
+      <w:r>
+        <w:rPr>
+          <w:rFonts w:ascii="Times New Roman" w:eastAsia="Times New Roman" w:hAnsi="Times New Roman" w:cs="Times New Roman"/>
+          <w:lang w:eastAsia="tr-TR"/>
+        </w:rPr>
+        <w:t xml:space="preserve"> as a highly </w:t>
+      </w:r>
+      <w:r>
+        <w:rPr>
+          <w:rFonts w:ascii="Times New Roman" w:eastAsia="Times New Roman" w:hAnsi="Times New Roman" w:cs="Times New Roman"/>
+          <w:lang w:eastAsia="tr-TR"/>
+        </w:rPr>
+        <w:t xml:space="preserve">reliable proxy </w:t>
+      </w:r>
+      <w:r>
+        <w:rPr>
+          <w:rFonts w:ascii="Times New Roman" w:eastAsia="Times New Roman" w:hAnsi="Times New Roman" w:cs="Times New Roman"/>
+          <w:lang w:eastAsia="tr-TR"/>
+        </w:rPr>
+        <w:t>for a manual domain expert workforce on</w:t>
+      </w:r>
+      <w:r>
+        <w:rPr>
+          <w:rFonts w:ascii="Times New Roman" w:eastAsia="Times New Roman" w:hAnsi="Times New Roman" w:cs="Times New Roman"/>
+          <w:lang w:eastAsia="tr-TR"/>
+        </w:rPr>
+        <w:t xml:space="preserve"> the ground-truth dataset; as a result, this approach will</w:t>
+      </w:r>
+      <w:r>
+        <w:rPr>
+          <w:rFonts w:ascii="Times New Roman" w:eastAsia="Times New Roman" w:hAnsi="Times New Roman" w:cs="Times New Roman"/>
+          <w:lang w:eastAsia="tr-TR"/>
+        </w:rPr>
+        <w:t xml:space="preserve"> significantly reduce the time, effort, and cost required for manual data labeling. </w:t>
+      </w:r>
+    </w:p>
+    <w:p>
+      <w:pPr>
         <w:rPr>
           <w:rFonts w:ascii="Times New Roman" w:eastAsia="Times New Roman" w:hAnsi="Times New Roman" w:cs="Times New Roman"/>
           <w:b/>
@@ -5033,6 +5740,133 @@
         </w:rPr>
         <w:t xml:space="preserve">Weaknesses of the Simulated Expert on the Dataset </w:t>
       </w:r>
+    </w:p>
+    <w:p>
+      <w:pPr>
+        <w:rPr>
+          <w:rFonts w:ascii="Times New Roman" w:eastAsia="Times New Roman" w:hAnsi="Times New Roman" w:cs="Times New Roman"/>
+          <w:b/>
+          <w:bCs/>
+          <w:lang w:eastAsia="tr-TR"/>
+        </w:rPr>
+      </w:pPr>
+      <w:r>
+        <w:rPr>
+          <w:rFonts w:ascii="Times New Roman" w:eastAsia="Times New Roman" w:hAnsi="Times New Roman" w:cs="Times New Roman"/>
+          <w:b/>
+          <w:bCs/>
+          <w:lang w:eastAsia="tr-TR"/>
+        </w:rPr>
+        <w:t xml:space="preserve">1. </w:t>
+      </w:r>
+    </w:p>
+    <w:p>
+      <w:pPr>
+        <w:rPr>
+          <w:rFonts w:ascii="Times New Roman" w:eastAsia="Times New Roman" w:hAnsi="Times New Roman" w:cs="Times New Roman"/>
+          <w:b/>
+          <w:bCs/>
+          <w:lang w:eastAsia="tr-TR"/>
+        </w:rPr>
+      </w:pPr>
+    </w:p>
+    <w:p>
+      <w:pPr>
+        <w:rPr>
+          <w:rFonts w:ascii="Times New Roman" w:eastAsia="Times New Roman" w:hAnsi="Times New Roman" w:cs="Times New Roman"/>
+          <w:b/>
+          <w:bCs/>
+          <w:lang w:eastAsia="tr-TR"/>
+        </w:rPr>
+      </w:pPr>
+    </w:p>
+    <w:p>
+      <w:pPr>
+        <w:rPr>
+          <w:rFonts w:ascii="Times New Roman" w:eastAsia="Times New Roman" w:hAnsi="Times New Roman" w:cs="Times New Roman"/>
+          <w:b/>
+          <w:bCs/>
+          <w:lang w:eastAsia="tr-TR"/>
+        </w:rPr>
+      </w:pPr>
+      <w:r>
+        <w:rPr>
+          <w:rFonts w:ascii="Times New Roman" w:eastAsia="Times New Roman" w:hAnsi="Times New Roman" w:cs="Times New Roman"/>
+          <w:b/>
+          <w:bCs/>
+          <w:lang w:eastAsia="tr-TR"/>
+        </w:rPr>
+        <w:t xml:space="preserve">2. </w:t>
+      </w:r>
+    </w:p>
+    <w:p>
+      <w:pPr>
+        <w:rPr>
+          <w:rFonts w:ascii="Times New Roman" w:eastAsia="Times New Roman" w:hAnsi="Times New Roman" w:cs="Times New Roman"/>
+          <w:b/>
+          <w:bCs/>
+          <w:lang w:eastAsia="tr-TR"/>
+        </w:rPr>
+      </w:pPr>
+    </w:p>
+    <w:p>
+      <w:pPr>
+        <w:rPr>
+          <w:rFonts w:ascii="Times New Roman" w:eastAsia="Times New Roman" w:hAnsi="Times New Roman" w:cs="Times New Roman"/>
+          <w:b/>
+          <w:bCs/>
+          <w:lang w:eastAsia="tr-TR"/>
+        </w:rPr>
+      </w:pPr>
+    </w:p>
+    <w:p>
+      <w:pPr>
+        <w:rPr>
+          <w:rFonts w:ascii="Times New Roman" w:eastAsia="Times New Roman" w:hAnsi="Times New Roman" w:cs="Times New Roman"/>
+          <w:b/>
+          <w:bCs/>
+          <w:lang w:eastAsia="tr-TR"/>
+        </w:rPr>
+      </w:pPr>
+      <w:r>
+        <w:rPr>
+          <w:rFonts w:ascii="Times New Roman" w:eastAsia="Times New Roman" w:hAnsi="Times New Roman" w:cs="Times New Roman"/>
+          <w:b/>
+          <w:bCs/>
+          <w:lang w:eastAsia="tr-TR"/>
+        </w:rPr>
+        <w:t xml:space="preserve">3. </w:t>
+      </w:r>
+    </w:p>
+    <w:p>
+      <w:pPr>
+        <w:rPr>
+          <w:rFonts w:ascii="Times New Roman" w:eastAsia="Times New Roman" w:hAnsi="Times New Roman" w:cs="Times New Roman"/>
+          <w:b/>
+          <w:bCs/>
+          <w:lang w:eastAsia="tr-TR"/>
+        </w:rPr>
+      </w:pPr>
+    </w:p>
+    <w:p>
+      <w:pPr>
+        <w:rPr>
+          <w:rFonts w:ascii="Times New Roman" w:eastAsia="Times New Roman" w:hAnsi="Times New Roman" w:cs="Times New Roman"/>
+          <w:b/>
+          <w:bCs/>
+          <w:lang w:eastAsia="tr-TR"/>
+        </w:rPr>
+      </w:pPr>
+    </w:p>
+    <w:p>
+      <w:pPr>
+        <w:rPr>
+          <w:rFonts w:ascii="Times New Roman" w:eastAsia="Times New Roman" w:hAnsi="Times New Roman" w:cs="Times New Roman"/>
+          <w:b/>
+          <w:bCs/>
+          <w:lang w:eastAsia="tr-TR"/>
+        </w:rPr>
+      </w:pPr>
     </w:p>
     <w:p>
       <w:pPr>

</xml_diff>

<commit_message>
add false & true undeferral counts and rates
</commit_message>
<xml_diff>
--- a/Project3_Report.docx
+++ b/Project3_Report.docx
@@ -128,6 +128,7 @@
           <w:rFonts w:ascii="Times New Roman" w:hAnsi="Times New Roman" w:cs="Times New Roman"/>
           <w:b/>
           <w:bCs/>
+          <w:u w:val="single"/>
           <w:lang w:val="tr-TR"/>
         </w:rPr>
       </w:pPr>
@@ -137,6 +138,7 @@
           <w:rFonts w:ascii="Times New Roman" w:hAnsi="Times New Roman" w:cs="Times New Roman"/>
           <w:b/>
           <w:bCs/>
+          <w:u w:val="single"/>
           <w:lang w:val="tr-TR"/>
         </w:rPr>
         <w:t>In</w:t>
@@ -147,6 +149,7 @@
           <w:rFonts w:ascii="Times New Roman" w:hAnsi="Times New Roman" w:cs="Times New Roman"/>
           <w:b/>
           <w:bCs/>
+          <w:u w:val="single"/>
           <w:lang w:val="tr-TR"/>
         </w:rPr>
         <w:t xml:space="preserve"> </w:t>
@@ -157,6 +160,7 @@
           <w:rFonts w:ascii="Times New Roman" w:hAnsi="Times New Roman" w:cs="Times New Roman"/>
           <w:b/>
           <w:bCs/>
+          <w:u w:val="single"/>
           <w:lang w:val="tr-TR"/>
         </w:rPr>
         <w:t>this</w:t>
@@ -167,6 +171,7 @@
           <w:rFonts w:ascii="Times New Roman" w:hAnsi="Times New Roman" w:cs="Times New Roman"/>
           <w:b/>
           <w:bCs/>
+          <w:u w:val="single"/>
           <w:lang w:val="tr-TR"/>
         </w:rPr>
         <w:t xml:space="preserve"> </w:t>
@@ -177,6 +182,7 @@
           <w:rFonts w:ascii="Times New Roman" w:hAnsi="Times New Roman" w:cs="Times New Roman"/>
           <w:b/>
           <w:bCs/>
+          <w:u w:val="single"/>
           <w:lang w:val="tr-TR"/>
         </w:rPr>
         <w:t>project</w:t>
@@ -187,6 +193,7 @@
           <w:rFonts w:ascii="Times New Roman" w:hAnsi="Times New Roman" w:cs="Times New Roman"/>
           <w:b/>
           <w:bCs/>
+          <w:u w:val="single"/>
           <w:lang w:val="tr-TR"/>
         </w:rPr>
         <w:t xml:space="preserve">, </w:t>
@@ -197,6 +204,7 @@
           <w:rFonts w:ascii="Times New Roman" w:hAnsi="Times New Roman" w:cs="Times New Roman"/>
           <w:b/>
           <w:bCs/>
+          <w:u w:val="single"/>
           <w:lang w:val="tr-TR"/>
         </w:rPr>
         <w:t>the</w:t>
@@ -207,6 +215,7 @@
           <w:rFonts w:ascii="Times New Roman" w:hAnsi="Times New Roman" w:cs="Times New Roman"/>
           <w:b/>
           <w:bCs/>
+          <w:u w:val="single"/>
           <w:lang w:val="tr-TR"/>
         </w:rPr>
         <w:t xml:space="preserve"> </w:t>
@@ -217,6 +226,7 @@
           <w:rFonts w:ascii="Times New Roman" w:hAnsi="Times New Roman" w:cs="Times New Roman"/>
           <w:b/>
           <w:bCs/>
+          <w:u w:val="single"/>
           <w:lang w:val="tr-TR"/>
         </w:rPr>
         <w:t>following</w:t>
@@ -227,6 +237,7 @@
           <w:rFonts w:ascii="Times New Roman" w:hAnsi="Times New Roman" w:cs="Times New Roman"/>
           <w:b/>
           <w:bCs/>
+          <w:u w:val="single"/>
           <w:lang w:val="tr-TR"/>
         </w:rPr>
         <w:t xml:space="preserve"> </w:t>
@@ -237,6 +248,7 @@
           <w:rFonts w:ascii="Times New Roman" w:hAnsi="Times New Roman" w:cs="Times New Roman"/>
           <w:b/>
           <w:bCs/>
+          <w:u w:val="single"/>
           <w:lang w:val="tr-TR"/>
         </w:rPr>
         <w:t>class</w:t>
@@ -247,6 +259,7 @@
           <w:rFonts w:ascii="Times New Roman" w:hAnsi="Times New Roman" w:cs="Times New Roman"/>
           <w:b/>
           <w:bCs/>
+          <w:u w:val="single"/>
           <w:lang w:val="tr-TR"/>
         </w:rPr>
         <w:t xml:space="preserve"> </w:t>
@@ -257,6 +270,7 @@
           <w:rFonts w:ascii="Times New Roman" w:hAnsi="Times New Roman" w:cs="Times New Roman"/>
           <w:b/>
           <w:bCs/>
+          <w:u w:val="single"/>
           <w:lang w:val="tr-TR"/>
         </w:rPr>
         <w:t>mappings</w:t>
@@ -267,6 +281,7 @@
           <w:rFonts w:ascii="Times New Roman" w:hAnsi="Times New Roman" w:cs="Times New Roman"/>
           <w:b/>
           <w:bCs/>
+          <w:u w:val="single"/>
           <w:lang w:val="tr-TR"/>
         </w:rPr>
         <w:t xml:space="preserve"> </w:t>
@@ -277,6 +292,7 @@
           <w:rFonts w:ascii="Times New Roman" w:hAnsi="Times New Roman" w:cs="Times New Roman"/>
           <w:b/>
           <w:bCs/>
+          <w:u w:val="single"/>
           <w:lang w:val="tr-TR"/>
         </w:rPr>
         <w:t>are</w:t>
@@ -287,6 +303,7 @@
           <w:rFonts w:ascii="Times New Roman" w:hAnsi="Times New Roman" w:cs="Times New Roman"/>
           <w:b/>
           <w:bCs/>
+          <w:u w:val="single"/>
           <w:lang w:val="tr-TR"/>
         </w:rPr>
         <w:t xml:space="preserve"> </w:t>
@@ -297,6 +314,7 @@
           <w:rFonts w:ascii="Times New Roman" w:hAnsi="Times New Roman" w:cs="Times New Roman"/>
           <w:b/>
           <w:bCs/>
+          <w:u w:val="single"/>
           <w:lang w:val="tr-TR"/>
         </w:rPr>
         <w:t>used</w:t>
@@ -307,6 +325,7 @@
           <w:rFonts w:ascii="Times New Roman" w:hAnsi="Times New Roman" w:cs="Times New Roman"/>
           <w:b/>
           <w:bCs/>
+          <w:u w:val="single"/>
           <w:lang w:val="tr-TR"/>
         </w:rPr>
         <w:t xml:space="preserve">: </w:t>
@@ -345,7 +364,13 @@
         <w:rPr>
           <w:rFonts w:ascii="Times New Roman" w:hAnsi="Times New Roman" w:cs="Times New Roman"/>
         </w:rPr>
-        <w:t>World”</w:t>
+        <w:t>World</w:t>
+      </w:r>
+      <w:r>
+        <w:rPr>
+          <w:rFonts w:ascii="Times New Roman" w:hAnsi="Times New Roman" w:cs="Times New Roman"/>
+        </w:rPr>
+        <w:t>"</w:t>
       </w:r>
     </w:p>
     <w:p>
@@ -5486,7 +5511,25 @@
           <w:bCs/>
           <w:lang w:eastAsia="tr-TR"/>
         </w:rPr>
-        <w:t xml:space="preserve">1. Specific Domain Expertise: </w:t>
+        <w:t>1. Domain Expertise</w:t>
+      </w:r>
+      <w:r>
+        <w:rPr>
+          <w:rFonts w:ascii="Times New Roman" w:eastAsia="Times New Roman" w:hAnsi="Times New Roman" w:cs="Times New Roman"/>
+          <w:b/>
+          <w:bCs/>
+          <w:lang w:eastAsia="tr-TR"/>
+        </w:rPr>
+        <w:t xml:space="preserve"> in Specific Regions of the Input Space</w:t>
+      </w:r>
+      <w:r>
+        <w:rPr>
+          <w:rFonts w:ascii="Times New Roman" w:eastAsia="Times New Roman" w:hAnsi="Times New Roman" w:cs="Times New Roman"/>
+          <w:b/>
+          <w:bCs/>
+          <w:lang w:eastAsia="tr-TR"/>
+        </w:rPr>
+        <w:t xml:space="preserve">: </w:t>
       </w:r>
       <w:r>
         <w:rPr>
@@ -5743,10 +5786,9 @@
     </w:p>
     <w:p>
       <w:pPr>
-        <w:rPr>
-          <w:rFonts w:ascii="Times New Roman" w:eastAsia="Times New Roman" w:hAnsi="Times New Roman" w:cs="Times New Roman"/>
-          <w:b/>
-          <w:bCs/>
+        <w:jc w:val="both"/>
+        <w:rPr>
+          <w:rFonts w:ascii="Times New Roman" w:eastAsia="Times New Roman" w:hAnsi="Times New Roman" w:cs="Times New Roman"/>
           <w:lang w:eastAsia="tr-TR"/>
         </w:rPr>
       </w:pPr>
@@ -5758,6 +5800,121 @@
           <w:lang w:eastAsia="tr-TR"/>
         </w:rPr>
         <w:t xml:space="preserve">1. </w:t>
+      </w:r>
+      <w:r>
+        <w:rPr>
+          <w:rFonts w:ascii="Times New Roman" w:eastAsia="Times New Roman" w:hAnsi="Times New Roman" w:cs="Times New Roman"/>
+          <w:b/>
+          <w:bCs/>
+          <w:lang w:eastAsia="tr-TR"/>
+        </w:rPr>
+        <w:t xml:space="preserve"> Uniform </w:t>
+      </w:r>
+      <w:r>
+        <w:rPr>
+          <w:rFonts w:ascii="Times New Roman" w:eastAsia="Times New Roman" w:hAnsi="Times New Roman" w:cs="Times New Roman"/>
+          <w:b/>
+          <w:bCs/>
+          <w:lang w:eastAsia="tr-TR"/>
+        </w:rPr>
+        <w:t xml:space="preserve">Error Distribution: </w:t>
+      </w:r>
+      <w:r>
+        <w:rPr>
+          <w:rFonts w:ascii="Times New Roman" w:eastAsia="Times New Roman" w:hAnsi="Times New Roman" w:cs="Times New Roman"/>
+          <w:lang w:eastAsia="tr-TR"/>
+        </w:rPr>
+        <w:t xml:space="preserve">The simulated expert makes mistakes %10 of his/her choices. A class for the given text is randomly and uniformly chosen from the remaining options, with equal probability for each class option. However, this is not the case for the decisions of </w:t>
+      </w:r>
+      <w:r>
+        <w:rPr>
+          <w:rFonts w:ascii="Times New Roman" w:eastAsia="Times New Roman" w:hAnsi="Times New Roman" w:cs="Times New Roman"/>
+          <w:lang w:eastAsia="tr-TR"/>
+        </w:rPr>
+        <w:t>real-</w:t>
+      </w:r>
+      <w:r>
+        <w:rPr>
+          <w:rFonts w:ascii="Times New Roman" w:eastAsia="Times New Roman" w:hAnsi="Times New Roman" w:cs="Times New Roman"/>
+          <w:lang w:eastAsia="tr-TR"/>
+        </w:rPr>
+        <w:t xml:space="preserve">life human experts. </w:t>
+      </w:r>
+      <w:r>
+        <w:rPr>
+          <w:rFonts w:ascii="Times New Roman" w:eastAsia="Times New Roman" w:hAnsi="Times New Roman" w:cs="Times New Roman"/>
+          <w:lang w:eastAsia="tr-TR"/>
+        </w:rPr>
+        <w:t xml:space="preserve">Human experts rarely guess uniformly and randomly. They are typically influenced by cognitive biases, systematic biases, patterned behavior, and social context, which makes them usually confuse specific classes sharing similar features. </w:t>
+      </w:r>
+    </w:p>
+    <w:p>
+      <w:pPr>
+        <w:rPr>
+          <w:rFonts w:ascii="Times New Roman" w:eastAsia="Times New Roman" w:hAnsi="Times New Roman" w:cs="Times New Roman"/>
+          <w:b/>
+          <w:bCs/>
+          <w:lang w:eastAsia="tr-TR"/>
+        </w:rPr>
+      </w:pPr>
+      <w:r>
+        <w:rPr>
+          <w:rFonts w:ascii="Times New Roman" w:eastAsia="Times New Roman" w:hAnsi="Times New Roman" w:cs="Times New Roman"/>
+          <w:b/>
+          <w:bCs/>
+          <w:noProof/>
+          <w:lang w:eastAsia="tr-TR"/>
+        </w:rPr>
+        <w:drawing>
+          <wp:inline distT="0" distB="0" distL="0" distR="0" wp14:anchorId="3CC5C960" wp14:editId="337B91E5">
+            <wp:extent cx="5174428" cy="1192530"/>
+            <wp:effectExtent l="0" t="0" r="0" b="1270"/>
+            <wp:docPr id="1829921598" name="Resim 1"/>
+            <wp:cNvGraphicFramePr>
+              <a:graphicFrameLocks xmlns:a="http://schemas.openxmlformats.org/drawingml/2006/main" noChangeAspect="1"/>
+            </wp:cNvGraphicFramePr>
+            <a:graphic xmlns:a="http://schemas.openxmlformats.org/drawingml/2006/main">
+              <a:graphicData uri="http://schemas.openxmlformats.org/drawingml/2006/picture">
+                <pic:pic xmlns:pic="http://schemas.openxmlformats.org/drawingml/2006/picture">
+                  <pic:nvPicPr>
+                    <pic:cNvPr id="1829921598" name="Resim 1829921598"/>
+                    <pic:cNvPicPr/>
+                  </pic:nvPicPr>
+                  <pic:blipFill rotWithShape="1">
+                    <a:blip r:embed="rId4">
+                      <a:extLst>
+                        <a:ext uri="{28A0092B-C50C-407E-A947-70E740481C1C}">
+                          <a14:useLocalDpi xmlns:a14="http://schemas.microsoft.com/office/drawing/2010/main" val="0"/>
+                        </a:ext>
+                      </a:extLst>
+                    </a:blip>
+                    <a:srcRect r="9720"/>
+                    <a:stretch>
+                      <a:fillRect/>
+                    </a:stretch>
+                  </pic:blipFill>
+                  <pic:spPr bwMode="auto">
+                    <a:xfrm>
+                      <a:off x="0" y="0"/>
+                      <a:ext cx="5174428" cy="1192530"/>
+                    </a:xfrm>
+                    <a:prstGeom prst="rect">
+                      <a:avLst/>
+                    </a:prstGeom>
+                    <a:ln>
+                      <a:noFill/>
+                    </a:ln>
+                    <a:extLst>
+                      <a:ext uri="{53640926-AAD7-44D8-BBD7-CCE9431645EC}">
+                        <a14:shadowObscured xmlns:a14="http://schemas.microsoft.com/office/drawing/2010/main"/>
+                      </a:ext>
+                    </a:extLst>
+                  </pic:spPr>
+                </pic:pic>
+              </a:graphicData>
+            </a:graphic>
+          </wp:inline>
+        </w:drawing>
       </w:r>
     </w:p>
     <w:p>
@@ -5772,6 +5929,7 @@
     </w:p>
     <w:p>
       <w:pPr>
+        <w:jc w:val="both"/>
         <w:rPr>
           <w:rFonts w:ascii="Times New Roman" w:eastAsia="Times New Roman" w:hAnsi="Times New Roman" w:cs="Times New Roman"/>
           <w:b/>
@@ -5782,10 +5940,9 @@
     </w:p>
     <w:p>
       <w:pPr>
-        <w:rPr>
-          <w:rFonts w:ascii="Times New Roman" w:eastAsia="Times New Roman" w:hAnsi="Times New Roman" w:cs="Times New Roman"/>
-          <w:b/>
-          <w:bCs/>
+        <w:jc w:val="both"/>
+        <w:rPr>
+          <w:rFonts w:ascii="Times New Roman" w:eastAsia="Times New Roman" w:hAnsi="Times New Roman" w:cs="Times New Roman"/>
           <w:lang w:eastAsia="tr-TR"/>
         </w:rPr>
       </w:pPr>
@@ -5796,47 +5953,491 @@
           <w:bCs/>
           <w:lang w:eastAsia="tr-TR"/>
         </w:rPr>
-        <w:t xml:space="preserve">2. </w:t>
+        <w:lastRenderedPageBreak/>
+        <w:t xml:space="preserve">2. Class Imbalance Problem: </w:t>
+      </w:r>
+      <w:r>
+        <w:rPr>
+          <w:rFonts w:ascii="Times New Roman" w:eastAsia="Times New Roman" w:hAnsi="Times New Roman" w:cs="Times New Roman"/>
+          <w:lang w:eastAsia="tr-TR"/>
+        </w:rPr>
+        <w:t xml:space="preserve">When human experts encounter an unclear text, they will inherently develop a high level of prior bias towards the classes with more dominance than the others. However, my simulated expert cannot observe the frequencies of the </w:t>
+      </w:r>
+      <w:r>
+        <w:rPr>
+          <w:rFonts w:ascii="Times New Roman" w:eastAsia="Times New Roman" w:hAnsi="Times New Roman" w:cs="Times New Roman"/>
+          <w:lang w:eastAsia="tr-TR"/>
+        </w:rPr>
+        <w:t>classes (labels).</w:t>
+      </w:r>
+      <w:r>
+        <w:rPr>
+          <w:rFonts w:ascii="Times New Roman" w:eastAsia="Times New Roman" w:hAnsi="Times New Roman" w:cs="Times New Roman"/>
+          <w:lang w:eastAsia="tr-TR"/>
+        </w:rPr>
+        <w:t xml:space="preserve"> </w:t>
+      </w:r>
+      <w:r>
+        <w:rPr>
+          <w:rFonts w:ascii="Times New Roman" w:eastAsia="Times New Roman" w:hAnsi="Times New Roman" w:cs="Times New Roman"/>
+          <w:lang w:eastAsia="tr-TR"/>
+        </w:rPr>
+        <w:t>T</w:t>
+      </w:r>
+      <w:r>
+        <w:rPr>
+          <w:rFonts w:ascii="Times New Roman" w:eastAsia="Times New Roman" w:hAnsi="Times New Roman" w:cs="Times New Roman"/>
+          <w:lang w:eastAsia="tr-TR"/>
+        </w:rPr>
+        <w:t>herefore</w:t>
+      </w:r>
+      <w:r>
+        <w:rPr>
+          <w:rFonts w:ascii="Times New Roman" w:eastAsia="Times New Roman" w:hAnsi="Times New Roman" w:cs="Times New Roman"/>
+          <w:lang w:eastAsia="tr-TR"/>
+        </w:rPr>
+        <w:t>,</w:t>
+      </w:r>
+      <w:r>
+        <w:rPr>
+          <w:rFonts w:ascii="Times New Roman" w:eastAsia="Times New Roman" w:hAnsi="Times New Roman" w:cs="Times New Roman"/>
+          <w:lang w:eastAsia="tr-TR"/>
+        </w:rPr>
+        <w:t xml:space="preserve"> its guessing behavior </w:t>
+      </w:r>
+      <w:r>
+        <w:rPr>
+          <w:rFonts w:ascii="Times New Roman" w:eastAsia="Times New Roman" w:hAnsi="Times New Roman" w:cs="Times New Roman"/>
+          <w:lang w:eastAsia="tr-TR"/>
+        </w:rPr>
+        <w:t xml:space="preserve">and following prediction errors do not change </w:t>
+      </w:r>
+      <w:r>
+        <w:rPr>
+          <w:rFonts w:ascii="Times New Roman" w:eastAsia="Times New Roman" w:hAnsi="Times New Roman" w:cs="Times New Roman"/>
+          <w:lang w:eastAsia="tr-TR"/>
+        </w:rPr>
+        <w:t>based on which classes are seen more often</w:t>
+      </w:r>
+      <w:r>
+        <w:rPr>
+          <w:rFonts w:ascii="Times New Roman" w:eastAsia="Times New Roman" w:hAnsi="Times New Roman" w:cs="Times New Roman"/>
+          <w:lang w:eastAsia="tr-TR"/>
+        </w:rPr>
+        <w:t xml:space="preserve">, which means the simulated expert is not affected by the class distribution. </w:t>
       </w:r>
     </w:p>
     <w:p>
       <w:pPr>
-        <w:rPr>
-          <w:rFonts w:ascii="Times New Roman" w:eastAsia="Times New Roman" w:hAnsi="Times New Roman" w:cs="Times New Roman"/>
-          <w:b/>
-          <w:bCs/>
-          <w:lang w:eastAsia="tr-TR"/>
+        <w:jc w:val="both"/>
+        <w:rPr>
+          <w:rFonts w:ascii="Times New Roman" w:eastAsia="Times New Roman" w:hAnsi="Times New Roman" w:cs="Times New Roman"/>
+          <w:lang w:eastAsia="tr-TR"/>
+        </w:rPr>
+      </w:pPr>
+      <w:r>
+        <w:rPr>
+          <w:rFonts w:ascii="Times New Roman" w:eastAsia="Times New Roman" w:hAnsi="Times New Roman" w:cs="Times New Roman"/>
+          <w:b/>
+          <w:bCs/>
+          <w:lang w:eastAsia="tr-TR"/>
+        </w:rPr>
+        <w:t>3</w:t>
+      </w:r>
+      <w:r>
+        <w:rPr>
+          <w:rFonts w:ascii="Times New Roman" w:eastAsia="Times New Roman" w:hAnsi="Times New Roman" w:cs="Times New Roman"/>
+          <w:b/>
+          <w:bCs/>
+          <w:lang w:eastAsia="tr-TR"/>
+        </w:rPr>
+        <w:t xml:space="preserve">. </w:t>
+      </w:r>
+      <w:r>
+        <w:rPr>
+          <w:rFonts w:ascii="Times New Roman" w:eastAsia="Times New Roman" w:hAnsi="Times New Roman" w:cs="Times New Roman"/>
+          <w:b/>
+          <w:bCs/>
+          <w:lang w:eastAsia="tr-TR"/>
+        </w:rPr>
+        <w:t xml:space="preserve">Static Error Ratio: </w:t>
+      </w:r>
+      <w:r>
+        <w:rPr>
+          <w:rFonts w:ascii="Times New Roman" w:eastAsia="Times New Roman" w:hAnsi="Times New Roman" w:cs="Times New Roman"/>
+          <w:lang w:eastAsia="tr-TR"/>
+        </w:rPr>
+        <w:t xml:space="preserve">The error ratio is static </w:t>
+      </w:r>
+      <w:r>
+        <w:rPr>
+          <w:rFonts w:ascii="Times New Roman" w:eastAsia="Times New Roman" w:hAnsi="Times New Roman" w:cs="Times New Roman"/>
+          <w:lang w:eastAsia="tr-TR"/>
+        </w:rPr>
+        <w:t xml:space="preserve">and 10% for all </w:t>
+      </w:r>
+      <w:r>
+        <w:rPr>
+          <w:rFonts w:ascii="Times New Roman" w:eastAsia="Times New Roman" w:hAnsi="Times New Roman" w:cs="Times New Roman"/>
+          <w:lang w:eastAsia="tr-TR"/>
+        </w:rPr>
+        <w:t xml:space="preserve">remaining classes except Class 1, which are Class 0, 2, </w:t>
+      </w:r>
+      <w:r>
+        <w:rPr>
+          <w:rFonts w:ascii="Times New Roman" w:eastAsia="Times New Roman" w:hAnsi="Times New Roman" w:cs="Times New Roman"/>
+          <w:lang w:eastAsia="tr-TR"/>
+        </w:rPr>
+        <w:t xml:space="preserve">and </w:t>
+      </w:r>
+      <w:r>
+        <w:rPr>
+          <w:rFonts w:ascii="Times New Roman" w:eastAsia="Times New Roman" w:hAnsi="Times New Roman" w:cs="Times New Roman"/>
+          <w:lang w:eastAsia="tr-TR"/>
+        </w:rPr>
+        <w:t xml:space="preserve">3. </w:t>
+      </w:r>
+      <w:r>
+        <w:rPr>
+          <w:rFonts w:ascii="Times New Roman" w:eastAsia="Times New Roman" w:hAnsi="Times New Roman" w:cs="Times New Roman"/>
+          <w:lang w:eastAsia="tr-TR"/>
+        </w:rPr>
+        <w:t>However, the human experts' data labeling performance and errors made in this process change a lot based on several factors, such as tiredness level, daytime, and changing expertise levels for the remaining classes.</w:t>
+      </w:r>
+      <w:r>
+        <w:rPr>
+          <w:rFonts w:ascii="Times New Roman" w:eastAsia="Times New Roman" w:hAnsi="Times New Roman" w:cs="Times New Roman"/>
+          <w:lang w:eastAsia="tr-TR"/>
+        </w:rPr>
+        <w:t xml:space="preserve"> </w:t>
+      </w:r>
+    </w:p>
+    <w:p>
+      <w:pPr>
+        <w:spacing w:after="0"/>
+        <w:jc w:val="both"/>
+        <w:rPr>
+          <w:rFonts w:ascii="Times New Roman" w:hAnsi="Times New Roman" w:cs="Times New Roman"/>
+        </w:rPr>
+      </w:pPr>
+      <w:r>
+        <w:rPr>
+          <w:rFonts w:ascii="Times New Roman" w:eastAsia="Times New Roman" w:hAnsi="Times New Roman" w:cs="Times New Roman"/>
+          <w:b/>
+          <w:bCs/>
+          <w:lang w:eastAsia="tr-TR"/>
+        </w:rPr>
+        <w:t>4</w:t>
+      </w:r>
+      <w:r>
+        <w:rPr>
+          <w:rFonts w:ascii="Times New Roman" w:eastAsia="Times New Roman" w:hAnsi="Times New Roman" w:cs="Times New Roman"/>
+          <w:b/>
+          <w:bCs/>
+          <w:lang w:eastAsia="tr-TR"/>
+        </w:rPr>
+        <w:t xml:space="preserve">. </w:t>
+      </w:r>
+      <w:r>
+        <w:rPr>
+          <w:rFonts w:ascii="Times New Roman" w:eastAsia="Times New Roman" w:hAnsi="Times New Roman" w:cs="Times New Roman"/>
+          <w:b/>
+          <w:bCs/>
+          <w:lang w:eastAsia="tr-TR"/>
+        </w:rPr>
+        <w:t>No Contextual Knowledge</w:t>
+      </w:r>
+      <w:r>
+        <w:rPr>
+          <w:rFonts w:ascii="Times New Roman" w:eastAsia="Times New Roman" w:hAnsi="Times New Roman" w:cs="Times New Roman"/>
+          <w:b/>
+          <w:bCs/>
+          <w:lang w:eastAsia="tr-TR"/>
+        </w:rPr>
+        <w:t xml:space="preserve"> of the Input X Values</w:t>
+      </w:r>
+      <w:r>
+        <w:rPr>
+          <w:rFonts w:ascii="Times New Roman" w:eastAsia="Times New Roman" w:hAnsi="Times New Roman" w:cs="Times New Roman"/>
+          <w:b/>
+          <w:bCs/>
+          <w:lang w:eastAsia="tr-TR"/>
+        </w:rPr>
+        <w:t xml:space="preserve">: </w:t>
+      </w:r>
+      <w:r>
+        <w:rPr>
+          <w:rFonts w:ascii="Times New Roman" w:eastAsia="Times New Roman" w:hAnsi="Times New Roman" w:cs="Times New Roman"/>
+          <w:lang w:eastAsia="tr-TR"/>
+        </w:rPr>
+        <w:t xml:space="preserve">Even though the simulated expert knows the ground-truth class labels (Class 0 =&gt; </w:t>
+      </w:r>
+      <w:r>
+        <w:rPr>
+          <w:rFonts w:ascii="Times New Roman" w:hAnsi="Times New Roman" w:cs="Times New Roman"/>
+        </w:rPr>
+        <w:t>"World"</w:t>
+      </w:r>
+      <w:r>
+        <w:rPr>
+          <w:rFonts w:ascii="Times New Roman" w:hAnsi="Times New Roman" w:cs="Times New Roman"/>
+        </w:rPr>
+        <w:t xml:space="preserve">, Class 1 =&gt; </w:t>
+      </w:r>
+      <w:r>
+        <w:rPr>
+          <w:rFonts w:ascii="Times New Roman" w:hAnsi="Times New Roman" w:cs="Times New Roman"/>
+        </w:rPr>
+        <w:t>"</w:t>
+      </w:r>
+      <w:r>
+        <w:rPr>
+          <w:rFonts w:ascii="Times New Roman" w:hAnsi="Times New Roman" w:cs="Times New Roman"/>
+        </w:rPr>
+        <w:t>Sports</w:t>
+      </w:r>
+      <w:r>
+        <w:rPr>
+          <w:rFonts w:ascii="Times New Roman" w:hAnsi="Times New Roman" w:cs="Times New Roman"/>
+        </w:rPr>
+        <w:t>"</w:t>
+      </w:r>
+      <w:r>
+        <w:rPr>
+          <w:rFonts w:ascii="Times New Roman" w:hAnsi="Times New Roman" w:cs="Times New Roman"/>
+        </w:rPr>
+        <w:t xml:space="preserve">, Class 2 =&gt; </w:t>
+      </w:r>
+      <w:r>
+        <w:rPr>
+          <w:rFonts w:ascii="Times New Roman" w:hAnsi="Times New Roman" w:cs="Times New Roman"/>
+        </w:rPr>
+        <w:t>"</w:t>
+      </w:r>
+      <w:r>
+        <w:rPr>
+          <w:rFonts w:ascii="Times New Roman" w:hAnsi="Times New Roman" w:cs="Times New Roman"/>
+        </w:rPr>
+        <w:t>Business</w:t>
+      </w:r>
+      <w:r>
+        <w:rPr>
+          <w:rFonts w:ascii="Times New Roman" w:hAnsi="Times New Roman" w:cs="Times New Roman"/>
+        </w:rPr>
+        <w:t>"</w:t>
+      </w:r>
+      <w:r>
+        <w:rPr>
+          <w:rFonts w:ascii="Times New Roman" w:hAnsi="Times New Roman" w:cs="Times New Roman"/>
+        </w:rPr>
+        <w:t xml:space="preserve">, Class 3 =&gt; </w:t>
+      </w:r>
+      <w:r>
+        <w:rPr>
+          <w:rFonts w:ascii="Times New Roman" w:hAnsi="Times New Roman" w:cs="Times New Roman"/>
+        </w:rPr>
+        <w:t>"</w:t>
+      </w:r>
+      <w:r>
+        <w:rPr>
+          <w:rFonts w:ascii="Times New Roman" w:hAnsi="Times New Roman" w:cs="Times New Roman"/>
+        </w:rPr>
+        <w:t>Sci/Tech</w:t>
+      </w:r>
+      <w:r>
+        <w:rPr>
+          <w:rFonts w:ascii="Times New Roman" w:hAnsi="Times New Roman" w:cs="Times New Roman"/>
+        </w:rPr>
+        <w:t>"</w:t>
+      </w:r>
+      <w:r>
+        <w:rPr>
+          <w:rFonts w:ascii="Times New Roman" w:hAnsi="Times New Roman" w:cs="Times New Roman"/>
+        </w:rPr>
+        <w:t xml:space="preserve">), it does not know how the features of the input values differ from each other in terms of the length, </w:t>
+      </w:r>
+      <w:r>
+        <w:rPr>
+          <w:rFonts w:ascii="Times New Roman" w:hAnsi="Times New Roman" w:cs="Times New Roman"/>
+        </w:rPr>
+        <w:t xml:space="preserve">number, </w:t>
+      </w:r>
+      <w:r>
+        <w:rPr>
+          <w:rFonts w:ascii="Times New Roman" w:hAnsi="Times New Roman" w:cs="Times New Roman"/>
+        </w:rPr>
+        <w:t xml:space="preserve">meaning, complexity, and structure of the words in each input text. </w:t>
+      </w:r>
+    </w:p>
+    <w:p>
+      <w:pPr>
+        <w:spacing w:after="0"/>
+        <w:jc w:val="both"/>
+        <w:rPr>
+          <w:rFonts w:ascii="Times New Roman" w:hAnsi="Times New Roman" w:cs="Times New Roman"/>
         </w:rPr>
       </w:pPr>
     </w:p>
     <w:p>
       <w:pPr>
-        <w:rPr>
-          <w:rFonts w:ascii="Times New Roman" w:eastAsia="Times New Roman" w:hAnsi="Times New Roman" w:cs="Times New Roman"/>
-          <w:b/>
-          <w:bCs/>
-          <w:lang w:eastAsia="tr-TR"/>
+        <w:spacing w:after="0"/>
+        <w:jc w:val="both"/>
+        <w:rPr>
+          <w:rFonts w:ascii="Times New Roman" w:hAnsi="Times New Roman" w:cs="Times New Roman"/>
+        </w:rPr>
+      </w:pPr>
+      <w:r>
+        <w:rPr>
+          <w:rFonts w:ascii="Times New Roman" w:hAnsi="Times New Roman" w:cs="Times New Roman"/>
+          <w:b/>
+          <w:bCs/>
+        </w:rPr>
+        <w:t>5</w:t>
+      </w:r>
+      <w:r>
+        <w:rPr>
+          <w:rFonts w:ascii="Times New Roman" w:hAnsi="Times New Roman" w:cs="Times New Roman"/>
+          <w:b/>
+          <w:bCs/>
+        </w:rPr>
+        <w:t xml:space="preserve">. No “I am </w:t>
+      </w:r>
+      <w:r>
+        <w:rPr>
+          <w:rFonts w:ascii="Times New Roman" w:hAnsi="Times New Roman" w:cs="Times New Roman"/>
+          <w:b/>
+          <w:bCs/>
+        </w:rPr>
+        <w:t>completely</w:t>
+      </w:r>
+      <w:r>
+        <w:rPr>
+          <w:rFonts w:ascii="Times New Roman" w:hAnsi="Times New Roman" w:cs="Times New Roman"/>
+          <w:b/>
+          <w:bCs/>
+        </w:rPr>
+        <w:t xml:space="preserve"> unsure</w:t>
+      </w:r>
+      <w:r>
+        <w:rPr>
+          <w:rFonts w:ascii="Times New Roman" w:hAnsi="Times New Roman" w:cs="Times New Roman"/>
+          <w:b/>
+          <w:bCs/>
+        </w:rPr>
+        <w:t xml:space="preserve">” Option: </w:t>
+      </w:r>
+      <w:r>
+        <w:rPr>
+          <w:rFonts w:ascii="Times New Roman" w:hAnsi="Times New Roman" w:cs="Times New Roman"/>
+        </w:rPr>
+        <w:t>This expert is forced to select from the available labels</w:t>
+      </w:r>
+      <w:r>
+        <w:rPr>
+          <w:rFonts w:ascii="Times New Roman" w:hAnsi="Times New Roman" w:cs="Times New Roman"/>
+        </w:rPr>
+        <w:t xml:space="preserve"> in the error case. However, our expert in real-life might not be able to classify the input into the provided categories and put it into a category like </w:t>
+      </w:r>
+      <w:r>
+        <w:rPr>
+          <w:rFonts w:ascii="Times New Roman" w:hAnsi="Times New Roman" w:cs="Times New Roman"/>
+        </w:rPr>
+        <w:t>"Unknown"</w:t>
+      </w:r>
+      <w:r>
+        <w:rPr>
+          <w:rFonts w:ascii="Times New Roman" w:hAnsi="Times New Roman" w:cs="Times New Roman"/>
+        </w:rPr>
+        <w:t xml:space="preserve">. </w:t>
+      </w:r>
+    </w:p>
+    <w:p>
+      <w:pPr>
+        <w:rPr>
+          <w:rFonts w:ascii="Times New Roman" w:hAnsi="Times New Roman" w:cs="Times New Roman"/>
+          <w:lang w:val="tr-TR"/>
         </w:rPr>
       </w:pPr>
     </w:p>
     <w:p>
       <w:pPr>
         <w:rPr>
-          <w:rFonts w:ascii="Times New Roman" w:eastAsia="Times New Roman" w:hAnsi="Times New Roman" w:cs="Times New Roman"/>
-          <w:b/>
-          <w:bCs/>
-          <w:lang w:eastAsia="tr-TR"/>
+          <w:rFonts w:ascii="Times New Roman" w:hAnsi="Times New Roman" w:cs="Times New Roman"/>
+          <w:lang w:val="tr-TR"/>
         </w:rPr>
       </w:pPr>
-      <w:r>
-        <w:rPr>
-          <w:rFonts w:ascii="Times New Roman" w:eastAsia="Times New Roman" w:hAnsi="Times New Roman" w:cs="Times New Roman"/>
-          <w:b/>
-          <w:bCs/>
-          <w:lang w:eastAsia="tr-TR"/>
-        </w:rPr>
-        <w:t xml:space="preserve">3. </w:t>
-      </w:r>
+    </w:p>
+    <w:p>
+      <w:pPr>
+        <w:rPr>
+          <w:rFonts w:ascii="Times New Roman" w:hAnsi="Times New Roman" w:cs="Times New Roman"/>
+          <w:b/>
+          <w:bCs/>
+          <w:u w:val="single"/>
+          <w:lang w:val="tr-TR"/>
+        </w:rPr>
+      </w:pPr>
+      <w:proofErr w:type="spellStart"/>
+      <w:r>
+        <w:rPr>
+          <w:rFonts w:ascii="Times New Roman" w:hAnsi="Times New Roman" w:cs="Times New Roman"/>
+          <w:b/>
+          <w:bCs/>
+          <w:u w:val="single"/>
+          <w:lang w:val="tr-TR"/>
+        </w:rPr>
+        <w:t>Task</w:t>
+      </w:r>
+      <w:proofErr w:type="spellEnd"/>
+      <w:r>
+        <w:rPr>
+          <w:rFonts w:ascii="Times New Roman" w:hAnsi="Times New Roman" w:cs="Times New Roman"/>
+          <w:b/>
+          <w:bCs/>
+          <w:u w:val="single"/>
+          <w:lang w:val="tr-TR"/>
+        </w:rPr>
+        <w:t xml:space="preserve"> 3: </w:t>
+      </w:r>
+    </w:p>
+    <w:p>
+      <w:pPr>
+        <w:jc w:val="both"/>
+        <w:rPr>
+          <w:rFonts w:ascii="Times New Roman" w:eastAsia="Times New Roman" w:hAnsi="Times New Roman" w:cs="Times New Roman"/>
+          <w:lang w:eastAsia="tr-TR"/>
+        </w:rPr>
+      </w:pPr>
+    </w:p>
+    <w:p>
+      <w:pPr>
+        <w:rPr>
+          <w:rFonts w:ascii="Times New Roman" w:eastAsia="Times New Roman" w:hAnsi="Times New Roman" w:cs="Times New Roman"/>
+          <w:b/>
+          <w:bCs/>
+          <w:lang w:eastAsia="tr-TR"/>
+        </w:rPr>
+      </w:pPr>
+    </w:p>
+    <w:p>
+      <w:pPr>
+        <w:rPr>
+          <w:rFonts w:ascii="Times New Roman" w:eastAsia="Times New Roman" w:hAnsi="Times New Roman" w:cs="Times New Roman"/>
+          <w:b/>
+          <w:bCs/>
+          <w:lang w:eastAsia="tr-TR"/>
+        </w:rPr>
+      </w:pPr>
+    </w:p>
+    <w:p>
+      <w:pPr>
+        <w:rPr>
+          <w:rFonts w:ascii="Times New Roman" w:eastAsia="Times New Roman" w:hAnsi="Times New Roman" w:cs="Times New Roman"/>
+          <w:b/>
+          <w:bCs/>
+          <w:lang w:eastAsia="tr-TR"/>
+        </w:rPr>
+      </w:pPr>
     </w:p>
     <w:p>
       <w:pPr>

</xml_diff>

<commit_message>
implement active learning strategy evaluation and plotting script
</commit_message>
<xml_diff>
--- a/Project3_Report.docx
+++ b/Project3_Report.docx
@@ -358,20 +358,14 @@
         <w:rPr>
           <w:rFonts w:ascii="Times New Roman" w:hAnsi="Times New Roman" w:cs="Times New Roman"/>
         </w:rPr>
+        <w:t>"World</w:t>
+      </w:r>
+      <w:r>
+        <w:rPr>
+          <w:rFonts w:ascii="Times New Roman" w:hAnsi="Times New Roman" w:cs="Times New Roman"/>
+        </w:rPr>
         <w:t>"</w:t>
       </w:r>
-      <w:r>
-        <w:rPr>
-          <w:rFonts w:ascii="Times New Roman" w:hAnsi="Times New Roman" w:cs="Times New Roman"/>
-        </w:rPr>
-        <w:t>World</w:t>
-      </w:r>
-      <w:r>
-        <w:rPr>
-          <w:rFonts w:ascii="Times New Roman" w:hAnsi="Times New Roman" w:cs="Times New Roman"/>
-        </w:rPr>
-        <w:t>"</w:t>
-      </w:r>
     </w:p>
     <w:p>
       <w:pPr>
@@ -400,19 +394,7 @@
         <w:rPr>
           <w:rFonts w:ascii="Times New Roman" w:hAnsi="Times New Roman" w:cs="Times New Roman"/>
         </w:rPr>
-        <w:t>"</w:t>
-      </w:r>
-      <w:r>
-        <w:rPr>
-          <w:rFonts w:ascii="Times New Roman" w:hAnsi="Times New Roman" w:cs="Times New Roman"/>
-        </w:rPr>
-        <w:t>Sports</w:t>
-      </w:r>
-      <w:r>
-        <w:rPr>
-          <w:rFonts w:ascii="Times New Roman" w:hAnsi="Times New Roman" w:cs="Times New Roman"/>
-        </w:rPr>
-        <w:t>"</w:t>
+        <w:t>"Sports"</w:t>
       </w:r>
     </w:p>
     <w:p>
@@ -442,19 +424,7 @@
         <w:rPr>
           <w:rFonts w:ascii="Times New Roman" w:hAnsi="Times New Roman" w:cs="Times New Roman"/>
         </w:rPr>
-        <w:t>"</w:t>
-      </w:r>
-      <w:r>
-        <w:rPr>
-          <w:rFonts w:ascii="Times New Roman" w:hAnsi="Times New Roman" w:cs="Times New Roman"/>
-        </w:rPr>
-        <w:t>Business</w:t>
-      </w:r>
-      <w:r>
-        <w:rPr>
-          <w:rFonts w:ascii="Times New Roman" w:hAnsi="Times New Roman" w:cs="Times New Roman"/>
-        </w:rPr>
-        <w:t>"</w:t>
+        <w:t>"Business"</w:t>
       </w:r>
     </w:p>
     <w:p>
@@ -484,19 +454,7 @@
         <w:rPr>
           <w:rFonts w:ascii="Times New Roman" w:hAnsi="Times New Roman" w:cs="Times New Roman"/>
         </w:rPr>
-        <w:t>"</w:t>
-      </w:r>
-      <w:r>
-        <w:rPr>
-          <w:rFonts w:ascii="Times New Roman" w:hAnsi="Times New Roman" w:cs="Times New Roman"/>
-        </w:rPr>
-        <w:t>Sci/Tech</w:t>
-      </w:r>
-      <w:r>
-        <w:rPr>
-          <w:rFonts w:ascii="Times New Roman" w:hAnsi="Times New Roman" w:cs="Times New Roman"/>
-        </w:rPr>
-        <w:t>"</w:t>
+        <w:t>"Sci/Tech"</w:t>
       </w:r>
     </w:p>
     <w:p>
@@ -6377,6 +6335,452 @@
           <w:lang w:val="tr-TR"/>
         </w:rPr>
       </w:pPr>
+      <w:r>
+        <w:rPr>
+          <w:noProof/>
+        </w:rPr>
+        <mc:AlternateContent>
+          <mc:Choice Requires="wps">
+            <w:drawing>
+              <wp:anchor distT="0" distB="0" distL="114300" distR="114300" simplePos="0" relativeHeight="251660288" behindDoc="0" locked="0" layoutInCell="1" allowOverlap="1" wp14:anchorId="35BAAA38" wp14:editId="2C5C035A">
+                <wp:simplePos x="0" y="0"/>
+                <wp:positionH relativeFrom="column">
+                  <wp:posOffset>-471805</wp:posOffset>
+                </wp:positionH>
+                <wp:positionV relativeFrom="paragraph">
+                  <wp:posOffset>4605655</wp:posOffset>
+                </wp:positionV>
+                <wp:extent cx="6568440" cy="635"/>
+                <wp:effectExtent l="0" t="0" r="0" b="12065"/>
+                <wp:wrapNone/>
+                <wp:docPr id="182332565" name="Metin Kutusu 1"/>
+                <wp:cNvGraphicFramePr/>
+                <a:graphic xmlns:a="http://schemas.openxmlformats.org/drawingml/2006/main">
+                  <a:graphicData uri="http://schemas.microsoft.com/office/word/2010/wordprocessingShape">
+                    <wps:wsp>
+                      <wps:cNvSpPr txBox="1"/>
+                      <wps:spPr>
+                        <a:xfrm>
+                          <a:off x="0" y="0"/>
+                          <a:ext cx="6568440" cy="635"/>
+                        </a:xfrm>
+                        <a:prstGeom prst="rect">
+                          <a:avLst/>
+                        </a:prstGeom>
+                        <a:solidFill>
+                          <a:prstClr val="white"/>
+                        </a:solidFill>
+                        <a:ln>
+                          <a:noFill/>
+                        </a:ln>
+                      </wps:spPr>
+                      <wps:txbx>
+                        <w:txbxContent>
+                          <w:p>
+                            <w:pPr>
+                              <w:pStyle w:val="ResimYazs"/>
+                              <w:rPr>
+                                <w:rFonts w:ascii="Times New Roman" w:eastAsia="Times New Roman" w:hAnsi="Times New Roman" w:cs="Times New Roman"/>
+                                <w:b/>
+                                <w:bCs/>
+                                <w:noProof/>
+                                <w:lang w:val="tr-TR"/>
+                              </w:rPr>
+                            </w:pPr>
+                            <w:proofErr w:type="spellStart"/>
+                            <w:r>
+                              <w:rPr>
+                                <w:rFonts w:ascii="Times New Roman" w:hAnsi="Times New Roman" w:cs="Times New Roman"/>
+                                <w:b/>
+                                <w:bCs/>
+                                <w:lang w:val="tr-TR"/>
+                              </w:rPr>
+                              <w:t>Figure</w:t>
+                            </w:r>
+                            <w:proofErr w:type="spellEnd"/>
+                            <w:r>
+                              <w:rPr>
+                                <w:rFonts w:ascii="Times New Roman" w:hAnsi="Times New Roman" w:cs="Times New Roman"/>
+                                <w:b/>
+                                <w:bCs/>
+                                <w:lang w:val="tr-TR"/>
+                              </w:rPr>
+                              <w:t xml:space="preserve"> 1: Learning </w:t>
+                            </w:r>
+                            <w:proofErr w:type="spellStart"/>
+                            <w:r>
+                              <w:rPr>
+                                <w:rFonts w:ascii="Times New Roman" w:hAnsi="Times New Roman" w:cs="Times New Roman"/>
+                                <w:b/>
+                                <w:bCs/>
+                                <w:lang w:val="tr-TR"/>
+                              </w:rPr>
+                              <w:t>to</w:t>
+                            </w:r>
+                            <w:proofErr w:type="spellEnd"/>
+                            <w:r>
+                              <w:rPr>
+                                <w:rFonts w:ascii="Times New Roman" w:hAnsi="Times New Roman" w:cs="Times New Roman"/>
+                                <w:b/>
+                                <w:bCs/>
+                                <w:lang w:val="tr-TR"/>
+                              </w:rPr>
+                              <w:t xml:space="preserve"> </w:t>
+                            </w:r>
+                            <w:proofErr w:type="spellStart"/>
+                            <w:r>
+                              <w:rPr>
+                                <w:rFonts w:ascii="Times New Roman" w:hAnsi="Times New Roman" w:cs="Times New Roman"/>
+                                <w:b/>
+                                <w:bCs/>
+                                <w:lang w:val="tr-TR"/>
+                              </w:rPr>
+                              <w:t>Defer</w:t>
+                            </w:r>
+                            <w:proofErr w:type="spellEnd"/>
+                            <w:r>
+                              <w:rPr>
+                                <w:rFonts w:ascii="Times New Roman" w:hAnsi="Times New Roman" w:cs="Times New Roman"/>
+                                <w:b/>
+                                <w:bCs/>
+                                <w:lang w:val="tr-TR"/>
+                              </w:rPr>
+                              <w:t xml:space="preserve"> </w:t>
+                            </w:r>
+                            <w:proofErr w:type="spellStart"/>
+                            <w:r>
+                              <w:rPr>
+                                <w:rFonts w:ascii="Times New Roman" w:hAnsi="Times New Roman" w:cs="Times New Roman"/>
+                                <w:b/>
+                                <w:bCs/>
+                                <w:lang w:val="tr-TR"/>
+                              </w:rPr>
+                              <w:t>Strategy</w:t>
+                            </w:r>
+                            <w:proofErr w:type="spellEnd"/>
+                            <w:r>
+                              <w:rPr>
+                                <w:rFonts w:ascii="Times New Roman" w:hAnsi="Times New Roman" w:cs="Times New Roman"/>
+                                <w:b/>
+                                <w:bCs/>
+                                <w:lang w:val="tr-TR"/>
+                              </w:rPr>
+                              <w:t xml:space="preserve"> Evaluation </w:t>
+                            </w:r>
+                            <w:proofErr w:type="spellStart"/>
+                            <w:r>
+                              <w:rPr>
+                                <w:rFonts w:ascii="Times New Roman" w:hAnsi="Times New Roman" w:cs="Times New Roman"/>
+                                <w:b/>
+                                <w:bCs/>
+                                <w:lang w:val="tr-TR"/>
+                              </w:rPr>
+                              <w:t>When</w:t>
+                            </w:r>
+                            <w:proofErr w:type="spellEnd"/>
+                            <w:r>
+                              <w:rPr>
+                                <w:rFonts w:ascii="Times New Roman" w:hAnsi="Times New Roman" w:cs="Times New Roman"/>
+                                <w:b/>
+                                <w:bCs/>
+                                <w:lang w:val="tr-TR"/>
+                              </w:rPr>
+                              <w:t xml:space="preserve"> </w:t>
+                            </w:r>
+                            <w:proofErr w:type="spellStart"/>
+                            <w:r>
+                              <w:rPr>
+                                <w:rFonts w:ascii="Times New Roman" w:hAnsi="Times New Roman" w:cs="Times New Roman"/>
+                                <w:b/>
+                                <w:bCs/>
+                                <w:lang w:val="tr-TR"/>
+                              </w:rPr>
+                              <w:t>Confidence</w:t>
+                            </w:r>
+                            <w:proofErr w:type="spellEnd"/>
+                            <w:r>
+                              <w:rPr>
+                                <w:rFonts w:ascii="Times New Roman" w:hAnsi="Times New Roman" w:cs="Times New Roman"/>
+                                <w:b/>
+                                <w:bCs/>
+                                <w:lang w:val="tr-TR"/>
+                              </w:rPr>
+                              <w:t xml:space="preserve"> </w:t>
+                            </w:r>
+                            <w:proofErr w:type="spellStart"/>
+                            <w:r>
+                              <w:rPr>
+                                <w:rFonts w:ascii="Times New Roman" w:hAnsi="Times New Roman" w:cs="Times New Roman"/>
+                                <w:b/>
+                                <w:bCs/>
+                                <w:lang w:val="tr-TR"/>
+                              </w:rPr>
+                              <w:t>Threshold</w:t>
+                            </w:r>
+                            <w:proofErr w:type="spellEnd"/>
+                            <w:r>
+                              <w:rPr>
+                                <w:rFonts w:ascii="Times New Roman" w:hAnsi="Times New Roman" w:cs="Times New Roman"/>
+                                <w:b/>
+                                <w:bCs/>
+                                <w:lang w:val="tr-TR"/>
+                              </w:rPr>
+                              <w:t xml:space="preserve"> is 0.60 </w:t>
+                            </w:r>
+                          </w:p>
+                        </w:txbxContent>
+                      </wps:txbx>
+                      <wps:bodyPr rot="0" spcFirstLastPara="0" vertOverflow="overflow" horzOverflow="overflow" vert="horz" wrap="square" lIns="0" tIns="0" rIns="0" bIns="0" numCol="1" spcCol="0" rtlCol="0" fromWordArt="0" anchor="t" anchorCtr="0" forceAA="0" compatLnSpc="1">
+                        <a:prstTxWarp prst="textNoShape">
+                          <a:avLst/>
+                        </a:prstTxWarp>
+                        <a:spAutoFit/>
+                      </wps:bodyPr>
+                    </wps:wsp>
+                  </a:graphicData>
+                </a:graphic>
+              </wp:anchor>
+            </w:drawing>
+          </mc:Choice>
+          <mc:Fallback>
+            <w:pict>
+              <v:shapetype w14:anchorId="35BAAA38" id="_x0000_t202" coordsize="21600,21600" o:spt="202" path="m,l,21600r21600,l21600,xe">
+                <v:stroke joinstyle="miter"/>
+                <v:path gradientshapeok="t" o:connecttype="rect"/>
+              </v:shapetype>
+              <v:shape id="Metin Kutusu 1" o:spid="_x0000_s1026" type="#_x0000_t202" style="position:absolute;margin-left:-37.15pt;margin-top:362.65pt;width:517.2pt;height:.05pt;z-index:251660288;visibility:visible;mso-wrap-style:square;mso-wrap-distance-left:9pt;mso-wrap-distance-top:0;mso-wrap-distance-right:9pt;mso-wrap-distance-bottom:0;mso-position-horizontal:absolute;mso-position-horizontal-relative:text;mso-position-vertical:absolute;mso-position-vertical-relative:text;v-text-anchor:top" o:gfxdata="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" stroked="f">
+                <v:textbox style="mso-fit-shape-to-text:t" inset="0,0,0,0">
+                  <w:txbxContent>
+                    <w:p>
+                      <w:pPr>
+                        <w:pStyle w:val="ResimYazs"/>
+                        <w:rPr>
+                          <w:rFonts w:ascii="Times New Roman" w:eastAsia="Times New Roman" w:hAnsi="Times New Roman" w:cs="Times New Roman"/>
+                          <w:b/>
+                          <w:bCs/>
+                          <w:noProof/>
+                          <w:lang w:val="tr-TR"/>
+                        </w:rPr>
+                      </w:pPr>
+                      <w:proofErr w:type="spellStart"/>
+                      <w:r>
+                        <w:rPr>
+                          <w:rFonts w:ascii="Times New Roman" w:hAnsi="Times New Roman" w:cs="Times New Roman"/>
+                          <w:b/>
+                          <w:bCs/>
+                          <w:lang w:val="tr-TR"/>
+                        </w:rPr>
+                        <w:t>Figure</w:t>
+                      </w:r>
+                      <w:proofErr w:type="spellEnd"/>
+                      <w:r>
+                        <w:rPr>
+                          <w:rFonts w:ascii="Times New Roman" w:hAnsi="Times New Roman" w:cs="Times New Roman"/>
+                          <w:b/>
+                          <w:bCs/>
+                          <w:lang w:val="tr-TR"/>
+                        </w:rPr>
+                        <w:t xml:space="preserve"> 1: Learning </w:t>
+                      </w:r>
+                      <w:proofErr w:type="spellStart"/>
+                      <w:r>
+                        <w:rPr>
+                          <w:rFonts w:ascii="Times New Roman" w:hAnsi="Times New Roman" w:cs="Times New Roman"/>
+                          <w:b/>
+                          <w:bCs/>
+                          <w:lang w:val="tr-TR"/>
+                        </w:rPr>
+                        <w:t>to</w:t>
+                      </w:r>
+                      <w:proofErr w:type="spellEnd"/>
+                      <w:r>
+                        <w:rPr>
+                          <w:rFonts w:ascii="Times New Roman" w:hAnsi="Times New Roman" w:cs="Times New Roman"/>
+                          <w:b/>
+                          <w:bCs/>
+                          <w:lang w:val="tr-TR"/>
+                        </w:rPr>
+                        <w:t xml:space="preserve"> </w:t>
+                      </w:r>
+                      <w:proofErr w:type="spellStart"/>
+                      <w:r>
+                        <w:rPr>
+                          <w:rFonts w:ascii="Times New Roman" w:hAnsi="Times New Roman" w:cs="Times New Roman"/>
+                          <w:b/>
+                          <w:bCs/>
+                          <w:lang w:val="tr-TR"/>
+                        </w:rPr>
+                        <w:t>Defer</w:t>
+                      </w:r>
+                      <w:proofErr w:type="spellEnd"/>
+                      <w:r>
+                        <w:rPr>
+                          <w:rFonts w:ascii="Times New Roman" w:hAnsi="Times New Roman" w:cs="Times New Roman"/>
+                          <w:b/>
+                          <w:bCs/>
+                          <w:lang w:val="tr-TR"/>
+                        </w:rPr>
+                        <w:t xml:space="preserve"> </w:t>
+                      </w:r>
+                      <w:proofErr w:type="spellStart"/>
+                      <w:r>
+                        <w:rPr>
+                          <w:rFonts w:ascii="Times New Roman" w:hAnsi="Times New Roman" w:cs="Times New Roman"/>
+                          <w:b/>
+                          <w:bCs/>
+                          <w:lang w:val="tr-TR"/>
+                        </w:rPr>
+                        <w:t>Strategy</w:t>
+                      </w:r>
+                      <w:proofErr w:type="spellEnd"/>
+                      <w:r>
+                        <w:rPr>
+                          <w:rFonts w:ascii="Times New Roman" w:hAnsi="Times New Roman" w:cs="Times New Roman"/>
+                          <w:b/>
+                          <w:bCs/>
+                          <w:lang w:val="tr-TR"/>
+                        </w:rPr>
+                        <w:t xml:space="preserve"> Evaluation </w:t>
+                      </w:r>
+                      <w:proofErr w:type="spellStart"/>
+                      <w:r>
+                        <w:rPr>
+                          <w:rFonts w:ascii="Times New Roman" w:hAnsi="Times New Roman" w:cs="Times New Roman"/>
+                          <w:b/>
+                          <w:bCs/>
+                          <w:lang w:val="tr-TR"/>
+                        </w:rPr>
+                        <w:t>When</w:t>
+                      </w:r>
+                      <w:proofErr w:type="spellEnd"/>
+                      <w:r>
+                        <w:rPr>
+                          <w:rFonts w:ascii="Times New Roman" w:hAnsi="Times New Roman" w:cs="Times New Roman"/>
+                          <w:b/>
+                          <w:bCs/>
+                          <w:lang w:val="tr-TR"/>
+                        </w:rPr>
+                        <w:t xml:space="preserve"> </w:t>
+                      </w:r>
+                      <w:proofErr w:type="spellStart"/>
+                      <w:r>
+                        <w:rPr>
+                          <w:rFonts w:ascii="Times New Roman" w:hAnsi="Times New Roman" w:cs="Times New Roman"/>
+                          <w:b/>
+                          <w:bCs/>
+                          <w:lang w:val="tr-TR"/>
+                        </w:rPr>
+                        <w:t>Confidence</w:t>
+                      </w:r>
+                      <w:proofErr w:type="spellEnd"/>
+                      <w:r>
+                        <w:rPr>
+                          <w:rFonts w:ascii="Times New Roman" w:hAnsi="Times New Roman" w:cs="Times New Roman"/>
+                          <w:b/>
+                          <w:bCs/>
+                          <w:lang w:val="tr-TR"/>
+                        </w:rPr>
+                        <w:t xml:space="preserve"> </w:t>
+                      </w:r>
+                      <w:proofErr w:type="spellStart"/>
+                      <w:r>
+                        <w:rPr>
+                          <w:rFonts w:ascii="Times New Roman" w:hAnsi="Times New Roman" w:cs="Times New Roman"/>
+                          <w:b/>
+                          <w:bCs/>
+                          <w:lang w:val="tr-TR"/>
+                        </w:rPr>
+                        <w:t>Threshold</w:t>
+                      </w:r>
+                      <w:proofErr w:type="spellEnd"/>
+                      <w:r>
+                        <w:rPr>
+                          <w:rFonts w:ascii="Times New Roman" w:hAnsi="Times New Roman" w:cs="Times New Roman"/>
+                          <w:b/>
+                          <w:bCs/>
+                          <w:lang w:val="tr-TR"/>
+                        </w:rPr>
+                        <w:t xml:space="preserve"> is 0.60 </w:t>
+                      </w:r>
+                    </w:p>
+                  </w:txbxContent>
+                </v:textbox>
+              </v:shape>
+            </w:pict>
+          </mc:Fallback>
+        </mc:AlternateContent>
+      </w:r>
+      <w:r>
+        <w:rPr>
+          <w:rFonts w:ascii="Times New Roman" w:eastAsia="Times New Roman" w:hAnsi="Times New Roman" w:cs="Times New Roman"/>
+          <w:noProof/>
+          <w:lang w:eastAsia="tr-TR"/>
+        </w:rPr>
+        <w:drawing>
+          <wp:anchor distT="0" distB="0" distL="114300" distR="114300" simplePos="0" relativeHeight="251658240" behindDoc="0" locked="0" layoutInCell="1" allowOverlap="1" wp14:anchorId="2A88F9DB" wp14:editId="559D5797">
+            <wp:simplePos x="0" y="0"/>
+            <wp:positionH relativeFrom="column">
+              <wp:posOffset>-472328</wp:posOffset>
+            </wp:positionH>
+            <wp:positionV relativeFrom="paragraph">
+              <wp:posOffset>364191</wp:posOffset>
+            </wp:positionV>
+            <wp:extent cx="6568911" cy="4184725"/>
+            <wp:effectExtent l="0" t="0" r="0" b="0"/>
+            <wp:wrapNone/>
+            <wp:docPr id="1248022986" name="Resim 1"/>
+            <wp:cNvGraphicFramePr>
+              <a:graphicFrameLocks xmlns:a="http://schemas.openxmlformats.org/drawingml/2006/main" noChangeAspect="1"/>
+            </wp:cNvGraphicFramePr>
+            <a:graphic xmlns:a="http://schemas.openxmlformats.org/drawingml/2006/main">
+              <a:graphicData uri="http://schemas.openxmlformats.org/drawingml/2006/picture">
+                <pic:pic xmlns:pic="http://schemas.openxmlformats.org/drawingml/2006/picture">
+                  <pic:nvPicPr>
+                    <pic:cNvPr id="1248022986" name="Resim 1248022986"/>
+                    <pic:cNvPicPr/>
+                  </pic:nvPicPr>
+                  <pic:blipFill rotWithShape="1">
+                    <a:blip r:embed="rId5" cstate="print">
+                      <a:extLst>
+                        <a:ext uri="{28A0092B-C50C-407E-A947-70E740481C1C}">
+                          <a14:useLocalDpi xmlns:a14="http://schemas.microsoft.com/office/drawing/2010/main" val="0"/>
+                        </a:ext>
+                      </a:extLst>
+                    </a:blip>
+                    <a:srcRect b="2657"/>
+                    <a:stretch>
+                      <a:fillRect/>
+                    </a:stretch>
+                  </pic:blipFill>
+                  <pic:spPr bwMode="auto">
+                    <a:xfrm>
+                      <a:off x="0" y="0"/>
+                      <a:ext cx="6568911" cy="4184725"/>
+                    </a:xfrm>
+                    <a:prstGeom prst="rect">
+                      <a:avLst/>
+                    </a:prstGeom>
+                    <a:ln>
+                      <a:noFill/>
+                    </a:ln>
+                    <a:extLst>
+                      <a:ext uri="{53640926-AAD7-44D8-BBD7-CCE9431645EC}">
+                        <a14:shadowObscured xmlns:a14="http://schemas.microsoft.com/office/drawing/2010/main"/>
+                      </a:ext>
+                    </a:extLst>
+                  </pic:spPr>
+                </pic:pic>
+              </a:graphicData>
+            </a:graphic>
+            <wp14:sizeRelH relativeFrom="page">
+              <wp14:pctWidth>0</wp14:pctWidth>
+            </wp14:sizeRelH>
+            <wp14:sizeRelV relativeFrom="page">
+              <wp14:pctHeight>0</wp14:pctHeight>
+            </wp14:sizeRelV>
+          </wp:anchor>
+        </w:drawing>
+      </w:r>
       <w:proofErr w:type="spellStart"/>
       <w:r>
         <w:rPr>
@@ -6412,6 +6816,326 @@
     <w:p>
       <w:pPr>
         <w:rPr>
+          <w:rFonts w:ascii="Times New Roman" w:hAnsi="Times New Roman" w:cs="Times New Roman"/>
+          <w:b/>
+          <w:bCs/>
+          <w:u w:val="single"/>
+          <w:lang w:val="tr-TR"/>
+        </w:rPr>
+      </w:pPr>
+    </w:p>
+    <w:p>
+      <w:pPr>
+        <w:rPr>
+          <w:rFonts w:ascii="Times New Roman" w:hAnsi="Times New Roman" w:cs="Times New Roman"/>
+          <w:b/>
+          <w:bCs/>
+          <w:u w:val="single"/>
+          <w:lang w:val="tr-TR"/>
+        </w:rPr>
+      </w:pPr>
+    </w:p>
+    <w:p>
+      <w:pPr>
+        <w:rPr>
+          <w:rFonts w:ascii="Times New Roman" w:hAnsi="Times New Roman" w:cs="Times New Roman"/>
+          <w:b/>
+          <w:bCs/>
+          <w:u w:val="single"/>
+          <w:lang w:val="tr-TR"/>
+        </w:rPr>
+      </w:pPr>
+    </w:p>
+    <w:p>
+      <w:pPr>
+        <w:rPr>
+          <w:rFonts w:ascii="Times New Roman" w:hAnsi="Times New Roman" w:cs="Times New Roman"/>
+          <w:b/>
+          <w:bCs/>
+          <w:u w:val="single"/>
+          <w:lang w:val="tr-TR"/>
+        </w:rPr>
+      </w:pPr>
+    </w:p>
+    <w:p>
+      <w:pPr>
+        <w:rPr>
+          <w:rFonts w:ascii="Times New Roman" w:hAnsi="Times New Roman" w:cs="Times New Roman"/>
+          <w:b/>
+          <w:bCs/>
+          <w:u w:val="single"/>
+          <w:lang w:val="tr-TR"/>
+        </w:rPr>
+      </w:pPr>
+    </w:p>
+    <w:p>
+      <w:pPr>
+        <w:rPr>
+          <w:rFonts w:ascii="Times New Roman" w:hAnsi="Times New Roman" w:cs="Times New Roman"/>
+          <w:b/>
+          <w:bCs/>
+          <w:u w:val="single"/>
+          <w:lang w:val="tr-TR"/>
+        </w:rPr>
+      </w:pPr>
+    </w:p>
+    <w:p>
+      <w:pPr>
+        <w:rPr>
+          <w:rFonts w:ascii="Times New Roman" w:hAnsi="Times New Roman" w:cs="Times New Roman"/>
+          <w:b/>
+          <w:bCs/>
+          <w:u w:val="single"/>
+          <w:lang w:val="tr-TR"/>
+        </w:rPr>
+      </w:pPr>
+    </w:p>
+    <w:p>
+      <w:pPr>
+        <w:rPr>
+          <w:rFonts w:ascii="Times New Roman" w:hAnsi="Times New Roman" w:cs="Times New Roman"/>
+          <w:b/>
+          <w:bCs/>
+          <w:u w:val="single"/>
+          <w:lang w:val="tr-TR"/>
+        </w:rPr>
+      </w:pPr>
+    </w:p>
+    <w:p>
+      <w:pPr>
+        <w:rPr>
+          <w:rFonts w:ascii="Times New Roman" w:hAnsi="Times New Roman" w:cs="Times New Roman"/>
+          <w:b/>
+          <w:bCs/>
+          <w:u w:val="single"/>
+          <w:lang w:val="tr-TR"/>
+        </w:rPr>
+      </w:pPr>
+    </w:p>
+    <w:p>
+      <w:pPr>
+        <w:rPr>
+          <w:rFonts w:ascii="Times New Roman" w:hAnsi="Times New Roman" w:cs="Times New Roman"/>
+          <w:b/>
+          <w:bCs/>
+          <w:u w:val="single"/>
+          <w:lang w:val="tr-TR"/>
+        </w:rPr>
+      </w:pPr>
+    </w:p>
+    <w:p>
+      <w:pPr>
+        <w:rPr>
+          <w:rFonts w:ascii="Times New Roman" w:hAnsi="Times New Roman" w:cs="Times New Roman"/>
+          <w:b/>
+          <w:bCs/>
+          <w:u w:val="single"/>
+          <w:lang w:val="tr-TR"/>
+        </w:rPr>
+      </w:pPr>
+    </w:p>
+    <w:p>
+      <w:pPr>
+        <w:rPr>
+          <w:rFonts w:ascii="Times New Roman" w:hAnsi="Times New Roman" w:cs="Times New Roman"/>
+          <w:b/>
+          <w:bCs/>
+          <w:u w:val="single"/>
+          <w:lang w:val="tr-TR"/>
+        </w:rPr>
+      </w:pPr>
+    </w:p>
+    <w:p>
+      <w:pPr>
+        <w:rPr>
+          <w:rFonts w:ascii="Times New Roman" w:hAnsi="Times New Roman" w:cs="Times New Roman"/>
+          <w:b/>
+          <w:bCs/>
+          <w:u w:val="single"/>
+          <w:lang w:val="tr-TR"/>
+        </w:rPr>
+      </w:pPr>
+      <w:r>
+        <w:rPr>
+          <w:noProof/>
+        </w:rPr>
+        <w:lastRenderedPageBreak/>
+        <mc:AlternateContent>
+          <mc:Choice Requires="wps">
+            <w:drawing>
+              <wp:anchor distT="0" distB="0" distL="114300" distR="114300" simplePos="0" relativeHeight="251663360" behindDoc="0" locked="0" layoutInCell="1" allowOverlap="1" wp14:anchorId="13A9F1FA" wp14:editId="0609C5AA">
+                <wp:simplePos x="0" y="0"/>
+                <wp:positionH relativeFrom="column">
+                  <wp:posOffset>-386715</wp:posOffset>
+                </wp:positionH>
+                <wp:positionV relativeFrom="paragraph">
+                  <wp:posOffset>3591560</wp:posOffset>
+                </wp:positionV>
+                <wp:extent cx="6454140" cy="635"/>
+                <wp:effectExtent l="0" t="0" r="0" b="0"/>
+                <wp:wrapNone/>
+                <wp:docPr id="341635747" name="Metin Kutusu 1"/>
+                <wp:cNvGraphicFramePr/>
+                <a:graphic xmlns:a="http://schemas.openxmlformats.org/drawingml/2006/main">
+                  <a:graphicData uri="http://schemas.microsoft.com/office/word/2010/wordprocessingShape">
+                    <wps:wsp>
+                      <wps:cNvSpPr txBox="1"/>
+                      <wps:spPr>
+                        <a:xfrm>
+                          <a:off x="0" y="0"/>
+                          <a:ext cx="6454140" cy="635"/>
+                        </a:xfrm>
+                        <a:prstGeom prst="rect">
+                          <a:avLst/>
+                        </a:prstGeom>
+                        <a:solidFill>
+                          <a:prstClr val="white"/>
+                        </a:solidFill>
+                        <a:ln>
+                          <a:noFill/>
+                        </a:ln>
+                      </wps:spPr>
+                      <wps:txbx>
+                        <w:txbxContent>
+                          <w:p>
+                            <w:pPr>
+                              <w:pStyle w:val="ResimYazs"/>
+                              <w:rPr>
+                                <w:rFonts w:ascii="Times New Roman" w:hAnsi="Times New Roman" w:cs="Times New Roman"/>
+                                <w:b/>
+                                <w:bCs/>
+                                <w:noProof/>
+                                <w:lang w:val="tr-TR"/>
+                              </w:rPr>
+                            </w:pPr>
+                            <w:r>
+                              <w:rPr>
+                                <w:rFonts w:ascii="Times New Roman" w:hAnsi="Times New Roman" w:cs="Times New Roman"/>
+                                <w:b/>
+                                <w:bCs/>
+                                <w:noProof/>
+                                <w:lang w:val="tr-TR"/>
+                              </w:rPr>
+                              <w:t xml:space="preserve">Figure 2: Learning to Defer Strategy Evaluation When Confidence Threshold is 0.315 </w:t>
+                            </w:r>
+                          </w:p>
+                        </w:txbxContent>
+                      </wps:txbx>
+                      <wps:bodyPr rot="0" spcFirstLastPara="0" vertOverflow="overflow" horzOverflow="overflow" vert="horz" wrap="square" lIns="0" tIns="0" rIns="0" bIns="0" numCol="1" spcCol="0" rtlCol="0" fromWordArt="0" anchor="t" anchorCtr="0" forceAA="0" compatLnSpc="1">
+                        <a:prstTxWarp prst="textNoShape">
+                          <a:avLst/>
+                        </a:prstTxWarp>
+                        <a:spAutoFit/>
+                      </wps:bodyPr>
+                    </wps:wsp>
+                  </a:graphicData>
+                </a:graphic>
+              </wp:anchor>
+            </w:drawing>
+          </mc:Choice>
+          <mc:Fallback>
+            <w:pict>
+              <v:shape w14:anchorId="13A9F1FA" id="_x0000_s1027" type="#_x0000_t202" style="position:absolute;margin-left:-30.45pt;margin-top:282.8pt;width:508.2pt;height:.05pt;z-index:251663360;visibility:visible;mso-wrap-style:square;mso-wrap-distance-left:9pt;mso-wrap-distance-top:0;mso-wrap-distance-right:9pt;mso-wrap-distance-bottom:0;mso-position-horizontal:absolute;mso-position-horizontal-relative:text;mso-position-vertical:absolute;mso-position-vertical-relative:text;v-text-anchor:top" o:gfxdata="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" stroked="f">
+                <v:textbox style="mso-fit-shape-to-text:t" inset="0,0,0,0">
+                  <w:txbxContent>
+                    <w:p>
+                      <w:pPr>
+                        <w:pStyle w:val="ResimYazs"/>
+                        <w:rPr>
+                          <w:rFonts w:ascii="Times New Roman" w:hAnsi="Times New Roman" w:cs="Times New Roman"/>
+                          <w:b/>
+                          <w:bCs/>
+                          <w:noProof/>
+                          <w:lang w:val="tr-TR"/>
+                        </w:rPr>
+                      </w:pPr>
+                      <w:r>
+                        <w:rPr>
+                          <w:rFonts w:ascii="Times New Roman" w:hAnsi="Times New Roman" w:cs="Times New Roman"/>
+                          <w:b/>
+                          <w:bCs/>
+                          <w:noProof/>
+                          <w:lang w:val="tr-TR"/>
+                        </w:rPr>
+                        <w:t xml:space="preserve">Figure 2: Learning to Defer Strategy Evaluation When Confidence Threshold is 0.315 </w:t>
+                      </w:r>
+                    </w:p>
+                  </w:txbxContent>
+                </v:textbox>
+              </v:shape>
+            </w:pict>
+          </mc:Fallback>
+        </mc:AlternateContent>
+      </w:r>
+      <w:r>
+        <w:rPr>
+          <w:rFonts w:ascii="Times New Roman" w:hAnsi="Times New Roman" w:cs="Times New Roman"/>
+          <w:b/>
+          <w:bCs/>
+          <w:noProof/>
+          <w:u w:val="single"/>
+          <w:lang w:val="tr-TR"/>
+        </w:rPr>
+        <w:drawing>
+          <wp:anchor distT="0" distB="0" distL="114300" distR="114300" simplePos="0" relativeHeight="251661312" behindDoc="0" locked="0" layoutInCell="1" allowOverlap="1" wp14:anchorId="586C122B" wp14:editId="34372683">
+            <wp:simplePos x="0" y="0"/>
+            <wp:positionH relativeFrom="column">
+              <wp:posOffset>-387275</wp:posOffset>
+            </wp:positionH>
+            <wp:positionV relativeFrom="paragraph">
+              <wp:posOffset>-753035</wp:posOffset>
+            </wp:positionV>
+            <wp:extent cx="6454588" cy="4287088"/>
+            <wp:effectExtent l="0" t="0" r="0" b="5715"/>
+            <wp:wrapNone/>
+            <wp:docPr id="1003897679" name="Resim 2"/>
+            <wp:cNvGraphicFramePr>
+              <a:graphicFrameLocks xmlns:a="http://schemas.openxmlformats.org/drawingml/2006/main" noChangeAspect="1"/>
+            </wp:cNvGraphicFramePr>
+            <a:graphic xmlns:a="http://schemas.openxmlformats.org/drawingml/2006/main">
+              <a:graphicData uri="http://schemas.openxmlformats.org/drawingml/2006/picture">
+                <pic:pic xmlns:pic="http://schemas.openxmlformats.org/drawingml/2006/picture">
+                  <pic:nvPicPr>
+                    <pic:cNvPr id="1003897679" name="Resim 1003897679"/>
+                    <pic:cNvPicPr/>
+                  </pic:nvPicPr>
+                  <pic:blipFill>
+                    <a:blip r:embed="rId6" cstate="print">
+                      <a:extLst>
+                        <a:ext uri="{28A0092B-C50C-407E-A947-70E740481C1C}">
+                          <a14:useLocalDpi xmlns:a14="http://schemas.microsoft.com/office/drawing/2010/main" val="0"/>
+                        </a:ext>
+                      </a:extLst>
+                    </a:blip>
+                    <a:stretch>
+                      <a:fillRect/>
+                    </a:stretch>
+                  </pic:blipFill>
+                  <pic:spPr>
+                    <a:xfrm>
+                      <a:off x="0" y="0"/>
+                      <a:ext cx="6480101" cy="4304033"/>
+                    </a:xfrm>
+                    <a:prstGeom prst="rect">
+                      <a:avLst/>
+                    </a:prstGeom>
+                  </pic:spPr>
+                </pic:pic>
+              </a:graphicData>
+            </a:graphic>
+            <wp14:sizeRelH relativeFrom="page">
+              <wp14:pctWidth>0</wp14:pctWidth>
+            </wp14:sizeRelH>
+            <wp14:sizeRelV relativeFrom="page">
+              <wp14:pctHeight>0</wp14:pctHeight>
+            </wp14:sizeRelV>
+          </wp:anchor>
+        </w:drawing>
+      </w:r>
+    </w:p>
+    <w:p>
+      <w:pPr>
+        <w:rPr>
           <w:rFonts w:ascii="Times New Roman" w:eastAsia="Times New Roman" w:hAnsi="Times New Roman" w:cs="Times New Roman"/>
           <w:b/>
           <w:bCs/>
@@ -6442,12 +7166,1368 @@
     <w:p>
       <w:pPr>
         <w:rPr>
+          <w:rFonts w:ascii="Times New Roman" w:hAnsi="Times New Roman" w:cs="Times New Roman"/>
+          <w:b/>
+          <w:bCs/>
+          <w:u w:val="single"/>
+          <w:lang w:val="tr-TR"/>
+        </w:rPr>
+      </w:pPr>
+    </w:p>
+    <w:p>
+      <w:pPr>
+        <w:rPr>
+          <w:rFonts w:ascii="Times New Roman" w:hAnsi="Times New Roman" w:cs="Times New Roman"/>
+          <w:b/>
+          <w:bCs/>
+          <w:u w:val="single"/>
+          <w:lang w:val="tr-TR"/>
+        </w:rPr>
+      </w:pPr>
+    </w:p>
+    <w:p>
+      <w:pPr>
+        <w:rPr>
+          <w:rFonts w:ascii="Times New Roman" w:hAnsi="Times New Roman" w:cs="Times New Roman"/>
+          <w:b/>
+          <w:bCs/>
+          <w:u w:val="single"/>
+          <w:lang w:val="tr-TR"/>
+        </w:rPr>
+      </w:pPr>
+    </w:p>
+    <w:p>
+      <w:pPr>
+        <w:rPr>
+          <w:rFonts w:ascii="Times New Roman" w:hAnsi="Times New Roman" w:cs="Times New Roman"/>
+          <w:b/>
+          <w:bCs/>
+          <w:u w:val="single"/>
+          <w:lang w:val="tr-TR"/>
+        </w:rPr>
+      </w:pPr>
+    </w:p>
+    <w:p>
+      <w:pPr>
+        <w:rPr>
+          <w:rFonts w:ascii="Times New Roman" w:hAnsi="Times New Roman" w:cs="Times New Roman"/>
+          <w:b/>
+          <w:bCs/>
+          <w:u w:val="single"/>
+          <w:lang w:val="tr-TR"/>
+        </w:rPr>
+      </w:pPr>
+    </w:p>
+    <w:p>
+      <w:pPr>
+        <w:rPr>
+          <w:rFonts w:ascii="Times New Roman" w:hAnsi="Times New Roman" w:cs="Times New Roman"/>
+          <w:b/>
+          <w:bCs/>
+          <w:u w:val="single"/>
+          <w:lang w:val="tr-TR"/>
+        </w:rPr>
+      </w:pPr>
+    </w:p>
+    <w:p>
+      <w:pPr>
+        <w:rPr>
+          <w:rFonts w:ascii="Times New Roman" w:hAnsi="Times New Roman" w:cs="Times New Roman"/>
+          <w:b/>
+          <w:bCs/>
+          <w:u w:val="single"/>
+          <w:lang w:val="tr-TR"/>
+        </w:rPr>
+      </w:pPr>
+    </w:p>
+    <w:p>
+      <w:pPr>
+        <w:rPr>
+          <w:rFonts w:ascii="Times New Roman" w:hAnsi="Times New Roman" w:cs="Times New Roman"/>
+          <w:b/>
+          <w:bCs/>
+          <w:u w:val="single"/>
+          <w:lang w:val="tr-TR"/>
+        </w:rPr>
+      </w:pPr>
+    </w:p>
+    <w:p>
+      <w:pPr>
+        <w:rPr>
+          <w:rFonts w:ascii="Times New Roman" w:hAnsi="Times New Roman" w:cs="Times New Roman"/>
+          <w:b/>
+          <w:bCs/>
+          <w:u w:val="single"/>
+          <w:lang w:val="tr-TR"/>
+        </w:rPr>
+      </w:pPr>
+    </w:p>
+    <w:p>
+      <w:pPr>
+        <w:rPr>
+          <w:rFonts w:ascii="Times New Roman" w:hAnsi="Times New Roman" w:cs="Times New Roman"/>
+          <w:b/>
+          <w:bCs/>
+          <w:u w:val="single"/>
+          <w:lang w:val="tr-TR"/>
+        </w:rPr>
+      </w:pPr>
+      <w:r>
+        <w:rPr>
+          <w:noProof/>
+        </w:rPr>
+        <mc:AlternateContent>
+          <mc:Choice Requires="wps">
+            <w:drawing>
+              <wp:anchor distT="0" distB="0" distL="114300" distR="114300" simplePos="0" relativeHeight="251666432" behindDoc="0" locked="0" layoutInCell="1" allowOverlap="1" wp14:anchorId="5420D7C1" wp14:editId="004366B5">
+                <wp:simplePos x="0" y="0"/>
+                <wp:positionH relativeFrom="column">
+                  <wp:posOffset>-386715</wp:posOffset>
+                </wp:positionH>
+                <wp:positionV relativeFrom="paragraph">
+                  <wp:posOffset>4487545</wp:posOffset>
+                </wp:positionV>
+                <wp:extent cx="6454775" cy="635"/>
+                <wp:effectExtent l="0" t="0" r="0" b="12065"/>
+                <wp:wrapNone/>
+                <wp:docPr id="1010592782" name="Metin Kutusu 1"/>
+                <wp:cNvGraphicFramePr/>
+                <a:graphic xmlns:a="http://schemas.openxmlformats.org/drawingml/2006/main">
+                  <a:graphicData uri="http://schemas.microsoft.com/office/word/2010/wordprocessingShape">
+                    <wps:wsp>
+                      <wps:cNvSpPr txBox="1"/>
+                      <wps:spPr>
+                        <a:xfrm>
+                          <a:off x="0" y="0"/>
+                          <a:ext cx="6454775" cy="635"/>
+                        </a:xfrm>
+                        <a:prstGeom prst="rect">
+                          <a:avLst/>
+                        </a:prstGeom>
+                        <a:solidFill>
+                          <a:prstClr val="white"/>
+                        </a:solidFill>
+                        <a:ln>
+                          <a:noFill/>
+                        </a:ln>
+                      </wps:spPr>
+                      <wps:txbx>
+                        <w:txbxContent>
+                          <w:p>
+                            <w:pPr>
+                              <w:pStyle w:val="ResimYazs"/>
+                              <w:rPr>
+                                <w:rFonts w:ascii="Times New Roman" w:eastAsia="Times New Roman" w:hAnsi="Times New Roman" w:cs="Times New Roman"/>
+                                <w:b/>
+                                <w:bCs/>
+                                <w:noProof/>
+                                <w:lang w:val="tr-TR"/>
+                              </w:rPr>
+                            </w:pPr>
+                            <w:proofErr w:type="spellStart"/>
+                            <w:r>
+                              <w:rPr>
+                                <w:rFonts w:ascii="Times New Roman" w:hAnsi="Times New Roman" w:cs="Times New Roman"/>
+                                <w:b/>
+                                <w:bCs/>
+                                <w:lang w:val="tr-TR"/>
+                              </w:rPr>
+                              <w:t>Figure</w:t>
+                            </w:r>
+                            <w:proofErr w:type="spellEnd"/>
+                            <w:r>
+                              <w:rPr>
+                                <w:rFonts w:ascii="Times New Roman" w:hAnsi="Times New Roman" w:cs="Times New Roman"/>
+                                <w:b/>
+                                <w:bCs/>
+                                <w:lang w:val="tr-TR"/>
+                              </w:rPr>
+                              <w:t xml:space="preserve"> 3: Learning </w:t>
+                            </w:r>
+                            <w:proofErr w:type="spellStart"/>
+                            <w:r>
+                              <w:rPr>
+                                <w:rFonts w:ascii="Times New Roman" w:hAnsi="Times New Roman" w:cs="Times New Roman"/>
+                                <w:b/>
+                                <w:bCs/>
+                                <w:lang w:val="tr-TR"/>
+                              </w:rPr>
+                              <w:t>to</w:t>
+                            </w:r>
+                            <w:proofErr w:type="spellEnd"/>
+                            <w:r>
+                              <w:rPr>
+                                <w:rFonts w:ascii="Times New Roman" w:hAnsi="Times New Roman" w:cs="Times New Roman"/>
+                                <w:b/>
+                                <w:bCs/>
+                                <w:lang w:val="tr-TR"/>
+                              </w:rPr>
+                              <w:t xml:space="preserve"> </w:t>
+                            </w:r>
+                            <w:proofErr w:type="spellStart"/>
+                            <w:r>
+                              <w:rPr>
+                                <w:rFonts w:ascii="Times New Roman" w:hAnsi="Times New Roman" w:cs="Times New Roman"/>
+                                <w:b/>
+                                <w:bCs/>
+                                <w:lang w:val="tr-TR"/>
+                              </w:rPr>
+                              <w:t>Defer</w:t>
+                            </w:r>
+                            <w:proofErr w:type="spellEnd"/>
+                            <w:r>
+                              <w:rPr>
+                                <w:rFonts w:ascii="Times New Roman" w:hAnsi="Times New Roman" w:cs="Times New Roman"/>
+                                <w:b/>
+                                <w:bCs/>
+                                <w:lang w:val="tr-TR"/>
+                              </w:rPr>
+                              <w:t xml:space="preserve"> </w:t>
+                            </w:r>
+                            <w:proofErr w:type="spellStart"/>
+                            <w:r>
+                              <w:rPr>
+                                <w:rFonts w:ascii="Times New Roman" w:hAnsi="Times New Roman" w:cs="Times New Roman"/>
+                                <w:b/>
+                                <w:bCs/>
+                                <w:lang w:val="tr-TR"/>
+                              </w:rPr>
+                              <w:t>Strategy</w:t>
+                            </w:r>
+                            <w:proofErr w:type="spellEnd"/>
+                            <w:r>
+                              <w:rPr>
+                                <w:rFonts w:ascii="Times New Roman" w:hAnsi="Times New Roman" w:cs="Times New Roman"/>
+                                <w:b/>
+                                <w:bCs/>
+                                <w:lang w:val="tr-TR"/>
+                              </w:rPr>
+                              <w:t xml:space="preserve"> Evaluation </w:t>
+                            </w:r>
+                            <w:proofErr w:type="spellStart"/>
+                            <w:r>
+                              <w:rPr>
+                                <w:rFonts w:ascii="Times New Roman" w:hAnsi="Times New Roman" w:cs="Times New Roman"/>
+                                <w:b/>
+                                <w:bCs/>
+                                <w:lang w:val="tr-TR"/>
+                              </w:rPr>
+                              <w:t>When</w:t>
+                            </w:r>
+                            <w:proofErr w:type="spellEnd"/>
+                            <w:r>
+                              <w:rPr>
+                                <w:rFonts w:ascii="Times New Roman" w:hAnsi="Times New Roman" w:cs="Times New Roman"/>
+                                <w:b/>
+                                <w:bCs/>
+                                <w:lang w:val="tr-TR"/>
+                              </w:rPr>
+                              <w:t xml:space="preserve"> </w:t>
+                            </w:r>
+                            <w:proofErr w:type="spellStart"/>
+                            <w:r>
+                              <w:rPr>
+                                <w:rFonts w:ascii="Times New Roman" w:hAnsi="Times New Roman" w:cs="Times New Roman"/>
+                                <w:b/>
+                                <w:bCs/>
+                                <w:lang w:val="tr-TR"/>
+                              </w:rPr>
+                              <w:t>Confidence</w:t>
+                            </w:r>
+                            <w:proofErr w:type="spellEnd"/>
+                            <w:r>
+                              <w:rPr>
+                                <w:rFonts w:ascii="Times New Roman" w:hAnsi="Times New Roman" w:cs="Times New Roman"/>
+                                <w:b/>
+                                <w:bCs/>
+                                <w:lang w:val="tr-TR"/>
+                              </w:rPr>
+                              <w:t xml:space="preserve"> </w:t>
+                            </w:r>
+                            <w:proofErr w:type="spellStart"/>
+                            <w:r>
+                              <w:rPr>
+                                <w:rFonts w:ascii="Times New Roman" w:hAnsi="Times New Roman" w:cs="Times New Roman"/>
+                                <w:b/>
+                                <w:bCs/>
+                                <w:lang w:val="tr-TR"/>
+                              </w:rPr>
+                              <w:t>Threshold</w:t>
+                            </w:r>
+                            <w:proofErr w:type="spellEnd"/>
+                            <w:r>
+                              <w:rPr>
+                                <w:rFonts w:ascii="Times New Roman" w:hAnsi="Times New Roman" w:cs="Times New Roman"/>
+                                <w:b/>
+                                <w:bCs/>
+                                <w:lang w:val="tr-TR"/>
+                              </w:rPr>
+                              <w:t xml:space="preserve"> is 0.835</w:t>
+                            </w:r>
+                          </w:p>
+                        </w:txbxContent>
+                      </wps:txbx>
+                      <wps:bodyPr rot="0" spcFirstLastPara="0" vertOverflow="overflow" horzOverflow="overflow" vert="horz" wrap="square" lIns="0" tIns="0" rIns="0" bIns="0" numCol="1" spcCol="0" rtlCol="0" fromWordArt="0" anchor="t" anchorCtr="0" forceAA="0" compatLnSpc="1">
+                        <a:prstTxWarp prst="textNoShape">
+                          <a:avLst/>
+                        </a:prstTxWarp>
+                        <a:spAutoFit/>
+                      </wps:bodyPr>
+                    </wps:wsp>
+                  </a:graphicData>
+                </a:graphic>
+              </wp:anchor>
+            </w:drawing>
+          </mc:Choice>
+          <mc:Fallback>
+            <w:pict>
+              <v:shape w14:anchorId="5420D7C1" id="_x0000_s1028" type="#_x0000_t202" style="position:absolute;margin-left:-30.45pt;margin-top:353.35pt;width:508.25pt;height:.05pt;z-index:251666432;visibility:visible;mso-wrap-style:square;mso-wrap-distance-left:9pt;mso-wrap-distance-top:0;mso-wrap-distance-right:9pt;mso-wrap-distance-bottom:0;mso-position-horizontal:absolute;mso-position-horizontal-relative:text;mso-position-vertical:absolute;mso-position-vertical-relative:text;v-text-anchor:top" o:gfxdata="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" stroked="f">
+                <v:textbox style="mso-fit-shape-to-text:t" inset="0,0,0,0">
+                  <w:txbxContent>
+                    <w:p>
+                      <w:pPr>
+                        <w:pStyle w:val="ResimYazs"/>
+                        <w:rPr>
+                          <w:rFonts w:ascii="Times New Roman" w:eastAsia="Times New Roman" w:hAnsi="Times New Roman" w:cs="Times New Roman"/>
+                          <w:b/>
+                          <w:bCs/>
+                          <w:noProof/>
+                          <w:lang w:val="tr-TR"/>
+                        </w:rPr>
+                      </w:pPr>
+                      <w:proofErr w:type="spellStart"/>
+                      <w:r>
+                        <w:rPr>
+                          <w:rFonts w:ascii="Times New Roman" w:hAnsi="Times New Roman" w:cs="Times New Roman"/>
+                          <w:b/>
+                          <w:bCs/>
+                          <w:lang w:val="tr-TR"/>
+                        </w:rPr>
+                        <w:t>Figure</w:t>
+                      </w:r>
+                      <w:proofErr w:type="spellEnd"/>
+                      <w:r>
+                        <w:rPr>
+                          <w:rFonts w:ascii="Times New Roman" w:hAnsi="Times New Roman" w:cs="Times New Roman"/>
+                          <w:b/>
+                          <w:bCs/>
+                          <w:lang w:val="tr-TR"/>
+                        </w:rPr>
+                        <w:t xml:space="preserve"> 3: Learning </w:t>
+                      </w:r>
+                      <w:proofErr w:type="spellStart"/>
+                      <w:r>
+                        <w:rPr>
+                          <w:rFonts w:ascii="Times New Roman" w:hAnsi="Times New Roman" w:cs="Times New Roman"/>
+                          <w:b/>
+                          <w:bCs/>
+                          <w:lang w:val="tr-TR"/>
+                        </w:rPr>
+                        <w:t>to</w:t>
+                      </w:r>
+                      <w:proofErr w:type="spellEnd"/>
+                      <w:r>
+                        <w:rPr>
+                          <w:rFonts w:ascii="Times New Roman" w:hAnsi="Times New Roman" w:cs="Times New Roman"/>
+                          <w:b/>
+                          <w:bCs/>
+                          <w:lang w:val="tr-TR"/>
+                        </w:rPr>
+                        <w:t xml:space="preserve"> </w:t>
+                      </w:r>
+                      <w:proofErr w:type="spellStart"/>
+                      <w:r>
+                        <w:rPr>
+                          <w:rFonts w:ascii="Times New Roman" w:hAnsi="Times New Roman" w:cs="Times New Roman"/>
+                          <w:b/>
+                          <w:bCs/>
+                          <w:lang w:val="tr-TR"/>
+                        </w:rPr>
+                        <w:t>Defer</w:t>
+                      </w:r>
+                      <w:proofErr w:type="spellEnd"/>
+                      <w:r>
+                        <w:rPr>
+                          <w:rFonts w:ascii="Times New Roman" w:hAnsi="Times New Roman" w:cs="Times New Roman"/>
+                          <w:b/>
+                          <w:bCs/>
+                          <w:lang w:val="tr-TR"/>
+                        </w:rPr>
+                        <w:t xml:space="preserve"> </w:t>
+                      </w:r>
+                      <w:proofErr w:type="spellStart"/>
+                      <w:r>
+                        <w:rPr>
+                          <w:rFonts w:ascii="Times New Roman" w:hAnsi="Times New Roman" w:cs="Times New Roman"/>
+                          <w:b/>
+                          <w:bCs/>
+                          <w:lang w:val="tr-TR"/>
+                        </w:rPr>
+                        <w:t>Strategy</w:t>
+                      </w:r>
+                      <w:proofErr w:type="spellEnd"/>
+                      <w:r>
+                        <w:rPr>
+                          <w:rFonts w:ascii="Times New Roman" w:hAnsi="Times New Roman" w:cs="Times New Roman"/>
+                          <w:b/>
+                          <w:bCs/>
+                          <w:lang w:val="tr-TR"/>
+                        </w:rPr>
+                        <w:t xml:space="preserve"> Evaluation </w:t>
+                      </w:r>
+                      <w:proofErr w:type="spellStart"/>
+                      <w:r>
+                        <w:rPr>
+                          <w:rFonts w:ascii="Times New Roman" w:hAnsi="Times New Roman" w:cs="Times New Roman"/>
+                          <w:b/>
+                          <w:bCs/>
+                          <w:lang w:val="tr-TR"/>
+                        </w:rPr>
+                        <w:t>When</w:t>
+                      </w:r>
+                      <w:proofErr w:type="spellEnd"/>
+                      <w:r>
+                        <w:rPr>
+                          <w:rFonts w:ascii="Times New Roman" w:hAnsi="Times New Roman" w:cs="Times New Roman"/>
+                          <w:b/>
+                          <w:bCs/>
+                          <w:lang w:val="tr-TR"/>
+                        </w:rPr>
+                        <w:t xml:space="preserve"> </w:t>
+                      </w:r>
+                      <w:proofErr w:type="spellStart"/>
+                      <w:r>
+                        <w:rPr>
+                          <w:rFonts w:ascii="Times New Roman" w:hAnsi="Times New Roman" w:cs="Times New Roman"/>
+                          <w:b/>
+                          <w:bCs/>
+                          <w:lang w:val="tr-TR"/>
+                        </w:rPr>
+                        <w:t>Confidence</w:t>
+                      </w:r>
+                      <w:proofErr w:type="spellEnd"/>
+                      <w:r>
+                        <w:rPr>
+                          <w:rFonts w:ascii="Times New Roman" w:hAnsi="Times New Roman" w:cs="Times New Roman"/>
+                          <w:b/>
+                          <w:bCs/>
+                          <w:lang w:val="tr-TR"/>
+                        </w:rPr>
+                        <w:t xml:space="preserve"> </w:t>
+                      </w:r>
+                      <w:proofErr w:type="spellStart"/>
+                      <w:r>
+                        <w:rPr>
+                          <w:rFonts w:ascii="Times New Roman" w:hAnsi="Times New Roman" w:cs="Times New Roman"/>
+                          <w:b/>
+                          <w:bCs/>
+                          <w:lang w:val="tr-TR"/>
+                        </w:rPr>
+                        <w:t>Threshold</w:t>
+                      </w:r>
+                      <w:proofErr w:type="spellEnd"/>
+                      <w:r>
+                        <w:rPr>
+                          <w:rFonts w:ascii="Times New Roman" w:hAnsi="Times New Roman" w:cs="Times New Roman"/>
+                          <w:b/>
+                          <w:bCs/>
+                          <w:lang w:val="tr-TR"/>
+                        </w:rPr>
+                        <w:t xml:space="preserve"> is 0.835</w:t>
+                      </w:r>
+                    </w:p>
+                  </w:txbxContent>
+                </v:textbox>
+              </v:shape>
+            </w:pict>
+          </mc:Fallback>
+        </mc:AlternateContent>
+      </w:r>
+      <w:r>
+        <w:rPr>
           <w:rFonts w:ascii="Times New Roman" w:eastAsia="Times New Roman" w:hAnsi="Times New Roman" w:cs="Times New Roman"/>
           <w:b/>
           <w:bCs/>
-          <w:lang w:eastAsia="tr-TR"/>
-        </w:rPr>
-      </w:pPr>
+          <w:noProof/>
+          <w:lang w:eastAsia="tr-TR"/>
+        </w:rPr>
+        <w:drawing>
+          <wp:anchor distT="0" distB="0" distL="114300" distR="114300" simplePos="0" relativeHeight="251664384" behindDoc="0" locked="0" layoutInCell="1" allowOverlap="1" wp14:anchorId="28EE7D3A" wp14:editId="1EF1903D">
+            <wp:simplePos x="0" y="0"/>
+            <wp:positionH relativeFrom="column">
+              <wp:posOffset>-387275</wp:posOffset>
+            </wp:positionH>
+            <wp:positionV relativeFrom="paragraph">
+              <wp:posOffset>117287</wp:posOffset>
+            </wp:positionV>
+            <wp:extent cx="6454992" cy="4313817"/>
+            <wp:effectExtent l="0" t="0" r="0" b="4445"/>
+            <wp:wrapNone/>
+            <wp:docPr id="1943388553" name="Resim 3"/>
+            <wp:cNvGraphicFramePr>
+              <a:graphicFrameLocks xmlns:a="http://schemas.openxmlformats.org/drawingml/2006/main" noChangeAspect="1"/>
+            </wp:cNvGraphicFramePr>
+            <a:graphic xmlns:a="http://schemas.openxmlformats.org/drawingml/2006/main">
+              <a:graphicData uri="http://schemas.openxmlformats.org/drawingml/2006/picture">
+                <pic:pic xmlns:pic="http://schemas.openxmlformats.org/drawingml/2006/picture">
+                  <pic:nvPicPr>
+                    <pic:cNvPr id="1943388553" name="Resim 1943388553"/>
+                    <pic:cNvPicPr/>
+                  </pic:nvPicPr>
+                  <pic:blipFill>
+                    <a:blip r:embed="rId7" cstate="print">
+                      <a:extLst>
+                        <a:ext uri="{28A0092B-C50C-407E-A947-70E740481C1C}">
+                          <a14:useLocalDpi xmlns:a14="http://schemas.microsoft.com/office/drawing/2010/main" val="0"/>
+                        </a:ext>
+                      </a:extLst>
+                    </a:blip>
+                    <a:stretch>
+                      <a:fillRect/>
+                    </a:stretch>
+                  </pic:blipFill>
+                  <pic:spPr>
+                    <a:xfrm>
+                      <a:off x="0" y="0"/>
+                      <a:ext cx="6491641" cy="4338309"/>
+                    </a:xfrm>
+                    <a:prstGeom prst="rect">
+                      <a:avLst/>
+                    </a:prstGeom>
+                  </pic:spPr>
+                </pic:pic>
+              </a:graphicData>
+            </a:graphic>
+            <wp14:sizeRelH relativeFrom="page">
+              <wp14:pctWidth>0</wp14:pctWidth>
+            </wp14:sizeRelH>
+            <wp14:sizeRelV relativeFrom="page">
+              <wp14:pctHeight>0</wp14:pctHeight>
+            </wp14:sizeRelV>
+          </wp:anchor>
+        </w:drawing>
+      </w:r>
+    </w:p>
+    <w:p>
+      <w:pPr>
+        <w:rPr>
+          <w:rFonts w:ascii="Times New Roman" w:hAnsi="Times New Roman" w:cs="Times New Roman"/>
+          <w:b/>
+          <w:bCs/>
+          <w:u w:val="single"/>
+          <w:lang w:val="tr-TR"/>
+        </w:rPr>
+      </w:pPr>
+    </w:p>
+    <w:p>
+      <w:pPr>
+        <w:rPr>
+          <w:rFonts w:ascii="Times New Roman" w:hAnsi="Times New Roman" w:cs="Times New Roman"/>
+          <w:b/>
+          <w:bCs/>
+          <w:u w:val="single"/>
+          <w:lang w:val="tr-TR"/>
+        </w:rPr>
+      </w:pPr>
+    </w:p>
+    <w:p>
+      <w:pPr>
+        <w:rPr>
+          <w:rFonts w:ascii="Times New Roman" w:hAnsi="Times New Roman" w:cs="Times New Roman"/>
+          <w:b/>
+          <w:bCs/>
+          <w:u w:val="single"/>
+          <w:lang w:val="tr-TR"/>
+        </w:rPr>
+      </w:pPr>
+    </w:p>
+    <w:p>
+      <w:pPr>
+        <w:rPr>
+          <w:rFonts w:ascii="Times New Roman" w:hAnsi="Times New Roman" w:cs="Times New Roman"/>
+          <w:b/>
+          <w:bCs/>
+          <w:u w:val="single"/>
+          <w:lang w:val="tr-TR"/>
+        </w:rPr>
+      </w:pPr>
+    </w:p>
+    <w:p>
+      <w:pPr>
+        <w:rPr>
+          <w:rFonts w:ascii="Times New Roman" w:hAnsi="Times New Roman" w:cs="Times New Roman"/>
+          <w:b/>
+          <w:bCs/>
+          <w:u w:val="single"/>
+          <w:lang w:val="tr-TR"/>
+        </w:rPr>
+      </w:pPr>
+    </w:p>
+    <w:p>
+      <w:pPr>
+        <w:rPr>
+          <w:rFonts w:ascii="Times New Roman" w:hAnsi="Times New Roman" w:cs="Times New Roman"/>
+          <w:b/>
+          <w:bCs/>
+          <w:u w:val="single"/>
+          <w:lang w:val="tr-TR"/>
+        </w:rPr>
+      </w:pPr>
+    </w:p>
+    <w:p>
+      <w:pPr>
+        <w:rPr>
+          <w:rFonts w:ascii="Times New Roman" w:hAnsi="Times New Roman" w:cs="Times New Roman"/>
+          <w:b/>
+          <w:bCs/>
+          <w:u w:val="single"/>
+          <w:lang w:val="tr-TR"/>
+        </w:rPr>
+      </w:pPr>
+    </w:p>
+    <w:p>
+      <w:pPr>
+        <w:rPr>
+          <w:rFonts w:ascii="Times New Roman" w:hAnsi="Times New Roman" w:cs="Times New Roman"/>
+          <w:b/>
+          <w:bCs/>
+          <w:u w:val="single"/>
+          <w:lang w:val="tr-TR"/>
+        </w:rPr>
+      </w:pPr>
+    </w:p>
+    <w:p>
+      <w:pPr>
+        <w:rPr>
+          <w:rFonts w:ascii="Times New Roman" w:hAnsi="Times New Roman" w:cs="Times New Roman"/>
+          <w:b/>
+          <w:bCs/>
+          <w:u w:val="single"/>
+          <w:lang w:val="tr-TR"/>
+        </w:rPr>
+      </w:pPr>
+    </w:p>
+    <w:p>
+      <w:pPr>
+        <w:rPr>
+          <w:rFonts w:ascii="Times New Roman" w:hAnsi="Times New Roman" w:cs="Times New Roman"/>
+          <w:b/>
+          <w:bCs/>
+          <w:u w:val="single"/>
+          <w:lang w:val="tr-TR"/>
+        </w:rPr>
+      </w:pPr>
+    </w:p>
+    <w:p>
+      <w:pPr>
+        <w:rPr>
+          <w:rFonts w:ascii="Times New Roman" w:hAnsi="Times New Roman" w:cs="Times New Roman"/>
+          <w:b/>
+          <w:bCs/>
+          <w:u w:val="single"/>
+          <w:lang w:val="tr-TR"/>
+        </w:rPr>
+      </w:pPr>
+    </w:p>
+    <w:p>
+      <w:pPr>
+        <w:rPr>
+          <w:rFonts w:ascii="Times New Roman" w:hAnsi="Times New Roman" w:cs="Times New Roman"/>
+          <w:b/>
+          <w:bCs/>
+          <w:u w:val="single"/>
+          <w:lang w:val="tr-TR"/>
+        </w:rPr>
+      </w:pPr>
+    </w:p>
+    <w:p>
+      <w:pPr>
+        <w:rPr>
+          <w:rFonts w:ascii="Times New Roman" w:hAnsi="Times New Roman" w:cs="Times New Roman"/>
+          <w:b/>
+          <w:bCs/>
+          <w:u w:val="single"/>
+          <w:lang w:val="tr-TR"/>
+        </w:rPr>
+      </w:pPr>
+    </w:p>
+    <w:p>
+      <w:pPr>
+        <w:rPr>
+          <w:rFonts w:ascii="Times New Roman" w:hAnsi="Times New Roman" w:cs="Times New Roman"/>
+          <w:b/>
+          <w:bCs/>
+          <w:u w:val="single"/>
+          <w:lang w:val="tr-TR"/>
+        </w:rPr>
+      </w:pPr>
+    </w:p>
+    <w:p>
+      <w:pPr>
+        <w:rPr>
+          <w:rFonts w:ascii="Times New Roman" w:hAnsi="Times New Roman" w:cs="Times New Roman"/>
+          <w:b/>
+          <w:bCs/>
+          <w:u w:val="single"/>
+          <w:lang w:val="tr-TR"/>
+        </w:rPr>
+      </w:pPr>
+    </w:p>
+    <w:p>
+      <w:pPr>
+        <w:rPr>
+          <w:rFonts w:ascii="Times New Roman" w:hAnsi="Times New Roman" w:cs="Times New Roman"/>
+          <w:b/>
+          <w:bCs/>
+          <w:u w:val="single"/>
+          <w:lang w:val="tr-TR"/>
+        </w:rPr>
+      </w:pPr>
+      <w:r>
+        <w:rPr>
+          <w:noProof/>
+        </w:rPr>
+        <w:lastRenderedPageBreak/>
+        <mc:AlternateContent>
+          <mc:Choice Requires="wps">
+            <w:drawing>
+              <wp:anchor distT="0" distB="0" distL="114300" distR="114300" simplePos="0" relativeHeight="251669504" behindDoc="0" locked="0" layoutInCell="1" allowOverlap="1" wp14:anchorId="40724422" wp14:editId="0A98C41C">
+                <wp:simplePos x="0" y="0"/>
+                <wp:positionH relativeFrom="column">
+                  <wp:posOffset>-418465</wp:posOffset>
+                </wp:positionH>
+                <wp:positionV relativeFrom="paragraph">
+                  <wp:posOffset>3756025</wp:posOffset>
+                </wp:positionV>
+                <wp:extent cx="6432550" cy="635"/>
+                <wp:effectExtent l="0" t="0" r="6350" b="12065"/>
+                <wp:wrapNone/>
+                <wp:docPr id="2069058256" name="Metin Kutusu 1"/>
+                <wp:cNvGraphicFramePr/>
+                <a:graphic xmlns:a="http://schemas.openxmlformats.org/drawingml/2006/main">
+                  <a:graphicData uri="http://schemas.microsoft.com/office/word/2010/wordprocessingShape">
+                    <wps:wsp>
+                      <wps:cNvSpPr txBox="1"/>
+                      <wps:spPr>
+                        <a:xfrm>
+                          <a:off x="0" y="0"/>
+                          <a:ext cx="6432550" cy="635"/>
+                        </a:xfrm>
+                        <a:prstGeom prst="rect">
+                          <a:avLst/>
+                        </a:prstGeom>
+                        <a:solidFill>
+                          <a:prstClr val="white"/>
+                        </a:solidFill>
+                        <a:ln>
+                          <a:noFill/>
+                        </a:ln>
+                      </wps:spPr>
+                      <wps:txbx>
+                        <w:txbxContent>
+                          <w:p>
+                            <w:pPr>
+                              <w:pStyle w:val="ResimYazs"/>
+                              <w:rPr>
+                                <w:rFonts w:ascii="Times New Roman" w:hAnsi="Times New Roman" w:cs="Times New Roman"/>
+                                <w:b/>
+                                <w:bCs/>
+                                <w:noProof/>
+                                <w:u w:val="single"/>
+                                <w:lang w:val="tr-TR"/>
+                              </w:rPr>
+                            </w:pPr>
+                            <w:proofErr w:type="spellStart"/>
+                            <w:r>
+                              <w:rPr>
+                                <w:rFonts w:ascii="Times New Roman" w:hAnsi="Times New Roman" w:cs="Times New Roman"/>
+                                <w:b/>
+                                <w:bCs/>
+                                <w:lang w:val="tr-TR"/>
+                              </w:rPr>
+                              <w:t>Figure</w:t>
+                            </w:r>
+                            <w:proofErr w:type="spellEnd"/>
+                            <w:r>
+                              <w:rPr>
+                                <w:rFonts w:ascii="Times New Roman" w:hAnsi="Times New Roman" w:cs="Times New Roman"/>
+                                <w:b/>
+                                <w:bCs/>
+                                <w:lang w:val="tr-TR"/>
+                              </w:rPr>
+                              <w:t xml:space="preserve"> 4: Learning </w:t>
+                            </w:r>
+                            <w:proofErr w:type="spellStart"/>
+                            <w:r>
+                              <w:rPr>
+                                <w:rFonts w:ascii="Times New Roman" w:hAnsi="Times New Roman" w:cs="Times New Roman"/>
+                                <w:b/>
+                                <w:bCs/>
+                                <w:lang w:val="tr-TR"/>
+                              </w:rPr>
+                              <w:t>to</w:t>
+                            </w:r>
+                            <w:proofErr w:type="spellEnd"/>
+                            <w:r>
+                              <w:rPr>
+                                <w:rFonts w:ascii="Times New Roman" w:hAnsi="Times New Roman" w:cs="Times New Roman"/>
+                                <w:b/>
+                                <w:bCs/>
+                                <w:lang w:val="tr-TR"/>
+                              </w:rPr>
+                              <w:t xml:space="preserve"> </w:t>
+                            </w:r>
+                            <w:proofErr w:type="spellStart"/>
+                            <w:r>
+                              <w:rPr>
+                                <w:rFonts w:ascii="Times New Roman" w:hAnsi="Times New Roman" w:cs="Times New Roman"/>
+                                <w:b/>
+                                <w:bCs/>
+                                <w:lang w:val="tr-TR"/>
+                              </w:rPr>
+                              <w:t>Defer</w:t>
+                            </w:r>
+                            <w:proofErr w:type="spellEnd"/>
+                            <w:r>
+                              <w:rPr>
+                                <w:rFonts w:ascii="Times New Roman" w:hAnsi="Times New Roman" w:cs="Times New Roman"/>
+                                <w:b/>
+                                <w:bCs/>
+                                <w:lang w:val="tr-TR"/>
+                              </w:rPr>
+                              <w:t xml:space="preserve"> </w:t>
+                            </w:r>
+                            <w:proofErr w:type="spellStart"/>
+                            <w:r>
+                              <w:rPr>
+                                <w:rFonts w:ascii="Times New Roman" w:hAnsi="Times New Roman" w:cs="Times New Roman"/>
+                                <w:b/>
+                                <w:bCs/>
+                                <w:lang w:val="tr-TR"/>
+                              </w:rPr>
+                              <w:t>Strategy</w:t>
+                            </w:r>
+                            <w:proofErr w:type="spellEnd"/>
+                            <w:r>
+                              <w:rPr>
+                                <w:rFonts w:ascii="Times New Roman" w:hAnsi="Times New Roman" w:cs="Times New Roman"/>
+                                <w:b/>
+                                <w:bCs/>
+                                <w:lang w:val="tr-TR"/>
+                              </w:rPr>
+                              <w:t xml:space="preserve"> Evaluation </w:t>
+                            </w:r>
+                            <w:proofErr w:type="spellStart"/>
+                            <w:r>
+                              <w:rPr>
+                                <w:rFonts w:ascii="Times New Roman" w:hAnsi="Times New Roman" w:cs="Times New Roman"/>
+                                <w:b/>
+                                <w:bCs/>
+                                <w:lang w:val="tr-TR"/>
+                              </w:rPr>
+                              <w:t>When</w:t>
+                            </w:r>
+                            <w:proofErr w:type="spellEnd"/>
+                            <w:r>
+                              <w:rPr>
+                                <w:rFonts w:ascii="Times New Roman" w:hAnsi="Times New Roman" w:cs="Times New Roman"/>
+                                <w:b/>
+                                <w:bCs/>
+                                <w:lang w:val="tr-TR"/>
+                              </w:rPr>
+                              <w:t xml:space="preserve"> </w:t>
+                            </w:r>
+                            <w:proofErr w:type="spellStart"/>
+                            <w:r>
+                              <w:rPr>
+                                <w:rFonts w:ascii="Times New Roman" w:hAnsi="Times New Roman" w:cs="Times New Roman"/>
+                                <w:b/>
+                                <w:bCs/>
+                                <w:lang w:val="tr-TR"/>
+                              </w:rPr>
+                              <w:t>Confidence</w:t>
+                            </w:r>
+                            <w:proofErr w:type="spellEnd"/>
+                            <w:r>
+                              <w:rPr>
+                                <w:rFonts w:ascii="Times New Roman" w:hAnsi="Times New Roman" w:cs="Times New Roman"/>
+                                <w:b/>
+                                <w:bCs/>
+                                <w:lang w:val="tr-TR"/>
+                              </w:rPr>
+                              <w:t xml:space="preserve"> </w:t>
+                            </w:r>
+                            <w:proofErr w:type="spellStart"/>
+                            <w:r>
+                              <w:rPr>
+                                <w:rFonts w:ascii="Times New Roman" w:hAnsi="Times New Roman" w:cs="Times New Roman"/>
+                                <w:b/>
+                                <w:bCs/>
+                                <w:lang w:val="tr-TR"/>
+                              </w:rPr>
+                              <w:t>Threshold</w:t>
+                            </w:r>
+                            <w:proofErr w:type="spellEnd"/>
+                            <w:r>
+                              <w:rPr>
+                                <w:rFonts w:ascii="Times New Roman" w:hAnsi="Times New Roman" w:cs="Times New Roman"/>
+                                <w:b/>
+                                <w:bCs/>
+                                <w:lang w:val="tr-TR"/>
+                              </w:rPr>
+                              <w:t xml:space="preserve"> is 0.29</w:t>
+                            </w:r>
+                          </w:p>
+                        </w:txbxContent>
+                      </wps:txbx>
+                      <wps:bodyPr rot="0" spcFirstLastPara="0" vertOverflow="overflow" horzOverflow="overflow" vert="horz" wrap="square" lIns="0" tIns="0" rIns="0" bIns="0" numCol="1" spcCol="0" rtlCol="0" fromWordArt="0" anchor="t" anchorCtr="0" forceAA="0" compatLnSpc="1">
+                        <a:prstTxWarp prst="textNoShape">
+                          <a:avLst/>
+                        </a:prstTxWarp>
+                        <a:spAutoFit/>
+                      </wps:bodyPr>
+                    </wps:wsp>
+                  </a:graphicData>
+                </a:graphic>
+              </wp:anchor>
+            </w:drawing>
+          </mc:Choice>
+          <mc:Fallback>
+            <w:pict>
+              <v:shape w14:anchorId="40724422" id="_x0000_s1029" type="#_x0000_t202" style="position:absolute;margin-left:-32.95pt;margin-top:295.75pt;width:506.5pt;height:.05pt;z-index:251669504;visibility:visible;mso-wrap-style:square;mso-wrap-distance-left:9pt;mso-wrap-distance-top:0;mso-wrap-distance-right:9pt;mso-wrap-distance-bottom:0;mso-position-horizontal:absolute;mso-position-horizontal-relative:text;mso-position-vertical:absolute;mso-position-vertical-relative:text;v-text-anchor:top" o:gfxdata="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" stroked="f">
+                <v:textbox style="mso-fit-shape-to-text:t" inset="0,0,0,0">
+                  <w:txbxContent>
+                    <w:p>
+                      <w:pPr>
+                        <w:pStyle w:val="ResimYazs"/>
+                        <w:rPr>
+                          <w:rFonts w:ascii="Times New Roman" w:hAnsi="Times New Roman" w:cs="Times New Roman"/>
+                          <w:b/>
+                          <w:bCs/>
+                          <w:noProof/>
+                          <w:u w:val="single"/>
+                          <w:lang w:val="tr-TR"/>
+                        </w:rPr>
+                      </w:pPr>
+                      <w:proofErr w:type="spellStart"/>
+                      <w:r>
+                        <w:rPr>
+                          <w:rFonts w:ascii="Times New Roman" w:hAnsi="Times New Roman" w:cs="Times New Roman"/>
+                          <w:b/>
+                          <w:bCs/>
+                          <w:lang w:val="tr-TR"/>
+                        </w:rPr>
+                        <w:t>Figure</w:t>
+                      </w:r>
+                      <w:proofErr w:type="spellEnd"/>
+                      <w:r>
+                        <w:rPr>
+                          <w:rFonts w:ascii="Times New Roman" w:hAnsi="Times New Roman" w:cs="Times New Roman"/>
+                          <w:b/>
+                          <w:bCs/>
+                          <w:lang w:val="tr-TR"/>
+                        </w:rPr>
+                        <w:t xml:space="preserve"> 4: Learning </w:t>
+                      </w:r>
+                      <w:proofErr w:type="spellStart"/>
+                      <w:r>
+                        <w:rPr>
+                          <w:rFonts w:ascii="Times New Roman" w:hAnsi="Times New Roman" w:cs="Times New Roman"/>
+                          <w:b/>
+                          <w:bCs/>
+                          <w:lang w:val="tr-TR"/>
+                        </w:rPr>
+                        <w:t>to</w:t>
+                      </w:r>
+                      <w:proofErr w:type="spellEnd"/>
+                      <w:r>
+                        <w:rPr>
+                          <w:rFonts w:ascii="Times New Roman" w:hAnsi="Times New Roman" w:cs="Times New Roman"/>
+                          <w:b/>
+                          <w:bCs/>
+                          <w:lang w:val="tr-TR"/>
+                        </w:rPr>
+                        <w:t xml:space="preserve"> </w:t>
+                      </w:r>
+                      <w:proofErr w:type="spellStart"/>
+                      <w:r>
+                        <w:rPr>
+                          <w:rFonts w:ascii="Times New Roman" w:hAnsi="Times New Roman" w:cs="Times New Roman"/>
+                          <w:b/>
+                          <w:bCs/>
+                          <w:lang w:val="tr-TR"/>
+                        </w:rPr>
+                        <w:t>Defer</w:t>
+                      </w:r>
+                      <w:proofErr w:type="spellEnd"/>
+                      <w:r>
+                        <w:rPr>
+                          <w:rFonts w:ascii="Times New Roman" w:hAnsi="Times New Roman" w:cs="Times New Roman"/>
+                          <w:b/>
+                          <w:bCs/>
+                          <w:lang w:val="tr-TR"/>
+                        </w:rPr>
+                        <w:t xml:space="preserve"> </w:t>
+                      </w:r>
+                      <w:proofErr w:type="spellStart"/>
+                      <w:r>
+                        <w:rPr>
+                          <w:rFonts w:ascii="Times New Roman" w:hAnsi="Times New Roman" w:cs="Times New Roman"/>
+                          <w:b/>
+                          <w:bCs/>
+                          <w:lang w:val="tr-TR"/>
+                        </w:rPr>
+                        <w:t>Strategy</w:t>
+                      </w:r>
+                      <w:proofErr w:type="spellEnd"/>
+                      <w:r>
+                        <w:rPr>
+                          <w:rFonts w:ascii="Times New Roman" w:hAnsi="Times New Roman" w:cs="Times New Roman"/>
+                          <w:b/>
+                          <w:bCs/>
+                          <w:lang w:val="tr-TR"/>
+                        </w:rPr>
+                        <w:t xml:space="preserve"> Evaluation </w:t>
+                      </w:r>
+                      <w:proofErr w:type="spellStart"/>
+                      <w:r>
+                        <w:rPr>
+                          <w:rFonts w:ascii="Times New Roman" w:hAnsi="Times New Roman" w:cs="Times New Roman"/>
+                          <w:b/>
+                          <w:bCs/>
+                          <w:lang w:val="tr-TR"/>
+                        </w:rPr>
+                        <w:t>When</w:t>
+                      </w:r>
+                      <w:proofErr w:type="spellEnd"/>
+                      <w:r>
+                        <w:rPr>
+                          <w:rFonts w:ascii="Times New Roman" w:hAnsi="Times New Roman" w:cs="Times New Roman"/>
+                          <w:b/>
+                          <w:bCs/>
+                          <w:lang w:val="tr-TR"/>
+                        </w:rPr>
+                        <w:t xml:space="preserve"> </w:t>
+                      </w:r>
+                      <w:proofErr w:type="spellStart"/>
+                      <w:r>
+                        <w:rPr>
+                          <w:rFonts w:ascii="Times New Roman" w:hAnsi="Times New Roman" w:cs="Times New Roman"/>
+                          <w:b/>
+                          <w:bCs/>
+                          <w:lang w:val="tr-TR"/>
+                        </w:rPr>
+                        <w:t>Confidence</w:t>
+                      </w:r>
+                      <w:proofErr w:type="spellEnd"/>
+                      <w:r>
+                        <w:rPr>
+                          <w:rFonts w:ascii="Times New Roman" w:hAnsi="Times New Roman" w:cs="Times New Roman"/>
+                          <w:b/>
+                          <w:bCs/>
+                          <w:lang w:val="tr-TR"/>
+                        </w:rPr>
+                        <w:t xml:space="preserve"> </w:t>
+                      </w:r>
+                      <w:proofErr w:type="spellStart"/>
+                      <w:r>
+                        <w:rPr>
+                          <w:rFonts w:ascii="Times New Roman" w:hAnsi="Times New Roman" w:cs="Times New Roman"/>
+                          <w:b/>
+                          <w:bCs/>
+                          <w:lang w:val="tr-TR"/>
+                        </w:rPr>
+                        <w:t>Threshold</w:t>
+                      </w:r>
+                      <w:proofErr w:type="spellEnd"/>
+                      <w:r>
+                        <w:rPr>
+                          <w:rFonts w:ascii="Times New Roman" w:hAnsi="Times New Roman" w:cs="Times New Roman"/>
+                          <w:b/>
+                          <w:bCs/>
+                          <w:lang w:val="tr-TR"/>
+                        </w:rPr>
+                        <w:t xml:space="preserve"> is 0.29</w:t>
+                      </w:r>
+                    </w:p>
+                  </w:txbxContent>
+                </v:textbox>
+              </v:shape>
+            </w:pict>
+          </mc:Fallback>
+        </mc:AlternateContent>
+      </w:r>
+      <w:r>
+        <w:rPr>
+          <w:rFonts w:ascii="Times New Roman" w:hAnsi="Times New Roman" w:cs="Times New Roman"/>
+          <w:b/>
+          <w:bCs/>
+          <w:noProof/>
+          <w:u w:val="single"/>
+          <w:lang w:val="tr-TR"/>
+        </w:rPr>
+        <w:drawing>
+          <wp:anchor distT="0" distB="0" distL="114300" distR="114300" simplePos="0" relativeHeight="251667456" behindDoc="0" locked="0" layoutInCell="1" allowOverlap="1" wp14:anchorId="5B641FDB" wp14:editId="351BD2CB">
+            <wp:simplePos x="0" y="0"/>
+            <wp:positionH relativeFrom="column">
+              <wp:posOffset>-418913</wp:posOffset>
+            </wp:positionH>
+            <wp:positionV relativeFrom="paragraph">
+              <wp:posOffset>-527050</wp:posOffset>
+            </wp:positionV>
+            <wp:extent cx="6433073" cy="4226471"/>
+            <wp:effectExtent l="0" t="0" r="0" b="3175"/>
+            <wp:wrapNone/>
+            <wp:docPr id="519262873" name="Resim 4"/>
+            <wp:cNvGraphicFramePr>
+              <a:graphicFrameLocks xmlns:a="http://schemas.openxmlformats.org/drawingml/2006/main" noChangeAspect="1"/>
+            </wp:cNvGraphicFramePr>
+            <a:graphic xmlns:a="http://schemas.openxmlformats.org/drawingml/2006/main">
+              <a:graphicData uri="http://schemas.openxmlformats.org/drawingml/2006/picture">
+                <pic:pic xmlns:pic="http://schemas.openxmlformats.org/drawingml/2006/picture">
+                  <pic:nvPicPr>
+                    <pic:cNvPr id="519262873" name="Resim 519262873"/>
+                    <pic:cNvPicPr/>
+                  </pic:nvPicPr>
+                  <pic:blipFill>
+                    <a:blip r:embed="rId8" cstate="print">
+                      <a:extLst>
+                        <a:ext uri="{28A0092B-C50C-407E-A947-70E740481C1C}">
+                          <a14:useLocalDpi xmlns:a14="http://schemas.microsoft.com/office/drawing/2010/main" val="0"/>
+                        </a:ext>
+                      </a:extLst>
+                    </a:blip>
+                    <a:stretch>
+                      <a:fillRect/>
+                    </a:stretch>
+                  </pic:blipFill>
+                  <pic:spPr>
+                    <a:xfrm>
+                      <a:off x="0" y="0"/>
+                      <a:ext cx="6433073" cy="4226471"/>
+                    </a:xfrm>
+                    <a:prstGeom prst="rect">
+                      <a:avLst/>
+                    </a:prstGeom>
+                  </pic:spPr>
+                </pic:pic>
+              </a:graphicData>
+            </a:graphic>
+            <wp14:sizeRelH relativeFrom="page">
+              <wp14:pctWidth>0</wp14:pctWidth>
+            </wp14:sizeRelH>
+            <wp14:sizeRelV relativeFrom="page">
+              <wp14:pctHeight>0</wp14:pctHeight>
+            </wp14:sizeRelV>
+          </wp:anchor>
+        </w:drawing>
+      </w:r>
+    </w:p>
+    <w:p>
+      <w:pPr>
+        <w:rPr>
+          <w:rFonts w:ascii="Times New Roman" w:hAnsi="Times New Roman" w:cs="Times New Roman"/>
+          <w:b/>
+          <w:bCs/>
+          <w:u w:val="single"/>
+          <w:lang w:val="tr-TR"/>
+        </w:rPr>
+      </w:pPr>
+    </w:p>
+    <w:p>
+      <w:pPr>
+        <w:rPr>
+          <w:rFonts w:ascii="Times New Roman" w:hAnsi="Times New Roman" w:cs="Times New Roman"/>
+          <w:b/>
+          <w:bCs/>
+          <w:u w:val="single"/>
+          <w:lang w:val="tr-TR"/>
+        </w:rPr>
+      </w:pPr>
+    </w:p>
+    <w:p>
+      <w:pPr>
+        <w:rPr>
+          <w:rFonts w:ascii="Times New Roman" w:hAnsi="Times New Roman" w:cs="Times New Roman"/>
+          <w:b/>
+          <w:bCs/>
+          <w:u w:val="single"/>
+          <w:lang w:val="tr-TR"/>
+        </w:rPr>
+      </w:pPr>
+    </w:p>
+    <w:p>
+      <w:pPr>
+        <w:rPr>
+          <w:rFonts w:ascii="Times New Roman" w:hAnsi="Times New Roman" w:cs="Times New Roman"/>
+          <w:b/>
+          <w:bCs/>
+          <w:u w:val="single"/>
+          <w:lang w:val="tr-TR"/>
+        </w:rPr>
+      </w:pPr>
+    </w:p>
+    <w:p>
+      <w:pPr>
+        <w:rPr>
+          <w:rFonts w:ascii="Times New Roman" w:hAnsi="Times New Roman" w:cs="Times New Roman"/>
+          <w:b/>
+          <w:bCs/>
+          <w:u w:val="single"/>
+          <w:lang w:val="tr-TR"/>
+        </w:rPr>
+      </w:pPr>
+    </w:p>
+    <w:p>
+      <w:pPr>
+        <w:rPr>
+          <w:rFonts w:ascii="Times New Roman" w:hAnsi="Times New Roman" w:cs="Times New Roman"/>
+          <w:b/>
+          <w:bCs/>
+          <w:u w:val="single"/>
+          <w:lang w:val="tr-TR"/>
+        </w:rPr>
+      </w:pPr>
+    </w:p>
+    <w:p>
+      <w:pPr>
+        <w:rPr>
+          <w:rFonts w:ascii="Times New Roman" w:hAnsi="Times New Roman" w:cs="Times New Roman"/>
+          <w:b/>
+          <w:bCs/>
+          <w:u w:val="single"/>
+          <w:lang w:val="tr-TR"/>
+        </w:rPr>
+      </w:pPr>
+    </w:p>
+    <w:p>
+      <w:pPr>
+        <w:rPr>
+          <w:rFonts w:ascii="Times New Roman" w:hAnsi="Times New Roman" w:cs="Times New Roman"/>
+          <w:b/>
+          <w:bCs/>
+          <w:u w:val="single"/>
+          <w:lang w:val="tr-TR"/>
+        </w:rPr>
+      </w:pPr>
+    </w:p>
+    <w:p>
+      <w:pPr>
+        <w:rPr>
+          <w:rFonts w:ascii="Times New Roman" w:hAnsi="Times New Roman" w:cs="Times New Roman"/>
+          <w:b/>
+          <w:bCs/>
+          <w:u w:val="single"/>
+          <w:lang w:val="tr-TR"/>
+        </w:rPr>
+      </w:pPr>
+    </w:p>
+    <w:p>
+      <w:pPr>
+        <w:rPr>
+          <w:rFonts w:ascii="Times New Roman" w:hAnsi="Times New Roman" w:cs="Times New Roman"/>
+          <w:b/>
+          <w:bCs/>
+          <w:u w:val="single"/>
+          <w:lang w:val="tr-TR"/>
+        </w:rPr>
+      </w:pPr>
+    </w:p>
+    <w:p>
+      <w:pPr>
+        <w:rPr>
+          <w:rFonts w:ascii="Times New Roman" w:hAnsi="Times New Roman" w:cs="Times New Roman"/>
+          <w:b/>
+          <w:bCs/>
+          <w:u w:val="single"/>
+          <w:lang w:val="tr-TR"/>
+        </w:rPr>
+      </w:pPr>
+    </w:p>
+    <w:p>
+      <w:pPr>
+        <w:rPr>
+          <w:rFonts w:ascii="Times New Roman" w:hAnsi="Times New Roman" w:cs="Times New Roman"/>
+          <w:b/>
+          <w:bCs/>
+          <w:u w:val="single"/>
+          <w:lang w:val="tr-TR"/>
+        </w:rPr>
+      </w:pPr>
+    </w:p>
+    <w:p>
+      <w:pPr>
+        <w:rPr>
+          <w:rFonts w:ascii="Times New Roman" w:hAnsi="Times New Roman" w:cs="Times New Roman"/>
+          <w:b/>
+          <w:bCs/>
+          <w:u w:val="single"/>
+          <w:lang w:val="tr-TR"/>
+        </w:rPr>
+      </w:pPr>
+    </w:p>
+    <w:p>
+      <w:pPr>
+        <w:rPr>
+          <w:rFonts w:ascii="Times New Roman" w:hAnsi="Times New Roman" w:cs="Times New Roman"/>
+          <w:b/>
+          <w:bCs/>
+          <w:u w:val="single"/>
+          <w:lang w:val="tr-TR"/>
+        </w:rPr>
+      </w:pPr>
+    </w:p>
+    <w:p>
+      <w:pPr>
+        <w:rPr>
+          <w:rFonts w:ascii="Times New Roman" w:eastAsia="Times New Roman" w:hAnsi="Times New Roman" w:cs="Times New Roman"/>
+          <w:b/>
+          <w:bCs/>
+          <w:lang w:eastAsia="tr-TR"/>
+        </w:rPr>
+      </w:pPr>
+      <w:proofErr w:type="spellStart"/>
+      <w:r>
+        <w:rPr>
+          <w:rFonts w:ascii="Times New Roman" w:hAnsi="Times New Roman" w:cs="Times New Roman"/>
+          <w:b/>
+          <w:bCs/>
+          <w:u w:val="single"/>
+          <w:lang w:val="tr-TR"/>
+        </w:rPr>
+        <w:t>Task</w:t>
+      </w:r>
+      <w:proofErr w:type="spellEnd"/>
+      <w:r>
+        <w:rPr>
+          <w:rFonts w:ascii="Times New Roman" w:hAnsi="Times New Roman" w:cs="Times New Roman"/>
+          <w:b/>
+          <w:bCs/>
+          <w:u w:val="single"/>
+          <w:lang w:val="tr-TR"/>
+        </w:rPr>
+        <w:t xml:space="preserve"> </w:t>
+      </w:r>
+      <w:r>
+        <w:rPr>
+          <w:rFonts w:ascii="Times New Roman" w:hAnsi="Times New Roman" w:cs="Times New Roman"/>
+          <w:b/>
+          <w:bCs/>
+          <w:u w:val="single"/>
+          <w:lang w:val="tr-TR"/>
+        </w:rPr>
+        <w:t>4</w:t>
+      </w:r>
+      <w:r>
+        <w:rPr>
+          <w:rFonts w:ascii="Times New Roman" w:hAnsi="Times New Roman" w:cs="Times New Roman"/>
+          <w:b/>
+          <w:bCs/>
+          <w:u w:val="single"/>
+          <w:lang w:val="tr-TR"/>
+        </w:rPr>
+        <w:t>:</w:t>
+      </w:r>
     </w:p>
     <w:p>
       <w:pPr>
@@ -7418,6 +9498,25 @@
       <w:spacing w:val="5"/>
     </w:rPr>
   </w:style>
+  <w:style w:type="paragraph" w:styleId="ResimYazs">
+    <w:name w:val="caption"/>
+    <w:basedOn w:val="Normal"/>
+    <w:next w:val="Normal"/>
+    <w:uiPriority w:val="35"/>
+    <w:unhideWhenUsed/>
+    <w:qFormat/>
+    <w:rsid w:val="00200BF7"/>
+    <w:pPr>
+      <w:spacing w:after="200" w:line="240" w:lineRule="auto"/>
+    </w:pPr>
+    <w:rPr>
+      <w:i/>
+      <w:iCs/>
+      <w:color w:val="0E2841" w:themeColor="text2"/>
+      <w:sz w:val="18"/>
+      <w:szCs w:val="18"/>
+    </w:rPr>
+  </w:style>
 </w:styles>
 </file>
 

</xml_diff>

<commit_message>
add the latest accuracy value, total query, and manual query counts
</commit_message>
<xml_diff>
--- a/Project3_Report.docx
+++ b/Project3_Report.docx
@@ -20,8 +20,9 @@
           <w:u w:val="single"/>
           <w:lang w:val="tr-TR"/>
         </w:rPr>
-        <w:t xml:space="preserve">Human-Centric Artificial Intelligence </w:t>
-      </w:r>
+        <w:t>Human-</w:t>
+      </w:r>
+      <w:proofErr w:type="spellStart"/>
       <w:r>
         <w:rPr>
           <w:rFonts w:ascii="Times New Roman" w:hAnsi="Times New Roman" w:cs="Times New Roman"/>
@@ -30,6 +31,71 @@
           <w:u w:val="single"/>
           <w:lang w:val="tr-TR"/>
         </w:rPr>
+        <w:t>Centric</w:t>
+      </w:r>
+      <w:proofErr w:type="spellEnd"/>
+      <w:r>
+        <w:rPr>
+          <w:rFonts w:ascii="Times New Roman" w:hAnsi="Times New Roman" w:cs="Times New Roman"/>
+          <w:b/>
+          <w:bCs/>
+          <w:u w:val="single"/>
+          <w:lang w:val="tr-TR"/>
+        </w:rPr>
+        <w:t xml:space="preserve"> </w:t>
+      </w:r>
+      <w:proofErr w:type="spellStart"/>
+      <w:r>
+        <w:rPr>
+          <w:rFonts w:ascii="Times New Roman" w:hAnsi="Times New Roman" w:cs="Times New Roman"/>
+          <w:b/>
+          <w:bCs/>
+          <w:u w:val="single"/>
+          <w:lang w:val="tr-TR"/>
+        </w:rPr>
+        <w:t>Artificial</w:t>
+      </w:r>
+      <w:proofErr w:type="spellEnd"/>
+      <w:r>
+        <w:rPr>
+          <w:rFonts w:ascii="Times New Roman" w:hAnsi="Times New Roman" w:cs="Times New Roman"/>
+          <w:b/>
+          <w:bCs/>
+          <w:u w:val="single"/>
+          <w:lang w:val="tr-TR"/>
+        </w:rPr>
+        <w:t xml:space="preserve"> </w:t>
+      </w:r>
+      <w:proofErr w:type="spellStart"/>
+      <w:r>
+        <w:rPr>
+          <w:rFonts w:ascii="Times New Roman" w:hAnsi="Times New Roman" w:cs="Times New Roman"/>
+          <w:b/>
+          <w:bCs/>
+          <w:u w:val="single"/>
+          <w:lang w:val="tr-TR"/>
+        </w:rPr>
+        <w:t>Intelligence</w:t>
+      </w:r>
+      <w:proofErr w:type="spellEnd"/>
+      <w:r>
+        <w:rPr>
+          <w:rFonts w:ascii="Times New Roman" w:hAnsi="Times New Roman" w:cs="Times New Roman"/>
+          <w:b/>
+          <w:bCs/>
+          <w:u w:val="single"/>
+          <w:lang w:val="tr-TR"/>
+        </w:rPr>
+        <w:t xml:space="preserve"> </w:t>
+      </w:r>
+      <w:r>
+        <w:rPr>
+          <w:rFonts w:ascii="Times New Roman" w:hAnsi="Times New Roman" w:cs="Times New Roman"/>
+          <w:b/>
+          <w:bCs/>
+          <w:u w:val="single"/>
+          <w:lang w:val="tr-TR"/>
+        </w:rPr>
         <w:t xml:space="preserve">Project-3 Report </w:t>
       </w:r>
     </w:p>
@@ -47,7 +113,27 @@
           <w:bCs/>
           <w:lang w:val="tr-TR"/>
         </w:rPr>
-        <w:t xml:space="preserve">Name – Surname: </w:t>
+        <w:t xml:space="preserve">Name – </w:t>
+      </w:r>
+      <w:proofErr w:type="spellStart"/>
+      <w:r>
+        <w:rPr>
+          <w:rFonts w:ascii="Times New Roman" w:hAnsi="Times New Roman" w:cs="Times New Roman"/>
+          <w:b/>
+          <w:bCs/>
+          <w:lang w:val="tr-TR"/>
+        </w:rPr>
+        <w:t>Surname</w:t>
+      </w:r>
+      <w:proofErr w:type="spellEnd"/>
+      <w:r>
+        <w:rPr>
+          <w:rFonts w:ascii="Times New Roman" w:hAnsi="Times New Roman" w:cs="Times New Roman"/>
+          <w:b/>
+          <w:bCs/>
+          <w:lang w:val="tr-TR"/>
+        </w:rPr>
+        <w:t xml:space="preserve">: </w:t>
       </w:r>
       <w:r>
         <w:rPr>
@@ -64,14 +150,45 @@
           <w:lang w:val="tr-TR"/>
         </w:rPr>
       </w:pPr>
-      <w:r>
-        <w:rPr>
-          <w:rFonts w:ascii="Times New Roman" w:hAnsi="Times New Roman" w:cs="Times New Roman"/>
-          <w:b/>
-          <w:bCs/>
-          <w:lang w:val="tr-TR"/>
-        </w:rPr>
-        <w:t>Matriculation Number:</w:t>
+      <w:proofErr w:type="spellStart"/>
+      <w:r>
+        <w:rPr>
+          <w:rFonts w:ascii="Times New Roman" w:hAnsi="Times New Roman" w:cs="Times New Roman"/>
+          <w:b/>
+          <w:bCs/>
+          <w:lang w:val="tr-TR"/>
+        </w:rPr>
+        <w:t>Matriculation</w:t>
+      </w:r>
+      <w:proofErr w:type="spellEnd"/>
+      <w:r>
+        <w:rPr>
+          <w:rFonts w:ascii="Times New Roman" w:hAnsi="Times New Roman" w:cs="Times New Roman"/>
+          <w:b/>
+          <w:bCs/>
+          <w:lang w:val="tr-TR"/>
+        </w:rPr>
+        <w:t xml:space="preserve"> </w:t>
+      </w:r>
+      <w:proofErr w:type="spellStart"/>
+      <w:r>
+        <w:rPr>
+          <w:rFonts w:ascii="Times New Roman" w:hAnsi="Times New Roman" w:cs="Times New Roman"/>
+          <w:b/>
+          <w:bCs/>
+          <w:lang w:val="tr-TR"/>
+        </w:rPr>
+        <w:t>Number</w:t>
+      </w:r>
+      <w:proofErr w:type="spellEnd"/>
+      <w:r>
+        <w:rPr>
+          <w:rFonts w:ascii="Times New Roman" w:hAnsi="Times New Roman" w:cs="Times New Roman"/>
+          <w:b/>
+          <w:bCs/>
+          <w:lang w:val="tr-TR"/>
+        </w:rPr>
+        <w:t>:</w:t>
       </w:r>
       <w:r>
         <w:rPr>
@@ -91,6 +208,7 @@
           <w:lang w:val="tr-TR"/>
         </w:rPr>
       </w:pPr>
+      <w:proofErr w:type="spellStart"/>
       <w:r>
         <w:rPr>
           <w:rFonts w:ascii="Times New Roman" w:hAnsi="Times New Roman" w:cs="Times New Roman"/>
@@ -99,7 +217,194 @@
           <w:u w:val="single"/>
           <w:lang w:val="tr-TR"/>
         </w:rPr>
-        <w:t xml:space="preserve">In this project, the following class mappings are used: </w:t>
+        <w:t>In</w:t>
+      </w:r>
+      <w:proofErr w:type="spellEnd"/>
+      <w:r>
+        <w:rPr>
+          <w:rFonts w:ascii="Times New Roman" w:hAnsi="Times New Roman" w:cs="Times New Roman"/>
+          <w:b/>
+          <w:bCs/>
+          <w:u w:val="single"/>
+          <w:lang w:val="tr-TR"/>
+        </w:rPr>
+        <w:t xml:space="preserve"> </w:t>
+      </w:r>
+      <w:proofErr w:type="spellStart"/>
+      <w:r>
+        <w:rPr>
+          <w:rFonts w:ascii="Times New Roman" w:hAnsi="Times New Roman" w:cs="Times New Roman"/>
+          <w:b/>
+          <w:bCs/>
+          <w:u w:val="single"/>
+          <w:lang w:val="tr-TR"/>
+        </w:rPr>
+        <w:t>this</w:t>
+      </w:r>
+      <w:proofErr w:type="spellEnd"/>
+      <w:r>
+        <w:rPr>
+          <w:rFonts w:ascii="Times New Roman" w:hAnsi="Times New Roman" w:cs="Times New Roman"/>
+          <w:b/>
+          <w:bCs/>
+          <w:u w:val="single"/>
+          <w:lang w:val="tr-TR"/>
+        </w:rPr>
+        <w:t xml:space="preserve"> </w:t>
+      </w:r>
+      <w:proofErr w:type="spellStart"/>
+      <w:r>
+        <w:rPr>
+          <w:rFonts w:ascii="Times New Roman" w:hAnsi="Times New Roman" w:cs="Times New Roman"/>
+          <w:b/>
+          <w:bCs/>
+          <w:u w:val="single"/>
+          <w:lang w:val="tr-TR"/>
+        </w:rPr>
+        <w:t>project</w:t>
+      </w:r>
+      <w:proofErr w:type="spellEnd"/>
+      <w:r>
+        <w:rPr>
+          <w:rFonts w:ascii="Times New Roman" w:hAnsi="Times New Roman" w:cs="Times New Roman"/>
+          <w:b/>
+          <w:bCs/>
+          <w:u w:val="single"/>
+          <w:lang w:val="tr-TR"/>
+        </w:rPr>
+        <w:t xml:space="preserve">, </w:t>
+      </w:r>
+      <w:proofErr w:type="spellStart"/>
+      <w:r>
+        <w:rPr>
+          <w:rFonts w:ascii="Times New Roman" w:hAnsi="Times New Roman" w:cs="Times New Roman"/>
+          <w:b/>
+          <w:bCs/>
+          <w:u w:val="single"/>
+          <w:lang w:val="tr-TR"/>
+        </w:rPr>
+        <w:t>the</w:t>
+      </w:r>
+      <w:proofErr w:type="spellEnd"/>
+      <w:r>
+        <w:rPr>
+          <w:rFonts w:ascii="Times New Roman" w:hAnsi="Times New Roman" w:cs="Times New Roman"/>
+          <w:b/>
+          <w:bCs/>
+          <w:u w:val="single"/>
+          <w:lang w:val="tr-TR"/>
+        </w:rPr>
+        <w:t xml:space="preserve"> </w:t>
+      </w:r>
+      <w:proofErr w:type="spellStart"/>
+      <w:r>
+        <w:rPr>
+          <w:rFonts w:ascii="Times New Roman" w:hAnsi="Times New Roman" w:cs="Times New Roman"/>
+          <w:b/>
+          <w:bCs/>
+          <w:u w:val="single"/>
+          <w:lang w:val="tr-TR"/>
+        </w:rPr>
+        <w:t>following</w:t>
+      </w:r>
+      <w:proofErr w:type="spellEnd"/>
+      <w:r>
+        <w:rPr>
+          <w:rFonts w:ascii="Times New Roman" w:hAnsi="Times New Roman" w:cs="Times New Roman"/>
+          <w:b/>
+          <w:bCs/>
+          <w:u w:val="single"/>
+          <w:lang w:val="tr-TR"/>
+        </w:rPr>
+        <w:t xml:space="preserve"> </w:t>
+      </w:r>
+      <w:proofErr w:type="spellStart"/>
+      <w:r>
+        <w:rPr>
+          <w:rFonts w:ascii="Times New Roman" w:hAnsi="Times New Roman" w:cs="Times New Roman"/>
+          <w:b/>
+          <w:bCs/>
+          <w:u w:val="single"/>
+          <w:lang w:val="tr-TR"/>
+        </w:rPr>
+        <w:t>class</w:t>
+      </w:r>
+      <w:proofErr w:type="spellEnd"/>
+      <w:r>
+        <w:rPr>
+          <w:rFonts w:ascii="Times New Roman" w:hAnsi="Times New Roman" w:cs="Times New Roman"/>
+          <w:b/>
+          <w:bCs/>
+          <w:u w:val="single"/>
+          <w:lang w:val="tr-TR"/>
+        </w:rPr>
+        <w:t xml:space="preserve"> </w:t>
+      </w:r>
+      <w:proofErr w:type="spellStart"/>
+      <w:r>
+        <w:rPr>
+          <w:rFonts w:ascii="Times New Roman" w:hAnsi="Times New Roman" w:cs="Times New Roman"/>
+          <w:b/>
+          <w:bCs/>
+          <w:u w:val="single"/>
+          <w:lang w:val="tr-TR"/>
+        </w:rPr>
+        <w:t>mappings</w:t>
+      </w:r>
+      <w:proofErr w:type="spellEnd"/>
+      <w:r>
+        <w:rPr>
+          <w:rFonts w:ascii="Times New Roman" w:hAnsi="Times New Roman" w:cs="Times New Roman"/>
+          <w:b/>
+          <w:bCs/>
+          <w:u w:val="single"/>
+          <w:lang w:val="tr-TR"/>
+        </w:rPr>
+        <w:t xml:space="preserve"> </w:t>
+      </w:r>
+      <w:proofErr w:type="spellStart"/>
+      <w:r>
+        <w:rPr>
+          <w:rFonts w:ascii="Times New Roman" w:hAnsi="Times New Roman" w:cs="Times New Roman"/>
+          <w:b/>
+          <w:bCs/>
+          <w:u w:val="single"/>
+          <w:lang w:val="tr-TR"/>
+        </w:rPr>
+        <w:t>are</w:t>
+      </w:r>
+      <w:proofErr w:type="spellEnd"/>
+      <w:r>
+        <w:rPr>
+          <w:rFonts w:ascii="Times New Roman" w:hAnsi="Times New Roman" w:cs="Times New Roman"/>
+          <w:b/>
+          <w:bCs/>
+          <w:u w:val="single"/>
+          <w:lang w:val="tr-TR"/>
+        </w:rPr>
+        <w:t xml:space="preserve"> </w:t>
+      </w:r>
+      <w:proofErr w:type="spellStart"/>
+      <w:r>
+        <w:rPr>
+          <w:rFonts w:ascii="Times New Roman" w:hAnsi="Times New Roman" w:cs="Times New Roman"/>
+          <w:b/>
+          <w:bCs/>
+          <w:u w:val="single"/>
+          <w:lang w:val="tr-TR"/>
+        </w:rPr>
+        <w:t>used</w:t>
+      </w:r>
+      <w:proofErr w:type="spellEnd"/>
+      <w:r>
+        <w:rPr>
+          <w:rFonts w:ascii="Times New Roman" w:hAnsi="Times New Roman" w:cs="Times New Roman"/>
+          <w:b/>
+          <w:bCs/>
+          <w:u w:val="single"/>
+          <w:lang w:val="tr-TR"/>
+        </w:rPr>
+        <w:t xml:space="preserve">: </w:t>
       </w:r>
     </w:p>
     <w:p>
@@ -238,6 +543,7 @@
           <w:lang w:val="tr-TR"/>
         </w:rPr>
       </w:pPr>
+      <w:proofErr w:type="spellStart"/>
       <w:r>
         <w:rPr>
           <w:rFonts w:ascii="Times New Roman" w:hAnsi="Times New Roman" w:cs="Times New Roman"/>
@@ -246,8 +552,9 @@
           <w:u w:val="single"/>
           <w:lang w:val="tr-TR"/>
         </w:rPr>
-        <w:t>Task 1</w:t>
-      </w:r>
+        <w:t>Task</w:t>
+      </w:r>
+      <w:proofErr w:type="spellEnd"/>
       <w:r>
         <w:rPr>
           <w:rFonts w:ascii="Times New Roman" w:hAnsi="Times New Roman" w:cs="Times New Roman"/>
@@ -256,6 +563,16 @@
           <w:u w:val="single"/>
           <w:lang w:val="tr-TR"/>
         </w:rPr>
+        <w:t xml:space="preserve"> 1</w:t>
+      </w:r>
+      <w:r>
+        <w:rPr>
+          <w:rFonts w:ascii="Times New Roman" w:hAnsi="Times New Roman" w:cs="Times New Roman"/>
+          <w:b/>
+          <w:bCs/>
+          <w:u w:val="single"/>
+          <w:lang w:val="tr-TR"/>
+        </w:rPr>
         <w:t>:</w:t>
       </w:r>
     </w:p>
@@ -266,23 +583,54 @@
           <w:lang w:val="tr-TR"/>
         </w:rPr>
       </w:pPr>
-      <w:r>
-        <w:rPr>
-          <w:rFonts w:ascii="Times New Roman" w:hAnsi="Times New Roman" w:cs="Times New Roman"/>
-          <w:b/>
-          <w:bCs/>
-          <w:lang w:val="tr-TR"/>
-        </w:rPr>
-        <w:t>Used Classi</w:t>
-      </w:r>
-      <w:r>
-        <w:rPr>
-          <w:rFonts w:ascii="Times New Roman" w:hAnsi="Times New Roman" w:cs="Times New Roman"/>
-          <w:b/>
-          <w:bCs/>
-          <w:lang w:val="tr-TR"/>
-        </w:rPr>
-        <w:t>fication Model</w:t>
+      <w:proofErr w:type="spellStart"/>
+      <w:r>
+        <w:rPr>
+          <w:rFonts w:ascii="Times New Roman" w:hAnsi="Times New Roman" w:cs="Times New Roman"/>
+          <w:b/>
+          <w:bCs/>
+          <w:lang w:val="tr-TR"/>
+        </w:rPr>
+        <w:t>Used</w:t>
+      </w:r>
+      <w:proofErr w:type="spellEnd"/>
+      <w:r>
+        <w:rPr>
+          <w:rFonts w:ascii="Times New Roman" w:hAnsi="Times New Roman" w:cs="Times New Roman"/>
+          <w:b/>
+          <w:bCs/>
+          <w:lang w:val="tr-TR"/>
+        </w:rPr>
+        <w:t xml:space="preserve"> </w:t>
+      </w:r>
+      <w:proofErr w:type="spellStart"/>
+      <w:r>
+        <w:rPr>
+          <w:rFonts w:ascii="Times New Roman" w:hAnsi="Times New Roman" w:cs="Times New Roman"/>
+          <w:b/>
+          <w:bCs/>
+          <w:lang w:val="tr-TR"/>
+        </w:rPr>
+        <w:t>Classi</w:t>
+      </w:r>
+      <w:r>
+        <w:rPr>
+          <w:rFonts w:ascii="Times New Roman" w:hAnsi="Times New Roman" w:cs="Times New Roman"/>
+          <w:b/>
+          <w:bCs/>
+          <w:lang w:val="tr-TR"/>
+        </w:rPr>
+        <w:t>fication</w:t>
+      </w:r>
+      <w:proofErr w:type="spellEnd"/>
+      <w:r>
+        <w:rPr>
+          <w:rFonts w:ascii="Times New Roman" w:hAnsi="Times New Roman" w:cs="Times New Roman"/>
+          <w:b/>
+          <w:bCs/>
+          <w:lang w:val="tr-TR"/>
+        </w:rPr>
+        <w:t xml:space="preserve"> Model</w:t>
       </w:r>
       <w:r>
         <w:rPr>
@@ -298,24 +646,120 @@
           <w:rFonts w:ascii="Times New Roman" w:hAnsi="Times New Roman" w:cs="Times New Roman"/>
           <w:lang w:val="tr-TR"/>
         </w:rPr>
-        <w:t xml:space="preserve"> Logistic Regression</w:t>
-      </w:r>
-    </w:p>
-    <w:p>
-      <w:pPr>
-        <w:rPr>
-          <w:rFonts w:ascii="Times New Roman" w:hAnsi="Times New Roman" w:cs="Times New Roman"/>
-          <w:lang w:val="tr-TR"/>
-        </w:rPr>
-      </w:pPr>
-      <w:r>
-        <w:rPr>
-          <w:rFonts w:ascii="Times New Roman" w:hAnsi="Times New Roman" w:cs="Times New Roman"/>
-          <w:b/>
-          <w:bCs/>
-          <w:lang w:val="tr-TR"/>
-        </w:rPr>
-        <w:t xml:space="preserve">Classifier Baseline Test Accuracy Achieved: </w:t>
+        <w:t xml:space="preserve"> </w:t>
+      </w:r>
+      <w:proofErr w:type="spellStart"/>
+      <w:r>
+        <w:rPr>
+          <w:rFonts w:ascii="Times New Roman" w:hAnsi="Times New Roman" w:cs="Times New Roman"/>
+          <w:lang w:val="tr-TR"/>
+        </w:rPr>
+        <w:t>Logistic</w:t>
+      </w:r>
+      <w:proofErr w:type="spellEnd"/>
+      <w:r>
+        <w:rPr>
+          <w:rFonts w:ascii="Times New Roman" w:hAnsi="Times New Roman" w:cs="Times New Roman"/>
+          <w:lang w:val="tr-TR"/>
+        </w:rPr>
+        <w:t xml:space="preserve"> </w:t>
+      </w:r>
+      <w:proofErr w:type="spellStart"/>
+      <w:r>
+        <w:rPr>
+          <w:rFonts w:ascii="Times New Roman" w:hAnsi="Times New Roman" w:cs="Times New Roman"/>
+          <w:lang w:val="tr-TR"/>
+        </w:rPr>
+        <w:t>Regression</w:t>
+      </w:r>
+      <w:proofErr w:type="spellEnd"/>
+    </w:p>
+    <w:p>
+      <w:pPr>
+        <w:rPr>
+          <w:rFonts w:ascii="Times New Roman" w:hAnsi="Times New Roman" w:cs="Times New Roman"/>
+          <w:lang w:val="tr-TR"/>
+        </w:rPr>
+      </w:pPr>
+      <w:proofErr w:type="spellStart"/>
+      <w:r>
+        <w:rPr>
+          <w:rFonts w:ascii="Times New Roman" w:hAnsi="Times New Roman" w:cs="Times New Roman"/>
+          <w:b/>
+          <w:bCs/>
+          <w:lang w:val="tr-TR"/>
+        </w:rPr>
+        <w:t>Classifier</w:t>
+      </w:r>
+      <w:proofErr w:type="spellEnd"/>
+      <w:r>
+        <w:rPr>
+          <w:rFonts w:ascii="Times New Roman" w:hAnsi="Times New Roman" w:cs="Times New Roman"/>
+          <w:b/>
+          <w:bCs/>
+          <w:lang w:val="tr-TR"/>
+        </w:rPr>
+        <w:t xml:space="preserve"> </w:t>
+      </w:r>
+      <w:proofErr w:type="spellStart"/>
+      <w:r>
+        <w:rPr>
+          <w:rFonts w:ascii="Times New Roman" w:hAnsi="Times New Roman" w:cs="Times New Roman"/>
+          <w:b/>
+          <w:bCs/>
+          <w:lang w:val="tr-TR"/>
+        </w:rPr>
+        <w:t>Baseline</w:t>
+      </w:r>
+      <w:proofErr w:type="spellEnd"/>
+      <w:r>
+        <w:rPr>
+          <w:rFonts w:ascii="Times New Roman" w:hAnsi="Times New Roman" w:cs="Times New Roman"/>
+          <w:b/>
+          <w:bCs/>
+          <w:lang w:val="tr-TR"/>
+        </w:rPr>
+        <w:t xml:space="preserve"> Test </w:t>
+      </w:r>
+      <w:proofErr w:type="spellStart"/>
+      <w:r>
+        <w:rPr>
+          <w:rFonts w:ascii="Times New Roman" w:hAnsi="Times New Roman" w:cs="Times New Roman"/>
+          <w:b/>
+          <w:bCs/>
+          <w:lang w:val="tr-TR"/>
+        </w:rPr>
+        <w:t>Accuracy</w:t>
+      </w:r>
+      <w:proofErr w:type="spellEnd"/>
+      <w:r>
+        <w:rPr>
+          <w:rFonts w:ascii="Times New Roman" w:hAnsi="Times New Roman" w:cs="Times New Roman"/>
+          <w:b/>
+          <w:bCs/>
+          <w:lang w:val="tr-TR"/>
+        </w:rPr>
+        <w:t xml:space="preserve"> </w:t>
+      </w:r>
+      <w:proofErr w:type="spellStart"/>
+      <w:r>
+        <w:rPr>
+          <w:rFonts w:ascii="Times New Roman" w:hAnsi="Times New Roman" w:cs="Times New Roman"/>
+          <w:b/>
+          <w:bCs/>
+          <w:lang w:val="tr-TR"/>
+        </w:rPr>
+        <w:t>Achieved</w:t>
+      </w:r>
+      <w:proofErr w:type="spellEnd"/>
+      <w:r>
+        <w:rPr>
+          <w:rFonts w:ascii="Times New Roman" w:hAnsi="Times New Roman" w:cs="Times New Roman"/>
+          <w:b/>
+          <w:bCs/>
+          <w:lang w:val="tr-TR"/>
+        </w:rPr>
+        <w:t xml:space="preserve">: </w:t>
       </w:r>
       <w:r>
         <w:rPr>
@@ -2827,6 +3271,7 @@
           <w:lang w:val="tr-TR"/>
         </w:rPr>
       </w:pPr>
+      <w:proofErr w:type="spellStart"/>
       <w:r>
         <w:rPr>
           <w:rFonts w:ascii="Times New Roman" w:hAnsi="Times New Roman" w:cs="Times New Roman"/>
@@ -2835,24 +3280,56 @@
           <w:u w:val="single"/>
           <w:lang w:val="tr-TR"/>
         </w:rPr>
-        <w:t xml:space="preserve">Task 2: </w:t>
-      </w:r>
-    </w:p>
-    <w:p>
-      <w:pPr>
-        <w:rPr>
-          <w:rFonts w:ascii="Times New Roman" w:hAnsi="Times New Roman" w:cs="Times New Roman"/>
-          <w:lang w:val="tr-TR"/>
-        </w:rPr>
-      </w:pPr>
-      <w:r>
-        <w:rPr>
-          <w:rFonts w:ascii="Times New Roman" w:hAnsi="Times New Roman" w:cs="Times New Roman"/>
-          <w:b/>
-          <w:bCs/>
-          <w:lang w:val="tr-TR"/>
-        </w:rPr>
-        <w:t>Simulated Expert</w:t>
+        <w:t>Task</w:t>
+      </w:r>
+      <w:proofErr w:type="spellEnd"/>
+      <w:r>
+        <w:rPr>
+          <w:rFonts w:ascii="Times New Roman" w:hAnsi="Times New Roman" w:cs="Times New Roman"/>
+          <w:b/>
+          <w:bCs/>
+          <w:u w:val="single"/>
+          <w:lang w:val="tr-TR"/>
+        </w:rPr>
+        <w:t xml:space="preserve"> 2: </w:t>
+      </w:r>
+    </w:p>
+    <w:p>
+      <w:pPr>
+        <w:rPr>
+          <w:rFonts w:ascii="Times New Roman" w:hAnsi="Times New Roman" w:cs="Times New Roman"/>
+          <w:lang w:val="tr-TR"/>
+        </w:rPr>
+      </w:pPr>
+      <w:proofErr w:type="spellStart"/>
+      <w:r>
+        <w:rPr>
+          <w:rFonts w:ascii="Times New Roman" w:hAnsi="Times New Roman" w:cs="Times New Roman"/>
+          <w:b/>
+          <w:bCs/>
+          <w:lang w:val="tr-TR"/>
+        </w:rPr>
+        <w:t>Simulated</w:t>
+      </w:r>
+      <w:proofErr w:type="spellEnd"/>
+      <w:r>
+        <w:rPr>
+          <w:rFonts w:ascii="Times New Roman" w:hAnsi="Times New Roman" w:cs="Times New Roman"/>
+          <w:b/>
+          <w:bCs/>
+          <w:lang w:val="tr-TR"/>
+        </w:rPr>
+        <w:t xml:space="preserve"> </w:t>
+      </w:r>
+      <w:proofErr w:type="spellStart"/>
+      <w:r>
+        <w:rPr>
+          <w:rFonts w:ascii="Times New Roman" w:hAnsi="Times New Roman" w:cs="Times New Roman"/>
+          <w:b/>
+          <w:bCs/>
+          <w:lang w:val="tr-TR"/>
+        </w:rPr>
+        <w:t>Expert</w:t>
       </w:r>
       <w:r>
         <w:rPr>
@@ -2863,6 +3340,7 @@
         </w:rPr>
         <w:t>’s</w:t>
       </w:r>
+      <w:proofErr w:type="spellEnd"/>
       <w:r>
         <w:rPr>
           <w:rFonts w:ascii="Times New Roman" w:hAnsi="Times New Roman" w:cs="Times New Roman"/>
@@ -2872,23 +3350,65 @@
         </w:rPr>
         <w:t xml:space="preserve"> Test </w:t>
       </w:r>
-      <w:r>
-        <w:rPr>
-          <w:rFonts w:ascii="Times New Roman" w:hAnsi="Times New Roman" w:cs="Times New Roman"/>
-          <w:b/>
-          <w:bCs/>
-          <w:lang w:val="tr-TR"/>
-        </w:rPr>
-        <w:t xml:space="preserve">Dataset </w:t>
-      </w:r>
-      <w:r>
-        <w:rPr>
-          <w:rFonts w:ascii="Times New Roman" w:hAnsi="Times New Roman" w:cs="Times New Roman"/>
-          <w:b/>
-          <w:bCs/>
-          <w:lang w:val="tr-TR"/>
-        </w:rPr>
-        <w:t xml:space="preserve">Accuracy Achieved: </w:t>
+      <w:proofErr w:type="spellStart"/>
+      <w:r>
+        <w:rPr>
+          <w:rFonts w:ascii="Times New Roman" w:hAnsi="Times New Roman" w:cs="Times New Roman"/>
+          <w:b/>
+          <w:bCs/>
+          <w:lang w:val="tr-TR"/>
+        </w:rPr>
+        <w:t>Dataset</w:t>
+      </w:r>
+      <w:proofErr w:type="spellEnd"/>
+      <w:r>
+        <w:rPr>
+          <w:rFonts w:ascii="Times New Roman" w:hAnsi="Times New Roman" w:cs="Times New Roman"/>
+          <w:b/>
+          <w:bCs/>
+          <w:lang w:val="tr-TR"/>
+        </w:rPr>
+        <w:t xml:space="preserve"> </w:t>
+      </w:r>
+      <w:proofErr w:type="spellStart"/>
+      <w:r>
+        <w:rPr>
+          <w:rFonts w:ascii="Times New Roman" w:hAnsi="Times New Roman" w:cs="Times New Roman"/>
+          <w:b/>
+          <w:bCs/>
+          <w:lang w:val="tr-TR"/>
+        </w:rPr>
+        <w:t>Accuracy</w:t>
+      </w:r>
+      <w:proofErr w:type="spellEnd"/>
+      <w:r>
+        <w:rPr>
+          <w:rFonts w:ascii="Times New Roman" w:hAnsi="Times New Roman" w:cs="Times New Roman"/>
+          <w:b/>
+          <w:bCs/>
+          <w:lang w:val="tr-TR"/>
+        </w:rPr>
+        <w:t xml:space="preserve"> </w:t>
+      </w:r>
+      <w:proofErr w:type="spellStart"/>
+      <w:r>
+        <w:rPr>
+          <w:rFonts w:ascii="Times New Roman" w:hAnsi="Times New Roman" w:cs="Times New Roman"/>
+          <w:b/>
+          <w:bCs/>
+          <w:lang w:val="tr-TR"/>
+        </w:rPr>
+        <w:t>Achieved</w:t>
+      </w:r>
+      <w:proofErr w:type="spellEnd"/>
+      <w:r>
+        <w:rPr>
+          <w:rFonts w:ascii="Times New Roman" w:hAnsi="Times New Roman" w:cs="Times New Roman"/>
+          <w:b/>
+          <w:bCs/>
+          <w:lang w:val="tr-TR"/>
+        </w:rPr>
+        <w:t xml:space="preserve">: </w:t>
       </w:r>
       <w:r>
         <w:rPr>
@@ -2916,7 +3436,39 @@
           <w:rFonts w:ascii="Times New Roman" w:hAnsi="Times New Roman" w:cs="Times New Roman"/>
           <w:lang w:val="tr-TR"/>
         </w:rPr>
-        <w:t xml:space="preserve"> (Specialized expertise </w:t>
+        <w:t xml:space="preserve"> (</w:t>
+      </w:r>
+      <w:proofErr w:type="spellStart"/>
+      <w:r>
+        <w:rPr>
+          <w:rFonts w:ascii="Times New Roman" w:hAnsi="Times New Roman" w:cs="Times New Roman"/>
+          <w:lang w:val="tr-TR"/>
+        </w:rPr>
+        <w:t>Specialized</w:t>
+      </w:r>
+      <w:proofErr w:type="spellEnd"/>
+      <w:r>
+        <w:rPr>
+          <w:rFonts w:ascii="Times New Roman" w:hAnsi="Times New Roman" w:cs="Times New Roman"/>
+          <w:lang w:val="tr-TR"/>
+        </w:rPr>
+        <w:t xml:space="preserve"> </w:t>
+      </w:r>
+      <w:proofErr w:type="spellStart"/>
+      <w:r>
+        <w:rPr>
+          <w:rFonts w:ascii="Times New Roman" w:hAnsi="Times New Roman" w:cs="Times New Roman"/>
+          <w:lang w:val="tr-TR"/>
+        </w:rPr>
+        <w:t>expertise</w:t>
+      </w:r>
+      <w:proofErr w:type="spellEnd"/>
+      <w:r>
+        <w:rPr>
+          <w:rFonts w:ascii="Times New Roman" w:hAnsi="Times New Roman" w:cs="Times New Roman"/>
+          <w:lang w:val="tr-TR"/>
+        </w:rPr>
+        <w:t xml:space="preserve"> </w:t>
       </w:r>
       <w:r>
         <w:rPr>
@@ -6081,6 +6633,7 @@
           <w:lang w:val="tr-TR"/>
         </w:rPr>
       </w:pPr>
+      <w:proofErr w:type="spellStart"/>
       <w:r>
         <w:rPr>
           <w:rFonts w:ascii="Times New Roman" w:hAnsi="Times New Roman" w:cs="Times New Roman"/>
@@ -6090,7 +6643,18 @@
           <w:lang w:val="tr-TR"/>
         </w:rPr>
         <w:lastRenderedPageBreak/>
-        <w:t xml:space="preserve">Task 3: </w:t>
+        <w:t>Task</w:t>
+      </w:r>
+      <w:proofErr w:type="spellEnd"/>
+      <w:r>
+        <w:rPr>
+          <w:rFonts w:ascii="Times New Roman" w:hAnsi="Times New Roman" w:cs="Times New Roman"/>
+          <w:b/>
+          <w:bCs/>
+          <w:u w:val="single"/>
+          <w:lang w:val="tr-TR"/>
+        </w:rPr>
+        <w:t xml:space="preserve"> 3: </w:t>
       </w:r>
     </w:p>
     <w:p>
@@ -6320,47 +6884,7 @@
                                 <w:noProof/>
                                 <w:lang w:val="tr-TR"/>
                               </w:rPr>
-                              <w:t xml:space="preserve">Figure </w:t>
-                            </w:r>
-                            <w:r>
-                              <w:rPr>
-                                <w:rFonts w:ascii="Times New Roman" w:hAnsi="Times New Roman" w:cs="Times New Roman"/>
-                                <w:b/>
-                                <w:bCs/>
-                                <w:noProof/>
-                                <w:lang w:val="tr-TR"/>
-                              </w:rPr>
-                              <w:t>1</w:t>
-                            </w:r>
-                            <w:r>
-                              <w:rPr>
-                                <w:rFonts w:ascii="Times New Roman" w:hAnsi="Times New Roman" w:cs="Times New Roman"/>
-                                <w:b/>
-                                <w:bCs/>
-                                <w:noProof/>
-                                <w:lang w:val="tr-TR"/>
-                              </w:rPr>
-                              <w:t>: Learning to Defer Strategy Evaluation When Confidence Threshold is 0.</w:t>
-                            </w:r>
-                            <w:r>
-                              <w:rPr>
-                                <w:rFonts w:ascii="Times New Roman" w:hAnsi="Times New Roman" w:cs="Times New Roman"/>
-                                <w:b/>
-                                <w:bCs/>
-                                <w:noProof/>
-                                <w:lang w:val="tr-TR"/>
-                              </w:rPr>
-                              <w:t>60</w:t>
-                            </w:r>
-                            <w:r>
-                              <w:rPr>
-                                <w:rFonts w:ascii="Times New Roman" w:hAnsi="Times New Roman" w:cs="Times New Roman"/>
-                                <w:b/>
-                                <w:bCs/>
-                                <w:noProof/>
-                                <w:lang w:val="tr-TR"/>
-                              </w:rPr>
-                              <w:t xml:space="preserve"> </w:t>
+                              <w:t xml:space="preserve">Figure 1: Learning to Defer Strategy Evaluation When Confidence Threshold is 0.60 </w:t>
                             </w:r>
                           </w:p>
                         </w:txbxContent>
@@ -6411,47 +6935,7 @@
                           <w:noProof/>
                           <w:lang w:val="tr-TR"/>
                         </w:rPr>
-                        <w:t xml:space="preserve">Figure </w:t>
-                      </w:r>
-                      <w:r>
-                        <w:rPr>
-                          <w:rFonts w:ascii="Times New Roman" w:hAnsi="Times New Roman" w:cs="Times New Roman"/>
-                          <w:b/>
-                          <w:bCs/>
-                          <w:noProof/>
-                          <w:lang w:val="tr-TR"/>
-                        </w:rPr>
-                        <w:t>1</w:t>
-                      </w:r>
-                      <w:r>
-                        <w:rPr>
-                          <w:rFonts w:ascii="Times New Roman" w:hAnsi="Times New Roman" w:cs="Times New Roman"/>
-                          <w:b/>
-                          <w:bCs/>
-                          <w:noProof/>
-                          <w:lang w:val="tr-TR"/>
-                        </w:rPr>
-                        <w:t>: Learning to Defer Strategy Evaluation When Confidence Threshold is 0.</w:t>
-                      </w:r>
-                      <w:r>
-                        <w:rPr>
-                          <w:rFonts w:ascii="Times New Roman" w:hAnsi="Times New Roman" w:cs="Times New Roman"/>
-                          <w:b/>
-                          <w:bCs/>
-                          <w:noProof/>
-                          <w:lang w:val="tr-TR"/>
-                        </w:rPr>
-                        <w:t>60</w:t>
-                      </w:r>
-                      <w:r>
-                        <w:rPr>
-                          <w:rFonts w:ascii="Times New Roman" w:hAnsi="Times New Roman" w:cs="Times New Roman"/>
-                          <w:b/>
-                          <w:bCs/>
-                          <w:noProof/>
-                          <w:lang w:val="tr-TR"/>
-                        </w:rPr>
-                        <w:t xml:space="preserve"> </w:t>
+                        <w:t xml:space="preserve">Figure 1: Learning to Defer Strategy Evaluation When Confidence Threshold is 0.60 </w:t>
                       </w:r>
                     </w:p>
                   </w:txbxContent>
@@ -6966,6 +7450,7 @@
                                 <w:lang w:val="tr-TR"/>
                               </w:rPr>
                             </w:pPr>
+                            <w:proofErr w:type="spellStart"/>
                             <w:r>
                               <w:rPr>
                                 <w:rFonts w:ascii="Times New Roman" w:hAnsi="Times New Roman" w:cs="Times New Roman"/>
@@ -6973,8 +7458,9 @@
                                 <w:bCs/>
                                 <w:lang w:val="tr-TR"/>
                               </w:rPr>
-                              <w:t xml:space="preserve">Figure </w:t>
+                              <w:t>Figure</w:t>
                             </w:r>
+                            <w:proofErr w:type="spellEnd"/>
                             <w:r>
                               <w:rPr>
                                 <w:rFonts w:ascii="Times New Roman" w:hAnsi="Times New Roman" w:cs="Times New Roman"/>
@@ -6982,8 +7468,9 @@
                                 <w:bCs/>
                                 <w:lang w:val="tr-TR"/>
                               </w:rPr>
-                              <w:t>3</w:t>
+                              <w:t xml:space="preserve"> 3: Learning </w:t>
                             </w:r>
+                            <w:proofErr w:type="spellStart"/>
                             <w:r>
                               <w:rPr>
                                 <w:rFonts w:ascii="Times New Roman" w:hAnsi="Times New Roman" w:cs="Times New Roman"/>
@@ -6991,8 +7478,9 @@
                                 <w:bCs/>
                                 <w:lang w:val="tr-TR"/>
                               </w:rPr>
-                              <w:t xml:space="preserve">: Learning to Defer Strategy Evaluation When Confidence Threshold is </w:t>
+                              <w:t>to</w:t>
                             </w:r>
+                            <w:proofErr w:type="spellEnd"/>
                             <w:r>
                               <w:rPr>
                                 <w:rFonts w:ascii="Times New Roman" w:hAnsi="Times New Roman" w:cs="Times New Roman"/>
@@ -7000,7 +7488,107 @@
                                 <w:bCs/>
                                 <w:lang w:val="tr-TR"/>
                               </w:rPr>
-                              <w:t>0.835</w:t>
+                              <w:t xml:space="preserve"> </w:t>
+                            </w:r>
+                            <w:proofErr w:type="spellStart"/>
+                            <w:r>
+                              <w:rPr>
+                                <w:rFonts w:ascii="Times New Roman" w:hAnsi="Times New Roman" w:cs="Times New Roman"/>
+                                <w:b/>
+                                <w:bCs/>
+                                <w:lang w:val="tr-TR"/>
+                              </w:rPr>
+                              <w:t>Defer</w:t>
+                            </w:r>
+                            <w:proofErr w:type="spellEnd"/>
+                            <w:r>
+                              <w:rPr>
+                                <w:rFonts w:ascii="Times New Roman" w:hAnsi="Times New Roman" w:cs="Times New Roman"/>
+                                <w:b/>
+                                <w:bCs/>
+                                <w:lang w:val="tr-TR"/>
+                              </w:rPr>
+                              <w:t xml:space="preserve"> </w:t>
+                            </w:r>
+                            <w:proofErr w:type="spellStart"/>
+                            <w:r>
+                              <w:rPr>
+                                <w:rFonts w:ascii="Times New Roman" w:hAnsi="Times New Roman" w:cs="Times New Roman"/>
+                                <w:b/>
+                                <w:bCs/>
+                                <w:lang w:val="tr-TR"/>
+                              </w:rPr>
+                              <w:t>Strategy</w:t>
+                            </w:r>
+                            <w:proofErr w:type="spellEnd"/>
+                            <w:r>
+                              <w:rPr>
+                                <w:rFonts w:ascii="Times New Roman" w:hAnsi="Times New Roman" w:cs="Times New Roman"/>
+                                <w:b/>
+                                <w:bCs/>
+                                <w:lang w:val="tr-TR"/>
+                              </w:rPr>
+                              <w:t xml:space="preserve"> Evaluation </w:t>
+                            </w:r>
+                            <w:proofErr w:type="spellStart"/>
+                            <w:r>
+                              <w:rPr>
+                                <w:rFonts w:ascii="Times New Roman" w:hAnsi="Times New Roman" w:cs="Times New Roman"/>
+                                <w:b/>
+                                <w:bCs/>
+                                <w:lang w:val="tr-TR"/>
+                              </w:rPr>
+                              <w:t>When</w:t>
+                            </w:r>
+                            <w:proofErr w:type="spellEnd"/>
+                            <w:r>
+                              <w:rPr>
+                                <w:rFonts w:ascii="Times New Roman" w:hAnsi="Times New Roman" w:cs="Times New Roman"/>
+                                <w:b/>
+                                <w:bCs/>
+                                <w:lang w:val="tr-TR"/>
+                              </w:rPr>
+                              <w:t xml:space="preserve"> </w:t>
+                            </w:r>
+                            <w:proofErr w:type="spellStart"/>
+                            <w:r>
+                              <w:rPr>
+                                <w:rFonts w:ascii="Times New Roman" w:hAnsi="Times New Roman" w:cs="Times New Roman"/>
+                                <w:b/>
+                                <w:bCs/>
+                                <w:lang w:val="tr-TR"/>
+                              </w:rPr>
+                              <w:t>Confidence</w:t>
+                            </w:r>
+                            <w:proofErr w:type="spellEnd"/>
+                            <w:r>
+                              <w:rPr>
+                                <w:rFonts w:ascii="Times New Roman" w:hAnsi="Times New Roman" w:cs="Times New Roman"/>
+                                <w:b/>
+                                <w:bCs/>
+                                <w:lang w:val="tr-TR"/>
+                              </w:rPr>
+                              <w:t xml:space="preserve"> </w:t>
+                            </w:r>
+                            <w:proofErr w:type="spellStart"/>
+                            <w:r>
+                              <w:rPr>
+                                <w:rFonts w:ascii="Times New Roman" w:hAnsi="Times New Roman" w:cs="Times New Roman"/>
+                                <w:b/>
+                                <w:bCs/>
+                                <w:lang w:val="tr-TR"/>
+                              </w:rPr>
+                              <w:t>Threshold</w:t>
+                            </w:r>
+                            <w:proofErr w:type="spellEnd"/>
+                            <w:r>
+                              <w:rPr>
+                                <w:rFonts w:ascii="Times New Roman" w:hAnsi="Times New Roman" w:cs="Times New Roman"/>
+                                <w:b/>
+                                <w:bCs/>
+                                <w:lang w:val="tr-TR"/>
+                              </w:rPr>
+                              <w:t xml:space="preserve"> is 0.835</w:t>
                             </w:r>
                           </w:p>
                         </w:txbxContent>
@@ -7040,6 +7628,7 @@
                           <w:lang w:val="tr-TR"/>
                         </w:rPr>
                       </w:pPr>
+                      <w:proofErr w:type="spellStart"/>
                       <w:r>
                         <w:rPr>
                           <w:rFonts w:ascii="Times New Roman" w:hAnsi="Times New Roman" w:cs="Times New Roman"/>
@@ -7047,8 +7636,9 @@
                           <w:bCs/>
                           <w:lang w:val="tr-TR"/>
                         </w:rPr>
-                        <w:t xml:space="preserve">Figure </w:t>
+                        <w:t>Figure</w:t>
                       </w:r>
+                      <w:proofErr w:type="spellEnd"/>
                       <w:r>
                         <w:rPr>
                           <w:rFonts w:ascii="Times New Roman" w:hAnsi="Times New Roman" w:cs="Times New Roman"/>
@@ -7056,8 +7646,9 @@
                           <w:bCs/>
                           <w:lang w:val="tr-TR"/>
                         </w:rPr>
-                        <w:t>3</w:t>
+                        <w:t xml:space="preserve"> 3: Learning </w:t>
                       </w:r>
+                      <w:proofErr w:type="spellStart"/>
                       <w:r>
                         <w:rPr>
                           <w:rFonts w:ascii="Times New Roman" w:hAnsi="Times New Roman" w:cs="Times New Roman"/>
@@ -7065,8 +7656,9 @@
                           <w:bCs/>
                           <w:lang w:val="tr-TR"/>
                         </w:rPr>
-                        <w:t xml:space="preserve">: Learning to Defer Strategy Evaluation When Confidence Threshold is </w:t>
+                        <w:t>to</w:t>
                       </w:r>
+                      <w:proofErr w:type="spellEnd"/>
                       <w:r>
                         <w:rPr>
                           <w:rFonts w:ascii="Times New Roman" w:hAnsi="Times New Roman" w:cs="Times New Roman"/>
@@ -7074,7 +7666,107 @@
                           <w:bCs/>
                           <w:lang w:val="tr-TR"/>
                         </w:rPr>
-                        <w:t>0.835</w:t>
+                        <w:t xml:space="preserve"> </w:t>
+                      </w:r>
+                      <w:proofErr w:type="spellStart"/>
+                      <w:r>
+                        <w:rPr>
+                          <w:rFonts w:ascii="Times New Roman" w:hAnsi="Times New Roman" w:cs="Times New Roman"/>
+                          <w:b/>
+                          <w:bCs/>
+                          <w:lang w:val="tr-TR"/>
+                        </w:rPr>
+                        <w:t>Defer</w:t>
+                      </w:r>
+                      <w:proofErr w:type="spellEnd"/>
+                      <w:r>
+                        <w:rPr>
+                          <w:rFonts w:ascii="Times New Roman" w:hAnsi="Times New Roman" w:cs="Times New Roman"/>
+                          <w:b/>
+                          <w:bCs/>
+                          <w:lang w:val="tr-TR"/>
+                        </w:rPr>
+                        <w:t xml:space="preserve"> </w:t>
+                      </w:r>
+                      <w:proofErr w:type="spellStart"/>
+                      <w:r>
+                        <w:rPr>
+                          <w:rFonts w:ascii="Times New Roman" w:hAnsi="Times New Roman" w:cs="Times New Roman"/>
+                          <w:b/>
+                          <w:bCs/>
+                          <w:lang w:val="tr-TR"/>
+                        </w:rPr>
+                        <w:t>Strategy</w:t>
+                      </w:r>
+                      <w:proofErr w:type="spellEnd"/>
+                      <w:r>
+                        <w:rPr>
+                          <w:rFonts w:ascii="Times New Roman" w:hAnsi="Times New Roman" w:cs="Times New Roman"/>
+                          <w:b/>
+                          <w:bCs/>
+                          <w:lang w:val="tr-TR"/>
+                        </w:rPr>
+                        <w:t xml:space="preserve"> Evaluation </w:t>
+                      </w:r>
+                      <w:proofErr w:type="spellStart"/>
+                      <w:r>
+                        <w:rPr>
+                          <w:rFonts w:ascii="Times New Roman" w:hAnsi="Times New Roman" w:cs="Times New Roman"/>
+                          <w:b/>
+                          <w:bCs/>
+                          <w:lang w:val="tr-TR"/>
+                        </w:rPr>
+                        <w:t>When</w:t>
+                      </w:r>
+                      <w:proofErr w:type="spellEnd"/>
+                      <w:r>
+                        <w:rPr>
+                          <w:rFonts w:ascii="Times New Roman" w:hAnsi="Times New Roman" w:cs="Times New Roman"/>
+                          <w:b/>
+                          <w:bCs/>
+                          <w:lang w:val="tr-TR"/>
+                        </w:rPr>
+                        <w:t xml:space="preserve"> </w:t>
+                      </w:r>
+                      <w:proofErr w:type="spellStart"/>
+                      <w:r>
+                        <w:rPr>
+                          <w:rFonts w:ascii="Times New Roman" w:hAnsi="Times New Roman" w:cs="Times New Roman"/>
+                          <w:b/>
+                          <w:bCs/>
+                          <w:lang w:val="tr-TR"/>
+                        </w:rPr>
+                        <w:t>Confidence</w:t>
+                      </w:r>
+                      <w:proofErr w:type="spellEnd"/>
+                      <w:r>
+                        <w:rPr>
+                          <w:rFonts w:ascii="Times New Roman" w:hAnsi="Times New Roman" w:cs="Times New Roman"/>
+                          <w:b/>
+                          <w:bCs/>
+                          <w:lang w:val="tr-TR"/>
+                        </w:rPr>
+                        <w:t xml:space="preserve"> </w:t>
+                      </w:r>
+                      <w:proofErr w:type="spellStart"/>
+                      <w:r>
+                        <w:rPr>
+                          <w:rFonts w:ascii="Times New Roman" w:hAnsi="Times New Roman" w:cs="Times New Roman"/>
+                          <w:b/>
+                          <w:bCs/>
+                          <w:lang w:val="tr-TR"/>
+                        </w:rPr>
+                        <w:t>Threshold</w:t>
+                      </w:r>
+                      <w:proofErr w:type="spellEnd"/>
+                      <w:r>
+                        <w:rPr>
+                          <w:rFonts w:ascii="Times New Roman" w:hAnsi="Times New Roman" w:cs="Times New Roman"/>
+                          <w:b/>
+                          <w:bCs/>
+                          <w:lang w:val="tr-TR"/>
+                        </w:rPr>
+                        <w:t xml:space="preserve"> is 0.835</w:t>
                       </w:r>
                     </w:p>
                   </w:txbxContent>
@@ -7136,6 +7828,7 @@
                                 <w:lang w:val="tr-TR"/>
                               </w:rPr>
                             </w:pPr>
+                            <w:proofErr w:type="spellStart"/>
                             <w:r>
                               <w:rPr>
                                 <w:rFonts w:ascii="Times New Roman" w:hAnsi="Times New Roman" w:cs="Times New Roman"/>
@@ -7143,7 +7836,137 @@
                                 <w:bCs/>
                                 <w:lang w:val="tr-TR"/>
                               </w:rPr>
-                              <w:t>Figure 3: Learning to Defer Strategy Evaluation When Confidence Threshold is 0.835</w:t>
+                              <w:t>Figure</w:t>
+                            </w:r>
+                            <w:proofErr w:type="spellEnd"/>
+                            <w:r>
+                              <w:rPr>
+                                <w:rFonts w:ascii="Times New Roman" w:hAnsi="Times New Roman" w:cs="Times New Roman"/>
+                                <w:b/>
+                                <w:bCs/>
+                                <w:lang w:val="tr-TR"/>
+                              </w:rPr>
+                              <w:t xml:space="preserve"> 3: Learning </w:t>
+                            </w:r>
+                            <w:proofErr w:type="spellStart"/>
+                            <w:r>
+                              <w:rPr>
+                                <w:rFonts w:ascii="Times New Roman" w:hAnsi="Times New Roman" w:cs="Times New Roman"/>
+                                <w:b/>
+                                <w:bCs/>
+                                <w:lang w:val="tr-TR"/>
+                              </w:rPr>
+                              <w:t>to</w:t>
+                            </w:r>
+                            <w:proofErr w:type="spellEnd"/>
+                            <w:r>
+                              <w:rPr>
+                                <w:rFonts w:ascii="Times New Roman" w:hAnsi="Times New Roman" w:cs="Times New Roman"/>
+                                <w:b/>
+                                <w:bCs/>
+                                <w:lang w:val="tr-TR"/>
+                              </w:rPr>
+                              <w:t xml:space="preserve"> </w:t>
+                            </w:r>
+                            <w:proofErr w:type="spellStart"/>
+                            <w:r>
+                              <w:rPr>
+                                <w:rFonts w:ascii="Times New Roman" w:hAnsi="Times New Roman" w:cs="Times New Roman"/>
+                                <w:b/>
+                                <w:bCs/>
+                                <w:lang w:val="tr-TR"/>
+                              </w:rPr>
+                              <w:t>Defer</w:t>
+                            </w:r>
+                            <w:proofErr w:type="spellEnd"/>
+                            <w:r>
+                              <w:rPr>
+                                <w:rFonts w:ascii="Times New Roman" w:hAnsi="Times New Roman" w:cs="Times New Roman"/>
+                                <w:b/>
+                                <w:bCs/>
+                                <w:lang w:val="tr-TR"/>
+                              </w:rPr>
+                              <w:t xml:space="preserve"> </w:t>
+                            </w:r>
+                            <w:proofErr w:type="spellStart"/>
+                            <w:r>
+                              <w:rPr>
+                                <w:rFonts w:ascii="Times New Roman" w:hAnsi="Times New Roman" w:cs="Times New Roman"/>
+                                <w:b/>
+                                <w:bCs/>
+                                <w:lang w:val="tr-TR"/>
+                              </w:rPr>
+                              <w:t>Strategy</w:t>
+                            </w:r>
+                            <w:proofErr w:type="spellEnd"/>
+                            <w:r>
+                              <w:rPr>
+                                <w:rFonts w:ascii="Times New Roman" w:hAnsi="Times New Roman" w:cs="Times New Roman"/>
+                                <w:b/>
+                                <w:bCs/>
+                                <w:lang w:val="tr-TR"/>
+                              </w:rPr>
+                              <w:t xml:space="preserve"> Evaluation </w:t>
+                            </w:r>
+                            <w:proofErr w:type="spellStart"/>
+                            <w:r>
+                              <w:rPr>
+                                <w:rFonts w:ascii="Times New Roman" w:hAnsi="Times New Roman" w:cs="Times New Roman"/>
+                                <w:b/>
+                                <w:bCs/>
+                                <w:lang w:val="tr-TR"/>
+                              </w:rPr>
+                              <w:t>When</w:t>
+                            </w:r>
+                            <w:proofErr w:type="spellEnd"/>
+                            <w:r>
+                              <w:rPr>
+                                <w:rFonts w:ascii="Times New Roman" w:hAnsi="Times New Roman" w:cs="Times New Roman"/>
+                                <w:b/>
+                                <w:bCs/>
+                                <w:lang w:val="tr-TR"/>
+                              </w:rPr>
+                              <w:t xml:space="preserve"> </w:t>
+                            </w:r>
+                            <w:proofErr w:type="spellStart"/>
+                            <w:r>
+                              <w:rPr>
+                                <w:rFonts w:ascii="Times New Roman" w:hAnsi="Times New Roman" w:cs="Times New Roman"/>
+                                <w:b/>
+                                <w:bCs/>
+                                <w:lang w:val="tr-TR"/>
+                              </w:rPr>
+                              <w:t>Confidence</w:t>
+                            </w:r>
+                            <w:proofErr w:type="spellEnd"/>
+                            <w:r>
+                              <w:rPr>
+                                <w:rFonts w:ascii="Times New Roman" w:hAnsi="Times New Roman" w:cs="Times New Roman"/>
+                                <w:b/>
+                                <w:bCs/>
+                                <w:lang w:val="tr-TR"/>
+                              </w:rPr>
+                              <w:t xml:space="preserve"> </w:t>
+                            </w:r>
+                            <w:proofErr w:type="spellStart"/>
+                            <w:r>
+                              <w:rPr>
+                                <w:rFonts w:ascii="Times New Roman" w:hAnsi="Times New Roman" w:cs="Times New Roman"/>
+                                <w:b/>
+                                <w:bCs/>
+                                <w:lang w:val="tr-TR"/>
+                              </w:rPr>
+                              <w:t>Threshold</w:t>
+                            </w:r>
+                            <w:proofErr w:type="spellEnd"/>
+                            <w:r>
+                              <w:rPr>
+                                <w:rFonts w:ascii="Times New Roman" w:hAnsi="Times New Roman" w:cs="Times New Roman"/>
+                                <w:b/>
+                                <w:bCs/>
+                                <w:lang w:val="tr-TR"/>
+                              </w:rPr>
+                              <w:t xml:space="preserve"> is 0.835</w:t>
                             </w:r>
                           </w:p>
                         </w:txbxContent>
@@ -7176,6 +7999,7 @@
                           <w:lang w:val="tr-TR"/>
                         </w:rPr>
                       </w:pPr>
+                      <w:proofErr w:type="spellStart"/>
                       <w:r>
                         <w:rPr>
                           <w:rFonts w:ascii="Times New Roman" w:hAnsi="Times New Roman" w:cs="Times New Roman"/>
@@ -7183,7 +8007,137 @@
                           <w:bCs/>
                           <w:lang w:val="tr-TR"/>
                         </w:rPr>
-                        <w:t>Figure 3: Learning to Defer Strategy Evaluation When Confidence Threshold is 0.835</w:t>
+                        <w:t>Figure</w:t>
+                      </w:r>
+                      <w:proofErr w:type="spellEnd"/>
+                      <w:r>
+                        <w:rPr>
+                          <w:rFonts w:ascii="Times New Roman" w:hAnsi="Times New Roman" w:cs="Times New Roman"/>
+                          <w:b/>
+                          <w:bCs/>
+                          <w:lang w:val="tr-TR"/>
+                        </w:rPr>
+                        <w:t xml:space="preserve"> 3: Learning </w:t>
+                      </w:r>
+                      <w:proofErr w:type="spellStart"/>
+                      <w:r>
+                        <w:rPr>
+                          <w:rFonts w:ascii="Times New Roman" w:hAnsi="Times New Roman" w:cs="Times New Roman"/>
+                          <w:b/>
+                          <w:bCs/>
+                          <w:lang w:val="tr-TR"/>
+                        </w:rPr>
+                        <w:t>to</w:t>
+                      </w:r>
+                      <w:proofErr w:type="spellEnd"/>
+                      <w:r>
+                        <w:rPr>
+                          <w:rFonts w:ascii="Times New Roman" w:hAnsi="Times New Roman" w:cs="Times New Roman"/>
+                          <w:b/>
+                          <w:bCs/>
+                          <w:lang w:val="tr-TR"/>
+                        </w:rPr>
+                        <w:t xml:space="preserve"> </w:t>
+                      </w:r>
+                      <w:proofErr w:type="spellStart"/>
+                      <w:r>
+                        <w:rPr>
+                          <w:rFonts w:ascii="Times New Roman" w:hAnsi="Times New Roman" w:cs="Times New Roman"/>
+                          <w:b/>
+                          <w:bCs/>
+                          <w:lang w:val="tr-TR"/>
+                        </w:rPr>
+                        <w:t>Defer</w:t>
+                      </w:r>
+                      <w:proofErr w:type="spellEnd"/>
+                      <w:r>
+                        <w:rPr>
+                          <w:rFonts w:ascii="Times New Roman" w:hAnsi="Times New Roman" w:cs="Times New Roman"/>
+                          <w:b/>
+                          <w:bCs/>
+                          <w:lang w:val="tr-TR"/>
+                        </w:rPr>
+                        <w:t xml:space="preserve"> </w:t>
+                      </w:r>
+                      <w:proofErr w:type="spellStart"/>
+                      <w:r>
+                        <w:rPr>
+                          <w:rFonts w:ascii="Times New Roman" w:hAnsi="Times New Roman" w:cs="Times New Roman"/>
+                          <w:b/>
+                          <w:bCs/>
+                          <w:lang w:val="tr-TR"/>
+                        </w:rPr>
+                        <w:t>Strategy</w:t>
+                      </w:r>
+                      <w:proofErr w:type="spellEnd"/>
+                      <w:r>
+                        <w:rPr>
+                          <w:rFonts w:ascii="Times New Roman" w:hAnsi="Times New Roman" w:cs="Times New Roman"/>
+                          <w:b/>
+                          <w:bCs/>
+                          <w:lang w:val="tr-TR"/>
+                        </w:rPr>
+                        <w:t xml:space="preserve"> Evaluation </w:t>
+                      </w:r>
+                      <w:proofErr w:type="spellStart"/>
+                      <w:r>
+                        <w:rPr>
+                          <w:rFonts w:ascii="Times New Roman" w:hAnsi="Times New Roman" w:cs="Times New Roman"/>
+                          <w:b/>
+                          <w:bCs/>
+                          <w:lang w:val="tr-TR"/>
+                        </w:rPr>
+                        <w:t>When</w:t>
+                      </w:r>
+                      <w:proofErr w:type="spellEnd"/>
+                      <w:r>
+                        <w:rPr>
+                          <w:rFonts w:ascii="Times New Roman" w:hAnsi="Times New Roman" w:cs="Times New Roman"/>
+                          <w:b/>
+                          <w:bCs/>
+                          <w:lang w:val="tr-TR"/>
+                        </w:rPr>
+                        <w:t xml:space="preserve"> </w:t>
+                      </w:r>
+                      <w:proofErr w:type="spellStart"/>
+                      <w:r>
+                        <w:rPr>
+                          <w:rFonts w:ascii="Times New Roman" w:hAnsi="Times New Roman" w:cs="Times New Roman"/>
+                          <w:b/>
+                          <w:bCs/>
+                          <w:lang w:val="tr-TR"/>
+                        </w:rPr>
+                        <w:t>Confidence</w:t>
+                      </w:r>
+                      <w:proofErr w:type="spellEnd"/>
+                      <w:r>
+                        <w:rPr>
+                          <w:rFonts w:ascii="Times New Roman" w:hAnsi="Times New Roman" w:cs="Times New Roman"/>
+                          <w:b/>
+                          <w:bCs/>
+                          <w:lang w:val="tr-TR"/>
+                        </w:rPr>
+                        <w:t xml:space="preserve"> </w:t>
+                      </w:r>
+                      <w:proofErr w:type="spellStart"/>
+                      <w:r>
+                        <w:rPr>
+                          <w:rFonts w:ascii="Times New Roman" w:hAnsi="Times New Roman" w:cs="Times New Roman"/>
+                          <w:b/>
+                          <w:bCs/>
+                          <w:lang w:val="tr-TR"/>
+                        </w:rPr>
+                        <w:t>Threshold</w:t>
+                      </w:r>
+                      <w:proofErr w:type="spellEnd"/>
+                      <w:r>
+                        <w:rPr>
+                          <w:rFonts w:ascii="Times New Roman" w:hAnsi="Times New Roman" w:cs="Times New Roman"/>
+                          <w:b/>
+                          <w:bCs/>
+                          <w:lang w:val="tr-TR"/>
+                        </w:rPr>
+                        <w:t xml:space="preserve"> is 0.835</w:t>
                       </w:r>
                     </w:p>
                   </w:txbxContent>
@@ -7389,6 +8343,7 @@
                                 <w:lang w:val="tr-TR"/>
                               </w:rPr>
                             </w:pPr>
+                            <w:proofErr w:type="spellStart"/>
                             <w:r>
                               <w:rPr>
                                 <w:rFonts w:ascii="Times New Roman" w:hAnsi="Times New Roman" w:cs="Times New Roman"/>
@@ -7414,7 +8369,17 @@
                                 <w:bCs/>
                                 <w:lang w:val="tr-TR"/>
                               </w:rPr>
-                              <w:t xml:space="preserve">ure </w:t>
+                              <w:t>ure</w:t>
+                            </w:r>
+                            <w:proofErr w:type="spellEnd"/>
+                            <w:r>
+                              <w:rPr>
+                                <w:rFonts w:ascii="Times New Roman" w:hAnsi="Times New Roman" w:cs="Times New Roman"/>
+                                <w:b/>
+                                <w:bCs/>
+                                <w:lang w:val="tr-TR"/>
+                              </w:rPr>
+                              <w:t xml:space="preserve"> </w:t>
                             </w:r>
                             <w:r>
                               <w:rPr>
@@ -7432,7 +8397,127 @@
                                 <w:bCs/>
                                 <w:lang w:val="tr-TR"/>
                               </w:rPr>
-                              <w:t>: Learning to Defer Strategy Evaluation When Confidence Threshold is 0.29</w:t>
+                              <w:t xml:space="preserve">: Learning </w:t>
+                            </w:r>
+                            <w:proofErr w:type="spellStart"/>
+                            <w:r>
+                              <w:rPr>
+                                <w:rFonts w:ascii="Times New Roman" w:hAnsi="Times New Roman" w:cs="Times New Roman"/>
+                                <w:b/>
+                                <w:bCs/>
+                                <w:lang w:val="tr-TR"/>
+                              </w:rPr>
+                              <w:t>to</w:t>
+                            </w:r>
+                            <w:proofErr w:type="spellEnd"/>
+                            <w:r>
+                              <w:rPr>
+                                <w:rFonts w:ascii="Times New Roman" w:hAnsi="Times New Roman" w:cs="Times New Roman"/>
+                                <w:b/>
+                                <w:bCs/>
+                                <w:lang w:val="tr-TR"/>
+                              </w:rPr>
+                              <w:t xml:space="preserve"> </w:t>
+                            </w:r>
+                            <w:proofErr w:type="spellStart"/>
+                            <w:r>
+                              <w:rPr>
+                                <w:rFonts w:ascii="Times New Roman" w:hAnsi="Times New Roman" w:cs="Times New Roman"/>
+                                <w:b/>
+                                <w:bCs/>
+                                <w:lang w:val="tr-TR"/>
+                              </w:rPr>
+                              <w:t>Defer</w:t>
+                            </w:r>
+                            <w:proofErr w:type="spellEnd"/>
+                            <w:r>
+                              <w:rPr>
+                                <w:rFonts w:ascii="Times New Roman" w:hAnsi="Times New Roman" w:cs="Times New Roman"/>
+                                <w:b/>
+                                <w:bCs/>
+                                <w:lang w:val="tr-TR"/>
+                              </w:rPr>
+                              <w:t xml:space="preserve"> </w:t>
+                            </w:r>
+                            <w:proofErr w:type="spellStart"/>
+                            <w:r>
+                              <w:rPr>
+                                <w:rFonts w:ascii="Times New Roman" w:hAnsi="Times New Roman" w:cs="Times New Roman"/>
+                                <w:b/>
+                                <w:bCs/>
+                                <w:lang w:val="tr-TR"/>
+                              </w:rPr>
+                              <w:t>Strategy</w:t>
+                            </w:r>
+                            <w:proofErr w:type="spellEnd"/>
+                            <w:r>
+                              <w:rPr>
+                                <w:rFonts w:ascii="Times New Roman" w:hAnsi="Times New Roman" w:cs="Times New Roman"/>
+                                <w:b/>
+                                <w:bCs/>
+                                <w:lang w:val="tr-TR"/>
+                              </w:rPr>
+                              <w:t xml:space="preserve"> Evaluation </w:t>
+                            </w:r>
+                            <w:proofErr w:type="spellStart"/>
+                            <w:r>
+                              <w:rPr>
+                                <w:rFonts w:ascii="Times New Roman" w:hAnsi="Times New Roman" w:cs="Times New Roman"/>
+                                <w:b/>
+                                <w:bCs/>
+                                <w:lang w:val="tr-TR"/>
+                              </w:rPr>
+                              <w:t>When</w:t>
+                            </w:r>
+                            <w:proofErr w:type="spellEnd"/>
+                            <w:r>
+                              <w:rPr>
+                                <w:rFonts w:ascii="Times New Roman" w:hAnsi="Times New Roman" w:cs="Times New Roman"/>
+                                <w:b/>
+                                <w:bCs/>
+                                <w:lang w:val="tr-TR"/>
+                              </w:rPr>
+                              <w:t xml:space="preserve"> </w:t>
+                            </w:r>
+                            <w:proofErr w:type="spellStart"/>
+                            <w:r>
+                              <w:rPr>
+                                <w:rFonts w:ascii="Times New Roman" w:hAnsi="Times New Roman" w:cs="Times New Roman"/>
+                                <w:b/>
+                                <w:bCs/>
+                                <w:lang w:val="tr-TR"/>
+                              </w:rPr>
+                              <w:t>Confidence</w:t>
+                            </w:r>
+                            <w:proofErr w:type="spellEnd"/>
+                            <w:r>
+                              <w:rPr>
+                                <w:rFonts w:ascii="Times New Roman" w:hAnsi="Times New Roman" w:cs="Times New Roman"/>
+                                <w:b/>
+                                <w:bCs/>
+                                <w:lang w:val="tr-TR"/>
+                              </w:rPr>
+                              <w:t xml:space="preserve"> </w:t>
+                            </w:r>
+                            <w:proofErr w:type="spellStart"/>
+                            <w:r>
+                              <w:rPr>
+                                <w:rFonts w:ascii="Times New Roman" w:hAnsi="Times New Roman" w:cs="Times New Roman"/>
+                                <w:b/>
+                                <w:bCs/>
+                                <w:lang w:val="tr-TR"/>
+                              </w:rPr>
+                              <w:t>Threshold</w:t>
+                            </w:r>
+                            <w:proofErr w:type="spellEnd"/>
+                            <w:r>
+                              <w:rPr>
+                                <w:rFonts w:ascii="Times New Roman" w:hAnsi="Times New Roman" w:cs="Times New Roman"/>
+                                <w:b/>
+                                <w:bCs/>
+                                <w:lang w:val="tr-TR"/>
+                              </w:rPr>
+                              <w:t xml:space="preserve"> is 0.29</w:t>
                             </w:r>
                           </w:p>
                         </w:txbxContent>
@@ -7472,6 +8557,7 @@
                           <w:lang w:val="tr-TR"/>
                         </w:rPr>
                       </w:pPr>
+                      <w:proofErr w:type="spellStart"/>
                       <w:r>
                         <w:rPr>
                           <w:rFonts w:ascii="Times New Roman" w:hAnsi="Times New Roman" w:cs="Times New Roman"/>
@@ -7497,7 +8583,17 @@
                           <w:bCs/>
                           <w:lang w:val="tr-TR"/>
                         </w:rPr>
-                        <w:t xml:space="preserve">ure </w:t>
+                        <w:t>ure</w:t>
+                      </w:r>
+                      <w:proofErr w:type="spellEnd"/>
+                      <w:r>
+                        <w:rPr>
+                          <w:rFonts w:ascii="Times New Roman" w:hAnsi="Times New Roman" w:cs="Times New Roman"/>
+                          <w:b/>
+                          <w:bCs/>
+                          <w:lang w:val="tr-TR"/>
+                        </w:rPr>
+                        <w:t xml:space="preserve"> </w:t>
                       </w:r>
                       <w:r>
                         <w:rPr>
@@ -7515,7 +8611,127 @@
                           <w:bCs/>
                           <w:lang w:val="tr-TR"/>
                         </w:rPr>
-                        <w:t>: Learning to Defer Strategy Evaluation When Confidence Threshold is 0.29</w:t>
+                        <w:t xml:space="preserve">: Learning </w:t>
+                      </w:r>
+                      <w:proofErr w:type="spellStart"/>
+                      <w:r>
+                        <w:rPr>
+                          <w:rFonts w:ascii="Times New Roman" w:hAnsi="Times New Roman" w:cs="Times New Roman"/>
+                          <w:b/>
+                          <w:bCs/>
+                          <w:lang w:val="tr-TR"/>
+                        </w:rPr>
+                        <w:t>to</w:t>
+                      </w:r>
+                      <w:proofErr w:type="spellEnd"/>
+                      <w:r>
+                        <w:rPr>
+                          <w:rFonts w:ascii="Times New Roman" w:hAnsi="Times New Roman" w:cs="Times New Roman"/>
+                          <w:b/>
+                          <w:bCs/>
+                          <w:lang w:val="tr-TR"/>
+                        </w:rPr>
+                        <w:t xml:space="preserve"> </w:t>
+                      </w:r>
+                      <w:proofErr w:type="spellStart"/>
+                      <w:r>
+                        <w:rPr>
+                          <w:rFonts w:ascii="Times New Roman" w:hAnsi="Times New Roman" w:cs="Times New Roman"/>
+                          <w:b/>
+                          <w:bCs/>
+                          <w:lang w:val="tr-TR"/>
+                        </w:rPr>
+                        <w:t>Defer</w:t>
+                      </w:r>
+                      <w:proofErr w:type="spellEnd"/>
+                      <w:r>
+                        <w:rPr>
+                          <w:rFonts w:ascii="Times New Roman" w:hAnsi="Times New Roman" w:cs="Times New Roman"/>
+                          <w:b/>
+                          <w:bCs/>
+                          <w:lang w:val="tr-TR"/>
+                        </w:rPr>
+                        <w:t xml:space="preserve"> </w:t>
+                      </w:r>
+                      <w:proofErr w:type="spellStart"/>
+                      <w:r>
+                        <w:rPr>
+                          <w:rFonts w:ascii="Times New Roman" w:hAnsi="Times New Roman" w:cs="Times New Roman"/>
+                          <w:b/>
+                          <w:bCs/>
+                          <w:lang w:val="tr-TR"/>
+                        </w:rPr>
+                        <w:t>Strategy</w:t>
+                      </w:r>
+                      <w:proofErr w:type="spellEnd"/>
+                      <w:r>
+                        <w:rPr>
+                          <w:rFonts w:ascii="Times New Roman" w:hAnsi="Times New Roman" w:cs="Times New Roman"/>
+                          <w:b/>
+                          <w:bCs/>
+                          <w:lang w:val="tr-TR"/>
+                        </w:rPr>
+                        <w:t xml:space="preserve"> Evaluation </w:t>
+                      </w:r>
+                      <w:proofErr w:type="spellStart"/>
+                      <w:r>
+                        <w:rPr>
+                          <w:rFonts w:ascii="Times New Roman" w:hAnsi="Times New Roman" w:cs="Times New Roman"/>
+                          <w:b/>
+                          <w:bCs/>
+                          <w:lang w:val="tr-TR"/>
+                        </w:rPr>
+                        <w:t>When</w:t>
+                      </w:r>
+                      <w:proofErr w:type="spellEnd"/>
+                      <w:r>
+                        <w:rPr>
+                          <w:rFonts w:ascii="Times New Roman" w:hAnsi="Times New Roman" w:cs="Times New Roman"/>
+                          <w:b/>
+                          <w:bCs/>
+                          <w:lang w:val="tr-TR"/>
+                        </w:rPr>
+                        <w:t xml:space="preserve"> </w:t>
+                      </w:r>
+                      <w:proofErr w:type="spellStart"/>
+                      <w:r>
+                        <w:rPr>
+                          <w:rFonts w:ascii="Times New Roman" w:hAnsi="Times New Roman" w:cs="Times New Roman"/>
+                          <w:b/>
+                          <w:bCs/>
+                          <w:lang w:val="tr-TR"/>
+                        </w:rPr>
+                        <w:t>Confidence</w:t>
+                      </w:r>
+                      <w:proofErr w:type="spellEnd"/>
+                      <w:r>
+                        <w:rPr>
+                          <w:rFonts w:ascii="Times New Roman" w:hAnsi="Times New Roman" w:cs="Times New Roman"/>
+                          <w:b/>
+                          <w:bCs/>
+                          <w:lang w:val="tr-TR"/>
+                        </w:rPr>
+                        <w:t xml:space="preserve"> </w:t>
+                      </w:r>
+                      <w:proofErr w:type="spellStart"/>
+                      <w:r>
+                        <w:rPr>
+                          <w:rFonts w:ascii="Times New Roman" w:hAnsi="Times New Roman" w:cs="Times New Roman"/>
+                          <w:b/>
+                          <w:bCs/>
+                          <w:lang w:val="tr-TR"/>
+                        </w:rPr>
+                        <w:t>Threshold</w:t>
+                      </w:r>
+                      <w:proofErr w:type="spellEnd"/>
+                      <w:r>
+                        <w:rPr>
+                          <w:rFonts w:ascii="Times New Roman" w:hAnsi="Times New Roman" w:cs="Times New Roman"/>
+                          <w:b/>
+                          <w:bCs/>
+                          <w:lang w:val="tr-TR"/>
+                        </w:rPr>
+                        <w:t xml:space="preserve"> is 0.29</w:t>
                       </w:r>
                     </w:p>
                   </w:txbxContent>
@@ -7914,7 +9130,231 @@
           <w:rFonts w:ascii="Times New Roman" w:hAnsi="Times New Roman" w:cs="Times New Roman"/>
           <w:lang w:val="tr-TR"/>
         </w:rPr>
-        <w:t xml:space="preserve">Here, the system accuracy calculated is a hybrid value. The accuracy value is calculated for the ground truth </w:t>
+        <w:t xml:space="preserve">Here, </w:t>
+      </w:r>
+      <w:proofErr w:type="spellStart"/>
+      <w:r>
+        <w:rPr>
+          <w:rFonts w:ascii="Times New Roman" w:hAnsi="Times New Roman" w:cs="Times New Roman"/>
+          <w:lang w:val="tr-TR"/>
+        </w:rPr>
+        <w:t>the</w:t>
+      </w:r>
+      <w:proofErr w:type="spellEnd"/>
+      <w:r>
+        <w:rPr>
+          <w:rFonts w:ascii="Times New Roman" w:hAnsi="Times New Roman" w:cs="Times New Roman"/>
+          <w:lang w:val="tr-TR"/>
+        </w:rPr>
+        <w:t xml:space="preserve"> </w:t>
+      </w:r>
+      <w:proofErr w:type="spellStart"/>
+      <w:r>
+        <w:rPr>
+          <w:rFonts w:ascii="Times New Roman" w:hAnsi="Times New Roman" w:cs="Times New Roman"/>
+          <w:lang w:val="tr-TR"/>
+        </w:rPr>
+        <w:t>system</w:t>
+      </w:r>
+      <w:proofErr w:type="spellEnd"/>
+      <w:r>
+        <w:rPr>
+          <w:rFonts w:ascii="Times New Roman" w:hAnsi="Times New Roman" w:cs="Times New Roman"/>
+          <w:lang w:val="tr-TR"/>
+        </w:rPr>
+        <w:t xml:space="preserve"> </w:t>
+      </w:r>
+      <w:proofErr w:type="spellStart"/>
+      <w:r>
+        <w:rPr>
+          <w:rFonts w:ascii="Times New Roman" w:hAnsi="Times New Roman" w:cs="Times New Roman"/>
+          <w:lang w:val="tr-TR"/>
+        </w:rPr>
+        <w:t>accuracy</w:t>
+      </w:r>
+      <w:proofErr w:type="spellEnd"/>
+      <w:r>
+        <w:rPr>
+          <w:rFonts w:ascii="Times New Roman" w:hAnsi="Times New Roman" w:cs="Times New Roman"/>
+          <w:lang w:val="tr-TR"/>
+        </w:rPr>
+        <w:t xml:space="preserve"> </w:t>
+      </w:r>
+      <w:proofErr w:type="spellStart"/>
+      <w:r>
+        <w:rPr>
+          <w:rFonts w:ascii="Times New Roman" w:hAnsi="Times New Roman" w:cs="Times New Roman"/>
+          <w:lang w:val="tr-TR"/>
+        </w:rPr>
+        <w:t>calculated</w:t>
+      </w:r>
+      <w:proofErr w:type="spellEnd"/>
+      <w:r>
+        <w:rPr>
+          <w:rFonts w:ascii="Times New Roman" w:hAnsi="Times New Roman" w:cs="Times New Roman"/>
+          <w:lang w:val="tr-TR"/>
+        </w:rPr>
+        <w:t xml:space="preserve"> is a </w:t>
+      </w:r>
+      <w:proofErr w:type="spellStart"/>
+      <w:r>
+        <w:rPr>
+          <w:rFonts w:ascii="Times New Roman" w:hAnsi="Times New Roman" w:cs="Times New Roman"/>
+          <w:lang w:val="tr-TR"/>
+        </w:rPr>
+        <w:t>hybrid</w:t>
+      </w:r>
+      <w:proofErr w:type="spellEnd"/>
+      <w:r>
+        <w:rPr>
+          <w:rFonts w:ascii="Times New Roman" w:hAnsi="Times New Roman" w:cs="Times New Roman"/>
+          <w:lang w:val="tr-TR"/>
+        </w:rPr>
+        <w:t xml:space="preserve"> </w:t>
+      </w:r>
+      <w:proofErr w:type="spellStart"/>
+      <w:r>
+        <w:rPr>
+          <w:rFonts w:ascii="Times New Roman" w:hAnsi="Times New Roman" w:cs="Times New Roman"/>
+          <w:lang w:val="tr-TR"/>
+        </w:rPr>
+        <w:t>value</w:t>
+      </w:r>
+      <w:proofErr w:type="spellEnd"/>
+      <w:r>
+        <w:rPr>
+          <w:rFonts w:ascii="Times New Roman" w:hAnsi="Times New Roman" w:cs="Times New Roman"/>
+          <w:lang w:val="tr-TR"/>
+        </w:rPr>
+        <w:t xml:space="preserve">. </w:t>
+      </w:r>
+      <w:proofErr w:type="spellStart"/>
+      <w:r>
+        <w:rPr>
+          <w:rFonts w:ascii="Times New Roman" w:hAnsi="Times New Roman" w:cs="Times New Roman"/>
+          <w:lang w:val="tr-TR"/>
+        </w:rPr>
+        <w:t>The</w:t>
+      </w:r>
+      <w:proofErr w:type="spellEnd"/>
+      <w:r>
+        <w:rPr>
+          <w:rFonts w:ascii="Times New Roman" w:hAnsi="Times New Roman" w:cs="Times New Roman"/>
+          <w:lang w:val="tr-TR"/>
+        </w:rPr>
+        <w:t xml:space="preserve"> </w:t>
+      </w:r>
+      <w:proofErr w:type="spellStart"/>
+      <w:r>
+        <w:rPr>
+          <w:rFonts w:ascii="Times New Roman" w:hAnsi="Times New Roman" w:cs="Times New Roman"/>
+          <w:lang w:val="tr-TR"/>
+        </w:rPr>
+        <w:t>accuracy</w:t>
+      </w:r>
+      <w:proofErr w:type="spellEnd"/>
+      <w:r>
+        <w:rPr>
+          <w:rFonts w:ascii="Times New Roman" w:hAnsi="Times New Roman" w:cs="Times New Roman"/>
+          <w:lang w:val="tr-TR"/>
+        </w:rPr>
+        <w:t xml:space="preserve"> </w:t>
+      </w:r>
+      <w:proofErr w:type="spellStart"/>
+      <w:r>
+        <w:rPr>
+          <w:rFonts w:ascii="Times New Roman" w:hAnsi="Times New Roman" w:cs="Times New Roman"/>
+          <w:lang w:val="tr-TR"/>
+        </w:rPr>
+        <w:t>value</w:t>
+      </w:r>
+      <w:proofErr w:type="spellEnd"/>
+      <w:r>
+        <w:rPr>
+          <w:rFonts w:ascii="Times New Roman" w:hAnsi="Times New Roman" w:cs="Times New Roman"/>
+          <w:lang w:val="tr-TR"/>
+        </w:rPr>
+        <w:t xml:space="preserve"> is </w:t>
+      </w:r>
+      <w:proofErr w:type="spellStart"/>
+      <w:r>
+        <w:rPr>
+          <w:rFonts w:ascii="Times New Roman" w:hAnsi="Times New Roman" w:cs="Times New Roman"/>
+          <w:lang w:val="tr-TR"/>
+        </w:rPr>
+        <w:t>calculated</w:t>
+      </w:r>
+      <w:proofErr w:type="spellEnd"/>
+      <w:r>
+        <w:rPr>
+          <w:rFonts w:ascii="Times New Roman" w:hAnsi="Times New Roman" w:cs="Times New Roman"/>
+          <w:lang w:val="tr-TR"/>
+        </w:rPr>
+        <w:t xml:space="preserve"> </w:t>
+      </w:r>
+      <w:proofErr w:type="spellStart"/>
+      <w:r>
+        <w:rPr>
+          <w:rFonts w:ascii="Times New Roman" w:hAnsi="Times New Roman" w:cs="Times New Roman"/>
+          <w:lang w:val="tr-TR"/>
+        </w:rPr>
+        <w:t>for</w:t>
+      </w:r>
+      <w:proofErr w:type="spellEnd"/>
+      <w:r>
+        <w:rPr>
+          <w:rFonts w:ascii="Times New Roman" w:hAnsi="Times New Roman" w:cs="Times New Roman"/>
+          <w:lang w:val="tr-TR"/>
+        </w:rPr>
+        <w:t xml:space="preserve"> </w:t>
+      </w:r>
+      <w:proofErr w:type="spellStart"/>
+      <w:r>
+        <w:rPr>
+          <w:rFonts w:ascii="Times New Roman" w:hAnsi="Times New Roman" w:cs="Times New Roman"/>
+          <w:lang w:val="tr-TR"/>
+        </w:rPr>
+        <w:t>the</w:t>
+      </w:r>
+      <w:proofErr w:type="spellEnd"/>
+      <w:r>
+        <w:rPr>
+          <w:rFonts w:ascii="Times New Roman" w:hAnsi="Times New Roman" w:cs="Times New Roman"/>
+          <w:lang w:val="tr-TR"/>
+        </w:rPr>
+        <w:t xml:space="preserve"> </w:t>
+      </w:r>
+      <w:proofErr w:type="spellStart"/>
+      <w:r>
+        <w:rPr>
+          <w:rFonts w:ascii="Times New Roman" w:hAnsi="Times New Roman" w:cs="Times New Roman"/>
+          <w:lang w:val="tr-TR"/>
+        </w:rPr>
+        <w:t>ground</w:t>
+      </w:r>
+      <w:proofErr w:type="spellEnd"/>
+      <w:r>
+        <w:rPr>
+          <w:rFonts w:ascii="Times New Roman" w:hAnsi="Times New Roman" w:cs="Times New Roman"/>
+          <w:lang w:val="tr-TR"/>
+        </w:rPr>
+        <w:t xml:space="preserve"> </w:t>
+      </w:r>
+      <w:proofErr w:type="spellStart"/>
+      <w:r>
+        <w:rPr>
+          <w:rFonts w:ascii="Times New Roman" w:hAnsi="Times New Roman" w:cs="Times New Roman"/>
+          <w:lang w:val="tr-TR"/>
+        </w:rPr>
+        <w:t>truth</w:t>
+      </w:r>
+      <w:proofErr w:type="spellEnd"/>
+      <w:r>
+        <w:rPr>
+          <w:rFonts w:ascii="Times New Roman" w:hAnsi="Times New Roman" w:cs="Times New Roman"/>
+          <w:lang w:val="tr-TR"/>
+        </w:rPr>
+        <w:t xml:space="preserve"> </w:t>
       </w:r>
       <w:r>
         <w:rPr>
@@ -7922,6 +9362,7 @@
         </w:rPr>
         <w:t>"</w:t>
       </w:r>
+      <w:proofErr w:type="spellStart"/>
       <w:r>
         <w:rPr>
           <w:rFonts w:ascii="Times New Roman" w:hAnsi="Times New Roman" w:cs="Times New Roman"/>
@@ -7931,17 +9372,12 @@
         </w:rPr>
         <w:t>y_test</w:t>
       </w:r>
-      <w:r>
-        <w:rPr>
-          <w:rFonts w:ascii="Times New Roman" w:hAnsi="Times New Roman" w:cs="Times New Roman"/>
-        </w:rPr>
-        <w:t>"</w:t>
-      </w:r>
-      <w:r>
-        <w:rPr>
-          <w:rFonts w:ascii="Times New Roman" w:hAnsi="Times New Roman" w:cs="Times New Roman"/>
-        </w:rPr>
-        <w:t xml:space="preserve"> values and final_predictions</w:t>
+      <w:proofErr w:type="spellEnd"/>
+      <w:r>
+        <w:rPr>
+          <w:rFonts w:ascii="Times New Roman" w:hAnsi="Times New Roman" w:cs="Times New Roman"/>
+        </w:rPr>
+        <w:t>" values and final_predictions</w:t>
       </w:r>
       <w:r>
         <w:rPr>
@@ -7977,138 +9413,939 @@
         </w:rPr>
         <w:tab/>
       </w:r>
-      <w:r>
-        <w:rPr>
-          <w:rFonts w:ascii="Times New Roman" w:hAnsi="Times New Roman" w:cs="Times New Roman"/>
-          <w:lang w:val="tr-TR"/>
-        </w:rPr>
-        <w:t>If t</w:t>
-      </w:r>
-      <w:r>
-        <w:rPr>
-          <w:rFonts w:ascii="Times New Roman" w:hAnsi="Times New Roman" w:cs="Times New Roman"/>
-          <w:lang w:val="tr-TR"/>
-        </w:rPr>
-        <w:t xml:space="preserve">he max probability coming from the baseline model trained on the X input test dataset </w:t>
-      </w:r>
-      <w:r>
-        <w:rPr>
-          <w:rFonts w:ascii="Times New Roman" w:hAnsi="Times New Roman" w:cs="Times New Roman"/>
-          <w:lang w:val="tr-TR"/>
-        </w:rPr>
-        <w:t>is below the threshold</w:t>
-      </w:r>
-      <w:r>
-        <w:rPr>
-          <w:rFonts w:ascii="Times New Roman" w:hAnsi="Times New Roman" w:cs="Times New Roman"/>
-          <w:lang w:val="tr-TR"/>
-        </w:rPr>
-        <w:t xml:space="preserve"> </w:t>
-      </w:r>
-      <w:r>
-        <w:rPr>
-          <w:rFonts w:ascii="Times New Roman" w:hAnsi="Times New Roman" w:cs="Times New Roman"/>
-          <w:b/>
-          <w:bCs/>
-          <w:lang w:val="tr-TR"/>
-        </w:rPr>
-        <w:t>(max_probs[i] </w:t>
-      </w:r>
-      <w:r>
-        <w:rPr>
-          <w:rFonts w:ascii="Times New Roman" w:hAnsi="Times New Roman" w:cs="Times New Roman"/>
-          <w:b/>
-          <w:bCs/>
-          <w:lang w:val="tr-TR"/>
-        </w:rPr>
-        <w:t>&lt;</w:t>
-      </w:r>
-      <w:r>
-        <w:rPr>
-          <w:rFonts w:ascii="Times New Roman" w:hAnsi="Times New Roman" w:cs="Times New Roman"/>
-          <w:b/>
-          <w:bCs/>
-          <w:lang w:val="tr-TR"/>
-        </w:rPr>
-        <w:t xml:space="preserve"> threshold)</w:t>
-      </w:r>
-      <w:r>
-        <w:rPr>
-          <w:rFonts w:ascii="Times New Roman" w:hAnsi="Times New Roman" w:cs="Times New Roman"/>
-          <w:lang w:val="tr-TR"/>
-        </w:rPr>
-        <w:t xml:space="preserve">, it means that we are deferring to the expert. </w:t>
-      </w:r>
-      <w:r>
-        <w:rPr>
-          <w:rFonts w:ascii="Times New Roman" w:hAnsi="Times New Roman" w:cs="Times New Roman"/>
-          <w:lang w:val="tr-TR"/>
-        </w:rPr>
-        <w:t xml:space="preserve">However, in this scenario, if the baseline classifier is correct for the current index, it is </w:t>
-      </w:r>
-      <w:r>
-        <w:rPr>
-          <w:rFonts w:ascii="Times New Roman" w:hAnsi="Times New Roman" w:cs="Times New Roman"/>
-          <w:b/>
-          <w:bCs/>
-          <w:lang w:val="tr-TR"/>
-        </w:rPr>
-        <w:t>a false deferral</w:t>
-      </w:r>
-      <w:r>
-        <w:rPr>
-          <w:rFonts w:ascii="Times New Roman" w:hAnsi="Times New Roman" w:cs="Times New Roman"/>
-          <w:lang w:val="tr-TR"/>
-        </w:rPr>
-        <w:t xml:space="preserve"> </w:t>
-      </w:r>
-      <w:r>
-        <w:rPr>
-          <w:rFonts w:ascii="Times New Roman" w:hAnsi="Times New Roman" w:cs="Times New Roman"/>
-          <w:b/>
-          <w:bCs/>
-          <w:lang w:val="tr-TR"/>
-        </w:rPr>
-        <w:t>(false positive)</w:t>
-      </w:r>
-      <w:r>
-        <w:rPr>
-          <w:rFonts w:ascii="Times New Roman" w:hAnsi="Times New Roman" w:cs="Times New Roman"/>
-          <w:lang w:val="tr-TR"/>
-        </w:rPr>
-        <w:t xml:space="preserve"> of knowledge to the expert. Otherwise, it is a </w:t>
-      </w:r>
-      <w:r>
-        <w:rPr>
-          <w:rFonts w:ascii="Times New Roman" w:hAnsi="Times New Roman" w:cs="Times New Roman"/>
-          <w:b/>
-          <w:bCs/>
-          <w:lang w:val="tr-TR"/>
-        </w:rPr>
-        <w:t>true deferral</w:t>
-      </w:r>
-      <w:r>
-        <w:rPr>
-          <w:rFonts w:ascii="Times New Roman" w:hAnsi="Times New Roman" w:cs="Times New Roman"/>
-          <w:lang w:val="tr-TR"/>
-        </w:rPr>
-        <w:t xml:space="preserve"> </w:t>
-      </w:r>
-      <w:r>
-        <w:rPr>
-          <w:rFonts w:ascii="Times New Roman" w:hAnsi="Times New Roman" w:cs="Times New Roman"/>
-          <w:b/>
-          <w:bCs/>
-          <w:lang w:val="tr-TR"/>
-        </w:rPr>
-        <w:t>(true positive)</w:t>
-      </w:r>
-      <w:r>
-        <w:rPr>
-          <w:rFonts w:ascii="Times New Roman" w:hAnsi="Times New Roman" w:cs="Times New Roman"/>
-          <w:lang w:val="tr-TR"/>
-        </w:rPr>
-        <w:t xml:space="preserve"> case. </w:t>
+      <w:proofErr w:type="spellStart"/>
+      <w:r>
+        <w:rPr>
+          <w:rFonts w:ascii="Times New Roman" w:hAnsi="Times New Roman" w:cs="Times New Roman"/>
+          <w:lang w:val="tr-TR"/>
+        </w:rPr>
+        <w:t>If</w:t>
+      </w:r>
+      <w:proofErr w:type="spellEnd"/>
+      <w:r>
+        <w:rPr>
+          <w:rFonts w:ascii="Times New Roman" w:hAnsi="Times New Roman" w:cs="Times New Roman"/>
+          <w:lang w:val="tr-TR"/>
+        </w:rPr>
+        <w:t xml:space="preserve"> </w:t>
+      </w:r>
+      <w:proofErr w:type="spellStart"/>
+      <w:r>
+        <w:rPr>
+          <w:rFonts w:ascii="Times New Roman" w:hAnsi="Times New Roman" w:cs="Times New Roman"/>
+          <w:lang w:val="tr-TR"/>
+        </w:rPr>
+        <w:t>t</w:t>
+      </w:r>
+      <w:r>
+        <w:rPr>
+          <w:rFonts w:ascii="Times New Roman" w:hAnsi="Times New Roman" w:cs="Times New Roman"/>
+          <w:lang w:val="tr-TR"/>
+        </w:rPr>
+        <w:t>he</w:t>
+      </w:r>
+      <w:proofErr w:type="spellEnd"/>
+      <w:r>
+        <w:rPr>
+          <w:rFonts w:ascii="Times New Roman" w:hAnsi="Times New Roman" w:cs="Times New Roman"/>
+          <w:lang w:val="tr-TR"/>
+        </w:rPr>
+        <w:t xml:space="preserve"> </w:t>
+      </w:r>
+      <w:proofErr w:type="spellStart"/>
+      <w:r>
+        <w:rPr>
+          <w:rFonts w:ascii="Times New Roman" w:hAnsi="Times New Roman" w:cs="Times New Roman"/>
+          <w:lang w:val="tr-TR"/>
+        </w:rPr>
+        <w:t>max</w:t>
+      </w:r>
+      <w:proofErr w:type="spellEnd"/>
+      <w:r>
+        <w:rPr>
+          <w:rFonts w:ascii="Times New Roman" w:hAnsi="Times New Roman" w:cs="Times New Roman"/>
+          <w:lang w:val="tr-TR"/>
+        </w:rPr>
+        <w:t xml:space="preserve"> </w:t>
+      </w:r>
+      <w:proofErr w:type="spellStart"/>
+      <w:r>
+        <w:rPr>
+          <w:rFonts w:ascii="Times New Roman" w:hAnsi="Times New Roman" w:cs="Times New Roman"/>
+          <w:lang w:val="tr-TR"/>
+        </w:rPr>
+        <w:t>probability</w:t>
+      </w:r>
+      <w:proofErr w:type="spellEnd"/>
+      <w:r>
+        <w:rPr>
+          <w:rFonts w:ascii="Times New Roman" w:hAnsi="Times New Roman" w:cs="Times New Roman"/>
+          <w:lang w:val="tr-TR"/>
+        </w:rPr>
+        <w:t xml:space="preserve"> </w:t>
+      </w:r>
+      <w:proofErr w:type="spellStart"/>
+      <w:r>
+        <w:rPr>
+          <w:rFonts w:ascii="Times New Roman" w:hAnsi="Times New Roman" w:cs="Times New Roman"/>
+          <w:lang w:val="tr-TR"/>
+        </w:rPr>
+        <w:t>coming</w:t>
+      </w:r>
+      <w:proofErr w:type="spellEnd"/>
+      <w:r>
+        <w:rPr>
+          <w:rFonts w:ascii="Times New Roman" w:hAnsi="Times New Roman" w:cs="Times New Roman"/>
+          <w:lang w:val="tr-TR"/>
+        </w:rPr>
+        <w:t xml:space="preserve"> </w:t>
+      </w:r>
+      <w:proofErr w:type="spellStart"/>
+      <w:r>
+        <w:rPr>
+          <w:rFonts w:ascii="Times New Roman" w:hAnsi="Times New Roman" w:cs="Times New Roman"/>
+          <w:lang w:val="tr-TR"/>
+        </w:rPr>
+        <w:t>from</w:t>
+      </w:r>
+      <w:proofErr w:type="spellEnd"/>
+      <w:r>
+        <w:rPr>
+          <w:rFonts w:ascii="Times New Roman" w:hAnsi="Times New Roman" w:cs="Times New Roman"/>
+          <w:lang w:val="tr-TR"/>
+        </w:rPr>
+        <w:t xml:space="preserve"> </w:t>
+      </w:r>
+      <w:proofErr w:type="spellStart"/>
+      <w:r>
+        <w:rPr>
+          <w:rFonts w:ascii="Times New Roman" w:hAnsi="Times New Roman" w:cs="Times New Roman"/>
+          <w:lang w:val="tr-TR"/>
+        </w:rPr>
+        <w:t>the</w:t>
+      </w:r>
+      <w:proofErr w:type="spellEnd"/>
+      <w:r>
+        <w:rPr>
+          <w:rFonts w:ascii="Times New Roman" w:hAnsi="Times New Roman" w:cs="Times New Roman"/>
+          <w:lang w:val="tr-TR"/>
+        </w:rPr>
+        <w:t xml:space="preserve"> </w:t>
+      </w:r>
+      <w:proofErr w:type="spellStart"/>
+      <w:r>
+        <w:rPr>
+          <w:rFonts w:ascii="Times New Roman" w:hAnsi="Times New Roman" w:cs="Times New Roman"/>
+          <w:lang w:val="tr-TR"/>
+        </w:rPr>
+        <w:t>baseline</w:t>
+      </w:r>
+      <w:proofErr w:type="spellEnd"/>
+      <w:r>
+        <w:rPr>
+          <w:rFonts w:ascii="Times New Roman" w:hAnsi="Times New Roman" w:cs="Times New Roman"/>
+          <w:lang w:val="tr-TR"/>
+        </w:rPr>
+        <w:t xml:space="preserve"> model </w:t>
+      </w:r>
+      <w:proofErr w:type="spellStart"/>
+      <w:r>
+        <w:rPr>
+          <w:rFonts w:ascii="Times New Roman" w:hAnsi="Times New Roman" w:cs="Times New Roman"/>
+          <w:lang w:val="tr-TR"/>
+        </w:rPr>
+        <w:t>trained</w:t>
+      </w:r>
+      <w:proofErr w:type="spellEnd"/>
+      <w:r>
+        <w:rPr>
+          <w:rFonts w:ascii="Times New Roman" w:hAnsi="Times New Roman" w:cs="Times New Roman"/>
+          <w:lang w:val="tr-TR"/>
+        </w:rPr>
+        <w:t xml:space="preserve"> on </w:t>
+      </w:r>
+      <w:proofErr w:type="spellStart"/>
+      <w:r>
+        <w:rPr>
+          <w:rFonts w:ascii="Times New Roman" w:hAnsi="Times New Roman" w:cs="Times New Roman"/>
+          <w:lang w:val="tr-TR"/>
+        </w:rPr>
+        <w:t>the</w:t>
+      </w:r>
+      <w:proofErr w:type="spellEnd"/>
+      <w:r>
+        <w:rPr>
+          <w:rFonts w:ascii="Times New Roman" w:hAnsi="Times New Roman" w:cs="Times New Roman"/>
+          <w:lang w:val="tr-TR"/>
+        </w:rPr>
+        <w:t xml:space="preserve"> X </w:t>
+      </w:r>
+      <w:proofErr w:type="spellStart"/>
+      <w:r>
+        <w:rPr>
+          <w:rFonts w:ascii="Times New Roman" w:hAnsi="Times New Roman" w:cs="Times New Roman"/>
+          <w:lang w:val="tr-TR"/>
+        </w:rPr>
+        <w:t>input</w:t>
+      </w:r>
+      <w:proofErr w:type="spellEnd"/>
+      <w:r>
+        <w:rPr>
+          <w:rFonts w:ascii="Times New Roman" w:hAnsi="Times New Roman" w:cs="Times New Roman"/>
+          <w:lang w:val="tr-TR"/>
+        </w:rPr>
+        <w:t xml:space="preserve"> test </w:t>
+      </w:r>
+      <w:proofErr w:type="spellStart"/>
+      <w:r>
+        <w:rPr>
+          <w:rFonts w:ascii="Times New Roman" w:hAnsi="Times New Roman" w:cs="Times New Roman"/>
+          <w:lang w:val="tr-TR"/>
+        </w:rPr>
+        <w:t>dataset</w:t>
+      </w:r>
+      <w:proofErr w:type="spellEnd"/>
+      <w:r>
+        <w:rPr>
+          <w:rFonts w:ascii="Times New Roman" w:hAnsi="Times New Roman" w:cs="Times New Roman"/>
+          <w:lang w:val="tr-TR"/>
+        </w:rPr>
+        <w:t xml:space="preserve"> </w:t>
+      </w:r>
+      <w:r>
+        <w:rPr>
+          <w:rFonts w:ascii="Times New Roman" w:hAnsi="Times New Roman" w:cs="Times New Roman"/>
+          <w:lang w:val="tr-TR"/>
+        </w:rPr>
+        <w:t xml:space="preserve">is </w:t>
+      </w:r>
+      <w:proofErr w:type="spellStart"/>
+      <w:r>
+        <w:rPr>
+          <w:rFonts w:ascii="Times New Roman" w:hAnsi="Times New Roman" w:cs="Times New Roman"/>
+          <w:lang w:val="tr-TR"/>
+        </w:rPr>
+        <w:t>below</w:t>
+      </w:r>
+      <w:proofErr w:type="spellEnd"/>
+      <w:r>
+        <w:rPr>
+          <w:rFonts w:ascii="Times New Roman" w:hAnsi="Times New Roman" w:cs="Times New Roman"/>
+          <w:lang w:val="tr-TR"/>
+        </w:rPr>
+        <w:t xml:space="preserve"> </w:t>
+      </w:r>
+      <w:proofErr w:type="spellStart"/>
+      <w:r>
+        <w:rPr>
+          <w:rFonts w:ascii="Times New Roman" w:hAnsi="Times New Roman" w:cs="Times New Roman"/>
+          <w:lang w:val="tr-TR"/>
+        </w:rPr>
+        <w:t>the</w:t>
+      </w:r>
+      <w:proofErr w:type="spellEnd"/>
+      <w:r>
+        <w:rPr>
+          <w:rFonts w:ascii="Times New Roman" w:hAnsi="Times New Roman" w:cs="Times New Roman"/>
+          <w:lang w:val="tr-TR"/>
+        </w:rPr>
+        <w:t xml:space="preserve"> </w:t>
+      </w:r>
+      <w:proofErr w:type="spellStart"/>
+      <w:r>
+        <w:rPr>
+          <w:rFonts w:ascii="Times New Roman" w:hAnsi="Times New Roman" w:cs="Times New Roman"/>
+          <w:lang w:val="tr-TR"/>
+        </w:rPr>
+        <w:t>threshold</w:t>
+      </w:r>
+      <w:proofErr w:type="spellEnd"/>
+      <w:r>
+        <w:rPr>
+          <w:rFonts w:ascii="Times New Roman" w:hAnsi="Times New Roman" w:cs="Times New Roman"/>
+          <w:lang w:val="tr-TR"/>
+        </w:rPr>
+        <w:t xml:space="preserve"> </w:t>
+      </w:r>
+      <w:r>
+        <w:rPr>
+          <w:rFonts w:ascii="Times New Roman" w:hAnsi="Times New Roman" w:cs="Times New Roman"/>
+          <w:b/>
+          <w:bCs/>
+          <w:lang w:val="tr-TR"/>
+        </w:rPr>
+        <w:t>(</w:t>
+      </w:r>
+      <w:proofErr w:type="spellStart"/>
+      <w:r>
+        <w:rPr>
+          <w:rFonts w:ascii="Times New Roman" w:hAnsi="Times New Roman" w:cs="Times New Roman"/>
+          <w:b/>
+          <w:bCs/>
+          <w:lang w:val="tr-TR"/>
+        </w:rPr>
+        <w:t>max_probs</w:t>
+      </w:r>
+      <w:proofErr w:type="spellEnd"/>
+      <w:r>
+        <w:rPr>
+          <w:rFonts w:ascii="Times New Roman" w:hAnsi="Times New Roman" w:cs="Times New Roman"/>
+          <w:b/>
+          <w:bCs/>
+          <w:lang w:val="tr-TR"/>
+        </w:rPr>
+        <w:t>[i] </w:t>
+      </w:r>
+      <w:proofErr w:type="gramStart"/>
+      <w:r>
+        <w:rPr>
+          <w:rFonts w:ascii="Times New Roman" w:hAnsi="Times New Roman" w:cs="Times New Roman"/>
+          <w:b/>
+          <w:bCs/>
+          <w:lang w:val="tr-TR"/>
+        </w:rPr>
+        <w:t xml:space="preserve">&lt; </w:t>
+      </w:r>
+      <w:proofErr w:type="spellStart"/>
+      <w:r>
+        <w:rPr>
+          <w:rFonts w:ascii="Times New Roman" w:hAnsi="Times New Roman" w:cs="Times New Roman"/>
+          <w:b/>
+          <w:bCs/>
+          <w:lang w:val="tr-TR"/>
+        </w:rPr>
+        <w:t>threshold</w:t>
+      </w:r>
+      <w:proofErr w:type="spellEnd"/>
+      <w:proofErr w:type="gramEnd"/>
+      <w:r>
+        <w:rPr>
+          <w:rFonts w:ascii="Times New Roman" w:hAnsi="Times New Roman" w:cs="Times New Roman"/>
+          <w:b/>
+          <w:bCs/>
+          <w:lang w:val="tr-TR"/>
+        </w:rPr>
+        <w:t>)</w:t>
+      </w:r>
+      <w:r>
+        <w:rPr>
+          <w:rFonts w:ascii="Times New Roman" w:hAnsi="Times New Roman" w:cs="Times New Roman"/>
+          <w:lang w:val="tr-TR"/>
+        </w:rPr>
+        <w:t xml:space="preserve">, it </w:t>
+      </w:r>
+      <w:proofErr w:type="spellStart"/>
+      <w:r>
+        <w:rPr>
+          <w:rFonts w:ascii="Times New Roman" w:hAnsi="Times New Roman" w:cs="Times New Roman"/>
+          <w:lang w:val="tr-TR"/>
+        </w:rPr>
+        <w:t>means</w:t>
+      </w:r>
+      <w:proofErr w:type="spellEnd"/>
+      <w:r>
+        <w:rPr>
+          <w:rFonts w:ascii="Times New Roman" w:hAnsi="Times New Roman" w:cs="Times New Roman"/>
+          <w:lang w:val="tr-TR"/>
+        </w:rPr>
+        <w:t xml:space="preserve"> </w:t>
+      </w:r>
+      <w:proofErr w:type="spellStart"/>
+      <w:r>
+        <w:rPr>
+          <w:rFonts w:ascii="Times New Roman" w:hAnsi="Times New Roman" w:cs="Times New Roman"/>
+          <w:lang w:val="tr-TR"/>
+        </w:rPr>
+        <w:t>that</w:t>
+      </w:r>
+      <w:proofErr w:type="spellEnd"/>
+      <w:r>
+        <w:rPr>
+          <w:rFonts w:ascii="Times New Roman" w:hAnsi="Times New Roman" w:cs="Times New Roman"/>
+          <w:lang w:val="tr-TR"/>
+        </w:rPr>
+        <w:t xml:space="preserve"> </w:t>
+      </w:r>
+      <w:proofErr w:type="spellStart"/>
+      <w:r>
+        <w:rPr>
+          <w:rFonts w:ascii="Times New Roman" w:hAnsi="Times New Roman" w:cs="Times New Roman"/>
+          <w:lang w:val="tr-TR"/>
+        </w:rPr>
+        <w:t>we</w:t>
+      </w:r>
+      <w:proofErr w:type="spellEnd"/>
+      <w:r>
+        <w:rPr>
+          <w:rFonts w:ascii="Times New Roman" w:hAnsi="Times New Roman" w:cs="Times New Roman"/>
+          <w:lang w:val="tr-TR"/>
+        </w:rPr>
+        <w:t xml:space="preserve"> </w:t>
+      </w:r>
+      <w:proofErr w:type="spellStart"/>
+      <w:r>
+        <w:rPr>
+          <w:rFonts w:ascii="Times New Roman" w:hAnsi="Times New Roman" w:cs="Times New Roman"/>
+          <w:lang w:val="tr-TR"/>
+        </w:rPr>
+        <w:t>are</w:t>
+      </w:r>
+      <w:proofErr w:type="spellEnd"/>
+      <w:r>
+        <w:rPr>
+          <w:rFonts w:ascii="Times New Roman" w:hAnsi="Times New Roman" w:cs="Times New Roman"/>
+          <w:lang w:val="tr-TR"/>
+        </w:rPr>
+        <w:t xml:space="preserve"> </w:t>
+      </w:r>
+      <w:proofErr w:type="spellStart"/>
+      <w:r>
+        <w:rPr>
+          <w:rFonts w:ascii="Times New Roman" w:hAnsi="Times New Roman" w:cs="Times New Roman"/>
+          <w:lang w:val="tr-TR"/>
+        </w:rPr>
+        <w:t>deferring</w:t>
+      </w:r>
+      <w:proofErr w:type="spellEnd"/>
+      <w:r>
+        <w:rPr>
+          <w:rFonts w:ascii="Times New Roman" w:hAnsi="Times New Roman" w:cs="Times New Roman"/>
+          <w:lang w:val="tr-TR"/>
+        </w:rPr>
+        <w:t xml:space="preserve"> </w:t>
+      </w:r>
+      <w:proofErr w:type="spellStart"/>
+      <w:r>
+        <w:rPr>
+          <w:rFonts w:ascii="Times New Roman" w:hAnsi="Times New Roman" w:cs="Times New Roman"/>
+          <w:lang w:val="tr-TR"/>
+        </w:rPr>
+        <w:t>to</w:t>
+      </w:r>
+      <w:proofErr w:type="spellEnd"/>
+      <w:r>
+        <w:rPr>
+          <w:rFonts w:ascii="Times New Roman" w:hAnsi="Times New Roman" w:cs="Times New Roman"/>
+          <w:lang w:val="tr-TR"/>
+        </w:rPr>
+        <w:t xml:space="preserve"> </w:t>
+      </w:r>
+      <w:proofErr w:type="spellStart"/>
+      <w:r>
+        <w:rPr>
+          <w:rFonts w:ascii="Times New Roman" w:hAnsi="Times New Roman" w:cs="Times New Roman"/>
+          <w:lang w:val="tr-TR"/>
+        </w:rPr>
+        <w:t>the</w:t>
+      </w:r>
+      <w:proofErr w:type="spellEnd"/>
+      <w:r>
+        <w:rPr>
+          <w:rFonts w:ascii="Times New Roman" w:hAnsi="Times New Roman" w:cs="Times New Roman"/>
+          <w:lang w:val="tr-TR"/>
+        </w:rPr>
+        <w:t xml:space="preserve"> </w:t>
+      </w:r>
+      <w:proofErr w:type="spellStart"/>
+      <w:r>
+        <w:rPr>
+          <w:rFonts w:ascii="Times New Roman" w:hAnsi="Times New Roman" w:cs="Times New Roman"/>
+          <w:lang w:val="tr-TR"/>
+        </w:rPr>
+        <w:t>expert</w:t>
+      </w:r>
+      <w:proofErr w:type="spellEnd"/>
+      <w:r>
+        <w:rPr>
+          <w:rFonts w:ascii="Times New Roman" w:hAnsi="Times New Roman" w:cs="Times New Roman"/>
+          <w:lang w:val="tr-TR"/>
+        </w:rPr>
+        <w:t xml:space="preserve">. </w:t>
+      </w:r>
+      <w:proofErr w:type="spellStart"/>
+      <w:r>
+        <w:rPr>
+          <w:rFonts w:ascii="Times New Roman" w:hAnsi="Times New Roman" w:cs="Times New Roman"/>
+          <w:lang w:val="tr-TR"/>
+        </w:rPr>
+        <w:t>However</w:t>
+      </w:r>
+      <w:proofErr w:type="spellEnd"/>
+      <w:r>
+        <w:rPr>
+          <w:rFonts w:ascii="Times New Roman" w:hAnsi="Times New Roman" w:cs="Times New Roman"/>
+          <w:lang w:val="tr-TR"/>
+        </w:rPr>
+        <w:t xml:space="preserve">, in </w:t>
+      </w:r>
+      <w:proofErr w:type="spellStart"/>
+      <w:r>
+        <w:rPr>
+          <w:rFonts w:ascii="Times New Roman" w:hAnsi="Times New Roman" w:cs="Times New Roman"/>
+          <w:lang w:val="tr-TR"/>
+        </w:rPr>
+        <w:t>this</w:t>
+      </w:r>
+      <w:proofErr w:type="spellEnd"/>
+      <w:r>
+        <w:rPr>
+          <w:rFonts w:ascii="Times New Roman" w:hAnsi="Times New Roman" w:cs="Times New Roman"/>
+          <w:lang w:val="tr-TR"/>
+        </w:rPr>
+        <w:t xml:space="preserve"> </w:t>
+      </w:r>
+      <w:proofErr w:type="spellStart"/>
+      <w:r>
+        <w:rPr>
+          <w:rFonts w:ascii="Times New Roman" w:hAnsi="Times New Roman" w:cs="Times New Roman"/>
+          <w:lang w:val="tr-TR"/>
+        </w:rPr>
+        <w:t>scenario</w:t>
+      </w:r>
+      <w:proofErr w:type="spellEnd"/>
+      <w:r>
+        <w:rPr>
+          <w:rFonts w:ascii="Times New Roman" w:hAnsi="Times New Roman" w:cs="Times New Roman"/>
+          <w:lang w:val="tr-TR"/>
+        </w:rPr>
+        <w:t xml:space="preserve">, </w:t>
+      </w:r>
+      <w:proofErr w:type="spellStart"/>
+      <w:r>
+        <w:rPr>
+          <w:rFonts w:ascii="Times New Roman" w:hAnsi="Times New Roman" w:cs="Times New Roman"/>
+          <w:lang w:val="tr-TR"/>
+        </w:rPr>
+        <w:t>if</w:t>
+      </w:r>
+      <w:proofErr w:type="spellEnd"/>
+      <w:r>
+        <w:rPr>
+          <w:rFonts w:ascii="Times New Roman" w:hAnsi="Times New Roman" w:cs="Times New Roman"/>
+          <w:lang w:val="tr-TR"/>
+        </w:rPr>
+        <w:t xml:space="preserve"> </w:t>
+      </w:r>
+      <w:proofErr w:type="spellStart"/>
+      <w:r>
+        <w:rPr>
+          <w:rFonts w:ascii="Times New Roman" w:hAnsi="Times New Roman" w:cs="Times New Roman"/>
+          <w:lang w:val="tr-TR"/>
+        </w:rPr>
+        <w:t>the</w:t>
+      </w:r>
+      <w:proofErr w:type="spellEnd"/>
+      <w:r>
+        <w:rPr>
+          <w:rFonts w:ascii="Times New Roman" w:hAnsi="Times New Roman" w:cs="Times New Roman"/>
+          <w:lang w:val="tr-TR"/>
+        </w:rPr>
+        <w:t xml:space="preserve"> </w:t>
+      </w:r>
+      <w:proofErr w:type="spellStart"/>
+      <w:r>
+        <w:rPr>
+          <w:rFonts w:ascii="Times New Roman" w:hAnsi="Times New Roman" w:cs="Times New Roman"/>
+          <w:lang w:val="tr-TR"/>
+        </w:rPr>
+        <w:t>baseline</w:t>
+      </w:r>
+      <w:proofErr w:type="spellEnd"/>
+      <w:r>
+        <w:rPr>
+          <w:rFonts w:ascii="Times New Roman" w:hAnsi="Times New Roman" w:cs="Times New Roman"/>
+          <w:lang w:val="tr-TR"/>
+        </w:rPr>
+        <w:t xml:space="preserve"> </w:t>
+      </w:r>
+      <w:proofErr w:type="spellStart"/>
+      <w:r>
+        <w:rPr>
+          <w:rFonts w:ascii="Times New Roman" w:hAnsi="Times New Roman" w:cs="Times New Roman"/>
+          <w:lang w:val="tr-TR"/>
+        </w:rPr>
+        <w:t>classifier</w:t>
+      </w:r>
+      <w:proofErr w:type="spellEnd"/>
+      <w:r>
+        <w:rPr>
+          <w:rFonts w:ascii="Times New Roman" w:hAnsi="Times New Roman" w:cs="Times New Roman"/>
+          <w:lang w:val="tr-TR"/>
+        </w:rPr>
+        <w:t xml:space="preserve"> is </w:t>
+      </w:r>
+      <w:proofErr w:type="spellStart"/>
+      <w:r>
+        <w:rPr>
+          <w:rFonts w:ascii="Times New Roman" w:hAnsi="Times New Roman" w:cs="Times New Roman"/>
+          <w:lang w:val="tr-TR"/>
+        </w:rPr>
+        <w:t>correct</w:t>
+      </w:r>
+      <w:proofErr w:type="spellEnd"/>
+      <w:r>
+        <w:rPr>
+          <w:rFonts w:ascii="Times New Roman" w:hAnsi="Times New Roman" w:cs="Times New Roman"/>
+          <w:lang w:val="tr-TR"/>
+        </w:rPr>
+        <w:t xml:space="preserve"> </w:t>
+      </w:r>
+      <w:proofErr w:type="spellStart"/>
+      <w:r>
+        <w:rPr>
+          <w:rFonts w:ascii="Times New Roman" w:hAnsi="Times New Roman" w:cs="Times New Roman"/>
+          <w:lang w:val="tr-TR"/>
+        </w:rPr>
+        <w:t>for</w:t>
+      </w:r>
+      <w:proofErr w:type="spellEnd"/>
+      <w:r>
+        <w:rPr>
+          <w:rFonts w:ascii="Times New Roman" w:hAnsi="Times New Roman" w:cs="Times New Roman"/>
+          <w:lang w:val="tr-TR"/>
+        </w:rPr>
+        <w:t xml:space="preserve"> </w:t>
+      </w:r>
+      <w:proofErr w:type="spellStart"/>
+      <w:r>
+        <w:rPr>
+          <w:rFonts w:ascii="Times New Roman" w:hAnsi="Times New Roman" w:cs="Times New Roman"/>
+          <w:lang w:val="tr-TR"/>
+        </w:rPr>
+        <w:t>the</w:t>
+      </w:r>
+      <w:proofErr w:type="spellEnd"/>
+      <w:r>
+        <w:rPr>
+          <w:rFonts w:ascii="Times New Roman" w:hAnsi="Times New Roman" w:cs="Times New Roman"/>
+          <w:lang w:val="tr-TR"/>
+        </w:rPr>
+        <w:t xml:space="preserve"> </w:t>
+      </w:r>
+      <w:proofErr w:type="spellStart"/>
+      <w:r>
+        <w:rPr>
+          <w:rFonts w:ascii="Times New Roman" w:hAnsi="Times New Roman" w:cs="Times New Roman"/>
+          <w:lang w:val="tr-TR"/>
+        </w:rPr>
+        <w:t>current</w:t>
+      </w:r>
+      <w:proofErr w:type="spellEnd"/>
+      <w:r>
+        <w:rPr>
+          <w:rFonts w:ascii="Times New Roman" w:hAnsi="Times New Roman" w:cs="Times New Roman"/>
+          <w:lang w:val="tr-TR"/>
+        </w:rPr>
+        <w:t xml:space="preserve"> </w:t>
+      </w:r>
+      <w:proofErr w:type="spellStart"/>
+      <w:r>
+        <w:rPr>
+          <w:rFonts w:ascii="Times New Roman" w:hAnsi="Times New Roman" w:cs="Times New Roman"/>
+          <w:lang w:val="tr-TR"/>
+        </w:rPr>
+        <w:t>index</w:t>
+      </w:r>
+      <w:proofErr w:type="spellEnd"/>
+      <w:r>
+        <w:rPr>
+          <w:rFonts w:ascii="Times New Roman" w:hAnsi="Times New Roman" w:cs="Times New Roman"/>
+          <w:lang w:val="tr-TR"/>
+        </w:rPr>
+        <w:t xml:space="preserve">, it is </w:t>
+      </w:r>
+      <w:r>
+        <w:rPr>
+          <w:rFonts w:ascii="Times New Roman" w:hAnsi="Times New Roman" w:cs="Times New Roman"/>
+          <w:b/>
+          <w:bCs/>
+          <w:lang w:val="tr-TR"/>
+        </w:rPr>
+        <w:t xml:space="preserve">a </w:t>
+      </w:r>
+      <w:proofErr w:type="spellStart"/>
+      <w:r>
+        <w:rPr>
+          <w:rFonts w:ascii="Times New Roman" w:hAnsi="Times New Roman" w:cs="Times New Roman"/>
+          <w:b/>
+          <w:bCs/>
+          <w:lang w:val="tr-TR"/>
+        </w:rPr>
+        <w:t>false</w:t>
+      </w:r>
+      <w:proofErr w:type="spellEnd"/>
+      <w:r>
+        <w:rPr>
+          <w:rFonts w:ascii="Times New Roman" w:hAnsi="Times New Roman" w:cs="Times New Roman"/>
+          <w:b/>
+          <w:bCs/>
+          <w:lang w:val="tr-TR"/>
+        </w:rPr>
+        <w:t xml:space="preserve"> </w:t>
+      </w:r>
+      <w:proofErr w:type="spellStart"/>
+      <w:r>
+        <w:rPr>
+          <w:rFonts w:ascii="Times New Roman" w:hAnsi="Times New Roman" w:cs="Times New Roman"/>
+          <w:b/>
+          <w:bCs/>
+          <w:lang w:val="tr-TR"/>
+        </w:rPr>
+        <w:t>deferral</w:t>
+      </w:r>
+      <w:proofErr w:type="spellEnd"/>
+      <w:r>
+        <w:rPr>
+          <w:rFonts w:ascii="Times New Roman" w:hAnsi="Times New Roman" w:cs="Times New Roman"/>
+          <w:lang w:val="tr-TR"/>
+        </w:rPr>
+        <w:t xml:space="preserve"> </w:t>
+      </w:r>
+      <w:r>
+        <w:rPr>
+          <w:rFonts w:ascii="Times New Roman" w:hAnsi="Times New Roman" w:cs="Times New Roman"/>
+          <w:b/>
+          <w:bCs/>
+          <w:lang w:val="tr-TR"/>
+        </w:rPr>
+        <w:t>(</w:t>
+      </w:r>
+      <w:proofErr w:type="spellStart"/>
+      <w:r>
+        <w:rPr>
+          <w:rFonts w:ascii="Times New Roman" w:hAnsi="Times New Roman" w:cs="Times New Roman"/>
+          <w:b/>
+          <w:bCs/>
+          <w:lang w:val="tr-TR"/>
+        </w:rPr>
+        <w:t>false</w:t>
+      </w:r>
+      <w:proofErr w:type="spellEnd"/>
+      <w:r>
+        <w:rPr>
+          <w:rFonts w:ascii="Times New Roman" w:hAnsi="Times New Roman" w:cs="Times New Roman"/>
+          <w:b/>
+          <w:bCs/>
+          <w:lang w:val="tr-TR"/>
+        </w:rPr>
+        <w:t xml:space="preserve"> </w:t>
+      </w:r>
+      <w:proofErr w:type="spellStart"/>
+      <w:r>
+        <w:rPr>
+          <w:rFonts w:ascii="Times New Roman" w:hAnsi="Times New Roman" w:cs="Times New Roman"/>
+          <w:b/>
+          <w:bCs/>
+          <w:lang w:val="tr-TR"/>
+        </w:rPr>
+        <w:t>positive</w:t>
+      </w:r>
+      <w:proofErr w:type="spellEnd"/>
+      <w:r>
+        <w:rPr>
+          <w:rFonts w:ascii="Times New Roman" w:hAnsi="Times New Roman" w:cs="Times New Roman"/>
+          <w:b/>
+          <w:bCs/>
+          <w:lang w:val="tr-TR"/>
+        </w:rPr>
+        <w:t>)</w:t>
+      </w:r>
+      <w:r>
+        <w:rPr>
+          <w:rFonts w:ascii="Times New Roman" w:hAnsi="Times New Roman" w:cs="Times New Roman"/>
+          <w:lang w:val="tr-TR"/>
+        </w:rPr>
+        <w:t xml:space="preserve"> of </w:t>
+      </w:r>
+      <w:proofErr w:type="spellStart"/>
+      <w:r>
+        <w:rPr>
+          <w:rFonts w:ascii="Times New Roman" w:hAnsi="Times New Roman" w:cs="Times New Roman"/>
+          <w:lang w:val="tr-TR"/>
+        </w:rPr>
+        <w:t>knowledge</w:t>
+      </w:r>
+      <w:proofErr w:type="spellEnd"/>
+      <w:r>
+        <w:rPr>
+          <w:rFonts w:ascii="Times New Roman" w:hAnsi="Times New Roman" w:cs="Times New Roman"/>
+          <w:lang w:val="tr-TR"/>
+        </w:rPr>
+        <w:t xml:space="preserve"> </w:t>
+      </w:r>
+      <w:proofErr w:type="spellStart"/>
+      <w:r>
+        <w:rPr>
+          <w:rFonts w:ascii="Times New Roman" w:hAnsi="Times New Roman" w:cs="Times New Roman"/>
+          <w:lang w:val="tr-TR"/>
+        </w:rPr>
+        <w:t>to</w:t>
+      </w:r>
+      <w:proofErr w:type="spellEnd"/>
+      <w:r>
+        <w:rPr>
+          <w:rFonts w:ascii="Times New Roman" w:hAnsi="Times New Roman" w:cs="Times New Roman"/>
+          <w:lang w:val="tr-TR"/>
+        </w:rPr>
+        <w:t xml:space="preserve"> </w:t>
+      </w:r>
+      <w:proofErr w:type="spellStart"/>
+      <w:r>
+        <w:rPr>
+          <w:rFonts w:ascii="Times New Roman" w:hAnsi="Times New Roman" w:cs="Times New Roman"/>
+          <w:lang w:val="tr-TR"/>
+        </w:rPr>
+        <w:t>the</w:t>
+      </w:r>
+      <w:proofErr w:type="spellEnd"/>
+      <w:r>
+        <w:rPr>
+          <w:rFonts w:ascii="Times New Roman" w:hAnsi="Times New Roman" w:cs="Times New Roman"/>
+          <w:lang w:val="tr-TR"/>
+        </w:rPr>
+        <w:t xml:space="preserve"> </w:t>
+      </w:r>
+      <w:proofErr w:type="spellStart"/>
+      <w:r>
+        <w:rPr>
+          <w:rFonts w:ascii="Times New Roman" w:hAnsi="Times New Roman" w:cs="Times New Roman"/>
+          <w:lang w:val="tr-TR"/>
+        </w:rPr>
+        <w:t>expert</w:t>
+      </w:r>
+      <w:proofErr w:type="spellEnd"/>
+      <w:r>
+        <w:rPr>
+          <w:rFonts w:ascii="Times New Roman" w:hAnsi="Times New Roman" w:cs="Times New Roman"/>
+          <w:lang w:val="tr-TR"/>
+        </w:rPr>
+        <w:t xml:space="preserve">. </w:t>
+      </w:r>
+      <w:proofErr w:type="spellStart"/>
+      <w:r>
+        <w:rPr>
+          <w:rFonts w:ascii="Times New Roman" w:hAnsi="Times New Roman" w:cs="Times New Roman"/>
+          <w:lang w:val="tr-TR"/>
+        </w:rPr>
+        <w:t>Otherwise</w:t>
+      </w:r>
+      <w:proofErr w:type="spellEnd"/>
+      <w:r>
+        <w:rPr>
+          <w:rFonts w:ascii="Times New Roman" w:hAnsi="Times New Roman" w:cs="Times New Roman"/>
+          <w:lang w:val="tr-TR"/>
+        </w:rPr>
+        <w:t xml:space="preserve">, it is a </w:t>
+      </w:r>
+      <w:proofErr w:type="spellStart"/>
+      <w:r>
+        <w:rPr>
+          <w:rFonts w:ascii="Times New Roman" w:hAnsi="Times New Roman" w:cs="Times New Roman"/>
+          <w:b/>
+          <w:bCs/>
+          <w:lang w:val="tr-TR"/>
+        </w:rPr>
+        <w:t>true</w:t>
+      </w:r>
+      <w:proofErr w:type="spellEnd"/>
+      <w:r>
+        <w:rPr>
+          <w:rFonts w:ascii="Times New Roman" w:hAnsi="Times New Roman" w:cs="Times New Roman"/>
+          <w:b/>
+          <w:bCs/>
+          <w:lang w:val="tr-TR"/>
+        </w:rPr>
+        <w:t xml:space="preserve"> </w:t>
+      </w:r>
+      <w:proofErr w:type="spellStart"/>
+      <w:r>
+        <w:rPr>
+          <w:rFonts w:ascii="Times New Roman" w:hAnsi="Times New Roman" w:cs="Times New Roman"/>
+          <w:b/>
+          <w:bCs/>
+          <w:lang w:val="tr-TR"/>
+        </w:rPr>
+        <w:t>deferral</w:t>
+      </w:r>
+      <w:proofErr w:type="spellEnd"/>
+      <w:r>
+        <w:rPr>
+          <w:rFonts w:ascii="Times New Roman" w:hAnsi="Times New Roman" w:cs="Times New Roman"/>
+          <w:lang w:val="tr-TR"/>
+        </w:rPr>
+        <w:t xml:space="preserve"> </w:t>
+      </w:r>
+      <w:r>
+        <w:rPr>
+          <w:rFonts w:ascii="Times New Roman" w:hAnsi="Times New Roman" w:cs="Times New Roman"/>
+          <w:b/>
+          <w:bCs/>
+          <w:lang w:val="tr-TR"/>
+        </w:rPr>
+        <w:t>(</w:t>
+      </w:r>
+      <w:proofErr w:type="spellStart"/>
+      <w:r>
+        <w:rPr>
+          <w:rFonts w:ascii="Times New Roman" w:hAnsi="Times New Roman" w:cs="Times New Roman"/>
+          <w:b/>
+          <w:bCs/>
+          <w:lang w:val="tr-TR"/>
+        </w:rPr>
+        <w:t>true</w:t>
+      </w:r>
+      <w:proofErr w:type="spellEnd"/>
+      <w:r>
+        <w:rPr>
+          <w:rFonts w:ascii="Times New Roman" w:hAnsi="Times New Roman" w:cs="Times New Roman"/>
+          <w:b/>
+          <w:bCs/>
+          <w:lang w:val="tr-TR"/>
+        </w:rPr>
+        <w:t xml:space="preserve"> </w:t>
+      </w:r>
+      <w:proofErr w:type="spellStart"/>
+      <w:r>
+        <w:rPr>
+          <w:rFonts w:ascii="Times New Roman" w:hAnsi="Times New Roman" w:cs="Times New Roman"/>
+          <w:b/>
+          <w:bCs/>
+          <w:lang w:val="tr-TR"/>
+        </w:rPr>
+        <w:t>positive</w:t>
+      </w:r>
+      <w:proofErr w:type="spellEnd"/>
+      <w:r>
+        <w:rPr>
+          <w:rFonts w:ascii="Times New Roman" w:hAnsi="Times New Roman" w:cs="Times New Roman"/>
+          <w:b/>
+          <w:bCs/>
+          <w:lang w:val="tr-TR"/>
+        </w:rPr>
+        <w:t>)</w:t>
+      </w:r>
+      <w:r>
+        <w:rPr>
+          <w:rFonts w:ascii="Times New Roman" w:hAnsi="Times New Roman" w:cs="Times New Roman"/>
+          <w:lang w:val="tr-TR"/>
+        </w:rPr>
+        <w:t xml:space="preserve"> </w:t>
+      </w:r>
+      <w:proofErr w:type="spellStart"/>
+      <w:r>
+        <w:rPr>
+          <w:rFonts w:ascii="Times New Roman" w:hAnsi="Times New Roman" w:cs="Times New Roman"/>
+          <w:lang w:val="tr-TR"/>
+        </w:rPr>
+        <w:t>case</w:t>
+      </w:r>
+      <w:proofErr w:type="spellEnd"/>
+      <w:r>
+        <w:rPr>
+          <w:rFonts w:ascii="Times New Roman" w:hAnsi="Times New Roman" w:cs="Times New Roman"/>
+          <w:lang w:val="tr-TR"/>
+        </w:rPr>
+        <w:t xml:space="preserve">. </w:t>
       </w:r>
     </w:p>
     <w:p>
@@ -8126,13 +10363,199 @@
         </w:rPr>
         <w:tab/>
       </w:r>
-      <w:r>
-        <w:rPr>
-          <w:rFonts w:ascii="Times New Roman" w:hAnsi="Times New Roman" w:cs="Times New Roman"/>
-          <w:lang w:val="tr-TR"/>
-        </w:rPr>
-        <w:t xml:space="preserve">If the max probability coming from the baseline model trained on the X input test dataset is </w:t>
-      </w:r>
+      <w:proofErr w:type="spellStart"/>
+      <w:r>
+        <w:rPr>
+          <w:rFonts w:ascii="Times New Roman" w:hAnsi="Times New Roman" w:cs="Times New Roman"/>
+          <w:lang w:val="tr-TR"/>
+        </w:rPr>
+        <w:t>If</w:t>
+      </w:r>
+      <w:proofErr w:type="spellEnd"/>
+      <w:r>
+        <w:rPr>
+          <w:rFonts w:ascii="Times New Roman" w:hAnsi="Times New Roman" w:cs="Times New Roman"/>
+          <w:lang w:val="tr-TR"/>
+        </w:rPr>
+        <w:t xml:space="preserve"> </w:t>
+      </w:r>
+      <w:proofErr w:type="spellStart"/>
+      <w:r>
+        <w:rPr>
+          <w:rFonts w:ascii="Times New Roman" w:hAnsi="Times New Roman" w:cs="Times New Roman"/>
+          <w:lang w:val="tr-TR"/>
+        </w:rPr>
+        <w:t>the</w:t>
+      </w:r>
+      <w:proofErr w:type="spellEnd"/>
+      <w:r>
+        <w:rPr>
+          <w:rFonts w:ascii="Times New Roman" w:hAnsi="Times New Roman" w:cs="Times New Roman"/>
+          <w:lang w:val="tr-TR"/>
+        </w:rPr>
+        <w:t xml:space="preserve"> </w:t>
+      </w:r>
+      <w:proofErr w:type="spellStart"/>
+      <w:r>
+        <w:rPr>
+          <w:rFonts w:ascii="Times New Roman" w:hAnsi="Times New Roman" w:cs="Times New Roman"/>
+          <w:lang w:val="tr-TR"/>
+        </w:rPr>
+        <w:t>max</w:t>
+      </w:r>
+      <w:proofErr w:type="spellEnd"/>
+      <w:r>
+        <w:rPr>
+          <w:rFonts w:ascii="Times New Roman" w:hAnsi="Times New Roman" w:cs="Times New Roman"/>
+          <w:lang w:val="tr-TR"/>
+        </w:rPr>
+        <w:t xml:space="preserve"> </w:t>
+      </w:r>
+      <w:proofErr w:type="spellStart"/>
+      <w:r>
+        <w:rPr>
+          <w:rFonts w:ascii="Times New Roman" w:hAnsi="Times New Roman" w:cs="Times New Roman"/>
+          <w:lang w:val="tr-TR"/>
+        </w:rPr>
+        <w:t>probability</w:t>
+      </w:r>
+      <w:proofErr w:type="spellEnd"/>
+      <w:r>
+        <w:rPr>
+          <w:rFonts w:ascii="Times New Roman" w:hAnsi="Times New Roman" w:cs="Times New Roman"/>
+          <w:lang w:val="tr-TR"/>
+        </w:rPr>
+        <w:t xml:space="preserve"> </w:t>
+      </w:r>
+      <w:proofErr w:type="spellStart"/>
+      <w:r>
+        <w:rPr>
+          <w:rFonts w:ascii="Times New Roman" w:hAnsi="Times New Roman" w:cs="Times New Roman"/>
+          <w:lang w:val="tr-TR"/>
+        </w:rPr>
+        <w:t>coming</w:t>
+      </w:r>
+      <w:proofErr w:type="spellEnd"/>
+      <w:r>
+        <w:rPr>
+          <w:rFonts w:ascii="Times New Roman" w:hAnsi="Times New Roman" w:cs="Times New Roman"/>
+          <w:lang w:val="tr-TR"/>
+        </w:rPr>
+        <w:t xml:space="preserve"> </w:t>
+      </w:r>
+      <w:proofErr w:type="spellStart"/>
+      <w:r>
+        <w:rPr>
+          <w:rFonts w:ascii="Times New Roman" w:hAnsi="Times New Roman" w:cs="Times New Roman"/>
+          <w:lang w:val="tr-TR"/>
+        </w:rPr>
+        <w:t>from</w:t>
+      </w:r>
+      <w:proofErr w:type="spellEnd"/>
+      <w:r>
+        <w:rPr>
+          <w:rFonts w:ascii="Times New Roman" w:hAnsi="Times New Roman" w:cs="Times New Roman"/>
+          <w:lang w:val="tr-TR"/>
+        </w:rPr>
+        <w:t xml:space="preserve"> </w:t>
+      </w:r>
+      <w:proofErr w:type="spellStart"/>
+      <w:r>
+        <w:rPr>
+          <w:rFonts w:ascii="Times New Roman" w:hAnsi="Times New Roman" w:cs="Times New Roman"/>
+          <w:lang w:val="tr-TR"/>
+        </w:rPr>
+        <w:t>the</w:t>
+      </w:r>
+      <w:proofErr w:type="spellEnd"/>
+      <w:r>
+        <w:rPr>
+          <w:rFonts w:ascii="Times New Roman" w:hAnsi="Times New Roman" w:cs="Times New Roman"/>
+          <w:lang w:val="tr-TR"/>
+        </w:rPr>
+        <w:t xml:space="preserve"> </w:t>
+      </w:r>
+      <w:proofErr w:type="spellStart"/>
+      <w:r>
+        <w:rPr>
+          <w:rFonts w:ascii="Times New Roman" w:hAnsi="Times New Roman" w:cs="Times New Roman"/>
+          <w:lang w:val="tr-TR"/>
+        </w:rPr>
+        <w:t>baseline</w:t>
+      </w:r>
+      <w:proofErr w:type="spellEnd"/>
+      <w:r>
+        <w:rPr>
+          <w:rFonts w:ascii="Times New Roman" w:hAnsi="Times New Roman" w:cs="Times New Roman"/>
+          <w:lang w:val="tr-TR"/>
+        </w:rPr>
+        <w:t xml:space="preserve"> model </w:t>
+      </w:r>
+      <w:proofErr w:type="spellStart"/>
+      <w:r>
+        <w:rPr>
+          <w:rFonts w:ascii="Times New Roman" w:hAnsi="Times New Roman" w:cs="Times New Roman"/>
+          <w:lang w:val="tr-TR"/>
+        </w:rPr>
+        <w:t>trained</w:t>
+      </w:r>
+      <w:proofErr w:type="spellEnd"/>
+      <w:r>
+        <w:rPr>
+          <w:rFonts w:ascii="Times New Roman" w:hAnsi="Times New Roman" w:cs="Times New Roman"/>
+          <w:lang w:val="tr-TR"/>
+        </w:rPr>
+        <w:t xml:space="preserve"> on </w:t>
+      </w:r>
+      <w:proofErr w:type="spellStart"/>
+      <w:r>
+        <w:rPr>
+          <w:rFonts w:ascii="Times New Roman" w:hAnsi="Times New Roman" w:cs="Times New Roman"/>
+          <w:lang w:val="tr-TR"/>
+        </w:rPr>
+        <w:t>the</w:t>
+      </w:r>
+      <w:proofErr w:type="spellEnd"/>
+      <w:r>
+        <w:rPr>
+          <w:rFonts w:ascii="Times New Roman" w:hAnsi="Times New Roman" w:cs="Times New Roman"/>
+          <w:lang w:val="tr-TR"/>
+        </w:rPr>
+        <w:t xml:space="preserve"> X </w:t>
+      </w:r>
+      <w:proofErr w:type="spellStart"/>
+      <w:r>
+        <w:rPr>
+          <w:rFonts w:ascii="Times New Roman" w:hAnsi="Times New Roman" w:cs="Times New Roman"/>
+          <w:lang w:val="tr-TR"/>
+        </w:rPr>
+        <w:t>input</w:t>
+      </w:r>
+      <w:proofErr w:type="spellEnd"/>
+      <w:r>
+        <w:rPr>
+          <w:rFonts w:ascii="Times New Roman" w:hAnsi="Times New Roman" w:cs="Times New Roman"/>
+          <w:lang w:val="tr-TR"/>
+        </w:rPr>
+        <w:t xml:space="preserve"> test </w:t>
+      </w:r>
+      <w:proofErr w:type="spellStart"/>
+      <w:r>
+        <w:rPr>
+          <w:rFonts w:ascii="Times New Roman" w:hAnsi="Times New Roman" w:cs="Times New Roman"/>
+          <w:lang w:val="tr-TR"/>
+        </w:rPr>
+        <w:t>dataset</w:t>
+      </w:r>
+      <w:proofErr w:type="spellEnd"/>
+      <w:r>
+        <w:rPr>
+          <w:rFonts w:ascii="Times New Roman" w:hAnsi="Times New Roman" w:cs="Times New Roman"/>
+          <w:lang w:val="tr-TR"/>
+        </w:rPr>
+        <w:t xml:space="preserve"> is </w:t>
+      </w:r>
+      <w:proofErr w:type="spellStart"/>
       <w:r>
         <w:rPr>
           <w:rFonts w:ascii="Times New Roman" w:hAnsi="Times New Roman" w:cs="Times New Roman"/>
@@ -8140,43 +10563,346 @@
         </w:rPr>
         <w:t>above</w:t>
       </w:r>
-      <w:r>
-        <w:rPr>
-          <w:rFonts w:ascii="Times New Roman" w:hAnsi="Times New Roman" w:cs="Times New Roman"/>
-          <w:lang w:val="tr-TR"/>
-        </w:rPr>
-        <w:t xml:space="preserve"> the threshold</w:t>
-      </w:r>
-      <w:r>
-        <w:rPr>
-          <w:rFonts w:ascii="Times New Roman" w:hAnsi="Times New Roman" w:cs="Times New Roman"/>
-          <w:lang w:val="tr-TR"/>
-        </w:rPr>
-        <w:t xml:space="preserve"> </w:t>
-      </w:r>
-      <w:r>
-        <w:rPr>
-          <w:rFonts w:ascii="Times New Roman" w:hAnsi="Times New Roman" w:cs="Times New Roman"/>
-          <w:b/>
-          <w:bCs/>
-          <w:lang w:val="tr-TR"/>
-        </w:rPr>
-        <w:t>(max_probs[i] &gt;= threshold)</w:t>
-      </w:r>
-      <w:r>
-        <w:rPr>
-          <w:rFonts w:ascii="Times New Roman" w:hAnsi="Times New Roman" w:cs="Times New Roman"/>
-          <w:lang w:val="tr-TR"/>
-        </w:rPr>
-        <w:t xml:space="preserve">, it means that we </w:t>
-      </w:r>
-      <w:r>
-        <w:rPr>
-          <w:rFonts w:ascii="Times New Roman" w:hAnsi="Times New Roman" w:cs="Times New Roman"/>
-          <w:lang w:val="tr-TR"/>
-        </w:rPr>
-        <w:t>do not defer to the expert, meaning the baseline model is confident enough in its prediction</w:t>
-      </w:r>
+      <w:proofErr w:type="spellEnd"/>
+      <w:r>
+        <w:rPr>
+          <w:rFonts w:ascii="Times New Roman" w:hAnsi="Times New Roman" w:cs="Times New Roman"/>
+          <w:lang w:val="tr-TR"/>
+        </w:rPr>
+        <w:t xml:space="preserve"> </w:t>
+      </w:r>
+      <w:proofErr w:type="spellStart"/>
+      <w:r>
+        <w:rPr>
+          <w:rFonts w:ascii="Times New Roman" w:hAnsi="Times New Roman" w:cs="Times New Roman"/>
+          <w:lang w:val="tr-TR"/>
+        </w:rPr>
+        <w:t>the</w:t>
+      </w:r>
+      <w:proofErr w:type="spellEnd"/>
+      <w:r>
+        <w:rPr>
+          <w:rFonts w:ascii="Times New Roman" w:hAnsi="Times New Roman" w:cs="Times New Roman"/>
+          <w:lang w:val="tr-TR"/>
+        </w:rPr>
+        <w:t xml:space="preserve"> </w:t>
+      </w:r>
+      <w:proofErr w:type="spellStart"/>
+      <w:r>
+        <w:rPr>
+          <w:rFonts w:ascii="Times New Roman" w:hAnsi="Times New Roman" w:cs="Times New Roman"/>
+          <w:lang w:val="tr-TR"/>
+        </w:rPr>
+        <w:t>threshold</w:t>
+      </w:r>
+      <w:proofErr w:type="spellEnd"/>
+      <w:r>
+        <w:rPr>
+          <w:rFonts w:ascii="Times New Roman" w:hAnsi="Times New Roman" w:cs="Times New Roman"/>
+          <w:lang w:val="tr-TR"/>
+        </w:rPr>
+        <w:t xml:space="preserve"> </w:t>
+      </w:r>
+      <w:r>
+        <w:rPr>
+          <w:rFonts w:ascii="Times New Roman" w:hAnsi="Times New Roman" w:cs="Times New Roman"/>
+          <w:b/>
+          <w:bCs/>
+          <w:lang w:val="tr-TR"/>
+        </w:rPr>
+        <w:t>(</w:t>
+      </w:r>
+      <w:proofErr w:type="spellStart"/>
+      <w:r>
+        <w:rPr>
+          <w:rFonts w:ascii="Times New Roman" w:hAnsi="Times New Roman" w:cs="Times New Roman"/>
+          <w:b/>
+          <w:bCs/>
+          <w:lang w:val="tr-TR"/>
+        </w:rPr>
+        <w:t>max_probs</w:t>
+      </w:r>
+      <w:proofErr w:type="spellEnd"/>
+      <w:r>
+        <w:rPr>
+          <w:rFonts w:ascii="Times New Roman" w:hAnsi="Times New Roman" w:cs="Times New Roman"/>
+          <w:b/>
+          <w:bCs/>
+          <w:lang w:val="tr-TR"/>
+        </w:rPr>
+        <w:t>[i</w:t>
+      </w:r>
+      <w:proofErr w:type="gramStart"/>
+      <w:r>
+        <w:rPr>
+          <w:rFonts w:ascii="Times New Roman" w:hAnsi="Times New Roman" w:cs="Times New Roman"/>
+          <w:b/>
+          <w:bCs/>
+          <w:lang w:val="tr-TR"/>
+        </w:rPr>
+        <w:t>] &gt;</w:t>
+      </w:r>
+      <w:proofErr w:type="gramEnd"/>
+      <w:r>
+        <w:rPr>
+          <w:rFonts w:ascii="Times New Roman" w:hAnsi="Times New Roman" w:cs="Times New Roman"/>
+          <w:b/>
+          <w:bCs/>
+          <w:lang w:val="tr-TR"/>
+        </w:rPr>
+        <w:t xml:space="preserve">= </w:t>
+      </w:r>
+      <w:proofErr w:type="spellStart"/>
+      <w:r>
+        <w:rPr>
+          <w:rFonts w:ascii="Times New Roman" w:hAnsi="Times New Roman" w:cs="Times New Roman"/>
+          <w:b/>
+          <w:bCs/>
+          <w:lang w:val="tr-TR"/>
+        </w:rPr>
+        <w:t>threshold</w:t>
+      </w:r>
+      <w:proofErr w:type="spellEnd"/>
+      <w:r>
+        <w:rPr>
+          <w:rFonts w:ascii="Times New Roman" w:hAnsi="Times New Roman" w:cs="Times New Roman"/>
+          <w:b/>
+          <w:bCs/>
+          <w:lang w:val="tr-TR"/>
+        </w:rPr>
+        <w:t>)</w:t>
+      </w:r>
+      <w:r>
+        <w:rPr>
+          <w:rFonts w:ascii="Times New Roman" w:hAnsi="Times New Roman" w:cs="Times New Roman"/>
+          <w:lang w:val="tr-TR"/>
+        </w:rPr>
+        <w:t xml:space="preserve">, it </w:t>
+      </w:r>
+      <w:proofErr w:type="spellStart"/>
+      <w:r>
+        <w:rPr>
+          <w:rFonts w:ascii="Times New Roman" w:hAnsi="Times New Roman" w:cs="Times New Roman"/>
+          <w:lang w:val="tr-TR"/>
+        </w:rPr>
+        <w:t>means</w:t>
+      </w:r>
+      <w:proofErr w:type="spellEnd"/>
+      <w:r>
+        <w:rPr>
+          <w:rFonts w:ascii="Times New Roman" w:hAnsi="Times New Roman" w:cs="Times New Roman"/>
+          <w:lang w:val="tr-TR"/>
+        </w:rPr>
+        <w:t xml:space="preserve"> </w:t>
+      </w:r>
+      <w:proofErr w:type="spellStart"/>
+      <w:r>
+        <w:rPr>
+          <w:rFonts w:ascii="Times New Roman" w:hAnsi="Times New Roman" w:cs="Times New Roman"/>
+          <w:lang w:val="tr-TR"/>
+        </w:rPr>
+        <w:t>that</w:t>
+      </w:r>
+      <w:proofErr w:type="spellEnd"/>
+      <w:r>
+        <w:rPr>
+          <w:rFonts w:ascii="Times New Roman" w:hAnsi="Times New Roman" w:cs="Times New Roman"/>
+          <w:lang w:val="tr-TR"/>
+        </w:rPr>
+        <w:t xml:space="preserve"> </w:t>
+      </w:r>
+      <w:proofErr w:type="spellStart"/>
+      <w:r>
+        <w:rPr>
+          <w:rFonts w:ascii="Times New Roman" w:hAnsi="Times New Roman" w:cs="Times New Roman"/>
+          <w:lang w:val="tr-TR"/>
+        </w:rPr>
+        <w:t>we</w:t>
+      </w:r>
+      <w:proofErr w:type="spellEnd"/>
+      <w:r>
+        <w:rPr>
+          <w:rFonts w:ascii="Times New Roman" w:hAnsi="Times New Roman" w:cs="Times New Roman"/>
+          <w:lang w:val="tr-TR"/>
+        </w:rPr>
+        <w:t xml:space="preserve"> </w:t>
+      </w:r>
+      <w:r>
+        <w:rPr>
+          <w:rFonts w:ascii="Times New Roman" w:hAnsi="Times New Roman" w:cs="Times New Roman"/>
+          <w:lang w:val="tr-TR"/>
+        </w:rPr>
+        <w:t xml:space="preserve">do not </w:t>
+      </w:r>
+      <w:proofErr w:type="spellStart"/>
+      <w:r>
+        <w:rPr>
+          <w:rFonts w:ascii="Times New Roman" w:hAnsi="Times New Roman" w:cs="Times New Roman"/>
+          <w:lang w:val="tr-TR"/>
+        </w:rPr>
+        <w:t>defer</w:t>
+      </w:r>
+      <w:proofErr w:type="spellEnd"/>
+      <w:r>
+        <w:rPr>
+          <w:rFonts w:ascii="Times New Roman" w:hAnsi="Times New Roman" w:cs="Times New Roman"/>
+          <w:lang w:val="tr-TR"/>
+        </w:rPr>
+        <w:t xml:space="preserve"> </w:t>
+      </w:r>
+      <w:proofErr w:type="spellStart"/>
+      <w:r>
+        <w:rPr>
+          <w:rFonts w:ascii="Times New Roman" w:hAnsi="Times New Roman" w:cs="Times New Roman"/>
+          <w:lang w:val="tr-TR"/>
+        </w:rPr>
+        <w:t>to</w:t>
+      </w:r>
+      <w:proofErr w:type="spellEnd"/>
+      <w:r>
+        <w:rPr>
+          <w:rFonts w:ascii="Times New Roman" w:hAnsi="Times New Roman" w:cs="Times New Roman"/>
+          <w:lang w:val="tr-TR"/>
+        </w:rPr>
+        <w:t xml:space="preserve"> </w:t>
+      </w:r>
+      <w:proofErr w:type="spellStart"/>
+      <w:r>
+        <w:rPr>
+          <w:rFonts w:ascii="Times New Roman" w:hAnsi="Times New Roman" w:cs="Times New Roman"/>
+          <w:lang w:val="tr-TR"/>
+        </w:rPr>
+        <w:t>the</w:t>
+      </w:r>
+      <w:proofErr w:type="spellEnd"/>
+      <w:r>
+        <w:rPr>
+          <w:rFonts w:ascii="Times New Roman" w:hAnsi="Times New Roman" w:cs="Times New Roman"/>
+          <w:lang w:val="tr-TR"/>
+        </w:rPr>
+        <w:t xml:space="preserve"> </w:t>
+      </w:r>
+      <w:proofErr w:type="spellStart"/>
+      <w:r>
+        <w:rPr>
+          <w:rFonts w:ascii="Times New Roman" w:hAnsi="Times New Roman" w:cs="Times New Roman"/>
+          <w:lang w:val="tr-TR"/>
+        </w:rPr>
+        <w:t>expert</w:t>
+      </w:r>
+      <w:proofErr w:type="spellEnd"/>
+      <w:r>
+        <w:rPr>
+          <w:rFonts w:ascii="Times New Roman" w:hAnsi="Times New Roman" w:cs="Times New Roman"/>
+          <w:lang w:val="tr-TR"/>
+        </w:rPr>
+        <w:t xml:space="preserve">, </w:t>
+      </w:r>
+      <w:proofErr w:type="spellStart"/>
+      <w:r>
+        <w:rPr>
+          <w:rFonts w:ascii="Times New Roman" w:hAnsi="Times New Roman" w:cs="Times New Roman"/>
+          <w:lang w:val="tr-TR"/>
+        </w:rPr>
+        <w:t>meaning</w:t>
+      </w:r>
+      <w:proofErr w:type="spellEnd"/>
+      <w:r>
+        <w:rPr>
+          <w:rFonts w:ascii="Times New Roman" w:hAnsi="Times New Roman" w:cs="Times New Roman"/>
+          <w:lang w:val="tr-TR"/>
+        </w:rPr>
+        <w:t xml:space="preserve"> </w:t>
+      </w:r>
+      <w:proofErr w:type="spellStart"/>
+      <w:r>
+        <w:rPr>
+          <w:rFonts w:ascii="Times New Roman" w:hAnsi="Times New Roman" w:cs="Times New Roman"/>
+          <w:lang w:val="tr-TR"/>
+        </w:rPr>
+        <w:t>the</w:t>
+      </w:r>
+      <w:proofErr w:type="spellEnd"/>
+      <w:r>
+        <w:rPr>
+          <w:rFonts w:ascii="Times New Roman" w:hAnsi="Times New Roman" w:cs="Times New Roman"/>
+          <w:lang w:val="tr-TR"/>
+        </w:rPr>
+        <w:t xml:space="preserve"> </w:t>
+      </w:r>
+      <w:proofErr w:type="spellStart"/>
+      <w:r>
+        <w:rPr>
+          <w:rFonts w:ascii="Times New Roman" w:hAnsi="Times New Roman" w:cs="Times New Roman"/>
+          <w:lang w:val="tr-TR"/>
+        </w:rPr>
+        <w:t>baseline</w:t>
+      </w:r>
+      <w:proofErr w:type="spellEnd"/>
+      <w:r>
+        <w:rPr>
+          <w:rFonts w:ascii="Times New Roman" w:hAnsi="Times New Roman" w:cs="Times New Roman"/>
+          <w:lang w:val="tr-TR"/>
+        </w:rPr>
+        <w:t xml:space="preserve"> model is </w:t>
+      </w:r>
+      <w:proofErr w:type="spellStart"/>
+      <w:r>
+        <w:rPr>
+          <w:rFonts w:ascii="Times New Roman" w:hAnsi="Times New Roman" w:cs="Times New Roman"/>
+          <w:lang w:val="tr-TR"/>
+        </w:rPr>
+        <w:t>confident</w:t>
+      </w:r>
+      <w:proofErr w:type="spellEnd"/>
+      <w:r>
+        <w:rPr>
+          <w:rFonts w:ascii="Times New Roman" w:hAnsi="Times New Roman" w:cs="Times New Roman"/>
+          <w:lang w:val="tr-TR"/>
+        </w:rPr>
+        <w:t xml:space="preserve"> </w:t>
+      </w:r>
+      <w:proofErr w:type="spellStart"/>
+      <w:r>
+        <w:rPr>
+          <w:rFonts w:ascii="Times New Roman" w:hAnsi="Times New Roman" w:cs="Times New Roman"/>
+          <w:lang w:val="tr-TR"/>
+        </w:rPr>
+        <w:t>enough</w:t>
+      </w:r>
+      <w:proofErr w:type="spellEnd"/>
+      <w:r>
+        <w:rPr>
+          <w:rFonts w:ascii="Times New Roman" w:hAnsi="Times New Roman" w:cs="Times New Roman"/>
+          <w:lang w:val="tr-TR"/>
+        </w:rPr>
+        <w:t xml:space="preserve"> in </w:t>
+      </w:r>
+      <w:proofErr w:type="spellStart"/>
+      <w:r>
+        <w:rPr>
+          <w:rFonts w:ascii="Times New Roman" w:hAnsi="Times New Roman" w:cs="Times New Roman"/>
+          <w:lang w:val="tr-TR"/>
+        </w:rPr>
+        <w:t>its</w:t>
+      </w:r>
+      <w:proofErr w:type="spellEnd"/>
+      <w:r>
+        <w:rPr>
+          <w:rFonts w:ascii="Times New Roman" w:hAnsi="Times New Roman" w:cs="Times New Roman"/>
+          <w:lang w:val="tr-TR"/>
+        </w:rPr>
+        <w:t xml:space="preserve"> </w:t>
+      </w:r>
+      <w:proofErr w:type="spellStart"/>
+      <w:r>
+        <w:rPr>
+          <w:rFonts w:ascii="Times New Roman" w:hAnsi="Times New Roman" w:cs="Times New Roman"/>
+          <w:lang w:val="tr-TR"/>
+        </w:rPr>
+        <w:t>prediction</w:t>
+      </w:r>
+      <w:proofErr w:type="spellEnd"/>
       <w:r>
         <w:rPr>
           <w:rFonts w:ascii="Times New Roman" w:hAnsi="Times New Roman" w:cs="Times New Roman"/>
@@ -8184,19 +10910,197 @@
         </w:rPr>
         <w:t xml:space="preserve">. </w:t>
       </w:r>
-      <w:r>
-        <w:rPr>
-          <w:rFonts w:ascii="Times New Roman" w:hAnsi="Times New Roman" w:cs="Times New Roman"/>
-          <w:lang w:val="tr-TR"/>
-        </w:rPr>
-        <w:t>However, i</w:t>
-      </w:r>
-      <w:r>
-        <w:rPr>
-          <w:rFonts w:ascii="Times New Roman" w:hAnsi="Times New Roman" w:cs="Times New Roman"/>
-          <w:lang w:val="tr-TR"/>
-        </w:rPr>
-        <w:t xml:space="preserve">n this scenario, if the baseline classifier is correct for the current index, it is </w:t>
+      <w:proofErr w:type="spellStart"/>
+      <w:r>
+        <w:rPr>
+          <w:rFonts w:ascii="Times New Roman" w:hAnsi="Times New Roman" w:cs="Times New Roman"/>
+          <w:lang w:val="tr-TR"/>
+        </w:rPr>
+        <w:t>However</w:t>
+      </w:r>
+      <w:proofErr w:type="spellEnd"/>
+      <w:r>
+        <w:rPr>
+          <w:rFonts w:ascii="Times New Roman" w:hAnsi="Times New Roman" w:cs="Times New Roman"/>
+          <w:lang w:val="tr-TR"/>
+        </w:rPr>
+        <w:t xml:space="preserve">, in </w:t>
+      </w:r>
+      <w:proofErr w:type="spellStart"/>
+      <w:r>
+        <w:rPr>
+          <w:rFonts w:ascii="Times New Roman" w:hAnsi="Times New Roman" w:cs="Times New Roman"/>
+          <w:lang w:val="tr-TR"/>
+        </w:rPr>
+        <w:t>this</w:t>
+      </w:r>
+      <w:proofErr w:type="spellEnd"/>
+      <w:r>
+        <w:rPr>
+          <w:rFonts w:ascii="Times New Roman" w:hAnsi="Times New Roman" w:cs="Times New Roman"/>
+          <w:lang w:val="tr-TR"/>
+        </w:rPr>
+        <w:t xml:space="preserve"> </w:t>
+      </w:r>
+      <w:proofErr w:type="spellStart"/>
+      <w:r>
+        <w:rPr>
+          <w:rFonts w:ascii="Times New Roman" w:hAnsi="Times New Roman" w:cs="Times New Roman"/>
+          <w:lang w:val="tr-TR"/>
+        </w:rPr>
+        <w:t>scenario</w:t>
+      </w:r>
+      <w:proofErr w:type="spellEnd"/>
+      <w:r>
+        <w:rPr>
+          <w:rFonts w:ascii="Times New Roman" w:hAnsi="Times New Roman" w:cs="Times New Roman"/>
+          <w:lang w:val="tr-TR"/>
+        </w:rPr>
+        <w:t xml:space="preserve">, </w:t>
+      </w:r>
+      <w:proofErr w:type="spellStart"/>
+      <w:r>
+        <w:rPr>
+          <w:rFonts w:ascii="Times New Roman" w:hAnsi="Times New Roman" w:cs="Times New Roman"/>
+          <w:lang w:val="tr-TR"/>
+        </w:rPr>
+        <w:t>if</w:t>
+      </w:r>
+      <w:proofErr w:type="spellEnd"/>
+      <w:r>
+        <w:rPr>
+          <w:rFonts w:ascii="Times New Roman" w:hAnsi="Times New Roman" w:cs="Times New Roman"/>
+          <w:lang w:val="tr-TR"/>
+        </w:rPr>
+        <w:t xml:space="preserve"> </w:t>
+      </w:r>
+      <w:proofErr w:type="spellStart"/>
+      <w:r>
+        <w:rPr>
+          <w:rFonts w:ascii="Times New Roman" w:hAnsi="Times New Roman" w:cs="Times New Roman"/>
+          <w:lang w:val="tr-TR"/>
+        </w:rPr>
+        <w:t>the</w:t>
+      </w:r>
+      <w:proofErr w:type="spellEnd"/>
+      <w:r>
+        <w:rPr>
+          <w:rFonts w:ascii="Times New Roman" w:hAnsi="Times New Roman" w:cs="Times New Roman"/>
+          <w:lang w:val="tr-TR"/>
+        </w:rPr>
+        <w:t xml:space="preserve"> </w:t>
+      </w:r>
+      <w:proofErr w:type="spellStart"/>
+      <w:r>
+        <w:rPr>
+          <w:rFonts w:ascii="Times New Roman" w:hAnsi="Times New Roman" w:cs="Times New Roman"/>
+          <w:lang w:val="tr-TR"/>
+        </w:rPr>
+        <w:t>baseline</w:t>
+      </w:r>
+      <w:proofErr w:type="spellEnd"/>
+      <w:r>
+        <w:rPr>
+          <w:rFonts w:ascii="Times New Roman" w:hAnsi="Times New Roman" w:cs="Times New Roman"/>
+          <w:lang w:val="tr-TR"/>
+        </w:rPr>
+        <w:t xml:space="preserve"> </w:t>
+      </w:r>
+      <w:proofErr w:type="spellStart"/>
+      <w:r>
+        <w:rPr>
+          <w:rFonts w:ascii="Times New Roman" w:hAnsi="Times New Roman" w:cs="Times New Roman"/>
+          <w:lang w:val="tr-TR"/>
+        </w:rPr>
+        <w:t>classifier</w:t>
+      </w:r>
+      <w:proofErr w:type="spellEnd"/>
+      <w:r>
+        <w:rPr>
+          <w:rFonts w:ascii="Times New Roman" w:hAnsi="Times New Roman" w:cs="Times New Roman"/>
+          <w:lang w:val="tr-TR"/>
+        </w:rPr>
+        <w:t xml:space="preserve"> is </w:t>
+      </w:r>
+      <w:proofErr w:type="spellStart"/>
+      <w:r>
+        <w:rPr>
+          <w:rFonts w:ascii="Times New Roman" w:hAnsi="Times New Roman" w:cs="Times New Roman"/>
+          <w:lang w:val="tr-TR"/>
+        </w:rPr>
+        <w:t>correct</w:t>
+      </w:r>
+      <w:proofErr w:type="spellEnd"/>
+      <w:r>
+        <w:rPr>
+          <w:rFonts w:ascii="Times New Roman" w:hAnsi="Times New Roman" w:cs="Times New Roman"/>
+          <w:lang w:val="tr-TR"/>
+        </w:rPr>
+        <w:t xml:space="preserve"> </w:t>
+      </w:r>
+      <w:proofErr w:type="spellStart"/>
+      <w:r>
+        <w:rPr>
+          <w:rFonts w:ascii="Times New Roman" w:hAnsi="Times New Roman" w:cs="Times New Roman"/>
+          <w:lang w:val="tr-TR"/>
+        </w:rPr>
+        <w:t>for</w:t>
+      </w:r>
+      <w:proofErr w:type="spellEnd"/>
+      <w:r>
+        <w:rPr>
+          <w:rFonts w:ascii="Times New Roman" w:hAnsi="Times New Roman" w:cs="Times New Roman"/>
+          <w:lang w:val="tr-TR"/>
+        </w:rPr>
+        <w:t xml:space="preserve"> </w:t>
+      </w:r>
+      <w:proofErr w:type="spellStart"/>
+      <w:r>
+        <w:rPr>
+          <w:rFonts w:ascii="Times New Roman" w:hAnsi="Times New Roman" w:cs="Times New Roman"/>
+          <w:lang w:val="tr-TR"/>
+        </w:rPr>
+        <w:t>the</w:t>
+      </w:r>
+      <w:proofErr w:type="spellEnd"/>
+      <w:r>
+        <w:rPr>
+          <w:rFonts w:ascii="Times New Roman" w:hAnsi="Times New Roman" w:cs="Times New Roman"/>
+          <w:lang w:val="tr-TR"/>
+        </w:rPr>
+        <w:t xml:space="preserve"> </w:t>
+      </w:r>
+      <w:proofErr w:type="spellStart"/>
+      <w:r>
+        <w:rPr>
+          <w:rFonts w:ascii="Times New Roman" w:hAnsi="Times New Roman" w:cs="Times New Roman"/>
+          <w:lang w:val="tr-TR"/>
+        </w:rPr>
+        <w:t>current</w:t>
+      </w:r>
+      <w:proofErr w:type="spellEnd"/>
+      <w:r>
+        <w:rPr>
+          <w:rFonts w:ascii="Times New Roman" w:hAnsi="Times New Roman" w:cs="Times New Roman"/>
+          <w:lang w:val="tr-TR"/>
+        </w:rPr>
+        <w:t xml:space="preserve"> </w:t>
+      </w:r>
+      <w:proofErr w:type="spellStart"/>
+      <w:r>
+        <w:rPr>
+          <w:rFonts w:ascii="Times New Roman" w:hAnsi="Times New Roman" w:cs="Times New Roman"/>
+          <w:lang w:val="tr-TR"/>
+        </w:rPr>
+        <w:t>index</w:t>
+      </w:r>
+      <w:proofErr w:type="spellEnd"/>
+      <w:r>
+        <w:rPr>
+          <w:rFonts w:ascii="Times New Roman" w:hAnsi="Times New Roman" w:cs="Times New Roman"/>
+          <w:lang w:val="tr-TR"/>
+        </w:rPr>
+        <w:t xml:space="preserve">, it is </w:t>
       </w:r>
       <w:r>
         <w:rPr>
@@ -8207,6 +11111,7 @@
         </w:rPr>
         <w:t xml:space="preserve">a </w:t>
       </w:r>
+      <w:proofErr w:type="spellStart"/>
       <w:r>
         <w:rPr>
           <w:rFonts w:ascii="Times New Roman" w:hAnsi="Times New Roman" w:cs="Times New Roman"/>
@@ -8216,33 +11121,27 @@
         </w:rPr>
         <w:t>true</w:t>
       </w:r>
-      <w:r>
-        <w:rPr>
-          <w:rFonts w:ascii="Times New Roman" w:hAnsi="Times New Roman" w:cs="Times New Roman"/>
-          <w:b/>
-          <w:bCs/>
-          <w:lang w:val="tr-TR"/>
-        </w:rPr>
-        <w:t xml:space="preserve"> </w:t>
-      </w:r>
-      <w:r>
-        <w:rPr>
-          <w:rFonts w:ascii="Times New Roman" w:hAnsi="Times New Roman" w:cs="Times New Roman"/>
-          <w:b/>
-          <w:bCs/>
-          <w:lang w:val="tr-TR"/>
-        </w:rPr>
-        <w:t>un</w:t>
-      </w:r>
-      <w:r>
-        <w:rPr>
-          <w:rFonts w:ascii="Times New Roman" w:hAnsi="Times New Roman" w:cs="Times New Roman"/>
-          <w:b/>
-          <w:bCs/>
-          <w:lang w:val="tr-TR"/>
-        </w:rPr>
-        <w:t>deferral</w:t>
-      </w:r>
+      <w:proofErr w:type="spellEnd"/>
+      <w:r>
+        <w:rPr>
+          <w:rFonts w:ascii="Times New Roman" w:hAnsi="Times New Roman" w:cs="Times New Roman"/>
+          <w:b/>
+          <w:bCs/>
+          <w:lang w:val="tr-TR"/>
+        </w:rPr>
+        <w:t xml:space="preserve"> </w:t>
+      </w:r>
+      <w:proofErr w:type="spellStart"/>
+      <w:r>
+        <w:rPr>
+          <w:rFonts w:ascii="Times New Roman" w:hAnsi="Times New Roman" w:cs="Times New Roman"/>
+          <w:b/>
+          <w:bCs/>
+          <w:lang w:val="tr-TR"/>
+        </w:rPr>
+        <w:t>undeferral</w:t>
+      </w:r>
+      <w:proofErr w:type="spellEnd"/>
       <w:r>
         <w:rPr>
           <w:rFonts w:ascii="Times New Roman" w:hAnsi="Times New Roman" w:cs="Times New Roman"/>
@@ -8259,15 +11158,37 @@
         </w:rPr>
         <w:t>(</w:t>
       </w:r>
-      <w:r>
-        <w:rPr>
-          <w:rFonts w:ascii="Times New Roman" w:hAnsi="Times New Roman" w:cs="Times New Roman"/>
-          <w:b/>
-          <w:bCs/>
-          <w:lang w:val="tr-TR"/>
-        </w:rPr>
-        <w:t>true negative</w:t>
-      </w:r>
+      <w:proofErr w:type="spellStart"/>
+      <w:r>
+        <w:rPr>
+          <w:rFonts w:ascii="Times New Roman" w:hAnsi="Times New Roman" w:cs="Times New Roman"/>
+          <w:b/>
+          <w:bCs/>
+          <w:lang w:val="tr-TR"/>
+        </w:rPr>
+        <w:t>true</w:t>
+      </w:r>
+      <w:proofErr w:type="spellEnd"/>
+      <w:r>
+        <w:rPr>
+          <w:rFonts w:ascii="Times New Roman" w:hAnsi="Times New Roman" w:cs="Times New Roman"/>
+          <w:b/>
+          <w:bCs/>
+          <w:lang w:val="tr-TR"/>
+        </w:rPr>
+        <w:t xml:space="preserve"> </w:t>
+      </w:r>
+      <w:proofErr w:type="spellStart"/>
+      <w:r>
+        <w:rPr>
+          <w:rFonts w:ascii="Times New Roman" w:hAnsi="Times New Roman" w:cs="Times New Roman"/>
+          <w:b/>
+          <w:bCs/>
+          <w:lang w:val="tr-TR"/>
+        </w:rPr>
+        <w:t>negative</w:t>
+      </w:r>
+      <w:proofErr w:type="spellEnd"/>
       <w:r>
         <w:rPr>
           <w:rFonts w:ascii="Times New Roman" w:hAnsi="Times New Roman" w:cs="Times New Roman"/>
@@ -8282,23 +11203,190 @@
           <w:rFonts w:ascii="Times New Roman" w:hAnsi="Times New Roman" w:cs="Times New Roman"/>
           <w:lang w:val="tr-TR"/>
         </w:rPr>
-        <w:t xml:space="preserve"> of knowledge to the expert. Otherwise, it is a </w:t>
-      </w:r>
-      <w:r>
-        <w:rPr>
-          <w:rFonts w:ascii="Times New Roman" w:hAnsi="Times New Roman" w:cs="Times New Roman"/>
-          <w:b/>
-          <w:bCs/>
-          <w:lang w:val="tr-TR"/>
-        </w:rPr>
-        <w:t>false undeferral (false negative)</w:t>
-      </w:r>
-      <w:r>
-        <w:rPr>
-          <w:rFonts w:ascii="Times New Roman" w:hAnsi="Times New Roman" w:cs="Times New Roman"/>
-          <w:lang w:val="tr-TR"/>
-        </w:rPr>
-        <w:t xml:space="preserve"> case. </w:t>
+        <w:t xml:space="preserve"> of </w:t>
+      </w:r>
+      <w:proofErr w:type="spellStart"/>
+      <w:r>
+        <w:rPr>
+          <w:rFonts w:ascii="Times New Roman" w:hAnsi="Times New Roman" w:cs="Times New Roman"/>
+          <w:lang w:val="tr-TR"/>
+        </w:rPr>
+        <w:t>knowledge</w:t>
+      </w:r>
+      <w:proofErr w:type="spellEnd"/>
+      <w:r>
+        <w:rPr>
+          <w:rFonts w:ascii="Times New Roman" w:hAnsi="Times New Roman" w:cs="Times New Roman"/>
+          <w:lang w:val="tr-TR"/>
+        </w:rPr>
+        <w:t xml:space="preserve"> </w:t>
+      </w:r>
+      <w:proofErr w:type="spellStart"/>
+      <w:r>
+        <w:rPr>
+          <w:rFonts w:ascii="Times New Roman" w:hAnsi="Times New Roman" w:cs="Times New Roman"/>
+          <w:lang w:val="tr-TR"/>
+        </w:rPr>
+        <w:t>to</w:t>
+      </w:r>
+      <w:proofErr w:type="spellEnd"/>
+      <w:r>
+        <w:rPr>
+          <w:rFonts w:ascii="Times New Roman" w:hAnsi="Times New Roman" w:cs="Times New Roman"/>
+          <w:lang w:val="tr-TR"/>
+        </w:rPr>
+        <w:t xml:space="preserve"> </w:t>
+      </w:r>
+      <w:proofErr w:type="spellStart"/>
+      <w:r>
+        <w:rPr>
+          <w:rFonts w:ascii="Times New Roman" w:hAnsi="Times New Roman" w:cs="Times New Roman"/>
+          <w:lang w:val="tr-TR"/>
+        </w:rPr>
+        <w:t>the</w:t>
+      </w:r>
+      <w:proofErr w:type="spellEnd"/>
+      <w:r>
+        <w:rPr>
+          <w:rFonts w:ascii="Times New Roman" w:hAnsi="Times New Roman" w:cs="Times New Roman"/>
+          <w:lang w:val="tr-TR"/>
+        </w:rPr>
+        <w:t xml:space="preserve"> </w:t>
+      </w:r>
+      <w:proofErr w:type="spellStart"/>
+      <w:r>
+        <w:rPr>
+          <w:rFonts w:ascii="Times New Roman" w:hAnsi="Times New Roman" w:cs="Times New Roman"/>
+          <w:lang w:val="tr-TR"/>
+        </w:rPr>
+        <w:t>expert</w:t>
+      </w:r>
+      <w:proofErr w:type="spellEnd"/>
+      <w:r>
+        <w:rPr>
+          <w:rFonts w:ascii="Times New Roman" w:hAnsi="Times New Roman" w:cs="Times New Roman"/>
+          <w:lang w:val="tr-TR"/>
+        </w:rPr>
+        <w:t xml:space="preserve">. </w:t>
+      </w:r>
+      <w:proofErr w:type="spellStart"/>
+      <w:r>
+        <w:rPr>
+          <w:rFonts w:ascii="Times New Roman" w:hAnsi="Times New Roman" w:cs="Times New Roman"/>
+          <w:lang w:val="tr-TR"/>
+        </w:rPr>
+        <w:t>Otherwise</w:t>
+      </w:r>
+      <w:proofErr w:type="spellEnd"/>
+      <w:r>
+        <w:rPr>
+          <w:rFonts w:ascii="Times New Roman" w:hAnsi="Times New Roman" w:cs="Times New Roman"/>
+          <w:lang w:val="tr-TR"/>
+        </w:rPr>
+        <w:t xml:space="preserve">, it is a </w:t>
+      </w:r>
+      <w:proofErr w:type="spellStart"/>
+      <w:r>
+        <w:rPr>
+          <w:rFonts w:ascii="Times New Roman" w:hAnsi="Times New Roman" w:cs="Times New Roman"/>
+          <w:b/>
+          <w:bCs/>
+          <w:lang w:val="tr-TR"/>
+        </w:rPr>
+        <w:t>false</w:t>
+      </w:r>
+      <w:proofErr w:type="spellEnd"/>
+      <w:r>
+        <w:rPr>
+          <w:rFonts w:ascii="Times New Roman" w:hAnsi="Times New Roman" w:cs="Times New Roman"/>
+          <w:b/>
+          <w:bCs/>
+          <w:lang w:val="tr-TR"/>
+        </w:rPr>
+        <w:t xml:space="preserve"> </w:t>
+      </w:r>
+      <w:proofErr w:type="spellStart"/>
+      <w:r>
+        <w:rPr>
+          <w:rFonts w:ascii="Times New Roman" w:hAnsi="Times New Roman" w:cs="Times New Roman"/>
+          <w:b/>
+          <w:bCs/>
+          <w:lang w:val="tr-TR"/>
+        </w:rPr>
+        <w:t>undeferral</w:t>
+      </w:r>
+      <w:proofErr w:type="spellEnd"/>
+      <w:r>
+        <w:rPr>
+          <w:rFonts w:ascii="Times New Roman" w:hAnsi="Times New Roman" w:cs="Times New Roman"/>
+          <w:b/>
+          <w:bCs/>
+          <w:lang w:val="tr-TR"/>
+        </w:rPr>
+        <w:t xml:space="preserve"> (</w:t>
+      </w:r>
+      <w:proofErr w:type="spellStart"/>
+      <w:r>
+        <w:rPr>
+          <w:rFonts w:ascii="Times New Roman" w:hAnsi="Times New Roman" w:cs="Times New Roman"/>
+          <w:b/>
+          <w:bCs/>
+          <w:lang w:val="tr-TR"/>
+        </w:rPr>
+        <w:t>false</w:t>
+      </w:r>
+      <w:proofErr w:type="spellEnd"/>
+      <w:r>
+        <w:rPr>
+          <w:rFonts w:ascii="Times New Roman" w:hAnsi="Times New Roman" w:cs="Times New Roman"/>
+          <w:b/>
+          <w:bCs/>
+          <w:lang w:val="tr-TR"/>
+        </w:rPr>
+        <w:t xml:space="preserve"> </w:t>
+      </w:r>
+      <w:proofErr w:type="spellStart"/>
+      <w:r>
+        <w:rPr>
+          <w:rFonts w:ascii="Times New Roman" w:hAnsi="Times New Roman" w:cs="Times New Roman"/>
+          <w:b/>
+          <w:bCs/>
+          <w:lang w:val="tr-TR"/>
+        </w:rPr>
+        <w:t>negative</w:t>
+      </w:r>
+      <w:proofErr w:type="spellEnd"/>
+      <w:r>
+        <w:rPr>
+          <w:rFonts w:ascii="Times New Roman" w:hAnsi="Times New Roman" w:cs="Times New Roman"/>
+          <w:b/>
+          <w:bCs/>
+          <w:lang w:val="tr-TR"/>
+        </w:rPr>
+        <w:t>)</w:t>
+      </w:r>
+      <w:r>
+        <w:rPr>
+          <w:rFonts w:ascii="Times New Roman" w:hAnsi="Times New Roman" w:cs="Times New Roman"/>
+          <w:lang w:val="tr-TR"/>
+        </w:rPr>
+        <w:t xml:space="preserve"> </w:t>
+      </w:r>
+      <w:proofErr w:type="spellStart"/>
+      <w:r>
+        <w:rPr>
+          <w:rFonts w:ascii="Times New Roman" w:hAnsi="Times New Roman" w:cs="Times New Roman"/>
+          <w:lang w:val="tr-TR"/>
+        </w:rPr>
+        <w:t>case</w:t>
+      </w:r>
+      <w:proofErr w:type="spellEnd"/>
+      <w:r>
+        <w:rPr>
+          <w:rFonts w:ascii="Times New Roman" w:hAnsi="Times New Roman" w:cs="Times New Roman"/>
+          <w:lang w:val="tr-TR"/>
+        </w:rPr>
+        <w:t xml:space="preserve">. </w:t>
       </w:r>
     </w:p>
     <w:p>
@@ -8374,6 +11462,7 @@
           </wp:anchor>
         </w:drawing>
       </w:r>
+      <w:proofErr w:type="spellStart"/>
       <w:r>
         <w:rPr>
           <w:rFonts w:ascii="Times New Roman" w:hAnsi="Times New Roman" w:cs="Times New Roman"/>
@@ -8382,7 +11471,18 @@
           <w:u w:val="single"/>
           <w:lang w:val="tr-TR"/>
         </w:rPr>
-        <w:t xml:space="preserve">Task </w:t>
+        <w:t>Task</w:t>
+      </w:r>
+      <w:proofErr w:type="spellEnd"/>
+      <w:r>
+        <w:rPr>
+          <w:rFonts w:ascii="Times New Roman" w:hAnsi="Times New Roman" w:cs="Times New Roman"/>
+          <w:b/>
+          <w:bCs/>
+          <w:u w:val="single"/>
+          <w:lang w:val="tr-TR"/>
+        </w:rPr>
+        <w:t xml:space="preserve"> </w:t>
       </w:r>
       <w:r>
         <w:rPr>
@@ -8509,6 +11609,7 @@
                                 <w:lang w:val="tr-TR"/>
                               </w:rPr>
                             </w:pPr>
+                            <w:proofErr w:type="spellStart"/>
                             <w:r>
                               <w:rPr>
                                 <w:rFonts w:ascii="Times New Roman" w:hAnsi="Times New Roman" w:cs="Times New Roman"/>
@@ -8516,8 +11617,9 @@
                                 <w:bCs/>
                                 <w:lang w:val="tr-TR"/>
                               </w:rPr>
-                              <w:t xml:space="preserve">Figure </w:t>
+                              <w:t>Figure</w:t>
                             </w:r>
+                            <w:proofErr w:type="spellEnd"/>
                             <w:r>
                               <w:rPr>
                                 <w:rFonts w:ascii="Times New Roman" w:hAnsi="Times New Roman" w:cs="Times New Roman"/>
@@ -8525,7 +11627,7 @@
                                 <w:bCs/>
                                 <w:lang w:val="tr-TR"/>
                               </w:rPr>
-                              <w:t xml:space="preserve">6: </w:t>
+                              <w:t xml:space="preserve"> 6: </w:t>
                             </w:r>
                             <w:r>
                               <w:rPr>
@@ -8574,6 +11676,7 @@
                           <w:lang w:val="tr-TR"/>
                         </w:rPr>
                       </w:pPr>
+                      <w:proofErr w:type="spellStart"/>
                       <w:r>
                         <w:rPr>
                           <w:rFonts w:ascii="Times New Roman" w:hAnsi="Times New Roman" w:cs="Times New Roman"/>
@@ -8581,8 +11684,9 @@
                           <w:bCs/>
                           <w:lang w:val="tr-TR"/>
                         </w:rPr>
-                        <w:t xml:space="preserve">Figure </w:t>
+                        <w:t>Figure</w:t>
                       </w:r>
+                      <w:proofErr w:type="spellEnd"/>
                       <w:r>
                         <w:rPr>
                           <w:rFonts w:ascii="Times New Roman" w:hAnsi="Times New Roman" w:cs="Times New Roman"/>
@@ -8590,7 +11694,7 @@
                           <w:bCs/>
                           <w:lang w:val="tr-TR"/>
                         </w:rPr>
-                        <w:t xml:space="preserve">6: </w:t>
+                        <w:t xml:space="preserve"> 6: </w:t>
                       </w:r>
                       <w:r>
                         <w:rPr>
@@ -8623,7 +11727,7 @@
           <w:lang w:eastAsia="tr-TR"/>
         </w:rPr>
         <w:drawing>
-          <wp:anchor distT="0" distB="0" distL="114300" distR="114300" simplePos="0" relativeHeight="251685888" behindDoc="0" locked="0" layoutInCell="1" allowOverlap="1" wp14:anchorId="7C5579EF" wp14:editId="16212975">
+          <wp:anchor distT="0" distB="0" distL="114300" distR="114300" simplePos="0" relativeHeight="251685888" behindDoc="0" locked="0" layoutInCell="1" allowOverlap="1" wp14:anchorId="7C5579EF" wp14:editId="0BD46199">
             <wp:simplePos x="0" y="0"/>
             <wp:positionH relativeFrom="column">
               <wp:posOffset>10758</wp:posOffset>
@@ -8739,6 +11843,7 @@
                                 <w:lang w:val="tr-TR"/>
                               </w:rPr>
                             </w:pPr>
+                            <w:proofErr w:type="spellStart"/>
                             <w:r>
                               <w:rPr>
                                 <w:rFonts w:ascii="Times New Roman" w:hAnsi="Times New Roman" w:cs="Times New Roman"/>
@@ -8746,7 +11851,197 @@
                                 <w:bCs/>
                                 <w:lang w:val="tr-TR"/>
                               </w:rPr>
-                              <w:t xml:space="preserve">Figure 5: Number of Labeled Samples vs Model’s Test Accuracy Graph for 30 Active Learning Queries </w:t>
+                              <w:t>Figure</w:t>
+                            </w:r>
+                            <w:proofErr w:type="spellEnd"/>
+                            <w:r>
+                              <w:rPr>
+                                <w:rFonts w:ascii="Times New Roman" w:hAnsi="Times New Roman" w:cs="Times New Roman"/>
+                                <w:b/>
+                                <w:bCs/>
+                                <w:lang w:val="tr-TR"/>
+                              </w:rPr>
+                              <w:t xml:space="preserve"> 5: </w:t>
+                            </w:r>
+                            <w:proofErr w:type="spellStart"/>
+                            <w:r>
+                              <w:rPr>
+                                <w:rFonts w:ascii="Times New Roman" w:hAnsi="Times New Roman" w:cs="Times New Roman"/>
+                                <w:b/>
+                                <w:bCs/>
+                                <w:lang w:val="tr-TR"/>
+                              </w:rPr>
+                              <w:t>Number</w:t>
+                            </w:r>
+                            <w:proofErr w:type="spellEnd"/>
+                            <w:r>
+                              <w:rPr>
+                                <w:rFonts w:ascii="Times New Roman" w:hAnsi="Times New Roman" w:cs="Times New Roman"/>
+                                <w:b/>
+                                <w:bCs/>
+                                <w:lang w:val="tr-TR"/>
+                              </w:rPr>
+                              <w:t xml:space="preserve"> of </w:t>
+                            </w:r>
+                            <w:proofErr w:type="spellStart"/>
+                            <w:r>
+                              <w:rPr>
+                                <w:rFonts w:ascii="Times New Roman" w:hAnsi="Times New Roman" w:cs="Times New Roman"/>
+                                <w:b/>
+                                <w:bCs/>
+                                <w:lang w:val="tr-TR"/>
+                              </w:rPr>
+                              <w:t>Labeled</w:t>
+                            </w:r>
+                            <w:proofErr w:type="spellEnd"/>
+                            <w:r>
+                              <w:rPr>
+                                <w:rFonts w:ascii="Times New Roman" w:hAnsi="Times New Roman" w:cs="Times New Roman"/>
+                                <w:b/>
+                                <w:bCs/>
+                                <w:lang w:val="tr-TR"/>
+                              </w:rPr>
+                              <w:t xml:space="preserve"> </w:t>
+                            </w:r>
+                            <w:proofErr w:type="spellStart"/>
+                            <w:r>
+                              <w:rPr>
+                                <w:rFonts w:ascii="Times New Roman" w:hAnsi="Times New Roman" w:cs="Times New Roman"/>
+                                <w:b/>
+                                <w:bCs/>
+                                <w:lang w:val="tr-TR"/>
+                              </w:rPr>
+                              <w:t>Samples</w:t>
+                            </w:r>
+                            <w:proofErr w:type="spellEnd"/>
+                            <w:r>
+                              <w:rPr>
+                                <w:rFonts w:ascii="Times New Roman" w:hAnsi="Times New Roman" w:cs="Times New Roman"/>
+                                <w:b/>
+                                <w:bCs/>
+                                <w:lang w:val="tr-TR"/>
+                              </w:rPr>
+                              <w:t xml:space="preserve"> </w:t>
+                            </w:r>
+                            <w:proofErr w:type="spellStart"/>
+                            <w:r>
+                              <w:rPr>
+                                <w:rFonts w:ascii="Times New Roman" w:hAnsi="Times New Roman" w:cs="Times New Roman"/>
+                                <w:b/>
+                                <w:bCs/>
+                                <w:lang w:val="tr-TR"/>
+                              </w:rPr>
+                              <w:t>vs</w:t>
+                            </w:r>
+                            <w:proofErr w:type="spellEnd"/>
+                            <w:r>
+                              <w:rPr>
+                                <w:rFonts w:ascii="Times New Roman" w:hAnsi="Times New Roman" w:cs="Times New Roman"/>
+                                <w:b/>
+                                <w:bCs/>
+                                <w:lang w:val="tr-TR"/>
+                              </w:rPr>
+                              <w:t xml:space="preserve"> </w:t>
+                            </w:r>
+                            <w:proofErr w:type="spellStart"/>
+                            <w:r>
+                              <w:rPr>
+                                <w:rFonts w:ascii="Times New Roman" w:hAnsi="Times New Roman" w:cs="Times New Roman"/>
+                                <w:b/>
+                                <w:bCs/>
+                                <w:lang w:val="tr-TR"/>
+                              </w:rPr>
+                              <w:t>Model’s</w:t>
+                            </w:r>
+                            <w:proofErr w:type="spellEnd"/>
+                            <w:r>
+                              <w:rPr>
+                                <w:rFonts w:ascii="Times New Roman" w:hAnsi="Times New Roman" w:cs="Times New Roman"/>
+                                <w:b/>
+                                <w:bCs/>
+                                <w:lang w:val="tr-TR"/>
+                              </w:rPr>
+                              <w:t xml:space="preserve"> Test </w:t>
+                            </w:r>
+                            <w:proofErr w:type="spellStart"/>
+                            <w:r>
+                              <w:rPr>
+                                <w:rFonts w:ascii="Times New Roman" w:hAnsi="Times New Roman" w:cs="Times New Roman"/>
+                                <w:b/>
+                                <w:bCs/>
+                                <w:lang w:val="tr-TR"/>
+                              </w:rPr>
+                              <w:t>Accuracy</w:t>
+                            </w:r>
+                            <w:proofErr w:type="spellEnd"/>
+                            <w:r>
+                              <w:rPr>
+                                <w:rFonts w:ascii="Times New Roman" w:hAnsi="Times New Roman" w:cs="Times New Roman"/>
+                                <w:b/>
+                                <w:bCs/>
+                                <w:lang w:val="tr-TR"/>
+                              </w:rPr>
+                              <w:t xml:space="preserve"> </w:t>
+                            </w:r>
+                            <w:proofErr w:type="spellStart"/>
+                            <w:r>
+                              <w:rPr>
+                                <w:rFonts w:ascii="Times New Roman" w:hAnsi="Times New Roman" w:cs="Times New Roman"/>
+                                <w:b/>
+                                <w:bCs/>
+                                <w:lang w:val="tr-TR"/>
+                              </w:rPr>
+                              <w:t>Graph</w:t>
+                            </w:r>
+                            <w:proofErr w:type="spellEnd"/>
+                            <w:r>
+                              <w:rPr>
+                                <w:rFonts w:ascii="Times New Roman" w:hAnsi="Times New Roman" w:cs="Times New Roman"/>
+                                <w:b/>
+                                <w:bCs/>
+                                <w:lang w:val="tr-TR"/>
+                              </w:rPr>
+                              <w:t xml:space="preserve"> </w:t>
+                            </w:r>
+                            <w:proofErr w:type="spellStart"/>
+                            <w:r>
+                              <w:rPr>
+                                <w:rFonts w:ascii="Times New Roman" w:hAnsi="Times New Roman" w:cs="Times New Roman"/>
+                                <w:b/>
+                                <w:bCs/>
+                                <w:lang w:val="tr-TR"/>
+                              </w:rPr>
+                              <w:t>for</w:t>
+                            </w:r>
+                            <w:proofErr w:type="spellEnd"/>
+                            <w:r>
+                              <w:rPr>
+                                <w:rFonts w:ascii="Times New Roman" w:hAnsi="Times New Roman" w:cs="Times New Roman"/>
+                                <w:b/>
+                                <w:bCs/>
+                                <w:lang w:val="tr-TR"/>
+                              </w:rPr>
+                              <w:t xml:space="preserve"> 30 Active Learning </w:t>
+                            </w:r>
+                            <w:proofErr w:type="spellStart"/>
+                            <w:r>
+                              <w:rPr>
+                                <w:rFonts w:ascii="Times New Roman" w:hAnsi="Times New Roman" w:cs="Times New Roman"/>
+                                <w:b/>
+                                <w:bCs/>
+                                <w:lang w:val="tr-TR"/>
+                              </w:rPr>
+                              <w:t>Queries</w:t>
+                            </w:r>
+                            <w:proofErr w:type="spellEnd"/>
+                            <w:r>
+                              <w:rPr>
+                                <w:rFonts w:ascii="Times New Roman" w:hAnsi="Times New Roman" w:cs="Times New Roman"/>
+                                <w:b/>
+                                <w:bCs/>
+                                <w:lang w:val="tr-TR"/>
+                              </w:rPr>
+                              <w:t xml:space="preserve"> </w:t>
                             </w:r>
                           </w:p>
                         </w:txbxContent>
@@ -8785,6 +12080,7 @@
                           <w:lang w:val="tr-TR"/>
                         </w:rPr>
                       </w:pPr>
+                      <w:proofErr w:type="spellStart"/>
                       <w:r>
                         <w:rPr>
                           <w:rFonts w:ascii="Times New Roman" w:hAnsi="Times New Roman" w:cs="Times New Roman"/>
@@ -8792,7 +12088,197 @@
                           <w:bCs/>
                           <w:lang w:val="tr-TR"/>
                         </w:rPr>
-                        <w:t xml:space="preserve">Figure 5: Number of Labeled Samples vs Model’s Test Accuracy Graph for 30 Active Learning Queries </w:t>
+                        <w:t>Figure</w:t>
+                      </w:r>
+                      <w:proofErr w:type="spellEnd"/>
+                      <w:r>
+                        <w:rPr>
+                          <w:rFonts w:ascii="Times New Roman" w:hAnsi="Times New Roman" w:cs="Times New Roman"/>
+                          <w:b/>
+                          <w:bCs/>
+                          <w:lang w:val="tr-TR"/>
+                        </w:rPr>
+                        <w:t xml:space="preserve"> 5: </w:t>
+                      </w:r>
+                      <w:proofErr w:type="spellStart"/>
+                      <w:r>
+                        <w:rPr>
+                          <w:rFonts w:ascii="Times New Roman" w:hAnsi="Times New Roman" w:cs="Times New Roman"/>
+                          <w:b/>
+                          <w:bCs/>
+                          <w:lang w:val="tr-TR"/>
+                        </w:rPr>
+                        <w:t>Number</w:t>
+                      </w:r>
+                      <w:proofErr w:type="spellEnd"/>
+                      <w:r>
+                        <w:rPr>
+                          <w:rFonts w:ascii="Times New Roman" w:hAnsi="Times New Roman" w:cs="Times New Roman"/>
+                          <w:b/>
+                          <w:bCs/>
+                          <w:lang w:val="tr-TR"/>
+                        </w:rPr>
+                        <w:t xml:space="preserve"> of </w:t>
+                      </w:r>
+                      <w:proofErr w:type="spellStart"/>
+                      <w:r>
+                        <w:rPr>
+                          <w:rFonts w:ascii="Times New Roman" w:hAnsi="Times New Roman" w:cs="Times New Roman"/>
+                          <w:b/>
+                          <w:bCs/>
+                          <w:lang w:val="tr-TR"/>
+                        </w:rPr>
+                        <w:t>Labeled</w:t>
+                      </w:r>
+                      <w:proofErr w:type="spellEnd"/>
+                      <w:r>
+                        <w:rPr>
+                          <w:rFonts w:ascii="Times New Roman" w:hAnsi="Times New Roman" w:cs="Times New Roman"/>
+                          <w:b/>
+                          <w:bCs/>
+                          <w:lang w:val="tr-TR"/>
+                        </w:rPr>
+                        <w:t xml:space="preserve"> </w:t>
+                      </w:r>
+                      <w:proofErr w:type="spellStart"/>
+                      <w:r>
+                        <w:rPr>
+                          <w:rFonts w:ascii="Times New Roman" w:hAnsi="Times New Roman" w:cs="Times New Roman"/>
+                          <w:b/>
+                          <w:bCs/>
+                          <w:lang w:val="tr-TR"/>
+                        </w:rPr>
+                        <w:t>Samples</w:t>
+                      </w:r>
+                      <w:proofErr w:type="spellEnd"/>
+                      <w:r>
+                        <w:rPr>
+                          <w:rFonts w:ascii="Times New Roman" w:hAnsi="Times New Roman" w:cs="Times New Roman"/>
+                          <w:b/>
+                          <w:bCs/>
+                          <w:lang w:val="tr-TR"/>
+                        </w:rPr>
+                        <w:t xml:space="preserve"> </w:t>
+                      </w:r>
+                      <w:proofErr w:type="spellStart"/>
+                      <w:r>
+                        <w:rPr>
+                          <w:rFonts w:ascii="Times New Roman" w:hAnsi="Times New Roman" w:cs="Times New Roman"/>
+                          <w:b/>
+                          <w:bCs/>
+                          <w:lang w:val="tr-TR"/>
+                        </w:rPr>
+                        <w:t>vs</w:t>
+                      </w:r>
+                      <w:proofErr w:type="spellEnd"/>
+                      <w:r>
+                        <w:rPr>
+                          <w:rFonts w:ascii="Times New Roman" w:hAnsi="Times New Roman" w:cs="Times New Roman"/>
+                          <w:b/>
+                          <w:bCs/>
+                          <w:lang w:val="tr-TR"/>
+                        </w:rPr>
+                        <w:t xml:space="preserve"> </w:t>
+                      </w:r>
+                      <w:proofErr w:type="spellStart"/>
+                      <w:r>
+                        <w:rPr>
+                          <w:rFonts w:ascii="Times New Roman" w:hAnsi="Times New Roman" w:cs="Times New Roman"/>
+                          <w:b/>
+                          <w:bCs/>
+                          <w:lang w:val="tr-TR"/>
+                        </w:rPr>
+                        <w:t>Model’s</w:t>
+                      </w:r>
+                      <w:proofErr w:type="spellEnd"/>
+                      <w:r>
+                        <w:rPr>
+                          <w:rFonts w:ascii="Times New Roman" w:hAnsi="Times New Roman" w:cs="Times New Roman"/>
+                          <w:b/>
+                          <w:bCs/>
+                          <w:lang w:val="tr-TR"/>
+                        </w:rPr>
+                        <w:t xml:space="preserve"> Test </w:t>
+                      </w:r>
+                      <w:proofErr w:type="spellStart"/>
+                      <w:r>
+                        <w:rPr>
+                          <w:rFonts w:ascii="Times New Roman" w:hAnsi="Times New Roman" w:cs="Times New Roman"/>
+                          <w:b/>
+                          <w:bCs/>
+                          <w:lang w:val="tr-TR"/>
+                        </w:rPr>
+                        <w:t>Accuracy</w:t>
+                      </w:r>
+                      <w:proofErr w:type="spellEnd"/>
+                      <w:r>
+                        <w:rPr>
+                          <w:rFonts w:ascii="Times New Roman" w:hAnsi="Times New Roman" w:cs="Times New Roman"/>
+                          <w:b/>
+                          <w:bCs/>
+                          <w:lang w:val="tr-TR"/>
+                        </w:rPr>
+                        <w:t xml:space="preserve"> </w:t>
+                      </w:r>
+                      <w:proofErr w:type="spellStart"/>
+                      <w:r>
+                        <w:rPr>
+                          <w:rFonts w:ascii="Times New Roman" w:hAnsi="Times New Roman" w:cs="Times New Roman"/>
+                          <w:b/>
+                          <w:bCs/>
+                          <w:lang w:val="tr-TR"/>
+                        </w:rPr>
+                        <w:t>Graph</w:t>
+                      </w:r>
+                      <w:proofErr w:type="spellEnd"/>
+                      <w:r>
+                        <w:rPr>
+                          <w:rFonts w:ascii="Times New Roman" w:hAnsi="Times New Roman" w:cs="Times New Roman"/>
+                          <w:b/>
+                          <w:bCs/>
+                          <w:lang w:val="tr-TR"/>
+                        </w:rPr>
+                        <w:t xml:space="preserve"> </w:t>
+                      </w:r>
+                      <w:proofErr w:type="spellStart"/>
+                      <w:r>
+                        <w:rPr>
+                          <w:rFonts w:ascii="Times New Roman" w:hAnsi="Times New Roman" w:cs="Times New Roman"/>
+                          <w:b/>
+                          <w:bCs/>
+                          <w:lang w:val="tr-TR"/>
+                        </w:rPr>
+                        <w:t>for</w:t>
+                      </w:r>
+                      <w:proofErr w:type="spellEnd"/>
+                      <w:r>
+                        <w:rPr>
+                          <w:rFonts w:ascii="Times New Roman" w:hAnsi="Times New Roman" w:cs="Times New Roman"/>
+                          <w:b/>
+                          <w:bCs/>
+                          <w:lang w:val="tr-TR"/>
+                        </w:rPr>
+                        <w:t xml:space="preserve"> 30 Active Learning </w:t>
+                      </w:r>
+                      <w:proofErr w:type="spellStart"/>
+                      <w:r>
+                        <w:rPr>
+                          <w:rFonts w:ascii="Times New Roman" w:hAnsi="Times New Roman" w:cs="Times New Roman"/>
+                          <w:b/>
+                          <w:bCs/>
+                          <w:lang w:val="tr-TR"/>
+                        </w:rPr>
+                        <w:t>Queries</w:t>
+                      </w:r>
+                      <w:proofErr w:type="spellEnd"/>
+                      <w:r>
+                        <w:rPr>
+                          <w:rFonts w:ascii="Times New Roman" w:hAnsi="Times New Roman" w:cs="Times New Roman"/>
+                          <w:b/>
+                          <w:bCs/>
+                          <w:lang w:val="tr-TR"/>
+                        </w:rPr>
+                        <w:t xml:space="preserve"> </w:t>
                       </w:r>
                     </w:p>
                   </w:txbxContent>
@@ -9135,20 +12621,19 @@
           <w:szCs w:val="18"/>
           <w:lang w:eastAsia="tr-TR"/>
         </w:rPr>
-        <w:lastRenderedPageBreak/>
         <w:drawing>
-          <wp:anchor distT="0" distB="0" distL="114300" distR="114300" simplePos="0" relativeHeight="251688960" behindDoc="0" locked="0" layoutInCell="1" allowOverlap="1" wp14:anchorId="2BCC3B6A" wp14:editId="19C16540">
+          <wp:anchor distT="0" distB="0" distL="114300" distR="114300" simplePos="0" relativeHeight="251688960" behindDoc="0" locked="0" layoutInCell="1" allowOverlap="1" wp14:anchorId="19DE4AA2" wp14:editId="19EBF2F5">
             <wp:simplePos x="0" y="0"/>
             <wp:positionH relativeFrom="column">
-              <wp:posOffset>2920178</wp:posOffset>
+              <wp:posOffset>2601819</wp:posOffset>
             </wp:positionH>
             <wp:positionV relativeFrom="paragraph">
-              <wp:posOffset>55544</wp:posOffset>
+              <wp:posOffset>142053</wp:posOffset>
             </wp:positionV>
-            <wp:extent cx="3403225" cy="2361304"/>
-            <wp:effectExtent l="0" t="0" r="635" b="1270"/>
+            <wp:extent cx="3894760" cy="2678691"/>
+            <wp:effectExtent l="0" t="0" r="4445" b="1270"/>
             <wp:wrapNone/>
-            <wp:docPr id="1729425858" name="Resim 18"/>
+            <wp:docPr id="1205808226" name="Resim 9"/>
             <wp:cNvGraphicFramePr>
               <a:graphicFrameLocks xmlns:a="http://schemas.openxmlformats.org/drawingml/2006/main" noChangeAspect="1"/>
             </wp:cNvGraphicFramePr>
@@ -9156,7 +12641,7 @@
               <a:graphicData uri="http://schemas.openxmlformats.org/drawingml/2006/picture">
                 <pic:pic xmlns:pic="http://schemas.openxmlformats.org/drawingml/2006/picture">
                   <pic:nvPicPr>
-                    <pic:cNvPr id="1729425858" name="Resim 1729425858"/>
+                    <pic:cNvPr id="1205808226" name="Resim 1205808226"/>
                     <pic:cNvPicPr/>
                   </pic:nvPicPr>
                   <pic:blipFill rotWithShape="1">
@@ -9167,7 +12652,7 @@
                         </a:ext>
                       </a:extLst>
                     </a:blip>
-                    <a:srcRect r="2118"/>
+                    <a:srcRect r="2809"/>
                     <a:stretch>
                       <a:fillRect/>
                     </a:stretch>
@@ -9175,7 +12660,7 @@
                   <pic:spPr bwMode="auto">
                     <a:xfrm>
                       <a:off x="0" y="0"/>
-                      <a:ext cx="3403225" cy="2361304"/>
+                      <a:ext cx="3894760" cy="2678691"/>
                     </a:xfrm>
                     <a:prstGeom prst="rect">
                       <a:avLst/>
@@ -9215,56 +12700,6 @@
           <w:lang w:eastAsia="tr-TR"/>
         </w:rPr>
         <w:t xml:space="preserve"> </w:t>
-      </w:r>
-      <w:r>
-        <w:rPr>
-          <w:rFonts w:ascii="Times New Roman" w:hAnsi="Times New Roman" w:cs="Times New Roman"/>
-          <w:noProof/>
-          <w:sz w:val="18"/>
-          <w:szCs w:val="18"/>
-          <w:lang w:eastAsia="tr-TR"/>
-        </w:rPr>
-        <w:drawing>
-          <wp:inline distT="0" distB="0" distL="0" distR="0" wp14:anchorId="79185BE5" wp14:editId="4DB7A853">
-            <wp:extent cx="4333369" cy="2900755"/>
-            <wp:effectExtent l="0" t="0" r="0" b="0"/>
-            <wp:docPr id="1606334086" name="Resim 19"/>
-            <wp:cNvGraphicFramePr>
-              <a:graphicFrameLocks xmlns:a="http://schemas.openxmlformats.org/drawingml/2006/main" noChangeAspect="1"/>
-            </wp:cNvGraphicFramePr>
-            <a:graphic xmlns:a="http://schemas.openxmlformats.org/drawingml/2006/main">
-              <a:graphicData uri="http://schemas.openxmlformats.org/drawingml/2006/picture">
-                <pic:pic xmlns:pic="http://schemas.openxmlformats.org/drawingml/2006/picture">
-                  <pic:nvPicPr>
-                    <pic:cNvPr id="1606334086" name="Resim 1606334086"/>
-                    <pic:cNvPicPr/>
-                  </pic:nvPicPr>
-                  <pic:blipFill>
-                    <a:blip r:embed="rId17" cstate="print">
-                      <a:extLst>
-                        <a:ext uri="{28A0092B-C50C-407E-A947-70E740481C1C}">
-                          <a14:useLocalDpi xmlns:a14="http://schemas.microsoft.com/office/drawing/2010/main" val="0"/>
-                        </a:ext>
-                      </a:extLst>
-                    </a:blip>
-                    <a:stretch>
-                      <a:fillRect/>
-                    </a:stretch>
-                  </pic:blipFill>
-                  <pic:spPr>
-                    <a:xfrm>
-                      <a:off x="0" y="0"/>
-                      <a:ext cx="4395144" cy="2942107"/>
-                    </a:xfrm>
-                    <a:prstGeom prst="rect">
-                      <a:avLst/>
-                    </a:prstGeom>
-                  </pic:spPr>
-                </pic:pic>
-              </a:graphicData>
-            </a:graphic>
-          </wp:inline>
-        </w:drawing>
       </w:r>
     </w:p>
     <w:sectPr>

</xml_diff>

<commit_message>
fix typos in the descriptions of the active learning process in the project-3 report
</commit_message>
<xml_diff>
--- a/Project3_Report.docx
+++ b/Project3_Report.docx
@@ -7134,7 +7134,7 @@
           <w:lang w:val="tr-TR"/>
         </w:rPr>
         <w:drawing>
-          <wp:anchor distT="0" distB="0" distL="114300" distR="114300" simplePos="0" relativeHeight="251670528" behindDoc="0" locked="0" layoutInCell="1" allowOverlap="1" wp14:anchorId="2FE1D6C2" wp14:editId="2C413E92">
+          <wp:anchor distT="0" distB="0" distL="114300" distR="114300" simplePos="0" relativeHeight="251670528" behindDoc="0" locked="0" layoutInCell="1" allowOverlap="1" wp14:anchorId="2FE1D6C2" wp14:editId="494A4A5F">
             <wp:simplePos x="0" y="0"/>
             <wp:positionH relativeFrom="column">
               <wp:posOffset>37220</wp:posOffset>
@@ -9556,15 +9556,15 @@
         <mc:AlternateContent>
           <mc:Choice Requires="wps">
             <w:drawing>
-              <wp:anchor distT="0" distB="0" distL="114300" distR="114300" simplePos="0" relativeHeight="251707392" behindDoc="0" locked="0" layoutInCell="1" allowOverlap="1" wp14:anchorId="606229A5" wp14:editId="651C1BEF">
+              <wp:anchor distT="0" distB="0" distL="114300" distR="114300" simplePos="0" relativeHeight="251707392" behindDoc="0" locked="0" layoutInCell="1" allowOverlap="1" wp14:anchorId="606229A5" wp14:editId="774B528B">
                 <wp:simplePos x="0" y="0"/>
                 <wp:positionH relativeFrom="column">
-                  <wp:posOffset>221578</wp:posOffset>
+                  <wp:posOffset>224589</wp:posOffset>
                 </wp:positionH>
                 <wp:positionV relativeFrom="paragraph">
-                  <wp:posOffset>-605440</wp:posOffset>
+                  <wp:posOffset>-601579</wp:posOffset>
                 </wp:positionV>
-                <wp:extent cx="5536333" cy="5099419"/>
+                <wp:extent cx="5536333" cy="9480884"/>
                 <wp:effectExtent l="0" t="0" r="13970" b="19050"/>
                 <wp:wrapNone/>
                 <wp:docPr id="1063178371" name="Metin Kutusu 20"/>
@@ -9576,7 +9576,7 @@
                       <wps:spPr>
                         <a:xfrm>
                           <a:off x="0" y="0"/>
-                          <a:ext cx="5536333" cy="5099419"/>
+                          <a:ext cx="5536333" cy="9480884"/>
                         </a:xfrm>
                         <a:prstGeom prst="rect">
                           <a:avLst/>
@@ -9597,25 +9597,21 @@
                               <w:jc w:val="both"/>
                               <w:rPr>
                                 <w:rFonts w:ascii="Times New Roman" w:hAnsi="Times New Roman" w:cs="Times New Roman"/>
+                                <w:lang w:val="tr-TR"/>
+                              </w:rPr>
+                            </w:pPr>
+                            <w:r>
+                              <w:rPr>
+                                <w:rFonts w:ascii="Times New Roman" w:hAnsi="Times New Roman" w:cs="Times New Roman"/>
                                 <w:sz w:val="18"/>
                                 <w:szCs w:val="18"/>
                                 <w:lang w:val="tr-TR"/>
                               </w:rPr>
-                            </w:pPr>
-                            <w:r>
-                              <w:rPr>
-                                <w:rFonts w:ascii="Times New Roman" w:hAnsi="Times New Roman" w:cs="Times New Roman"/>
-                                <w:sz w:val="18"/>
-                                <w:szCs w:val="18"/>
-                                <w:lang w:val="tr-TR"/>
-                              </w:rPr>
                               <w:tab/>
                             </w:r>
                             <w:r>
                               <w:rPr>
                                 <w:rFonts w:ascii="Times New Roman" w:hAnsi="Times New Roman" w:cs="Times New Roman"/>
-                                <w:sz w:val="18"/>
-                                <w:szCs w:val="18"/>
                                 <w:lang w:val="tr-TR"/>
                               </w:rPr>
                               <w:t>In the active learning process, it is aimed</w:t>
@@ -9623,8 +9619,6 @@
                             <w:r>
                               <w:rPr>
                                 <w:rFonts w:ascii="Times New Roman" w:hAnsi="Times New Roman" w:cs="Times New Roman"/>
-                                <w:sz w:val="18"/>
-                                <w:szCs w:val="18"/>
                                 <w:lang w:val="tr-TR"/>
                               </w:rPr>
                               <w:t xml:space="preserve"> to </w:t>
@@ -9632,8 +9626,6 @@
                             <w:r>
                               <w:rPr>
                                 <w:rFonts w:ascii="Times New Roman" w:hAnsi="Times New Roman" w:cs="Times New Roman"/>
-                                <w:sz w:val="18"/>
-                                <w:szCs w:val="18"/>
                                 <w:lang w:val="tr-TR"/>
                               </w:rPr>
                               <w:t>actively ch</w:t>
@@ -9641,8 +9633,6 @@
                             <w:r>
                               <w:rPr>
                                 <w:rFonts w:ascii="Times New Roman" w:hAnsi="Times New Roman" w:cs="Times New Roman"/>
-                                <w:sz w:val="18"/>
-                                <w:szCs w:val="18"/>
                                 <w:lang w:val="tr-TR"/>
                               </w:rPr>
                               <w:t>oo</w:t>
@@ -9650,8 +9640,6 @@
                             <w:r>
                               <w:rPr>
                                 <w:rFonts w:ascii="Times New Roman" w:hAnsi="Times New Roman" w:cs="Times New Roman"/>
-                                <w:sz w:val="18"/>
-                                <w:szCs w:val="18"/>
                                 <w:lang w:val="tr-TR"/>
                               </w:rPr>
                               <w:t xml:space="preserve">se which text instance(s) should be </w:t>
@@ -9659,8 +9647,6 @@
                             <w:r>
                               <w:rPr>
                                 <w:rFonts w:ascii="Times New Roman" w:hAnsi="Times New Roman" w:cs="Times New Roman"/>
-                                <w:sz w:val="18"/>
-                                <w:szCs w:val="18"/>
                                 <w:lang w:val="tr-TR"/>
                               </w:rPr>
                               <w:t>presented/</w:t>
@@ -9668,8 +9654,6 @@
                             <w:r>
                               <w:rPr>
                                 <w:rFonts w:ascii="Times New Roman" w:hAnsi="Times New Roman" w:cs="Times New Roman"/>
-                                <w:sz w:val="18"/>
-                                <w:szCs w:val="18"/>
                                 <w:lang w:val="tr-TR"/>
                               </w:rPr>
                               <w:t xml:space="preserve">deferred to the expert </w:t>
@@ -9677,8 +9661,6 @@
                             <w:r>
                               <w:rPr>
                                 <w:rFonts w:ascii="Times New Roman" w:hAnsi="Times New Roman" w:cs="Times New Roman"/>
-                                <w:sz w:val="18"/>
-                                <w:szCs w:val="18"/>
                                 <w:lang w:val="tr-TR"/>
                               </w:rPr>
                               <w:t xml:space="preserve">in order </w:t>
@@ -9686,8 +9668,6 @@
                             <w:r>
                               <w:rPr>
                                 <w:rFonts w:ascii="Times New Roman" w:hAnsi="Times New Roman" w:cs="Times New Roman"/>
-                                <w:sz w:val="18"/>
-                                <w:szCs w:val="18"/>
                                 <w:lang w:val="tr-TR"/>
                               </w:rPr>
                               <w:t xml:space="preserve">to </w:t>
@@ -9695,8 +9675,6 @@
                             <w:r>
                               <w:rPr>
                                 <w:rFonts w:ascii="Times New Roman" w:hAnsi="Times New Roman" w:cs="Times New Roman"/>
-                                <w:sz w:val="18"/>
-                                <w:szCs w:val="18"/>
                                 <w:lang w:val="tr-TR"/>
                               </w:rPr>
                               <w:t xml:space="preserve">efficiently learn the expert’s competence area, the text classification task, and the case where the deferral of knowledge is beneficial, given no access to any expert label during training.  </w:t>
@@ -9704,8 +9682,6 @@
                             <w:r>
                               <w:rPr>
                                 <w:rFonts w:ascii="Times New Roman" w:hAnsi="Times New Roman" w:cs="Times New Roman"/>
-                                <w:sz w:val="18"/>
-                                <w:szCs w:val="18"/>
                                 <w:lang w:val="tr-TR"/>
                               </w:rPr>
                               <w:t xml:space="preserve">In order to achieve this, I have used a sampling strategy named </w:t>
@@ -9713,8 +9689,6 @@
                             <w:r>
                               <w:rPr>
                                 <w:rFonts w:ascii="Times New Roman" w:hAnsi="Times New Roman" w:cs="Times New Roman"/>
-                                <w:sz w:val="18"/>
-                                <w:szCs w:val="18"/>
                               </w:rPr>
                               <w:t>"</w:t>
                             </w:r>
@@ -9723,8 +9697,6 @@
                                 <w:rFonts w:ascii="Times New Roman" w:hAnsi="Times New Roman" w:cs="Times New Roman"/>
                                 <w:b/>
                                 <w:bCs/>
-                                <w:sz w:val="18"/>
-                                <w:szCs w:val="18"/>
                                 <w:lang w:val="tr-TR"/>
                               </w:rPr>
                               <w:t>Uncertainty-Based (Least-Confidence) Sampling</w:t>
@@ -9732,16 +9704,12 @@
                             <w:r>
                               <w:rPr>
                                 <w:rFonts w:ascii="Times New Roman" w:hAnsi="Times New Roman" w:cs="Times New Roman"/>
-                                <w:sz w:val="18"/>
-                                <w:szCs w:val="18"/>
                               </w:rPr>
                               <w:t>"</w:t>
                             </w:r>
                             <w:r>
                               <w:rPr>
                                 <w:rFonts w:ascii="Times New Roman" w:hAnsi="Times New Roman" w:cs="Times New Roman"/>
-                                <w:sz w:val="18"/>
-                                <w:szCs w:val="18"/>
                                 <w:lang w:val="tr-TR"/>
                               </w:rPr>
                               <w:t xml:space="preserve"> in the</w:t>
@@ -9749,8 +9717,6 @@
                             <w:r>
                               <w:rPr>
                                 <w:rFonts w:ascii="Times New Roman" w:hAnsi="Times New Roman" w:cs="Times New Roman"/>
-                                <w:sz w:val="18"/>
-                                <w:szCs w:val="18"/>
                                 <w:lang w:val="tr-TR"/>
                               </w:rPr>
                               <w:t xml:space="preserve"> </w:t>
@@ -9758,8 +9724,6 @@
                             <w:r>
                               <w:rPr>
                                 <w:rFonts w:ascii="Times New Roman" w:hAnsi="Times New Roman" w:cs="Times New Roman"/>
-                                <w:sz w:val="18"/>
-                                <w:szCs w:val="18"/>
                               </w:rPr>
                               <w:t>"</w:t>
                             </w:r>
@@ -9768,8 +9732,6 @@
                                 <w:rFonts w:ascii="Times New Roman" w:hAnsi="Times New Roman" w:cs="Times New Roman"/>
                                 <w:b/>
                                 <w:bCs/>
-                                <w:sz w:val="18"/>
-                                <w:szCs w:val="18"/>
                                 <w:lang w:val="tr-TR"/>
                               </w:rPr>
                               <w:t>get_next_uncertain_sample()</w:t>
@@ -9777,16 +9739,12 @@
                             <w:r>
                               <w:rPr>
                                 <w:rFonts w:ascii="Times New Roman" w:hAnsi="Times New Roman" w:cs="Times New Roman"/>
-                                <w:sz w:val="18"/>
-                                <w:szCs w:val="18"/>
                               </w:rPr>
                               <w:t>"</w:t>
                             </w:r>
                             <w:r>
                               <w:rPr>
                                 <w:rFonts w:ascii="Times New Roman" w:hAnsi="Times New Roman" w:cs="Times New Roman"/>
-                                <w:sz w:val="18"/>
-                                <w:szCs w:val="18"/>
                                 <w:lang w:val="tr-TR"/>
                               </w:rPr>
                               <w:t xml:space="preserve"> function. </w:t>
@@ -9794,8 +9752,6 @@
                             <w:r>
                               <w:rPr>
                                 <w:rFonts w:ascii="Times New Roman" w:hAnsi="Times New Roman" w:cs="Times New Roman"/>
-                                <w:sz w:val="18"/>
-                                <w:szCs w:val="18"/>
                                 <w:lang w:val="tr-TR"/>
                               </w:rPr>
                               <w:t>I have predicted the probability distribution for the unlabeled part of the X training data corresponding to the active learning pool indices. Then, I have selected the maximum value in each row of this probability distribution</w:t>
@@ -9803,8 +9759,6 @@
                             <w:r>
                               <w:rPr>
                                 <w:rFonts w:ascii="Times New Roman" w:hAnsi="Times New Roman" w:cs="Times New Roman"/>
-                                <w:sz w:val="18"/>
-                                <w:szCs w:val="18"/>
                                 <w:lang w:val="tr-TR"/>
                               </w:rPr>
                               <w:t xml:space="preserve"> (using the </w:t>
@@ -9812,8 +9766,6 @@
                             <w:r>
                               <w:rPr>
                                 <w:rFonts w:ascii="Times New Roman" w:hAnsi="Times New Roman" w:cs="Times New Roman"/>
-                                <w:sz w:val="18"/>
-                                <w:szCs w:val="18"/>
                               </w:rPr>
                               <w:t>"</w:t>
                             </w:r>
@@ -9822,107 +9774,68 @@
                                 <w:rFonts w:ascii="Times New Roman" w:hAnsi="Times New Roman" w:cs="Times New Roman"/>
                                 <w:b/>
                                 <w:bCs/>
-                                <w:sz w:val="18"/>
-                                <w:szCs w:val="18"/>
                                 <w:lang w:val="tr-TR"/>
                               </w:rPr>
-                              <w:t>np.</w:t>
+                              <w:t>np.argmax(pool_probs, axis=1)</w:t>
                             </w:r>
                             <w:r>
                               <w:rPr>
                                 <w:rFonts w:ascii="Times New Roman" w:hAnsi="Times New Roman" w:cs="Times New Roman"/>
-                                <w:b/>
-                                <w:bCs/>
-                                <w:sz w:val="18"/>
-                                <w:szCs w:val="18"/>
-                                <w:lang w:val="tr-TR"/>
-                              </w:rPr>
-                              <w:t>argmax(pool_probs, axis=1)</w:t>
+                              </w:rPr>
+                              <w:t xml:space="preserve">" call) </w:t>
                             </w:r>
                             <w:r>
                               <w:rPr>
                                 <w:rFonts w:ascii="Times New Roman" w:hAnsi="Times New Roman" w:cs="Times New Roman"/>
-                                <w:sz w:val="18"/>
-                                <w:szCs w:val="18"/>
+                                <w:lang w:val="tr-TR"/>
+                              </w:rPr>
+                              <w:t xml:space="preserve">and created a maximum pool probabilities array. </w:t>
+                            </w:r>
+                            <w:r>
+                              <w:rPr>
+                                <w:rFonts w:ascii="Times New Roman" w:hAnsi="Times New Roman" w:cs="Times New Roman"/>
+                                <w:lang w:val="tr-TR"/>
+                              </w:rPr>
+                              <w:t xml:space="preserve">At this step, the benefit of deferral needs to be somehow increased. I have achieved this by selecting the global index where the active learning model is the least confident. Here, the least confident index from the pool is obtained by selecting the minimum index value </w:t>
+                            </w:r>
+                            <w:r>
+                              <w:rPr>
+                                <w:rFonts w:ascii="Times New Roman" w:hAnsi="Times New Roman" w:cs="Times New Roman"/>
+                                <w:lang w:val="tr-TR"/>
+                              </w:rPr>
+                              <w:t xml:space="preserve">(using the </w:t>
+                            </w:r>
+                            <w:r>
+                              <w:rPr>
+                                <w:rFonts w:ascii="Times New Roman" w:hAnsi="Times New Roman" w:cs="Times New Roman"/>
                               </w:rPr>
                               <w:t>"</w:t>
                             </w:r>
                             <w:r>
                               <w:rPr>
                                 <w:rFonts w:ascii="Times New Roman" w:hAnsi="Times New Roman" w:cs="Times New Roman"/>
-                                <w:sz w:val="18"/>
-                                <w:szCs w:val="18"/>
+                                <w:b/>
+                                <w:bCs/>
+                                <w:lang w:val="tr-TR"/>
+                              </w:rPr>
+                              <w:t>np.argmin(values)</w:t>
+                            </w:r>
+                            <w:r>
+                              <w:rPr>
+                                <w:rFonts w:ascii="Times New Roman" w:hAnsi="Times New Roman" w:cs="Times New Roman"/>
+                              </w:rPr>
+                              <w:t>"</w:t>
+                            </w:r>
+                            <w:r>
+                              <w:rPr>
+                                <w:rFonts w:ascii="Times New Roman" w:hAnsi="Times New Roman" w:cs="Times New Roman"/>
+                                <w:lang w:val="tr-TR"/>
                               </w:rPr>
                               <w:t xml:space="preserve"> call) </w:t>
                             </w:r>
                             <w:r>
                               <w:rPr>
                                 <w:rFonts w:ascii="Times New Roman" w:hAnsi="Times New Roman" w:cs="Times New Roman"/>
-                                <w:sz w:val="18"/>
-                                <w:szCs w:val="18"/>
-                                <w:lang w:val="tr-TR"/>
-                              </w:rPr>
-                              <w:t xml:space="preserve">and created a maximum pool probabilities array. </w:t>
-                            </w:r>
-                            <w:r>
-                              <w:rPr>
-                                <w:rFonts w:ascii="Times New Roman" w:hAnsi="Times New Roman" w:cs="Times New Roman"/>
-                                <w:sz w:val="18"/>
-                                <w:szCs w:val="18"/>
-                                <w:lang w:val="tr-TR"/>
-                              </w:rPr>
-                              <w:t xml:space="preserve">At this step, the benefit of deferral needs to be somehow increased. I have achieved this by selecting the global index where the active learning model is the least confident. Here, the least confident index from the pool is obtained by selecting the minimum index value </w:t>
-                            </w:r>
-                            <w:r>
-                              <w:rPr>
-                                <w:rFonts w:ascii="Times New Roman" w:hAnsi="Times New Roman" w:cs="Times New Roman"/>
-                                <w:sz w:val="18"/>
-                                <w:szCs w:val="18"/>
-                                <w:lang w:val="tr-TR"/>
-                              </w:rPr>
-                              <w:t xml:space="preserve">(using the </w:t>
-                            </w:r>
-                            <w:r>
-                              <w:rPr>
-                                <w:rFonts w:ascii="Times New Roman" w:hAnsi="Times New Roman" w:cs="Times New Roman"/>
-                                <w:sz w:val="18"/>
-                                <w:szCs w:val="18"/>
-                              </w:rPr>
-                              <w:t>"</w:t>
-                            </w:r>
-                            <w:r>
-                              <w:rPr>
-                                <w:rFonts w:ascii="Times New Roman" w:hAnsi="Times New Roman" w:cs="Times New Roman"/>
-                                <w:b/>
-                                <w:bCs/>
-                                <w:sz w:val="18"/>
-                                <w:szCs w:val="18"/>
-                                <w:lang w:val="tr-TR"/>
-                              </w:rPr>
-                              <w:t>np.argmin(values)</w:t>
-                            </w:r>
-                            <w:r>
-                              <w:rPr>
-                                <w:rFonts w:ascii="Times New Roman" w:hAnsi="Times New Roman" w:cs="Times New Roman"/>
-                                <w:sz w:val="18"/>
-                                <w:szCs w:val="18"/>
-                              </w:rPr>
-                              <w:t>"</w:t>
-                            </w:r>
-                            <w:r>
-                              <w:rPr>
-                                <w:rFonts w:ascii="Times New Roman" w:hAnsi="Times New Roman" w:cs="Times New Roman"/>
-                                <w:sz w:val="18"/>
-                                <w:szCs w:val="18"/>
-                                <w:lang w:val="tr-TR"/>
-                              </w:rPr>
-                              <w:t xml:space="preserve"> call) </w:t>
-                            </w:r>
-                            <w:r>
-                              <w:rPr>
-                                <w:rFonts w:ascii="Times New Roman" w:hAnsi="Times New Roman" w:cs="Times New Roman"/>
-                                <w:sz w:val="18"/>
-                                <w:szCs w:val="18"/>
                                 <w:lang w:val="tr-TR"/>
                               </w:rPr>
                               <w:t xml:space="preserve">from the maximum pool probabilities array created. This </w:t>
@@ -9930,8 +9843,6 @@
                             <w:r>
                               <w:rPr>
                                 <w:rFonts w:ascii="Times New Roman" w:hAnsi="Times New Roman" w:cs="Times New Roman"/>
-                                <w:sz w:val="18"/>
-                                <w:szCs w:val="18"/>
                                 <w:lang w:val="tr-TR"/>
                               </w:rPr>
                               <w:t>suggest</w:t>
@@ -9939,8 +9850,6 @@
                             <w:r>
                               <w:rPr>
                                 <w:rFonts w:ascii="Times New Roman" w:hAnsi="Times New Roman" w:cs="Times New Roman"/>
-                                <w:sz w:val="18"/>
-                                <w:szCs w:val="18"/>
                                 <w:lang w:val="tr-TR"/>
                               </w:rPr>
                               <w:t xml:space="preserve">s that the deferral is more useful </w:t>
@@ -9948,8 +9857,6 @@
                             <w:r>
                               <w:rPr>
                                 <w:rFonts w:ascii="Times New Roman" w:hAnsi="Times New Roman" w:cs="Times New Roman"/>
-                                <w:sz w:val="18"/>
-                                <w:szCs w:val="18"/>
                                 <w:lang w:val="tr-TR"/>
                               </w:rPr>
                               <w:t xml:space="preserve">because of the lower model confidence at that index. </w:t>
@@ -9957,8 +9864,6 @@
                             <w:r>
                               <w:rPr>
                                 <w:rFonts w:ascii="Times New Roman" w:hAnsi="Times New Roman" w:cs="Times New Roman"/>
-                                <w:sz w:val="18"/>
-                                <w:szCs w:val="18"/>
                                 <w:lang w:val="tr-TR"/>
                               </w:rPr>
                               <w:t xml:space="preserve"> </w:t>
@@ -9969,16 +9874,12 @@
                               <w:jc w:val="both"/>
                               <w:rPr>
                                 <w:rFonts w:ascii="Times New Roman" w:hAnsi="Times New Roman" w:cs="Times New Roman"/>
-                                <w:sz w:val="18"/>
-                                <w:szCs w:val="18"/>
                                 <w:lang w:val="tr-TR"/>
                               </w:rPr>
                             </w:pPr>
                             <w:r>
                               <w:rPr>
                                 <w:rFonts w:ascii="Times New Roman" w:hAnsi="Times New Roman" w:cs="Times New Roman"/>
-                                <w:sz w:val="18"/>
-                                <w:szCs w:val="18"/>
                                 <w:lang w:val="tr-TR"/>
                               </w:rPr>
                               <w:tab/>
@@ -9986,8 +9887,6 @@
                             <w:r>
                               <w:rPr>
                                 <w:rFonts w:ascii="Times New Roman" w:hAnsi="Times New Roman" w:cs="Times New Roman"/>
-                                <w:sz w:val="18"/>
-                                <w:szCs w:val="18"/>
                                 <w:lang w:val="tr-TR"/>
                               </w:rPr>
                               <w:t xml:space="preserve">In the </w:t>
@@ -9997,8 +9896,6 @@
                                 <w:rFonts w:ascii="Times New Roman" w:hAnsi="Times New Roman" w:cs="Times New Roman"/>
                                 <w:b/>
                                 <w:bCs/>
-                                <w:sz w:val="18"/>
-                                <w:szCs w:val="18"/>
                                 <w:lang w:val="tr-TR"/>
                               </w:rPr>
                               <w:t xml:space="preserve">“process_query_update” </w:t>
@@ -10006,8 +9903,6 @@
                             <w:r>
                               <w:rPr>
                                 <w:rFonts w:ascii="Times New Roman" w:hAnsi="Times New Roman" w:cs="Times New Roman"/>
-                                <w:sz w:val="18"/>
-                                <w:szCs w:val="18"/>
                                 <w:lang w:val="tr-TR"/>
                               </w:rPr>
                               <w:t>function, I</w:t>
@@ -10015,8 +9910,6 @@
                             <w:r>
                               <w:rPr>
                                 <w:rFonts w:ascii="Times New Roman" w:hAnsi="Times New Roman" w:cs="Times New Roman"/>
-                                <w:sz w:val="18"/>
-                                <w:szCs w:val="18"/>
                                 <w:lang w:val="tr-TR"/>
                               </w:rPr>
                               <w:t xml:space="preserve"> am updating the AL_pool_indices </w:t>
@@ -10026,17 +9919,13 @@
                                 <w:rFonts w:ascii="Times New Roman" w:hAnsi="Times New Roman" w:cs="Times New Roman"/>
                                 <w:b/>
                                 <w:bCs/>
-                                <w:sz w:val="18"/>
-                                <w:szCs w:val="18"/>
                                 <w:lang w:val="tr-TR"/>
                               </w:rPr>
-                              <w:t>(pool indices for active learning),</w:t>
+                              <w:t>(pool indices for active learning)</w:t>
                             </w:r>
                             <w:r>
                               <w:rPr>
                                 <w:rFonts w:ascii="Times New Roman" w:hAnsi="Times New Roman" w:cs="Times New Roman"/>
-                                <w:sz w:val="18"/>
-                                <w:szCs w:val="18"/>
                                 <w:lang w:val="tr-TR"/>
                               </w:rPr>
                               <w:t xml:space="preserve"> and AL_labeled_indices </w:t>
@@ -10046,8 +9935,6 @@
                                 <w:rFonts w:ascii="Times New Roman" w:hAnsi="Times New Roman" w:cs="Times New Roman"/>
                                 <w:b/>
                                 <w:bCs/>
-                                <w:sz w:val="18"/>
-                                <w:szCs w:val="18"/>
                                 <w:lang w:val="tr-TR"/>
                               </w:rPr>
                               <w:t>(labeled indices for active learning)</w:t>
@@ -10055,17 +9942,27 @@
                             <w:r>
                               <w:rPr>
                                 <w:rFonts w:ascii="Times New Roman" w:hAnsi="Times New Roman" w:cs="Times New Roman"/>
-                                <w:sz w:val="18"/>
-                                <w:szCs w:val="18"/>
                                 <w:lang w:val="tr-TR"/>
                               </w:rPr>
-                              <w:t xml:space="preserve"> lists after labeling each text instance. When I label a text sample, I remove its index from the active learning pool indices and uniqely add it to the labeled indices. Then, I retrain the active learning model with the new list of labeled indices for active learning. After that, I am evaluating the retrained model to get the recent </w:t>
+                              <w:t xml:space="preserve"> lists after labeling each text instance. When I label a text sample, I remove its index from the active learning pool indices and uniq</w:t>
                             </w:r>
                             <w:r>
                               <w:rPr>
                                 <w:rFonts w:ascii="Times New Roman" w:hAnsi="Times New Roman" w:cs="Times New Roman"/>
-                                <w:sz w:val="18"/>
-                                <w:szCs w:val="18"/>
+                                <w:lang w:val="tr-TR"/>
+                              </w:rPr>
+                              <w:t>u</w:t>
+                            </w:r>
+                            <w:r>
+                              <w:rPr>
+                                <w:rFonts w:ascii="Times New Roman" w:hAnsi="Times New Roman" w:cs="Times New Roman"/>
+                                <w:lang w:val="tr-TR"/>
+                              </w:rPr>
+                              <w:t xml:space="preserve">ely add it to the labeled indices. Then, I retrain the active learning model with the new list of labeled indices for active learning. After that, I am evaluating the retrained model to get the recent </w:t>
+                            </w:r>
+                            <w:r>
+                              <w:rPr>
+                                <w:rFonts w:ascii="Times New Roman" w:hAnsi="Times New Roman" w:cs="Times New Roman"/>
                                 <w:lang w:val="tr-TR"/>
                               </w:rPr>
                               <w:t xml:space="preserve">accuracy value of the active learning model trained with new query. </w:t>
@@ -10076,28 +9973,36 @@
                               <w:jc w:val="both"/>
                               <w:rPr>
                                 <w:rFonts w:ascii="Times New Roman" w:hAnsi="Times New Roman" w:cs="Times New Roman"/>
-                                <w:sz w:val="18"/>
-                                <w:szCs w:val="18"/>
                                 <w:lang w:val="tr-TR"/>
                               </w:rPr>
                             </w:pPr>
                             <w:r>
                               <w:rPr>
                                 <w:rFonts w:ascii="Times New Roman" w:hAnsi="Times New Roman" w:cs="Times New Roman"/>
-                                <w:sz w:val="18"/>
-                                <w:szCs w:val="18"/>
                                 <w:lang w:val="tr-TR"/>
                               </w:rPr>
                               <w:tab/>
-                              <w:t xml:space="preserve">When we look at the test accuracy growth graph for 30 new queries, </w:t>
+                              <w:t>When we look at the test accuracy growth graph for 30 new queries</w:t>
                             </w:r>
                             <w:r>
                               <w:rPr>
                                 <w:rFonts w:ascii="Times New Roman" w:hAnsi="Times New Roman" w:cs="Times New Roman"/>
+                                <w:lang w:val="tr-TR"/>
+                              </w:rPr>
+                              <w:t>,</w:t>
+                            </w:r>
+                            <w:r>
+                              <w:rPr>
+                                <w:rFonts w:ascii="Times New Roman" w:hAnsi="Times New Roman" w:cs="Times New Roman"/>
+                                <w:lang w:val="tr-TR"/>
+                              </w:rPr>
+                              <w:t xml:space="preserve"> </w:t>
+                            </w:r>
+                            <w:r>
+                              <w:rPr>
+                                <w:rFonts w:ascii="Times New Roman" w:hAnsi="Times New Roman" w:cs="Times New Roman"/>
                                 <w:b/>
                                 <w:bCs/>
-                                <w:sz w:val="18"/>
-                                <w:szCs w:val="18"/>
                                 <w:lang w:val="tr-TR"/>
                               </w:rPr>
                               <w:t>given in Figure 5</w:t>
@@ -10105,17 +10010,20 @@
                             <w:r>
                               <w:rPr>
                                 <w:rFonts w:ascii="Times New Roman" w:hAnsi="Times New Roman" w:cs="Times New Roman"/>
-                                <w:sz w:val="18"/>
-                                <w:szCs w:val="18"/>
                                 <w:lang w:val="tr-TR"/>
                               </w:rPr>
-                              <w:t xml:space="preserve">, we can observe that the overall trend of test accuracy is upward as new queries are provided. However, </w:t>
+                              <w:t>,</w:t>
                             </w:r>
                             <w:r>
                               <w:rPr>
                                 <w:rFonts w:ascii="Times New Roman" w:hAnsi="Times New Roman" w:cs="Times New Roman"/>
-                                <w:sz w:val="18"/>
-                                <w:szCs w:val="18"/>
+                                <w:lang w:val="tr-TR"/>
+                              </w:rPr>
+                              <w:t xml:space="preserve"> we can observe that the overall trend of test accuracy is upward as new queries are provided. However, </w:t>
+                            </w:r>
+                            <w:r>
+                              <w:rPr>
+                                <w:rFonts w:ascii="Times New Roman" w:hAnsi="Times New Roman" w:cs="Times New Roman"/>
                                 <w:lang w:val="tr-TR"/>
                               </w:rPr>
                               <w:t xml:space="preserve">when an active learner queries highly borderline samples, the decision boundary of the active learning classifier model aggressively changes, which often leads to performance stagnation or decreases on the test set before </w:t>
@@ -10123,8 +10031,6 @@
                             <w:r>
                               <w:rPr>
                                 <w:rFonts w:ascii="Times New Roman" w:hAnsi="Times New Roman" w:cs="Times New Roman"/>
-                                <w:sz w:val="18"/>
-                                <w:szCs w:val="18"/>
                                 <w:lang w:val="tr-TR"/>
                               </w:rPr>
                               <w:t>the</w:t>
@@ -10132,8 +10038,6 @@
                             <w:r>
                               <w:rPr>
                                 <w:rFonts w:ascii="Times New Roman" w:hAnsi="Times New Roman" w:cs="Times New Roman"/>
-                                <w:sz w:val="18"/>
-                                <w:szCs w:val="18"/>
                                 <w:lang w:val="tr-TR"/>
                               </w:rPr>
                               <w:t xml:space="preserve"> self-correction and increase in accuracy. </w:t>
@@ -10144,16 +10048,12 @@
                               <w:jc w:val="both"/>
                               <w:rPr>
                                 <w:rFonts w:ascii="Times New Roman" w:hAnsi="Times New Roman" w:cs="Times New Roman"/>
-                                <w:sz w:val="18"/>
-                                <w:szCs w:val="18"/>
                                 <w:lang w:val="tr-TR"/>
                               </w:rPr>
                             </w:pPr>
                             <w:r>
                               <w:rPr>
                                 <w:rFonts w:ascii="Times New Roman" w:hAnsi="Times New Roman" w:cs="Times New Roman"/>
-                                <w:sz w:val="18"/>
-                                <w:szCs w:val="18"/>
                                 <w:lang w:val="tr-TR"/>
                               </w:rPr>
                               <w:tab/>
@@ -10161,8 +10061,6 @@
                             <w:r>
                               <w:rPr>
                                 <w:rFonts w:ascii="Times New Roman" w:hAnsi="Times New Roman" w:cs="Times New Roman"/>
-                                <w:sz w:val="18"/>
-                                <w:szCs w:val="18"/>
                                 <w:lang w:val="tr-TR"/>
                               </w:rPr>
                               <w:t xml:space="preserve">I have kept track of the current test accuracies of the active learner in </w:t>
@@ -10174,8 +10072,6 @@
                                 <w:bCs/>
                                 <w:i/>
                                 <w:iCs/>
-                                <w:sz w:val="18"/>
-                                <w:szCs w:val="18"/>
                                 <w:lang w:val="tr-TR"/>
                               </w:rPr>
                               <w:t>self.accuracy_history</w:t>
@@ -10183,8 +10079,6 @@
                             <w:r>
                               <w:rPr>
                                 <w:rFonts w:ascii="Times New Roman" w:hAnsi="Times New Roman" w:cs="Times New Roman"/>
-                                <w:sz w:val="18"/>
-                                <w:szCs w:val="18"/>
                                 <w:lang w:val="tr-TR"/>
                               </w:rPr>
                               <w:t xml:space="preserve"> and the number of labeled samples in </w:t>
@@ -10196,8 +10090,6 @@
                                 <w:bCs/>
                                 <w:i/>
                                 <w:iCs/>
-                                <w:sz w:val="18"/>
-                                <w:szCs w:val="18"/>
                                 <w:lang w:val="tr-TR"/>
                               </w:rPr>
                               <w:t xml:space="preserve">self.query_history. </w:t>
@@ -10205,8 +10097,6 @@
                             <w:r>
                               <w:rPr>
                                 <w:rFonts w:ascii="Times New Roman" w:hAnsi="Times New Roman" w:cs="Times New Roman"/>
-                                <w:sz w:val="18"/>
-                                <w:szCs w:val="18"/>
                                 <w:lang w:val="tr-TR"/>
                               </w:rPr>
                               <w:t>In addition to the graph plotted, I have used deferral agreement &amp; disagreement rates, current test accuracy of the active learning model, and accuracy gain/loss per user query</w:t>
@@ -10214,8 +10104,6 @@
                             <w:r>
                               <w:rPr>
                                 <w:rFonts w:ascii="Times New Roman" w:hAnsi="Times New Roman" w:cs="Times New Roman"/>
-                                <w:sz w:val="18"/>
-                                <w:szCs w:val="18"/>
                                 <w:lang w:val="tr-TR"/>
                               </w:rPr>
                               <w:t xml:space="preserve"> for evaluating the active learning model. They indicate high initial </w:t>
@@ -10225,8 +10113,6 @@
                                 <w:rFonts w:ascii="Times New Roman" w:hAnsi="Times New Roman" w:cs="Times New Roman"/>
                                 <w:b/>
                                 <w:bCs/>
-                                <w:sz w:val="18"/>
-                                <w:szCs w:val="18"/>
                                 <w:lang w:val="tr-TR"/>
                               </w:rPr>
                               <w:t>(0.8508)</w:t>
@@ -10234,8 +10120,6 @@
                             <w:r>
                               <w:rPr>
                                 <w:rFonts w:ascii="Times New Roman" w:hAnsi="Times New Roman" w:cs="Times New Roman"/>
-                                <w:sz w:val="18"/>
-                                <w:szCs w:val="18"/>
                                 <w:lang w:val="tr-TR"/>
                               </w:rPr>
                               <w:t xml:space="preserve"> &amp; last </w:t>
@@ -10245,8 +10129,6 @@
                                 <w:rFonts w:ascii="Times New Roman" w:hAnsi="Times New Roman" w:cs="Times New Roman"/>
                                 <w:b/>
                                 <w:bCs/>
-                                <w:sz w:val="18"/>
-                                <w:szCs w:val="18"/>
                                 <w:lang w:val="tr-TR"/>
                               </w:rPr>
                               <w:t xml:space="preserve">(0.8530) </w:t>
@@ -10254,8 +10136,6 @@
                             <w:r>
                               <w:rPr>
                                 <w:rFonts w:ascii="Times New Roman" w:hAnsi="Times New Roman" w:cs="Times New Roman"/>
-                                <w:sz w:val="18"/>
-                                <w:szCs w:val="18"/>
                                 <w:lang w:val="tr-TR"/>
                               </w:rPr>
                               <w:t xml:space="preserve">test accuracies, which means active learning performs well on the unseen test data. In order to calculate the disagreement rate between the active learning model and the simulated expert, I have first calculated the part where </w:t>
@@ -10265,8 +10145,6 @@
                                 <w:rFonts w:ascii="Times New Roman" w:hAnsi="Times New Roman" w:cs="Times New Roman"/>
                                 <w:b/>
                                 <w:bCs/>
-                                <w:sz w:val="18"/>
-                                <w:szCs w:val="18"/>
                                 <w:lang w:val="tr-TR"/>
                               </w:rPr>
                               <w:t>the active learning model</w:t>
@@ -10274,8 +10152,6 @@
                             <w:r>
                               <w:rPr>
                                 <w:rFonts w:ascii="Times New Roman" w:hAnsi="Times New Roman" w:cs="Times New Roman"/>
-                                <w:sz w:val="18"/>
-                                <w:szCs w:val="18"/>
                                 <w:lang w:val="tr-TR"/>
                               </w:rPr>
                               <w:t xml:space="preserve"> </w:t>
@@ -10285,8 +10161,6 @@
                                 <w:rFonts w:ascii="Times New Roman" w:hAnsi="Times New Roman" w:cs="Times New Roman"/>
                                 <w:b/>
                                 <w:bCs/>
-                                <w:sz w:val="18"/>
-                                <w:szCs w:val="18"/>
                                 <w:lang w:val="tr-TR"/>
                               </w:rPr>
                               <w:t>predictions on the unseen ‘y_test’ data</w:t>
@@ -10294,8 +10168,6 @@
                             <w:r>
                               <w:rPr>
                                 <w:rFonts w:ascii="Times New Roman" w:hAnsi="Times New Roman" w:cs="Times New Roman"/>
-                                <w:sz w:val="18"/>
-                                <w:szCs w:val="18"/>
                                 <w:lang w:val="tr-TR"/>
                               </w:rPr>
                               <w:t xml:space="preserve"> </w:t>
@@ -10305,8 +10177,6 @@
                                 <w:rFonts w:ascii="Times New Roman" w:hAnsi="Times New Roman" w:cs="Times New Roman"/>
                                 <w:i/>
                                 <w:iCs/>
-                                <w:sz w:val="18"/>
-                                <w:szCs w:val="18"/>
                                 <w:lang w:val="tr-TR"/>
                               </w:rPr>
                               <w:t>do not match</w:t>
@@ -10314,8 +10184,6 @@
                             <w:r>
                               <w:rPr>
                                 <w:rFonts w:ascii="Times New Roman" w:hAnsi="Times New Roman" w:cs="Times New Roman"/>
-                                <w:sz w:val="18"/>
-                                <w:szCs w:val="18"/>
                                 <w:lang w:val="tr-TR"/>
                               </w:rPr>
                               <w:t xml:space="preserve"> </w:t>
@@ -10325,8 +10193,6 @@
                                 <w:rFonts w:ascii="Times New Roman" w:hAnsi="Times New Roman" w:cs="Times New Roman"/>
                                 <w:b/>
                                 <w:bCs/>
-                                <w:sz w:val="18"/>
-                                <w:szCs w:val="18"/>
                                 <w:lang w:val="tr-TR"/>
                               </w:rPr>
                               <w:t xml:space="preserve">the ground truth ‘y_test’ data. </w:t>
@@ -10334,8 +10200,6 @@
                             <w:r>
                               <w:rPr>
                                 <w:rFonts w:ascii="Times New Roman" w:hAnsi="Times New Roman" w:cs="Times New Roman"/>
-                                <w:sz w:val="18"/>
-                                <w:szCs w:val="18"/>
                                 <w:lang w:val="tr-TR"/>
                               </w:rPr>
                               <w:t xml:space="preserve">Then, I have calculated the part where </w:t>
@@ -10345,8 +10209,6 @@
                                 <w:rFonts w:ascii="Times New Roman" w:hAnsi="Times New Roman" w:cs="Times New Roman"/>
                                 <w:b/>
                                 <w:bCs/>
-                                <w:sz w:val="18"/>
-                                <w:szCs w:val="18"/>
                                 <w:lang w:val="tr-TR"/>
                               </w:rPr>
                               <w:t>the simulated expert</w:t>
@@ -10354,8 +10216,6 @@
                             <w:r>
                               <w:rPr>
                                 <w:rFonts w:ascii="Times New Roman" w:hAnsi="Times New Roman" w:cs="Times New Roman"/>
-                                <w:sz w:val="18"/>
-                                <w:szCs w:val="18"/>
                                 <w:lang w:val="tr-TR"/>
                               </w:rPr>
                               <w:t xml:space="preserve"> </w:t>
@@ -10365,8 +10225,6 @@
                                 <w:rFonts w:ascii="Times New Roman" w:hAnsi="Times New Roman" w:cs="Times New Roman"/>
                                 <w:b/>
                                 <w:bCs/>
-                                <w:sz w:val="18"/>
-                                <w:szCs w:val="18"/>
                                 <w:lang w:val="tr-TR"/>
                               </w:rPr>
                               <w:t xml:space="preserve">predictions on the unseen ‘y_test’ data </w:t>
@@ -10376,8 +10234,6 @@
                                 <w:rFonts w:ascii="Times New Roman" w:hAnsi="Times New Roman" w:cs="Times New Roman"/>
                                 <w:i/>
                                 <w:iCs/>
-                                <w:sz w:val="18"/>
-                                <w:szCs w:val="18"/>
                                 <w:lang w:val="tr-TR"/>
                               </w:rPr>
                               <w:t>do match</w:t>
@@ -10385,8 +10241,6 @@
                             <w:r>
                               <w:rPr>
                                 <w:rFonts w:ascii="Times New Roman" w:hAnsi="Times New Roman" w:cs="Times New Roman"/>
-                                <w:sz w:val="18"/>
-                                <w:szCs w:val="18"/>
                                 <w:lang w:val="tr-TR"/>
                               </w:rPr>
                               <w:t xml:space="preserve"> </w:t>
@@ -10396,8 +10250,6 @@
                                 <w:rFonts w:ascii="Times New Roman" w:hAnsi="Times New Roman" w:cs="Times New Roman"/>
                                 <w:b/>
                                 <w:bCs/>
-                                <w:sz w:val="18"/>
-                                <w:szCs w:val="18"/>
                                 <w:lang w:val="tr-TR"/>
                               </w:rPr>
                               <w:t xml:space="preserve">the ground truth ‘y_test’ data. </w:t>
@@ -10405,8 +10257,6 @@
                             <w:r>
                               <w:rPr>
                                 <w:rFonts w:ascii="Times New Roman" w:hAnsi="Times New Roman" w:cs="Times New Roman"/>
-                                <w:sz w:val="18"/>
-                                <w:szCs w:val="18"/>
                                 <w:lang w:val="tr-TR"/>
                               </w:rPr>
                               <w:t xml:space="preserve">After that, I get the </w:t>
@@ -10416,8 +10266,6 @@
                                 <w:rFonts w:ascii="Times New Roman" w:hAnsi="Times New Roman" w:cs="Times New Roman"/>
                                 <w:b/>
                                 <w:bCs/>
-                                <w:sz w:val="18"/>
-                                <w:szCs w:val="18"/>
                                 <w:lang w:val="tr-TR"/>
                               </w:rPr>
                               <w:t>“AND”</w:t>
@@ -10425,8 +10273,6 @@
                             <w:r>
                               <w:rPr>
                                 <w:rFonts w:ascii="Times New Roman" w:hAnsi="Times New Roman" w:cs="Times New Roman"/>
-                                <w:sz w:val="18"/>
-                                <w:szCs w:val="18"/>
                                 <w:lang w:val="tr-TR"/>
                               </w:rPr>
                               <w:t xml:space="preserve"> mask of these parts. Finally, I have applied </w:t>
@@ -10436,8 +10282,6 @@
                                 <w:rFonts w:ascii="Times New Roman" w:hAnsi="Times New Roman" w:cs="Times New Roman"/>
                                 <w:i/>
                                 <w:iCs/>
-                                <w:sz w:val="18"/>
-                                <w:szCs w:val="18"/>
                                 <w:lang w:val="tr-TR"/>
                               </w:rPr>
                               <w:t>np.mean()</w:t>
@@ -10445,8 +10289,6 @@
                             <w:r>
                               <w:rPr>
                                 <w:rFonts w:ascii="Times New Roman" w:hAnsi="Times New Roman" w:cs="Times New Roman"/>
-                                <w:sz w:val="18"/>
-                                <w:szCs w:val="18"/>
                                 <w:lang w:val="tr-TR"/>
                               </w:rPr>
                               <w:t xml:space="preserve"> on the created mask, which treats the true boolean value as 1 and the false boolean value as 0. The </w:t>
@@ -10456,8 +10298,6 @@
                                 <w:rFonts w:ascii="Times New Roman" w:hAnsi="Times New Roman" w:cs="Times New Roman"/>
                                 <w:i/>
                                 <w:iCs/>
-                                <w:sz w:val="18"/>
-                                <w:szCs w:val="18"/>
                                 <w:lang w:val="tr-TR"/>
                               </w:rPr>
                               <w:t>np.mean()</w:t>
@@ -10465,8 +10305,6 @@
                             <w:r>
                               <w:rPr>
                                 <w:rFonts w:ascii="Times New Roman" w:hAnsi="Times New Roman" w:cs="Times New Roman"/>
-                                <w:sz w:val="18"/>
-                                <w:szCs w:val="18"/>
                                 <w:lang w:val="tr-TR"/>
                               </w:rPr>
                               <w:t xml:space="preserve"> call will then give the deferral disagreement rate, which indicates how often the active learning model </w:t>
@@ -10474,8 +10312,6 @@
                             <w:r>
                               <w:rPr>
                                 <w:rFonts w:ascii="Times New Roman" w:hAnsi="Times New Roman" w:cs="Times New Roman"/>
-                                <w:sz w:val="18"/>
-                                <w:szCs w:val="18"/>
                                 <w:lang w:val="tr-TR"/>
                               </w:rPr>
                               <w:t xml:space="preserve">is wrong while the simulated expert is right. </w:t>
@@ -10483,8 +10319,6 @@
                             <w:r>
                               <w:rPr>
                                 <w:rFonts w:ascii="Times New Roman" w:hAnsi="Times New Roman" w:cs="Times New Roman"/>
-                                <w:sz w:val="18"/>
-                                <w:szCs w:val="18"/>
                                 <w:lang w:val="tr-TR"/>
                               </w:rPr>
                               <w:t xml:space="preserve">  </w:t>
@@ -10542,7 +10376,7 @@
           </mc:Choice>
           <mc:Fallback>
             <w:pict>
-              <v:shape w14:anchorId="606229A5" id="Metin Kutusu 20" o:spid="_x0000_s1037" type="#_x0000_t202" style="position:absolute;margin-left:17.45pt;margin-top:-47.65pt;width:435.95pt;height:401.55pt;z-index:251707392;visibility:visible;mso-wrap-style:square;mso-width-percent:0;mso-height-percent:0;mso-wrap-distance-left:9pt;mso-wrap-distance-top:0;mso-wrap-distance-right:9pt;mso-wrap-distance-bottom:0;mso-position-horizontal:absolute;mso-position-horizontal-relative:text;mso-position-vertical:absolute;mso-position-vertical-relative:text;mso-width-percent:0;mso-height-percent:0;mso-width-relative:margin;mso-height-relative:margin;v-text-anchor:top" o:gfxdata="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" fillcolor="white [3201]" strokeweight=".5pt">
+              <v:shape w14:anchorId="606229A5" id="Metin Kutusu 20" o:spid="_x0000_s1037" type="#_x0000_t202" style="position:absolute;margin-left:17.7pt;margin-top:-47.35pt;width:435.95pt;height:746.55pt;z-index:251707392;visibility:visible;mso-wrap-style:square;mso-width-percent:0;mso-height-percent:0;mso-wrap-distance-left:9pt;mso-wrap-distance-top:0;mso-wrap-distance-right:9pt;mso-wrap-distance-bottom:0;mso-position-horizontal:absolute;mso-position-horizontal-relative:text;mso-position-vertical:absolute;mso-position-vertical-relative:text;mso-width-percent:0;mso-height-percent:0;mso-width-relative:margin;mso-height-relative:margin;v-text-anchor:top" o:gfxdata="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" fillcolor="white [3201]" strokeweight=".5pt">
                 <v:textbox>
                   <w:txbxContent>
                     <w:p>
@@ -10550,25 +10384,21 @@
                         <w:jc w:val="both"/>
                         <w:rPr>
                           <w:rFonts w:ascii="Times New Roman" w:hAnsi="Times New Roman" w:cs="Times New Roman"/>
+                          <w:lang w:val="tr-TR"/>
+                        </w:rPr>
+                      </w:pPr>
+                      <w:r>
+                        <w:rPr>
+                          <w:rFonts w:ascii="Times New Roman" w:hAnsi="Times New Roman" w:cs="Times New Roman"/>
                           <w:sz w:val="18"/>
                           <w:szCs w:val="18"/>
                           <w:lang w:val="tr-TR"/>
                         </w:rPr>
-                      </w:pPr>
-                      <w:r>
-                        <w:rPr>
-                          <w:rFonts w:ascii="Times New Roman" w:hAnsi="Times New Roman" w:cs="Times New Roman"/>
-                          <w:sz w:val="18"/>
-                          <w:szCs w:val="18"/>
-                          <w:lang w:val="tr-TR"/>
-                        </w:rPr>
                         <w:tab/>
                       </w:r>
                       <w:r>
                         <w:rPr>
                           <w:rFonts w:ascii="Times New Roman" w:hAnsi="Times New Roman" w:cs="Times New Roman"/>
-                          <w:sz w:val="18"/>
-                          <w:szCs w:val="18"/>
                           <w:lang w:val="tr-TR"/>
                         </w:rPr>
                         <w:t>In the active learning process, it is aimed</w:t>
@@ -10576,8 +10406,6 @@
                       <w:r>
                         <w:rPr>
                           <w:rFonts w:ascii="Times New Roman" w:hAnsi="Times New Roman" w:cs="Times New Roman"/>
-                          <w:sz w:val="18"/>
-                          <w:szCs w:val="18"/>
                           <w:lang w:val="tr-TR"/>
                         </w:rPr>
                         <w:t xml:space="preserve"> to </w:t>
@@ -10585,8 +10413,6 @@
                       <w:r>
                         <w:rPr>
                           <w:rFonts w:ascii="Times New Roman" w:hAnsi="Times New Roman" w:cs="Times New Roman"/>
-                          <w:sz w:val="18"/>
-                          <w:szCs w:val="18"/>
                           <w:lang w:val="tr-TR"/>
                         </w:rPr>
                         <w:t>actively ch</w:t>
@@ -10594,8 +10420,6 @@
                       <w:r>
                         <w:rPr>
                           <w:rFonts w:ascii="Times New Roman" w:hAnsi="Times New Roman" w:cs="Times New Roman"/>
-                          <w:sz w:val="18"/>
-                          <w:szCs w:val="18"/>
                           <w:lang w:val="tr-TR"/>
                         </w:rPr>
                         <w:t>oo</w:t>
@@ -10603,8 +10427,6 @@
                       <w:r>
                         <w:rPr>
                           <w:rFonts w:ascii="Times New Roman" w:hAnsi="Times New Roman" w:cs="Times New Roman"/>
-                          <w:sz w:val="18"/>
-                          <w:szCs w:val="18"/>
                           <w:lang w:val="tr-TR"/>
                         </w:rPr>
                         <w:t xml:space="preserve">se which text instance(s) should be </w:t>
@@ -10612,8 +10434,6 @@
                       <w:r>
                         <w:rPr>
                           <w:rFonts w:ascii="Times New Roman" w:hAnsi="Times New Roman" w:cs="Times New Roman"/>
-                          <w:sz w:val="18"/>
-                          <w:szCs w:val="18"/>
                           <w:lang w:val="tr-TR"/>
                         </w:rPr>
                         <w:t>presented/</w:t>
@@ -10621,8 +10441,6 @@
                       <w:r>
                         <w:rPr>
                           <w:rFonts w:ascii="Times New Roman" w:hAnsi="Times New Roman" w:cs="Times New Roman"/>
-                          <w:sz w:val="18"/>
-                          <w:szCs w:val="18"/>
                           <w:lang w:val="tr-TR"/>
                         </w:rPr>
                         <w:t xml:space="preserve">deferred to the expert </w:t>
@@ -10630,8 +10448,6 @@
                       <w:r>
                         <w:rPr>
                           <w:rFonts w:ascii="Times New Roman" w:hAnsi="Times New Roman" w:cs="Times New Roman"/>
-                          <w:sz w:val="18"/>
-                          <w:szCs w:val="18"/>
                           <w:lang w:val="tr-TR"/>
                         </w:rPr>
                         <w:t xml:space="preserve">in order </w:t>
@@ -10639,8 +10455,6 @@
                       <w:r>
                         <w:rPr>
                           <w:rFonts w:ascii="Times New Roman" w:hAnsi="Times New Roman" w:cs="Times New Roman"/>
-                          <w:sz w:val="18"/>
-                          <w:szCs w:val="18"/>
                           <w:lang w:val="tr-TR"/>
                         </w:rPr>
                         <w:t xml:space="preserve">to </w:t>
@@ -10648,8 +10462,6 @@
                       <w:r>
                         <w:rPr>
                           <w:rFonts w:ascii="Times New Roman" w:hAnsi="Times New Roman" w:cs="Times New Roman"/>
-                          <w:sz w:val="18"/>
-                          <w:szCs w:val="18"/>
                           <w:lang w:val="tr-TR"/>
                         </w:rPr>
                         <w:t xml:space="preserve">efficiently learn the expert’s competence area, the text classification task, and the case where the deferral of knowledge is beneficial, given no access to any expert label during training.  </w:t>
@@ -10657,8 +10469,6 @@
                       <w:r>
                         <w:rPr>
                           <w:rFonts w:ascii="Times New Roman" w:hAnsi="Times New Roman" w:cs="Times New Roman"/>
-                          <w:sz w:val="18"/>
-                          <w:szCs w:val="18"/>
                           <w:lang w:val="tr-TR"/>
                         </w:rPr>
                         <w:t xml:space="preserve">In order to achieve this, I have used a sampling strategy named </w:t>
@@ -10666,8 +10476,6 @@
                       <w:r>
                         <w:rPr>
                           <w:rFonts w:ascii="Times New Roman" w:hAnsi="Times New Roman" w:cs="Times New Roman"/>
-                          <w:sz w:val="18"/>
-                          <w:szCs w:val="18"/>
                         </w:rPr>
                         <w:t>"</w:t>
                       </w:r>
@@ -10676,8 +10484,6 @@
                           <w:rFonts w:ascii="Times New Roman" w:hAnsi="Times New Roman" w:cs="Times New Roman"/>
                           <w:b/>
                           <w:bCs/>
-                          <w:sz w:val="18"/>
-                          <w:szCs w:val="18"/>
                           <w:lang w:val="tr-TR"/>
                         </w:rPr>
                         <w:t>Uncertainty-Based (Least-Confidence) Sampling</w:t>
@@ -10685,16 +10491,12 @@
                       <w:r>
                         <w:rPr>
                           <w:rFonts w:ascii="Times New Roman" w:hAnsi="Times New Roman" w:cs="Times New Roman"/>
-                          <w:sz w:val="18"/>
-                          <w:szCs w:val="18"/>
                         </w:rPr>
                         <w:t>"</w:t>
                       </w:r>
                       <w:r>
                         <w:rPr>
                           <w:rFonts w:ascii="Times New Roman" w:hAnsi="Times New Roman" w:cs="Times New Roman"/>
-                          <w:sz w:val="18"/>
-                          <w:szCs w:val="18"/>
                           <w:lang w:val="tr-TR"/>
                         </w:rPr>
                         <w:t xml:space="preserve"> in the</w:t>
@@ -10702,8 +10504,6 @@
                       <w:r>
                         <w:rPr>
                           <w:rFonts w:ascii="Times New Roman" w:hAnsi="Times New Roman" w:cs="Times New Roman"/>
-                          <w:sz w:val="18"/>
-                          <w:szCs w:val="18"/>
                           <w:lang w:val="tr-TR"/>
                         </w:rPr>
                         <w:t xml:space="preserve"> </w:t>
@@ -10711,8 +10511,6 @@
                       <w:r>
                         <w:rPr>
                           <w:rFonts w:ascii="Times New Roman" w:hAnsi="Times New Roman" w:cs="Times New Roman"/>
-                          <w:sz w:val="18"/>
-                          <w:szCs w:val="18"/>
                         </w:rPr>
                         <w:t>"</w:t>
                       </w:r>
@@ -10721,8 +10519,6 @@
                           <w:rFonts w:ascii="Times New Roman" w:hAnsi="Times New Roman" w:cs="Times New Roman"/>
                           <w:b/>
                           <w:bCs/>
-                          <w:sz w:val="18"/>
-                          <w:szCs w:val="18"/>
                           <w:lang w:val="tr-TR"/>
                         </w:rPr>
                         <w:t>get_next_uncertain_sample()</w:t>
@@ -10730,16 +10526,12 @@
                       <w:r>
                         <w:rPr>
                           <w:rFonts w:ascii="Times New Roman" w:hAnsi="Times New Roman" w:cs="Times New Roman"/>
-                          <w:sz w:val="18"/>
-                          <w:szCs w:val="18"/>
                         </w:rPr>
                         <w:t>"</w:t>
                       </w:r>
                       <w:r>
                         <w:rPr>
                           <w:rFonts w:ascii="Times New Roman" w:hAnsi="Times New Roman" w:cs="Times New Roman"/>
-                          <w:sz w:val="18"/>
-                          <w:szCs w:val="18"/>
                           <w:lang w:val="tr-TR"/>
                         </w:rPr>
                         <w:t xml:space="preserve"> function. </w:t>
@@ -10747,8 +10539,6 @@
                       <w:r>
                         <w:rPr>
                           <w:rFonts w:ascii="Times New Roman" w:hAnsi="Times New Roman" w:cs="Times New Roman"/>
-                          <w:sz w:val="18"/>
-                          <w:szCs w:val="18"/>
                           <w:lang w:val="tr-TR"/>
                         </w:rPr>
                         <w:t>I have predicted the probability distribution for the unlabeled part of the X training data corresponding to the active learning pool indices. Then, I have selected the maximum value in each row of this probability distribution</w:t>
@@ -10756,8 +10546,6 @@
                       <w:r>
                         <w:rPr>
                           <w:rFonts w:ascii="Times New Roman" w:hAnsi="Times New Roman" w:cs="Times New Roman"/>
-                          <w:sz w:val="18"/>
-                          <w:szCs w:val="18"/>
                           <w:lang w:val="tr-TR"/>
                         </w:rPr>
                         <w:t xml:space="preserve"> (using the </w:t>
@@ -10765,8 +10553,6 @@
                       <w:r>
                         <w:rPr>
                           <w:rFonts w:ascii="Times New Roman" w:hAnsi="Times New Roman" w:cs="Times New Roman"/>
-                          <w:sz w:val="18"/>
-                          <w:szCs w:val="18"/>
                         </w:rPr>
                         <w:t>"</w:t>
                       </w:r>
@@ -10775,107 +10561,68 @@
                           <w:rFonts w:ascii="Times New Roman" w:hAnsi="Times New Roman" w:cs="Times New Roman"/>
                           <w:b/>
                           <w:bCs/>
-                          <w:sz w:val="18"/>
-                          <w:szCs w:val="18"/>
                           <w:lang w:val="tr-TR"/>
                         </w:rPr>
-                        <w:t>np.</w:t>
+                        <w:t>np.argmax(pool_probs, axis=1)</w:t>
                       </w:r>
                       <w:r>
                         <w:rPr>
                           <w:rFonts w:ascii="Times New Roman" w:hAnsi="Times New Roman" w:cs="Times New Roman"/>
-                          <w:b/>
-                          <w:bCs/>
-                          <w:sz w:val="18"/>
-                          <w:szCs w:val="18"/>
-                          <w:lang w:val="tr-TR"/>
-                        </w:rPr>
-                        <w:t>argmax(pool_probs, axis=1)</w:t>
+                        </w:rPr>
+                        <w:t xml:space="preserve">" call) </w:t>
                       </w:r>
                       <w:r>
                         <w:rPr>
                           <w:rFonts w:ascii="Times New Roman" w:hAnsi="Times New Roman" w:cs="Times New Roman"/>
-                          <w:sz w:val="18"/>
-                          <w:szCs w:val="18"/>
+                          <w:lang w:val="tr-TR"/>
+                        </w:rPr>
+                        <w:t xml:space="preserve">and created a maximum pool probabilities array. </w:t>
+                      </w:r>
+                      <w:r>
+                        <w:rPr>
+                          <w:rFonts w:ascii="Times New Roman" w:hAnsi="Times New Roman" w:cs="Times New Roman"/>
+                          <w:lang w:val="tr-TR"/>
+                        </w:rPr>
+                        <w:t xml:space="preserve">At this step, the benefit of deferral needs to be somehow increased. I have achieved this by selecting the global index where the active learning model is the least confident. Here, the least confident index from the pool is obtained by selecting the minimum index value </w:t>
+                      </w:r>
+                      <w:r>
+                        <w:rPr>
+                          <w:rFonts w:ascii="Times New Roman" w:hAnsi="Times New Roman" w:cs="Times New Roman"/>
+                          <w:lang w:val="tr-TR"/>
+                        </w:rPr>
+                        <w:t xml:space="preserve">(using the </w:t>
+                      </w:r>
+                      <w:r>
+                        <w:rPr>
+                          <w:rFonts w:ascii="Times New Roman" w:hAnsi="Times New Roman" w:cs="Times New Roman"/>
                         </w:rPr>
                         <w:t>"</w:t>
                       </w:r>
                       <w:r>
                         <w:rPr>
                           <w:rFonts w:ascii="Times New Roman" w:hAnsi="Times New Roman" w:cs="Times New Roman"/>
-                          <w:sz w:val="18"/>
-                          <w:szCs w:val="18"/>
+                          <w:b/>
+                          <w:bCs/>
+                          <w:lang w:val="tr-TR"/>
+                        </w:rPr>
+                        <w:t>np.argmin(values)</w:t>
+                      </w:r>
+                      <w:r>
+                        <w:rPr>
+                          <w:rFonts w:ascii="Times New Roman" w:hAnsi="Times New Roman" w:cs="Times New Roman"/>
+                        </w:rPr>
+                        <w:t>"</w:t>
+                      </w:r>
+                      <w:r>
+                        <w:rPr>
+                          <w:rFonts w:ascii="Times New Roman" w:hAnsi="Times New Roman" w:cs="Times New Roman"/>
+                          <w:lang w:val="tr-TR"/>
                         </w:rPr>
                         <w:t xml:space="preserve"> call) </w:t>
                       </w:r>
                       <w:r>
                         <w:rPr>
                           <w:rFonts w:ascii="Times New Roman" w:hAnsi="Times New Roman" w:cs="Times New Roman"/>
-                          <w:sz w:val="18"/>
-                          <w:szCs w:val="18"/>
-                          <w:lang w:val="tr-TR"/>
-                        </w:rPr>
-                        <w:t xml:space="preserve">and created a maximum pool probabilities array. </w:t>
-                      </w:r>
-                      <w:r>
-                        <w:rPr>
-                          <w:rFonts w:ascii="Times New Roman" w:hAnsi="Times New Roman" w:cs="Times New Roman"/>
-                          <w:sz w:val="18"/>
-                          <w:szCs w:val="18"/>
-                          <w:lang w:val="tr-TR"/>
-                        </w:rPr>
-                        <w:t xml:space="preserve">At this step, the benefit of deferral needs to be somehow increased. I have achieved this by selecting the global index where the active learning model is the least confident. Here, the least confident index from the pool is obtained by selecting the minimum index value </w:t>
-                      </w:r>
-                      <w:r>
-                        <w:rPr>
-                          <w:rFonts w:ascii="Times New Roman" w:hAnsi="Times New Roman" w:cs="Times New Roman"/>
-                          <w:sz w:val="18"/>
-                          <w:szCs w:val="18"/>
-                          <w:lang w:val="tr-TR"/>
-                        </w:rPr>
-                        <w:t xml:space="preserve">(using the </w:t>
-                      </w:r>
-                      <w:r>
-                        <w:rPr>
-                          <w:rFonts w:ascii="Times New Roman" w:hAnsi="Times New Roman" w:cs="Times New Roman"/>
-                          <w:sz w:val="18"/>
-                          <w:szCs w:val="18"/>
-                        </w:rPr>
-                        <w:t>"</w:t>
-                      </w:r>
-                      <w:r>
-                        <w:rPr>
-                          <w:rFonts w:ascii="Times New Roman" w:hAnsi="Times New Roman" w:cs="Times New Roman"/>
-                          <w:b/>
-                          <w:bCs/>
-                          <w:sz w:val="18"/>
-                          <w:szCs w:val="18"/>
-                          <w:lang w:val="tr-TR"/>
-                        </w:rPr>
-                        <w:t>np.argmin(values)</w:t>
-                      </w:r>
-                      <w:r>
-                        <w:rPr>
-                          <w:rFonts w:ascii="Times New Roman" w:hAnsi="Times New Roman" w:cs="Times New Roman"/>
-                          <w:sz w:val="18"/>
-                          <w:szCs w:val="18"/>
-                        </w:rPr>
-                        <w:t>"</w:t>
-                      </w:r>
-                      <w:r>
-                        <w:rPr>
-                          <w:rFonts w:ascii="Times New Roman" w:hAnsi="Times New Roman" w:cs="Times New Roman"/>
-                          <w:sz w:val="18"/>
-                          <w:szCs w:val="18"/>
-                          <w:lang w:val="tr-TR"/>
-                        </w:rPr>
-                        <w:t xml:space="preserve"> call) </w:t>
-                      </w:r>
-                      <w:r>
-                        <w:rPr>
-                          <w:rFonts w:ascii="Times New Roman" w:hAnsi="Times New Roman" w:cs="Times New Roman"/>
-                          <w:sz w:val="18"/>
-                          <w:szCs w:val="18"/>
                           <w:lang w:val="tr-TR"/>
                         </w:rPr>
                         <w:t xml:space="preserve">from the maximum pool probabilities array created. This </w:t>
@@ -10883,8 +10630,6 @@
                       <w:r>
                         <w:rPr>
                           <w:rFonts w:ascii="Times New Roman" w:hAnsi="Times New Roman" w:cs="Times New Roman"/>
-                          <w:sz w:val="18"/>
-                          <w:szCs w:val="18"/>
                           <w:lang w:val="tr-TR"/>
                         </w:rPr>
                         <w:t>suggest</w:t>
@@ -10892,8 +10637,6 @@
                       <w:r>
                         <w:rPr>
                           <w:rFonts w:ascii="Times New Roman" w:hAnsi="Times New Roman" w:cs="Times New Roman"/>
-                          <w:sz w:val="18"/>
-                          <w:szCs w:val="18"/>
                           <w:lang w:val="tr-TR"/>
                         </w:rPr>
                         <w:t xml:space="preserve">s that the deferral is more useful </w:t>
@@ -10901,8 +10644,6 @@
                       <w:r>
                         <w:rPr>
                           <w:rFonts w:ascii="Times New Roman" w:hAnsi="Times New Roman" w:cs="Times New Roman"/>
-                          <w:sz w:val="18"/>
-                          <w:szCs w:val="18"/>
                           <w:lang w:val="tr-TR"/>
                         </w:rPr>
                         <w:t xml:space="preserve">because of the lower model confidence at that index. </w:t>
@@ -10910,8 +10651,6 @@
                       <w:r>
                         <w:rPr>
                           <w:rFonts w:ascii="Times New Roman" w:hAnsi="Times New Roman" w:cs="Times New Roman"/>
-                          <w:sz w:val="18"/>
-                          <w:szCs w:val="18"/>
                           <w:lang w:val="tr-TR"/>
                         </w:rPr>
                         <w:t xml:space="preserve"> </w:t>
@@ -10922,16 +10661,12 @@
                         <w:jc w:val="both"/>
                         <w:rPr>
                           <w:rFonts w:ascii="Times New Roman" w:hAnsi="Times New Roman" w:cs="Times New Roman"/>
-                          <w:sz w:val="18"/>
-                          <w:szCs w:val="18"/>
                           <w:lang w:val="tr-TR"/>
                         </w:rPr>
                       </w:pPr>
                       <w:r>
                         <w:rPr>
                           <w:rFonts w:ascii="Times New Roman" w:hAnsi="Times New Roman" w:cs="Times New Roman"/>
-                          <w:sz w:val="18"/>
-                          <w:szCs w:val="18"/>
                           <w:lang w:val="tr-TR"/>
                         </w:rPr>
                         <w:tab/>
@@ -10939,8 +10674,6 @@
                       <w:r>
                         <w:rPr>
                           <w:rFonts w:ascii="Times New Roman" w:hAnsi="Times New Roman" w:cs="Times New Roman"/>
-                          <w:sz w:val="18"/>
-                          <w:szCs w:val="18"/>
                           <w:lang w:val="tr-TR"/>
                         </w:rPr>
                         <w:t xml:space="preserve">In the </w:t>
@@ -10950,8 +10683,6 @@
                           <w:rFonts w:ascii="Times New Roman" w:hAnsi="Times New Roman" w:cs="Times New Roman"/>
                           <w:b/>
                           <w:bCs/>
-                          <w:sz w:val="18"/>
-                          <w:szCs w:val="18"/>
                           <w:lang w:val="tr-TR"/>
                         </w:rPr>
                         <w:t xml:space="preserve">“process_query_update” </w:t>
@@ -10959,8 +10690,6 @@
                       <w:r>
                         <w:rPr>
                           <w:rFonts w:ascii="Times New Roman" w:hAnsi="Times New Roman" w:cs="Times New Roman"/>
-                          <w:sz w:val="18"/>
-                          <w:szCs w:val="18"/>
                           <w:lang w:val="tr-TR"/>
                         </w:rPr>
                         <w:t>function, I</w:t>
@@ -10968,8 +10697,6 @@
                       <w:r>
                         <w:rPr>
                           <w:rFonts w:ascii="Times New Roman" w:hAnsi="Times New Roman" w:cs="Times New Roman"/>
-                          <w:sz w:val="18"/>
-                          <w:szCs w:val="18"/>
                           <w:lang w:val="tr-TR"/>
                         </w:rPr>
                         <w:t xml:space="preserve"> am updating the AL_pool_indices </w:t>
@@ -10979,17 +10706,13 @@
                           <w:rFonts w:ascii="Times New Roman" w:hAnsi="Times New Roman" w:cs="Times New Roman"/>
                           <w:b/>
                           <w:bCs/>
-                          <w:sz w:val="18"/>
-                          <w:szCs w:val="18"/>
                           <w:lang w:val="tr-TR"/>
                         </w:rPr>
-                        <w:t>(pool indices for active learning),</w:t>
+                        <w:t>(pool indices for active learning)</w:t>
                       </w:r>
                       <w:r>
                         <w:rPr>
                           <w:rFonts w:ascii="Times New Roman" w:hAnsi="Times New Roman" w:cs="Times New Roman"/>
-                          <w:sz w:val="18"/>
-                          <w:szCs w:val="18"/>
                           <w:lang w:val="tr-TR"/>
                         </w:rPr>
                         <w:t xml:space="preserve"> and AL_labeled_indices </w:t>
@@ -10999,8 +10722,6 @@
                           <w:rFonts w:ascii="Times New Roman" w:hAnsi="Times New Roman" w:cs="Times New Roman"/>
                           <w:b/>
                           <w:bCs/>
-                          <w:sz w:val="18"/>
-                          <w:szCs w:val="18"/>
                           <w:lang w:val="tr-TR"/>
                         </w:rPr>
                         <w:t>(labeled indices for active learning)</w:t>
@@ -11008,17 +10729,27 @@
                       <w:r>
                         <w:rPr>
                           <w:rFonts w:ascii="Times New Roman" w:hAnsi="Times New Roman" w:cs="Times New Roman"/>
-                          <w:sz w:val="18"/>
-                          <w:szCs w:val="18"/>
                           <w:lang w:val="tr-TR"/>
                         </w:rPr>
-                        <w:t xml:space="preserve"> lists after labeling each text instance. When I label a text sample, I remove its index from the active learning pool indices and uniqely add it to the labeled indices. Then, I retrain the active learning model with the new list of labeled indices for active learning. After that, I am evaluating the retrained model to get the recent </w:t>
+                        <w:t xml:space="preserve"> lists after labeling each text instance. When I label a text sample, I remove its index from the active learning pool indices and uniq</w:t>
                       </w:r>
                       <w:r>
                         <w:rPr>
                           <w:rFonts w:ascii="Times New Roman" w:hAnsi="Times New Roman" w:cs="Times New Roman"/>
-                          <w:sz w:val="18"/>
-                          <w:szCs w:val="18"/>
+                          <w:lang w:val="tr-TR"/>
+                        </w:rPr>
+                        <w:t>u</w:t>
+                      </w:r>
+                      <w:r>
+                        <w:rPr>
+                          <w:rFonts w:ascii="Times New Roman" w:hAnsi="Times New Roman" w:cs="Times New Roman"/>
+                          <w:lang w:val="tr-TR"/>
+                        </w:rPr>
+                        <w:t xml:space="preserve">ely add it to the labeled indices. Then, I retrain the active learning model with the new list of labeled indices for active learning. After that, I am evaluating the retrained model to get the recent </w:t>
+                      </w:r>
+                      <w:r>
+                        <w:rPr>
+                          <w:rFonts w:ascii="Times New Roman" w:hAnsi="Times New Roman" w:cs="Times New Roman"/>
                           <w:lang w:val="tr-TR"/>
                         </w:rPr>
                         <w:t xml:space="preserve">accuracy value of the active learning model trained with new query. </w:t>
@@ -11029,28 +10760,36 @@
                         <w:jc w:val="both"/>
                         <w:rPr>
                           <w:rFonts w:ascii="Times New Roman" w:hAnsi="Times New Roman" w:cs="Times New Roman"/>
-                          <w:sz w:val="18"/>
-                          <w:szCs w:val="18"/>
                           <w:lang w:val="tr-TR"/>
                         </w:rPr>
                       </w:pPr>
                       <w:r>
                         <w:rPr>
                           <w:rFonts w:ascii="Times New Roman" w:hAnsi="Times New Roman" w:cs="Times New Roman"/>
-                          <w:sz w:val="18"/>
-                          <w:szCs w:val="18"/>
                           <w:lang w:val="tr-TR"/>
                         </w:rPr>
                         <w:tab/>
-                        <w:t xml:space="preserve">When we look at the test accuracy growth graph for 30 new queries, </w:t>
+                        <w:t>When we look at the test accuracy growth graph for 30 new queries</w:t>
                       </w:r>
                       <w:r>
                         <w:rPr>
                           <w:rFonts w:ascii="Times New Roman" w:hAnsi="Times New Roman" w:cs="Times New Roman"/>
+                          <w:lang w:val="tr-TR"/>
+                        </w:rPr>
+                        <w:t>,</w:t>
+                      </w:r>
+                      <w:r>
+                        <w:rPr>
+                          <w:rFonts w:ascii="Times New Roman" w:hAnsi="Times New Roman" w:cs="Times New Roman"/>
+                          <w:lang w:val="tr-TR"/>
+                        </w:rPr>
+                        <w:t xml:space="preserve"> </w:t>
+                      </w:r>
+                      <w:r>
+                        <w:rPr>
+                          <w:rFonts w:ascii="Times New Roman" w:hAnsi="Times New Roman" w:cs="Times New Roman"/>
                           <w:b/>
                           <w:bCs/>
-                          <w:sz w:val="18"/>
-                          <w:szCs w:val="18"/>
                           <w:lang w:val="tr-TR"/>
                         </w:rPr>
                         <w:t>given in Figure 5</w:t>
@@ -11058,17 +10797,20 @@
                       <w:r>
                         <w:rPr>
                           <w:rFonts w:ascii="Times New Roman" w:hAnsi="Times New Roman" w:cs="Times New Roman"/>
-                          <w:sz w:val="18"/>
-                          <w:szCs w:val="18"/>
                           <w:lang w:val="tr-TR"/>
                         </w:rPr>
-                        <w:t xml:space="preserve">, we can observe that the overall trend of test accuracy is upward as new queries are provided. However, </w:t>
+                        <w:t>,</w:t>
                       </w:r>
                       <w:r>
                         <w:rPr>
                           <w:rFonts w:ascii="Times New Roman" w:hAnsi="Times New Roman" w:cs="Times New Roman"/>
-                          <w:sz w:val="18"/>
-                          <w:szCs w:val="18"/>
+                          <w:lang w:val="tr-TR"/>
+                        </w:rPr>
+                        <w:t xml:space="preserve"> we can observe that the overall trend of test accuracy is upward as new queries are provided. However, </w:t>
+                      </w:r>
+                      <w:r>
+                        <w:rPr>
+                          <w:rFonts w:ascii="Times New Roman" w:hAnsi="Times New Roman" w:cs="Times New Roman"/>
                           <w:lang w:val="tr-TR"/>
                         </w:rPr>
                         <w:t xml:space="preserve">when an active learner queries highly borderline samples, the decision boundary of the active learning classifier model aggressively changes, which often leads to performance stagnation or decreases on the test set before </w:t>
@@ -11076,8 +10818,6 @@
                       <w:r>
                         <w:rPr>
                           <w:rFonts w:ascii="Times New Roman" w:hAnsi="Times New Roman" w:cs="Times New Roman"/>
-                          <w:sz w:val="18"/>
-                          <w:szCs w:val="18"/>
                           <w:lang w:val="tr-TR"/>
                         </w:rPr>
                         <w:t>the</w:t>
@@ -11085,8 +10825,6 @@
                       <w:r>
                         <w:rPr>
                           <w:rFonts w:ascii="Times New Roman" w:hAnsi="Times New Roman" w:cs="Times New Roman"/>
-                          <w:sz w:val="18"/>
-                          <w:szCs w:val="18"/>
                           <w:lang w:val="tr-TR"/>
                         </w:rPr>
                         <w:t xml:space="preserve"> self-correction and increase in accuracy. </w:t>
@@ -11097,16 +10835,12 @@
                         <w:jc w:val="both"/>
                         <w:rPr>
                           <w:rFonts w:ascii="Times New Roman" w:hAnsi="Times New Roman" w:cs="Times New Roman"/>
-                          <w:sz w:val="18"/>
-                          <w:szCs w:val="18"/>
                           <w:lang w:val="tr-TR"/>
                         </w:rPr>
                       </w:pPr>
                       <w:r>
                         <w:rPr>
                           <w:rFonts w:ascii="Times New Roman" w:hAnsi="Times New Roman" w:cs="Times New Roman"/>
-                          <w:sz w:val="18"/>
-                          <w:szCs w:val="18"/>
                           <w:lang w:val="tr-TR"/>
                         </w:rPr>
                         <w:tab/>
@@ -11114,8 +10848,6 @@
                       <w:r>
                         <w:rPr>
                           <w:rFonts w:ascii="Times New Roman" w:hAnsi="Times New Roman" w:cs="Times New Roman"/>
-                          <w:sz w:val="18"/>
-                          <w:szCs w:val="18"/>
                           <w:lang w:val="tr-TR"/>
                         </w:rPr>
                         <w:t xml:space="preserve">I have kept track of the current test accuracies of the active learner in </w:t>
@@ -11127,8 +10859,6 @@
                           <w:bCs/>
                           <w:i/>
                           <w:iCs/>
-                          <w:sz w:val="18"/>
-                          <w:szCs w:val="18"/>
                           <w:lang w:val="tr-TR"/>
                         </w:rPr>
                         <w:t>self.accuracy_history</w:t>
@@ -11136,8 +10866,6 @@
                       <w:r>
                         <w:rPr>
                           <w:rFonts w:ascii="Times New Roman" w:hAnsi="Times New Roman" w:cs="Times New Roman"/>
-                          <w:sz w:val="18"/>
-                          <w:szCs w:val="18"/>
                           <w:lang w:val="tr-TR"/>
                         </w:rPr>
                         <w:t xml:space="preserve"> and the number of labeled samples in </w:t>
@@ -11149,8 +10877,6 @@
                           <w:bCs/>
                           <w:i/>
                           <w:iCs/>
-                          <w:sz w:val="18"/>
-                          <w:szCs w:val="18"/>
                           <w:lang w:val="tr-TR"/>
                         </w:rPr>
                         <w:t xml:space="preserve">self.query_history. </w:t>
@@ -11158,8 +10884,6 @@
                       <w:r>
                         <w:rPr>
                           <w:rFonts w:ascii="Times New Roman" w:hAnsi="Times New Roman" w:cs="Times New Roman"/>
-                          <w:sz w:val="18"/>
-                          <w:szCs w:val="18"/>
                           <w:lang w:val="tr-TR"/>
                         </w:rPr>
                         <w:t>In addition to the graph plotted, I have used deferral agreement &amp; disagreement rates, current test accuracy of the active learning model, and accuracy gain/loss per user query</w:t>
@@ -11167,8 +10891,6 @@
                       <w:r>
                         <w:rPr>
                           <w:rFonts w:ascii="Times New Roman" w:hAnsi="Times New Roman" w:cs="Times New Roman"/>
-                          <w:sz w:val="18"/>
-                          <w:szCs w:val="18"/>
                           <w:lang w:val="tr-TR"/>
                         </w:rPr>
                         <w:t xml:space="preserve"> for evaluating the active learning model. They indicate high initial </w:t>
@@ -11178,8 +10900,6 @@
                           <w:rFonts w:ascii="Times New Roman" w:hAnsi="Times New Roman" w:cs="Times New Roman"/>
                           <w:b/>
                           <w:bCs/>
-                          <w:sz w:val="18"/>
-                          <w:szCs w:val="18"/>
                           <w:lang w:val="tr-TR"/>
                         </w:rPr>
                         <w:t>(0.8508)</w:t>
@@ -11187,8 +10907,6 @@
                       <w:r>
                         <w:rPr>
                           <w:rFonts w:ascii="Times New Roman" w:hAnsi="Times New Roman" w:cs="Times New Roman"/>
-                          <w:sz w:val="18"/>
-                          <w:szCs w:val="18"/>
                           <w:lang w:val="tr-TR"/>
                         </w:rPr>
                         <w:t xml:space="preserve"> &amp; last </w:t>
@@ -11198,8 +10916,6 @@
                           <w:rFonts w:ascii="Times New Roman" w:hAnsi="Times New Roman" w:cs="Times New Roman"/>
                           <w:b/>
                           <w:bCs/>
-                          <w:sz w:val="18"/>
-                          <w:szCs w:val="18"/>
                           <w:lang w:val="tr-TR"/>
                         </w:rPr>
                         <w:t xml:space="preserve">(0.8530) </w:t>
@@ -11207,8 +10923,6 @@
                       <w:r>
                         <w:rPr>
                           <w:rFonts w:ascii="Times New Roman" w:hAnsi="Times New Roman" w:cs="Times New Roman"/>
-                          <w:sz w:val="18"/>
-                          <w:szCs w:val="18"/>
                           <w:lang w:val="tr-TR"/>
                         </w:rPr>
                         <w:t xml:space="preserve">test accuracies, which means active learning performs well on the unseen test data. In order to calculate the disagreement rate between the active learning model and the simulated expert, I have first calculated the part where </w:t>
@@ -11218,8 +10932,6 @@
                           <w:rFonts w:ascii="Times New Roman" w:hAnsi="Times New Roman" w:cs="Times New Roman"/>
                           <w:b/>
                           <w:bCs/>
-                          <w:sz w:val="18"/>
-                          <w:szCs w:val="18"/>
                           <w:lang w:val="tr-TR"/>
                         </w:rPr>
                         <w:t>the active learning model</w:t>
@@ -11227,8 +10939,6 @@
                       <w:r>
                         <w:rPr>
                           <w:rFonts w:ascii="Times New Roman" w:hAnsi="Times New Roman" w:cs="Times New Roman"/>
-                          <w:sz w:val="18"/>
-                          <w:szCs w:val="18"/>
                           <w:lang w:val="tr-TR"/>
                         </w:rPr>
                         <w:t xml:space="preserve"> </w:t>
@@ -11238,8 +10948,6 @@
                           <w:rFonts w:ascii="Times New Roman" w:hAnsi="Times New Roman" w:cs="Times New Roman"/>
                           <w:b/>
                           <w:bCs/>
-                          <w:sz w:val="18"/>
-                          <w:szCs w:val="18"/>
                           <w:lang w:val="tr-TR"/>
                         </w:rPr>
                         <w:t>predictions on the unseen ‘y_test’ data</w:t>
@@ -11247,8 +10955,6 @@
                       <w:r>
                         <w:rPr>
                           <w:rFonts w:ascii="Times New Roman" w:hAnsi="Times New Roman" w:cs="Times New Roman"/>
-                          <w:sz w:val="18"/>
-                          <w:szCs w:val="18"/>
                           <w:lang w:val="tr-TR"/>
                         </w:rPr>
                         <w:t xml:space="preserve"> </w:t>
@@ -11258,8 +10964,6 @@
                           <w:rFonts w:ascii="Times New Roman" w:hAnsi="Times New Roman" w:cs="Times New Roman"/>
                           <w:i/>
                           <w:iCs/>
-                          <w:sz w:val="18"/>
-                          <w:szCs w:val="18"/>
                           <w:lang w:val="tr-TR"/>
                         </w:rPr>
                         <w:t>do not match</w:t>
@@ -11267,8 +10971,6 @@
                       <w:r>
                         <w:rPr>
                           <w:rFonts w:ascii="Times New Roman" w:hAnsi="Times New Roman" w:cs="Times New Roman"/>
-                          <w:sz w:val="18"/>
-                          <w:szCs w:val="18"/>
                           <w:lang w:val="tr-TR"/>
                         </w:rPr>
                         <w:t xml:space="preserve"> </w:t>
@@ -11278,8 +10980,6 @@
                           <w:rFonts w:ascii="Times New Roman" w:hAnsi="Times New Roman" w:cs="Times New Roman"/>
                           <w:b/>
                           <w:bCs/>
-                          <w:sz w:val="18"/>
-                          <w:szCs w:val="18"/>
                           <w:lang w:val="tr-TR"/>
                         </w:rPr>
                         <w:t xml:space="preserve">the ground truth ‘y_test’ data. </w:t>
@@ -11287,8 +10987,6 @@
                       <w:r>
                         <w:rPr>
                           <w:rFonts w:ascii="Times New Roman" w:hAnsi="Times New Roman" w:cs="Times New Roman"/>
-                          <w:sz w:val="18"/>
-                          <w:szCs w:val="18"/>
                           <w:lang w:val="tr-TR"/>
                         </w:rPr>
                         <w:t xml:space="preserve">Then, I have calculated the part where </w:t>
@@ -11298,8 +10996,6 @@
                           <w:rFonts w:ascii="Times New Roman" w:hAnsi="Times New Roman" w:cs="Times New Roman"/>
                           <w:b/>
                           <w:bCs/>
-                          <w:sz w:val="18"/>
-                          <w:szCs w:val="18"/>
                           <w:lang w:val="tr-TR"/>
                         </w:rPr>
                         <w:t>the simulated expert</w:t>
@@ -11307,8 +11003,6 @@
                       <w:r>
                         <w:rPr>
                           <w:rFonts w:ascii="Times New Roman" w:hAnsi="Times New Roman" w:cs="Times New Roman"/>
-                          <w:sz w:val="18"/>
-                          <w:szCs w:val="18"/>
                           <w:lang w:val="tr-TR"/>
                         </w:rPr>
                         <w:t xml:space="preserve"> </w:t>
@@ -11318,8 +11012,6 @@
                           <w:rFonts w:ascii="Times New Roman" w:hAnsi="Times New Roman" w:cs="Times New Roman"/>
                           <w:b/>
                           <w:bCs/>
-                          <w:sz w:val="18"/>
-                          <w:szCs w:val="18"/>
                           <w:lang w:val="tr-TR"/>
                         </w:rPr>
                         <w:t xml:space="preserve">predictions on the unseen ‘y_test’ data </w:t>
@@ -11329,8 +11021,6 @@
                           <w:rFonts w:ascii="Times New Roman" w:hAnsi="Times New Roman" w:cs="Times New Roman"/>
                           <w:i/>
                           <w:iCs/>
-                          <w:sz w:val="18"/>
-                          <w:szCs w:val="18"/>
                           <w:lang w:val="tr-TR"/>
                         </w:rPr>
                         <w:t>do match</w:t>
@@ -11338,8 +11028,6 @@
                       <w:r>
                         <w:rPr>
                           <w:rFonts w:ascii="Times New Roman" w:hAnsi="Times New Roman" w:cs="Times New Roman"/>
-                          <w:sz w:val="18"/>
-                          <w:szCs w:val="18"/>
                           <w:lang w:val="tr-TR"/>
                         </w:rPr>
                         <w:t xml:space="preserve"> </w:t>
@@ -11349,8 +11037,6 @@
                           <w:rFonts w:ascii="Times New Roman" w:hAnsi="Times New Roman" w:cs="Times New Roman"/>
                           <w:b/>
                           <w:bCs/>
-                          <w:sz w:val="18"/>
-                          <w:szCs w:val="18"/>
                           <w:lang w:val="tr-TR"/>
                         </w:rPr>
                         <w:t xml:space="preserve">the ground truth ‘y_test’ data. </w:t>
@@ -11358,8 +11044,6 @@
                       <w:r>
                         <w:rPr>
                           <w:rFonts w:ascii="Times New Roman" w:hAnsi="Times New Roman" w:cs="Times New Roman"/>
-                          <w:sz w:val="18"/>
-                          <w:szCs w:val="18"/>
                           <w:lang w:val="tr-TR"/>
                         </w:rPr>
                         <w:t xml:space="preserve">After that, I get the </w:t>
@@ -11369,8 +11053,6 @@
                           <w:rFonts w:ascii="Times New Roman" w:hAnsi="Times New Roman" w:cs="Times New Roman"/>
                           <w:b/>
                           <w:bCs/>
-                          <w:sz w:val="18"/>
-                          <w:szCs w:val="18"/>
                           <w:lang w:val="tr-TR"/>
                         </w:rPr>
                         <w:t>“AND”</w:t>
@@ -11378,8 +11060,6 @@
                       <w:r>
                         <w:rPr>
                           <w:rFonts w:ascii="Times New Roman" w:hAnsi="Times New Roman" w:cs="Times New Roman"/>
-                          <w:sz w:val="18"/>
-                          <w:szCs w:val="18"/>
                           <w:lang w:val="tr-TR"/>
                         </w:rPr>
                         <w:t xml:space="preserve"> mask of these parts. Finally, I have applied </w:t>
@@ -11389,8 +11069,6 @@
                           <w:rFonts w:ascii="Times New Roman" w:hAnsi="Times New Roman" w:cs="Times New Roman"/>
                           <w:i/>
                           <w:iCs/>
-                          <w:sz w:val="18"/>
-                          <w:szCs w:val="18"/>
                           <w:lang w:val="tr-TR"/>
                         </w:rPr>
                         <w:t>np.mean()</w:t>
@@ -11398,8 +11076,6 @@
                       <w:r>
                         <w:rPr>
                           <w:rFonts w:ascii="Times New Roman" w:hAnsi="Times New Roman" w:cs="Times New Roman"/>
-                          <w:sz w:val="18"/>
-                          <w:szCs w:val="18"/>
                           <w:lang w:val="tr-TR"/>
                         </w:rPr>
                         <w:t xml:space="preserve"> on the created mask, which treats the true boolean value as 1 and the false boolean value as 0. The </w:t>
@@ -11409,8 +11085,6 @@
                           <w:rFonts w:ascii="Times New Roman" w:hAnsi="Times New Roman" w:cs="Times New Roman"/>
                           <w:i/>
                           <w:iCs/>
-                          <w:sz w:val="18"/>
-                          <w:szCs w:val="18"/>
                           <w:lang w:val="tr-TR"/>
                         </w:rPr>
                         <w:t>np.mean()</w:t>
@@ -11418,8 +11092,6 @@
                       <w:r>
                         <w:rPr>
                           <w:rFonts w:ascii="Times New Roman" w:hAnsi="Times New Roman" w:cs="Times New Roman"/>
-                          <w:sz w:val="18"/>
-                          <w:szCs w:val="18"/>
                           <w:lang w:val="tr-TR"/>
                         </w:rPr>
                         <w:t xml:space="preserve"> call will then give the deferral disagreement rate, which indicates how often the active learning model </w:t>
@@ -11427,8 +11099,6 @@
                       <w:r>
                         <w:rPr>
                           <w:rFonts w:ascii="Times New Roman" w:hAnsi="Times New Roman" w:cs="Times New Roman"/>
-                          <w:sz w:val="18"/>
-                          <w:szCs w:val="18"/>
                           <w:lang w:val="tr-TR"/>
                         </w:rPr>
                         <w:t xml:space="preserve">is wrong while the simulated expert is right. </w:t>
@@ -11436,8 +11106,6 @@
                       <w:r>
                         <w:rPr>
                           <w:rFonts w:ascii="Times New Roman" w:hAnsi="Times New Roman" w:cs="Times New Roman"/>
-                          <w:sz w:val="18"/>
-                          <w:szCs w:val="18"/>
                           <w:lang w:val="tr-TR"/>
                         </w:rPr>
                         <w:t xml:space="preserve">  </w:t>

</xml_diff>

<commit_message>
fix the styling and typos of the figure caption texts in the project-3 report
</commit_message>
<xml_diff>
--- a/Project3_Report.docx
+++ b/Project3_Report.docx
@@ -2813,16 +2813,20 @@
           <w:rFonts w:ascii="Times New Roman" w:hAnsi="Times New Roman" w:cs="Times New Roman"/>
           <w:b/>
           <w:bCs/>
-          <w:sz w:val="18"/>
-          <w:szCs w:val="18"/>
-          <w:lang w:val="tr-TR"/>
-        </w:rPr>
-      </w:pPr>
-      <w:r>
-        <w:rPr>
-          <w:rFonts w:ascii="Times New Roman" w:hAnsi="Times New Roman" w:cs="Times New Roman"/>
-          <w:b/>
-          <w:bCs/>
+          <w:i/>
+          <w:iCs/>
+          <w:sz w:val="18"/>
+          <w:szCs w:val="18"/>
+          <w:lang w:val="tr-TR"/>
+        </w:rPr>
+      </w:pPr>
+      <w:r>
+        <w:rPr>
+          <w:rFonts w:ascii="Times New Roman" w:hAnsi="Times New Roman" w:cs="Times New Roman"/>
+          <w:b/>
+          <w:bCs/>
+          <w:i/>
+          <w:iCs/>
           <w:sz w:val="18"/>
           <w:szCs w:val="18"/>
           <w:lang w:val="tr-TR"/>
@@ -2834,6 +2838,8 @@
           <w:rFonts w:ascii="Times New Roman" w:hAnsi="Times New Roman" w:cs="Times New Roman"/>
           <w:b/>
           <w:bCs/>
+          <w:i/>
+          <w:iCs/>
           <w:sz w:val="18"/>
           <w:szCs w:val="18"/>
           <w:lang w:val="tr-TR"/>
@@ -2845,6 +2851,8 @@
           <w:rFonts w:ascii="Times New Roman" w:hAnsi="Times New Roman" w:cs="Times New Roman"/>
           <w:b/>
           <w:bCs/>
+          <w:i/>
+          <w:iCs/>
           <w:sz w:val="18"/>
           <w:szCs w:val="18"/>
           <w:lang w:val="tr-TR"/>
@@ -2856,6 +2864,8 @@
           <w:rFonts w:ascii="Times New Roman" w:hAnsi="Times New Roman" w:cs="Times New Roman"/>
           <w:b/>
           <w:bCs/>
+          <w:i/>
+          <w:iCs/>
           <w:sz w:val="18"/>
           <w:szCs w:val="18"/>
           <w:lang w:val="tr-TR"/>
@@ -2867,6 +2877,8 @@
           <w:rFonts w:ascii="Times New Roman" w:hAnsi="Times New Roman" w:cs="Times New Roman"/>
           <w:b/>
           <w:bCs/>
+          <w:i/>
+          <w:iCs/>
           <w:sz w:val="18"/>
           <w:szCs w:val="18"/>
           <w:lang w:val="tr-TR"/>
@@ -2878,6 +2890,8 @@
           <w:rFonts w:ascii="Times New Roman" w:hAnsi="Times New Roman" w:cs="Times New Roman"/>
           <w:b/>
           <w:bCs/>
+          <w:i/>
+          <w:iCs/>
           <w:sz w:val="18"/>
           <w:szCs w:val="18"/>
           <w:lang w:val="tr-TR"/>
@@ -2889,6 +2903,8 @@
           <w:rFonts w:ascii="Times New Roman" w:hAnsi="Times New Roman" w:cs="Times New Roman"/>
           <w:b/>
           <w:bCs/>
+          <w:i/>
+          <w:iCs/>
           <w:sz w:val="18"/>
           <w:szCs w:val="18"/>
           <w:lang w:val="tr-TR"/>
@@ -2900,11 +2916,13 @@
           <w:rFonts w:ascii="Times New Roman" w:hAnsi="Times New Roman" w:cs="Times New Roman"/>
           <w:b/>
           <w:bCs/>
-          <w:sz w:val="18"/>
-          <w:szCs w:val="18"/>
-          <w:lang w:val="tr-TR"/>
-        </w:rPr>
-        <w:t>eline model test data predictions.</w:t>
+          <w:i/>
+          <w:iCs/>
+          <w:sz w:val="18"/>
+          <w:szCs w:val="18"/>
+          <w:lang w:val="tr-TR"/>
+        </w:rPr>
+        <w:t>eline model test data predictions</w:t>
       </w:r>
     </w:p>
     <w:p>
@@ -5003,6 +5021,8 @@
           <w:rFonts w:ascii="Times New Roman" w:eastAsia="Times New Roman" w:hAnsi="Times New Roman" w:cs="Times New Roman"/>
           <w:b/>
           <w:bCs/>
+          <w:i/>
+          <w:iCs/>
           <w:sz w:val="18"/>
           <w:szCs w:val="18"/>
           <w:lang w:eastAsia="tr-TR"/>
@@ -5013,6 +5033,8 @@
           <w:rFonts w:ascii="Times New Roman" w:eastAsia="Times New Roman" w:hAnsi="Times New Roman" w:cs="Times New Roman"/>
           <w:b/>
           <w:bCs/>
+          <w:i/>
+          <w:iCs/>
           <w:sz w:val="18"/>
           <w:szCs w:val="18"/>
           <w:lang w:eastAsia="tr-TR"/>
@@ -5024,6 +5046,8 @@
           <w:rFonts w:ascii="Times New Roman" w:eastAsia="Times New Roman" w:hAnsi="Times New Roman" w:cs="Times New Roman"/>
           <w:b/>
           <w:bCs/>
+          <w:i/>
+          <w:iCs/>
           <w:sz w:val="18"/>
           <w:szCs w:val="18"/>
           <w:lang w:eastAsia="tr-TR"/>
@@ -5035,6 +5059,8 @@
           <w:rFonts w:ascii="Times New Roman" w:eastAsia="Times New Roman" w:hAnsi="Times New Roman" w:cs="Times New Roman"/>
           <w:b/>
           <w:bCs/>
+          <w:i/>
+          <w:iCs/>
           <w:sz w:val="18"/>
           <w:szCs w:val="18"/>
           <w:lang w:eastAsia="tr-TR"/>
@@ -5046,6 +5072,8 @@
           <w:rFonts w:ascii="Times New Roman" w:eastAsia="Times New Roman" w:hAnsi="Times New Roman" w:cs="Times New Roman"/>
           <w:b/>
           <w:bCs/>
+          <w:i/>
+          <w:iCs/>
           <w:sz w:val="18"/>
           <w:szCs w:val="18"/>
           <w:lang w:eastAsia="tr-TR"/>
@@ -5057,6 +5085,8 @@
           <w:rFonts w:ascii="Times New Roman" w:eastAsia="Times New Roman" w:hAnsi="Times New Roman" w:cs="Times New Roman"/>
           <w:b/>
           <w:bCs/>
+          <w:i/>
+          <w:iCs/>
           <w:sz w:val="18"/>
           <w:szCs w:val="18"/>
           <w:lang w:eastAsia="tr-TR"/>
@@ -5068,6 +5098,8 @@
           <w:rFonts w:ascii="Times New Roman" w:eastAsia="Times New Roman" w:hAnsi="Times New Roman" w:cs="Times New Roman"/>
           <w:b/>
           <w:bCs/>
+          <w:i/>
+          <w:iCs/>
           <w:sz w:val="18"/>
           <w:szCs w:val="18"/>
           <w:lang w:eastAsia="tr-TR"/>
@@ -5079,6 +5111,8 @@
           <w:rFonts w:ascii="Times New Roman" w:eastAsia="Times New Roman" w:hAnsi="Times New Roman" w:cs="Times New Roman"/>
           <w:b/>
           <w:bCs/>
+          <w:i/>
+          <w:iCs/>
           <w:sz w:val="18"/>
           <w:szCs w:val="18"/>
           <w:lang w:eastAsia="tr-TR"/>
@@ -7134,7 +7168,7 @@
           <w:lang w:val="tr-TR"/>
         </w:rPr>
         <w:drawing>
-          <wp:anchor distT="0" distB="0" distL="114300" distR="114300" simplePos="0" relativeHeight="251670528" behindDoc="0" locked="0" layoutInCell="1" allowOverlap="1" wp14:anchorId="2FE1D6C2" wp14:editId="494A4A5F">
+          <wp:anchor distT="0" distB="0" distL="114300" distR="114300" simplePos="0" relativeHeight="251670528" behindDoc="0" locked="0" layoutInCell="1" allowOverlap="1" wp14:anchorId="2FE1D6C2" wp14:editId="206F272D">
             <wp:simplePos x="0" y="0"/>
             <wp:positionH relativeFrom="column">
               <wp:posOffset>37220</wp:posOffset>

</xml_diff>

<commit_message>
optimize input data reading in project3 via caching, correct some figure descriptions in project3 report
</commit_message>
<xml_diff>
--- a/Project3_Report.docx
+++ b/Project3_Report.docx
@@ -1,6 +1,6 @@
 
 <file path=word/document.xml><?xml version="1.0" encoding="utf-8"?>
-<w:document xmlns:wpc="http://schemas.microsoft.com/office/word/2010/wordprocessingCanvas" xmlns:cx="http://schemas.microsoft.com/office/drawing/2014/chartex" xmlns:cx1="http://schemas.microsoft.com/office/drawing/2015/9/8/chartex" xmlns:cx2="http://schemas.microsoft.com/office/drawing/2015/10/21/chartex" xmlns:cx3="http://schemas.microsoft.com/office/drawing/2016/5/9/chartex" xmlns:cx4="http://schemas.microsoft.com/office/drawing/2016/5/10/chartex" xmlns:cx5="http://schemas.microsoft.com/office/drawing/2016/5/11/chartex" xmlns:cx6="http://schemas.microsoft.com/office/drawing/2016/5/12/chartex" xmlns:cx7="http://schemas.microsoft.com/office/drawing/2016/5/13/chartex" xmlns:cx8="http://schemas.microsoft.com/office/drawing/2016/5/14/chartex" xmlns:mc="http://schemas.openxmlformats.org/markup-compatibility/2006" xmlns:m="http://schemas.openxmlformats.org/officeDocument/2006/math" xmlns:aink="http://schemas.microsoft.com/office/drawing/2016/ink" xmlns:am3d="http://schemas.microsoft.com/office/drawing/2017/model3d" xmlns:oel="http://schemas.microsoft.com/office/2019/extlst" xmlns:r="http://schemas.openxmlformats.org/officeDocument/2006/relationships" xmlns:wp14="http://schemas.microsoft.com/office/word/2010/wordprocessingDrawing" xmlns:wp="http://schemas.openxmlformats.org/drawingml/2006/wordprocessingDrawing" xmlns:wpg="http://schemas.microsoft.com/office/word/2010/wordprocessingGroup" xmlns:wpi="http://schemas.microsoft.com/office/word/2010/wordprocessingInk" xmlns:wps="http://schemas.microsoft.com/office/word/2010/wordprocessingShape" xmlns:o="urn:schemas-microsoft-com:office:office" xmlns:v="urn:schemas-microsoft-com:vml" xmlns:w10="urn:schemas-microsoft-com:office:word" xmlns:w="http://schemas.openxmlformats.org/wordprocessingml/2006/main" xmlns:w14="http://schemas.microsoft.com/office/word/2010/wordml" xmlns:w15="http://schemas.microsoft.com/office/word/2012/wordml" xmlns:w16cex="http://schemas.microsoft.com/office/word/2018/wordml/cex" xmlns:w16cid="http://schemas.microsoft.com/office/word/2016/wordml/cid" xmlns:w16="http://schemas.microsoft.com/office/word/2018/wordml" xmlns:w16sdtdh="http://schemas.microsoft.com/office/word/2020/wordml/sdtdatahash" xmlns:w16sdtfl="http://schemas.microsoft.com/office/word/2024/wordml/sdtformatlock" xmlns:w16se="http://schemas.microsoft.com/office/word/2015/wordml/symex" xmlns:w16du="http://schemas.microsoft.com/office/word/2023/wordml/word16du" xmlns:wne="http://schemas.microsoft.com/office/word/2006/wordml" mc:Ignorable="w14 w15 w16se w16cid w16 w16cex w16sdtdh w16sdtfl w16du wp14">
+<w:document xmlns:wpc="http://schemas.microsoft.com/office/word/2010/wordprocessingCanvas" xmlns:cx="http://schemas.microsoft.com/office/drawing/2014/chartex" xmlns:cx1="http://schemas.microsoft.com/office/drawing/2015/9/8/chartex" xmlns:cx2="http://schemas.microsoft.com/office/drawing/2015/10/21/chartex" xmlns:cx3="http://schemas.microsoft.com/office/drawing/2016/5/9/chartex" xmlns:cx4="http://schemas.microsoft.com/office/drawing/2016/5/10/chartex" xmlns:cx5="http://schemas.microsoft.com/office/drawing/2016/5/11/chartex" xmlns:cx6="http://schemas.microsoft.com/office/drawing/2016/5/12/chartex" xmlns:cx7="http://schemas.microsoft.com/office/drawing/2016/5/13/chartex" xmlns:cx8="http://schemas.microsoft.com/office/drawing/2016/5/14/chartex" xmlns:mc="http://schemas.openxmlformats.org/markup-compatibility/2006" xmlns:m="http://schemas.openxmlformats.org/officeDocument/2006/math" xmlns:aink="http://schemas.microsoft.com/office/drawing/2016/ink" xmlns:am3d="http://schemas.microsoft.com/office/drawing/2017/model3d" xmlns:oel="http://schemas.microsoft.com/office/2019/extlst" xmlns:r="http://schemas.openxmlformats.org/officeDocument/2006/relationships" xmlns:wp14="http://schemas.microsoft.com/office/word/2010/wordprocessingDrawing" xmlns:wp="http://schemas.openxmlformats.org/drawingml/2006/wordprocessingDrawing" xmlns:wpg="http://schemas.microsoft.com/office/word/2010/wordprocessingGroup" xmlns:wpi="http://schemas.microsoft.com/office/word/2010/wordprocessingInk" xmlns:wps="http://schemas.microsoft.com/office/word/2010/wordprocessingShape" xmlns:o="urn:schemas-microsoft-com:office:office" xmlns:v="urn:schemas-microsoft-com:vml" xmlns:w10="urn:schemas-microsoft-com:office:word" xmlns:w="http://schemas.openxmlformats.org/wordprocessingml/2006/main" xmlns:w14="http://schemas.microsoft.com/office/word/2010/wordml" xmlns:w15="http://schemas.microsoft.com/office/word/2012/wordml" xmlns:w16cei="http://schemas.microsoft.com/office/word/2026/wordml/cei" xmlns:w16cex="http://schemas.microsoft.com/office/word/2018/wordml/cex" xmlns:w16cid="http://schemas.microsoft.com/office/word/2016/wordml/cid" xmlns:w16="http://schemas.microsoft.com/office/word/2018/wordml" xmlns:w16sdtdh="http://schemas.microsoft.com/office/word/2020/wordml/sdtdatahash" xmlns:w16sdtfl="http://schemas.microsoft.com/office/word/2024/wordml/sdtformatlock" xmlns:w16se="http://schemas.microsoft.com/office/word/2015/wordml/symex" xmlns:w16du="http://schemas.microsoft.com/office/word/2023/wordml/word16du" xmlns:wne="http://schemas.microsoft.com/office/word/2006/wordml" mc:Ignorable="w14 w15 w16se w16cid w16 w16cex w16sdtdh w16sdtfl w16du wp14">
   <w:body>
     <w:p>
       <w:pPr>
@@ -7222,7 +7222,7 @@
           <w:lang w:val="tr-TR"/>
         </w:rPr>
         <w:drawing>
-          <wp:anchor distT="0" distB="0" distL="114300" distR="114300" simplePos="0" relativeHeight="251670528" behindDoc="0" locked="0" layoutInCell="1" allowOverlap="1" wp14:anchorId="2FE1D6C2" wp14:editId="00475F36">
+          <wp:anchor distT="0" distB="0" distL="114300" distR="114300" simplePos="0" relativeHeight="251670528" behindDoc="0" locked="0" layoutInCell="1" allowOverlap="1" wp14:anchorId="2FE1D6C2" wp14:editId="4BC231D1">
             <wp:simplePos x="0" y="0"/>
             <wp:positionH relativeFrom="column">
               <wp:posOffset>37220</wp:posOffset>
@@ -7427,16 +7427,16 @@
           <w:lang w:val="tr-TR"/>
         </w:rPr>
         <w:drawing>
-          <wp:anchor distT="0" distB="0" distL="114300" distR="114300" simplePos="0" relativeHeight="251671552" behindDoc="0" locked="0" layoutInCell="1" allowOverlap="1" wp14:anchorId="723402BF" wp14:editId="72A88021">
+          <wp:anchor distT="0" distB="0" distL="114300" distR="114300" simplePos="0" relativeHeight="251671552" behindDoc="0" locked="0" layoutInCell="1" allowOverlap="1" wp14:anchorId="723402BF" wp14:editId="56E94665">
             <wp:simplePos x="0" y="0"/>
             <wp:positionH relativeFrom="column">
-              <wp:posOffset>20036</wp:posOffset>
+              <wp:posOffset>16042</wp:posOffset>
             </wp:positionH>
             <wp:positionV relativeFrom="paragraph">
-              <wp:posOffset>44557</wp:posOffset>
+              <wp:posOffset>43914</wp:posOffset>
             </wp:positionV>
-            <wp:extent cx="3650976" cy="2419971"/>
-            <wp:effectExtent l="0" t="0" r="0" b="6350"/>
+            <wp:extent cx="3937443" cy="2671011"/>
+            <wp:effectExtent l="0" t="0" r="0" b="0"/>
             <wp:wrapNone/>
             <wp:docPr id="939875268" name="Resim 8"/>
             <wp:cNvGraphicFramePr>
@@ -7464,7 +7464,7 @@
                   <pic:spPr>
                     <a:xfrm>
                       <a:off x="0" y="0"/>
-                      <a:ext cx="3650976" cy="2419971"/>
+                      <a:ext cx="3978961" cy="2699175"/>
                     </a:xfrm>
                     <a:prstGeom prst="rect">
                       <a:avLst/>
@@ -7572,6 +7572,15 @@
           <w:lang w:val="tr-TR"/>
         </w:rPr>
       </w:pPr>
+    </w:p>
+    <w:p>
+      <w:pPr>
+        <w:jc w:val="both"/>
+        <w:rPr>
+          <w:rFonts w:ascii="Times New Roman" w:hAnsi="Times New Roman" w:cs="Times New Roman"/>
+          <w:lang w:val="tr-TR"/>
+        </w:rPr>
+      </w:pPr>
       <w:r>
         <w:rPr>
           <w:noProof/>
@@ -7579,15 +7588,15 @@
         <mc:AlternateContent>
           <mc:Choice Requires="wps">
             <w:drawing>
-              <wp:anchor distT="0" distB="0" distL="114300" distR="114300" simplePos="0" relativeHeight="251700224" behindDoc="0" locked="0" layoutInCell="1" allowOverlap="1" wp14:anchorId="5D3BF4BA" wp14:editId="6C79975B">
+              <wp:anchor distT="0" distB="0" distL="114300" distR="114300" simplePos="0" relativeHeight="251700224" behindDoc="0" locked="0" layoutInCell="1" allowOverlap="1" wp14:anchorId="5D3BF4BA" wp14:editId="592B10F8">
                 <wp:simplePos x="0" y="0"/>
                 <wp:positionH relativeFrom="column">
-                  <wp:posOffset>56175</wp:posOffset>
+                  <wp:posOffset>40104</wp:posOffset>
                 </wp:positionH>
                 <wp:positionV relativeFrom="paragraph">
-                  <wp:posOffset>102866</wp:posOffset>
+                  <wp:posOffset>95985</wp:posOffset>
                 </wp:positionV>
-                <wp:extent cx="3585821" cy="159162"/>
+                <wp:extent cx="3912937" cy="158750"/>
                 <wp:effectExtent l="0" t="0" r="0" b="6350"/>
                 <wp:wrapNone/>
                 <wp:docPr id="472233776" name="Metin Kutusu 1"/>
@@ -7599,7 +7608,7 @@
                       <wps:spPr>
                         <a:xfrm>
                           <a:off x="0" y="0"/>
-                          <a:ext cx="3585821" cy="159162"/>
+                          <a:ext cx="3912937" cy="158750"/>
                         </a:xfrm>
                         <a:prstGeom prst="rect">
                           <a:avLst/>
@@ -7653,7 +7662,7 @@
           </mc:Choice>
           <mc:Fallback>
             <w:pict>
-              <v:shape w14:anchorId="5D3BF4BA" id="_x0000_s1030" type="#_x0000_t202" style="position:absolute;left:0;text-align:left;margin-left:4.4pt;margin-top:8.1pt;width:282.35pt;height:12.55pt;z-index:251700224;visibility:visible;mso-wrap-style:square;mso-width-percent:0;mso-height-percent:0;mso-wrap-distance-left:9pt;mso-wrap-distance-top:0;mso-wrap-distance-right:9pt;mso-wrap-distance-bottom:0;mso-position-horizontal:absolute;mso-position-horizontal-relative:text;mso-position-vertical:absolute;mso-position-vertical-relative:text;mso-width-percent:0;mso-height-percent:0;mso-width-relative:margin;mso-height-relative:margin;v-text-anchor:top" o:gfxdata="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" stroked="f">
+              <v:shape w14:anchorId="5D3BF4BA" id="_x0000_s1030" type="#_x0000_t202" style="position:absolute;left:0;text-align:left;margin-left:3.15pt;margin-top:7.55pt;width:308.1pt;height:12.5pt;z-index:251700224;visibility:visible;mso-wrap-style:square;mso-width-percent:0;mso-height-percent:0;mso-wrap-distance-left:9pt;mso-wrap-distance-top:0;mso-wrap-distance-right:9pt;mso-wrap-distance-bottom:0;mso-position-horizontal:absolute;mso-position-horizontal-relative:text;mso-position-vertical:absolute;mso-position-vertical-relative:text;mso-width-percent:0;mso-height-percent:0;mso-width-relative:margin;mso-height-relative:margin;v-text-anchor:top" o:gfxdata="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" stroked="f">
                 <v:textbox inset="0,0,0,0">
                   <w:txbxContent>
                     <w:p>
@@ -7681,15 +7690,6 @@
           </mc:Fallback>
         </mc:AlternateContent>
       </w:r>
-    </w:p>
-    <w:p>
-      <w:pPr>
-        <w:jc w:val="both"/>
-        <w:rPr>
-          <w:rFonts w:ascii="Times New Roman" w:hAnsi="Times New Roman" w:cs="Times New Roman"/>
-          <w:lang w:val="tr-TR"/>
-        </w:rPr>
-      </w:pPr>
       <w:r>
         <w:rPr>
           <w:rFonts w:ascii="Times New Roman" w:hAnsi="Times New Roman" w:cs="Times New Roman"/>
@@ -8722,7 +8722,7 @@
         </w:rPr>
         <w:lastRenderedPageBreak/>
         <w:drawing>
-          <wp:anchor distT="0" distB="0" distL="114300" distR="114300" simplePos="0" relativeHeight="251695104" behindDoc="0" locked="0" layoutInCell="1" allowOverlap="1" wp14:anchorId="7D61ECF8" wp14:editId="462122F8">
+          <wp:anchor distT="0" distB="0" distL="114300" distR="114300" simplePos="0" relativeHeight="251695104" behindDoc="0" locked="0" layoutInCell="1" allowOverlap="1" wp14:anchorId="7D61ECF8" wp14:editId="0AF3F31C">
             <wp:simplePos x="0" y="0"/>
             <wp:positionH relativeFrom="column">
               <wp:posOffset>978568</wp:posOffset>
@@ -8865,16 +8865,16 @@
           <w:lang w:eastAsia="tr-TR"/>
         </w:rPr>
         <w:drawing>
-          <wp:anchor distT="0" distB="0" distL="114300" distR="114300" simplePos="0" relativeHeight="251696128" behindDoc="0" locked="0" layoutInCell="1" allowOverlap="1" wp14:anchorId="718374DE" wp14:editId="06F9ED83">
+          <wp:anchor distT="0" distB="0" distL="114300" distR="114300" simplePos="0" relativeHeight="251696128" behindDoc="0" locked="0" layoutInCell="1" allowOverlap="1" wp14:anchorId="718374DE" wp14:editId="4CE8683E">
             <wp:simplePos x="0" y="0"/>
             <wp:positionH relativeFrom="column">
               <wp:posOffset>978568</wp:posOffset>
             </wp:positionH>
             <wp:positionV relativeFrom="paragraph">
-              <wp:posOffset>38435</wp:posOffset>
+              <wp:posOffset>38434</wp:posOffset>
             </wp:positionV>
-            <wp:extent cx="3105785" cy="3120190"/>
-            <wp:effectExtent l="0" t="0" r="5715" b="4445"/>
+            <wp:extent cx="3105351" cy="3296653"/>
+            <wp:effectExtent l="0" t="0" r="0" b="5715"/>
             <wp:wrapNone/>
             <wp:docPr id="1685495282" name="Resim 17"/>
             <wp:cNvGraphicFramePr>
@@ -8902,7 +8902,7 @@
                   <pic:spPr>
                     <a:xfrm>
                       <a:off x="0" y="0"/>
-                      <a:ext cx="3111900" cy="3126334"/>
+                      <a:ext cx="3117423" cy="3309468"/>
                     </a:xfrm>
                     <a:prstGeom prst="rect">
                       <a:avLst/>
@@ -8997,13 +8997,13 @@
         <mc:AlternateContent>
           <mc:Choice Requires="wps">
             <w:drawing>
-              <wp:anchor distT="0" distB="0" distL="114300" distR="114300" simplePos="0" relativeHeight="251698176" behindDoc="0" locked="0" layoutInCell="1" allowOverlap="1" wp14:anchorId="578FFC31" wp14:editId="1C98F834">
+              <wp:anchor distT="0" distB="0" distL="114300" distR="114300" simplePos="0" relativeHeight="251698176" behindDoc="0" locked="0" layoutInCell="1" allowOverlap="1" wp14:anchorId="578FFC31" wp14:editId="738955CA">
                 <wp:simplePos x="0" y="0"/>
                 <wp:positionH relativeFrom="column">
-                  <wp:posOffset>978569</wp:posOffset>
+                  <wp:posOffset>978535</wp:posOffset>
                 </wp:positionH>
                 <wp:positionV relativeFrom="paragraph">
-                  <wp:posOffset>115771</wp:posOffset>
+                  <wp:posOffset>211823</wp:posOffset>
                 </wp:positionV>
                 <wp:extent cx="3168316" cy="174766"/>
                 <wp:effectExtent l="0" t="0" r="0" b="3175"/>
@@ -9093,7 +9093,7 @@
           </mc:Choice>
           <mc:Fallback>
             <w:pict>
-              <v:shape w14:anchorId="578FFC31" id="_x0000_s1034" type="#_x0000_t202" style="position:absolute;margin-left:77.05pt;margin-top:9.1pt;width:249.45pt;height:13.75pt;z-index:251698176;visibility:visible;mso-wrap-style:square;mso-width-percent:0;mso-height-percent:0;mso-wrap-distance-left:9pt;mso-wrap-distance-top:0;mso-wrap-distance-right:9pt;mso-wrap-distance-bottom:0;mso-position-horizontal:absolute;mso-position-horizontal-relative:text;mso-position-vertical:absolute;mso-position-vertical-relative:text;mso-width-percent:0;mso-height-percent:0;mso-width-relative:margin;mso-height-relative:margin;v-text-anchor:top" o:gfxdata="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" stroked="f">
+              <v:shape w14:anchorId="578FFC31" id="_x0000_s1034" type="#_x0000_t202" style="position:absolute;margin-left:77.05pt;margin-top:16.7pt;width:249.45pt;height:13.75pt;z-index:251698176;visibility:visible;mso-wrap-style:square;mso-width-percent:0;mso-height-percent:0;mso-wrap-distance-left:9pt;mso-wrap-distance-top:0;mso-wrap-distance-right:9pt;mso-wrap-distance-bottom:0;mso-position-horizontal:absolute;mso-position-horizontal-relative:text;mso-position-vertical:absolute;mso-position-vertical-relative:text;mso-width-percent:0;mso-height-percent:0;mso-width-relative:margin;mso-height-relative:margin;v-text-anchor:top" o:gfxdata="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" stroked="f">
                 <v:textbox inset="0,0,0,0">
                   <w:txbxContent>
                     <w:p>
@@ -9423,7 +9423,7 @@
                                 <w:bCs/>
                                 <w:color w:val="000000" w:themeColor="text1"/>
                               </w:rPr>
-                              <w:t>3</w:t>
+                              <w:t>7</w:t>
                             </w:r>
                             <w:r>
                               <w:rPr>
@@ -9496,7 +9496,7 @@
                           <w:bCs/>
                           <w:color w:val="000000" w:themeColor="text1"/>
                         </w:rPr>
-                        <w:t>3</w:t>
+                        <w:t>7</w:t>
                       </w:r>
                       <w:r>
                         <w:rPr>
@@ -12617,7 +12617,7 @@
 </file>
 
 <file path=word/endnotes.xml><?xml version="1.0" encoding="utf-8"?>
-<w:endnotes xmlns:wpc="http://schemas.microsoft.com/office/word/2010/wordprocessingCanvas" xmlns:cx="http://schemas.microsoft.com/office/drawing/2014/chartex" xmlns:cx1="http://schemas.microsoft.com/office/drawing/2015/9/8/chartex" xmlns:cx2="http://schemas.microsoft.com/office/drawing/2015/10/21/chartex" xmlns:cx3="http://schemas.microsoft.com/office/drawing/2016/5/9/chartex" xmlns:cx4="http://schemas.microsoft.com/office/drawing/2016/5/10/chartex" xmlns:cx5="http://schemas.microsoft.com/office/drawing/2016/5/11/chartex" xmlns:cx6="http://schemas.microsoft.com/office/drawing/2016/5/12/chartex" xmlns:cx7="http://schemas.microsoft.com/office/drawing/2016/5/13/chartex" xmlns:cx8="http://schemas.microsoft.com/office/drawing/2016/5/14/chartex" xmlns:mc="http://schemas.openxmlformats.org/markup-compatibility/2006" xmlns:m="http://schemas.openxmlformats.org/officeDocument/2006/math" xmlns:aink="http://schemas.microsoft.com/office/drawing/2016/ink" xmlns:am3d="http://schemas.microsoft.com/office/drawing/2017/model3d" xmlns:oel="http://schemas.microsoft.com/office/2019/extlst" xmlns:r="http://schemas.openxmlformats.org/officeDocument/2006/relationships" xmlns:wp14="http://schemas.microsoft.com/office/word/2010/wordprocessingDrawing" xmlns:wp="http://schemas.openxmlformats.org/drawingml/2006/wordprocessingDrawing" xmlns:wpg="http://schemas.microsoft.com/office/word/2010/wordprocessingGroup" xmlns:wpi="http://schemas.microsoft.com/office/word/2010/wordprocessingInk" xmlns:wps="http://schemas.microsoft.com/office/word/2010/wordprocessingShape" xmlns:o="urn:schemas-microsoft-com:office:office" xmlns:v="urn:schemas-microsoft-com:vml" xmlns:w10="urn:schemas-microsoft-com:office:word" xmlns:w="http://schemas.openxmlformats.org/wordprocessingml/2006/main" xmlns:w14="http://schemas.microsoft.com/office/word/2010/wordml" xmlns:w15="http://schemas.microsoft.com/office/word/2012/wordml" xmlns:w16cex="http://schemas.microsoft.com/office/word/2018/wordml/cex" xmlns:w16cid="http://schemas.microsoft.com/office/word/2016/wordml/cid" xmlns:w16="http://schemas.microsoft.com/office/word/2018/wordml" xmlns:w16sdtdh="http://schemas.microsoft.com/office/word/2020/wordml/sdtdatahash" xmlns:w16sdtfl="http://schemas.microsoft.com/office/word/2024/wordml/sdtformatlock" xmlns:w16se="http://schemas.microsoft.com/office/word/2015/wordml/symex" xmlns:w16du="http://schemas.microsoft.com/office/word/2023/wordml/word16du" xmlns:wne="http://schemas.microsoft.com/office/word/2006/wordml" mc:Ignorable="w14 w15 w16se w16cid w16 w16cex w16sdtdh w16sdtfl w16du wp14">
+<w:endnotes xmlns:wpc="http://schemas.microsoft.com/office/word/2010/wordprocessingCanvas" xmlns:cx="http://schemas.microsoft.com/office/drawing/2014/chartex" xmlns:cx1="http://schemas.microsoft.com/office/drawing/2015/9/8/chartex" xmlns:cx2="http://schemas.microsoft.com/office/drawing/2015/10/21/chartex" xmlns:cx3="http://schemas.microsoft.com/office/drawing/2016/5/9/chartex" xmlns:cx4="http://schemas.microsoft.com/office/drawing/2016/5/10/chartex" xmlns:cx5="http://schemas.microsoft.com/office/drawing/2016/5/11/chartex" xmlns:cx6="http://schemas.microsoft.com/office/drawing/2016/5/12/chartex" xmlns:cx7="http://schemas.microsoft.com/office/drawing/2016/5/13/chartex" xmlns:cx8="http://schemas.microsoft.com/office/drawing/2016/5/14/chartex" xmlns:mc="http://schemas.openxmlformats.org/markup-compatibility/2006" xmlns:m="http://schemas.openxmlformats.org/officeDocument/2006/math" xmlns:aink="http://schemas.microsoft.com/office/drawing/2016/ink" xmlns:am3d="http://schemas.microsoft.com/office/drawing/2017/model3d" xmlns:oel="http://schemas.microsoft.com/office/2019/extlst" xmlns:r="http://schemas.openxmlformats.org/officeDocument/2006/relationships" xmlns:wp14="http://schemas.microsoft.com/office/word/2010/wordprocessingDrawing" xmlns:wp="http://schemas.openxmlformats.org/drawingml/2006/wordprocessingDrawing" xmlns:wpg="http://schemas.microsoft.com/office/word/2010/wordprocessingGroup" xmlns:wpi="http://schemas.microsoft.com/office/word/2010/wordprocessingInk" xmlns:wps="http://schemas.microsoft.com/office/word/2010/wordprocessingShape" xmlns:o="urn:schemas-microsoft-com:office:office" xmlns:v="urn:schemas-microsoft-com:vml" xmlns:w10="urn:schemas-microsoft-com:office:word" xmlns:w="http://schemas.openxmlformats.org/wordprocessingml/2006/main" xmlns:w14="http://schemas.microsoft.com/office/word/2010/wordml" xmlns:w15="http://schemas.microsoft.com/office/word/2012/wordml" xmlns:w16cei="http://schemas.microsoft.com/office/word/2026/wordml/cei" xmlns:w16cex="http://schemas.microsoft.com/office/word/2018/wordml/cex" xmlns:w16cid="http://schemas.microsoft.com/office/word/2016/wordml/cid" xmlns:w16="http://schemas.microsoft.com/office/word/2018/wordml" xmlns:w16sdtdh="http://schemas.microsoft.com/office/word/2020/wordml/sdtdatahash" xmlns:w16sdtfl="http://schemas.microsoft.com/office/word/2024/wordml/sdtformatlock" xmlns:w16se="http://schemas.microsoft.com/office/word/2015/wordml/symex" xmlns:w16du="http://schemas.microsoft.com/office/word/2023/wordml/word16du" xmlns:wne="http://schemas.microsoft.com/office/word/2006/wordml" mc:Ignorable="w14 w15 w16se w16cid w16 w16cex w16sdtdh w16sdtfl w16du wp14">
   <w:endnote w:type="separator" w:id="-1">
     <w:p>
       <w:pPr>
@@ -12642,7 +12642,7 @@
 </file>
 
 <file path=word/footnotes.xml><?xml version="1.0" encoding="utf-8"?>
-<w:footnotes xmlns:wpc="http://schemas.microsoft.com/office/word/2010/wordprocessingCanvas" xmlns:cx="http://schemas.microsoft.com/office/drawing/2014/chartex" xmlns:cx1="http://schemas.microsoft.com/office/drawing/2015/9/8/chartex" xmlns:cx2="http://schemas.microsoft.com/office/drawing/2015/10/21/chartex" xmlns:cx3="http://schemas.microsoft.com/office/drawing/2016/5/9/chartex" xmlns:cx4="http://schemas.microsoft.com/office/drawing/2016/5/10/chartex" xmlns:cx5="http://schemas.microsoft.com/office/drawing/2016/5/11/chartex" xmlns:cx6="http://schemas.microsoft.com/office/drawing/2016/5/12/chartex" xmlns:cx7="http://schemas.microsoft.com/office/drawing/2016/5/13/chartex" xmlns:cx8="http://schemas.microsoft.com/office/drawing/2016/5/14/chartex" xmlns:mc="http://schemas.openxmlformats.org/markup-compatibility/2006" xmlns:m="http://schemas.openxmlformats.org/officeDocument/2006/math" xmlns:aink="http://schemas.microsoft.com/office/drawing/2016/ink" xmlns:am3d="http://schemas.microsoft.com/office/drawing/2017/model3d" xmlns:oel="http://schemas.microsoft.com/office/2019/extlst" xmlns:r="http://schemas.openxmlformats.org/officeDocument/2006/relationships" xmlns:wp14="http://schemas.microsoft.com/office/word/2010/wordprocessingDrawing" xmlns:wp="http://schemas.openxmlformats.org/drawingml/2006/wordprocessingDrawing" xmlns:wpg="http://schemas.microsoft.com/office/word/2010/wordprocessingGroup" xmlns:wpi="http://schemas.microsoft.com/office/word/2010/wordprocessingInk" xmlns:wps="http://schemas.microsoft.com/office/word/2010/wordprocessingShape" xmlns:o="urn:schemas-microsoft-com:office:office" xmlns:v="urn:schemas-microsoft-com:vml" xmlns:w10="urn:schemas-microsoft-com:office:word" xmlns:w="http://schemas.openxmlformats.org/wordprocessingml/2006/main" xmlns:w14="http://schemas.microsoft.com/office/word/2010/wordml" xmlns:w15="http://schemas.microsoft.com/office/word/2012/wordml" xmlns:w16cex="http://schemas.microsoft.com/office/word/2018/wordml/cex" xmlns:w16cid="http://schemas.microsoft.com/office/word/2016/wordml/cid" xmlns:w16="http://schemas.microsoft.com/office/word/2018/wordml" xmlns:w16sdtdh="http://schemas.microsoft.com/office/word/2020/wordml/sdtdatahash" xmlns:w16sdtfl="http://schemas.microsoft.com/office/word/2024/wordml/sdtformatlock" xmlns:w16se="http://schemas.microsoft.com/office/word/2015/wordml/symex" xmlns:w16du="http://schemas.microsoft.com/office/word/2023/wordml/word16du" xmlns:wne="http://schemas.microsoft.com/office/word/2006/wordml" mc:Ignorable="w14 w15 w16se w16cid w16 w16cex w16sdtdh w16sdtfl w16du wp14">
+<w:footnotes xmlns:wpc="http://schemas.microsoft.com/office/word/2010/wordprocessingCanvas" xmlns:cx="http://schemas.microsoft.com/office/drawing/2014/chartex" xmlns:cx1="http://schemas.microsoft.com/office/drawing/2015/9/8/chartex" xmlns:cx2="http://schemas.microsoft.com/office/drawing/2015/10/21/chartex" xmlns:cx3="http://schemas.microsoft.com/office/drawing/2016/5/9/chartex" xmlns:cx4="http://schemas.microsoft.com/office/drawing/2016/5/10/chartex" xmlns:cx5="http://schemas.microsoft.com/office/drawing/2016/5/11/chartex" xmlns:cx6="http://schemas.microsoft.com/office/drawing/2016/5/12/chartex" xmlns:cx7="http://schemas.microsoft.com/office/drawing/2016/5/13/chartex" xmlns:cx8="http://schemas.microsoft.com/office/drawing/2016/5/14/chartex" xmlns:mc="http://schemas.openxmlformats.org/markup-compatibility/2006" xmlns:m="http://schemas.openxmlformats.org/officeDocument/2006/math" xmlns:aink="http://schemas.microsoft.com/office/drawing/2016/ink" xmlns:am3d="http://schemas.microsoft.com/office/drawing/2017/model3d" xmlns:oel="http://schemas.microsoft.com/office/2019/extlst" xmlns:r="http://schemas.openxmlformats.org/officeDocument/2006/relationships" xmlns:wp14="http://schemas.microsoft.com/office/word/2010/wordprocessingDrawing" xmlns:wp="http://schemas.openxmlformats.org/drawingml/2006/wordprocessingDrawing" xmlns:wpg="http://schemas.microsoft.com/office/word/2010/wordprocessingGroup" xmlns:wpi="http://schemas.microsoft.com/office/word/2010/wordprocessingInk" xmlns:wps="http://schemas.microsoft.com/office/word/2010/wordprocessingShape" xmlns:o="urn:schemas-microsoft-com:office:office" xmlns:v="urn:schemas-microsoft-com:vml" xmlns:w10="urn:schemas-microsoft-com:office:word" xmlns:w="http://schemas.openxmlformats.org/wordprocessingml/2006/main" xmlns:w14="http://schemas.microsoft.com/office/word/2010/wordml" xmlns:w15="http://schemas.microsoft.com/office/word/2012/wordml" xmlns:w16cei="http://schemas.microsoft.com/office/word/2026/wordml/cei" xmlns:w16cex="http://schemas.microsoft.com/office/word/2018/wordml/cex" xmlns:w16cid="http://schemas.microsoft.com/office/word/2016/wordml/cid" xmlns:w16="http://schemas.microsoft.com/office/word/2018/wordml" xmlns:w16sdtdh="http://schemas.microsoft.com/office/word/2020/wordml/sdtdatahash" xmlns:w16sdtfl="http://schemas.microsoft.com/office/word/2024/wordml/sdtformatlock" xmlns:w16se="http://schemas.microsoft.com/office/word/2015/wordml/symex" xmlns:w16du="http://schemas.microsoft.com/office/word/2023/wordml/word16du" xmlns:wne="http://schemas.microsoft.com/office/word/2006/wordml" mc:Ignorable="w14 w15 w16se w16cid w16 w16cex w16sdtdh w16sdtfl w16du wp14">
   <w:footnote w:type="separator" w:id="-1">
     <w:p>
       <w:pPr>

</xml_diff>

<commit_message>
add strengths & weaknesses for the text feature extraction and trained baseline classifier section to the Project3 Report, improve comments of the project3
</commit_message>
<xml_diff>
--- a/Project3_Report.docx
+++ b/Project3_Report.docx
@@ -2870,7 +2870,33 @@
           <w:szCs w:val="18"/>
           <w:lang w:val="tr-TR"/>
         </w:rPr>
-        <w:t xml:space="preserve">Code used for train test splitting, text feature extraction, and baseline model training, and baseline model evaluation using accuracy score </w:t>
+        <w:t>Code used for train</w:t>
+      </w:r>
+      <w:r>
+        <w:rPr>
+          <w:rFonts w:ascii="Times New Roman" w:hAnsi="Times New Roman" w:cs="Times New Roman"/>
+          <w:b/>
+          <w:bCs/>
+          <w:i/>
+          <w:iCs/>
+          <w:sz w:val="18"/>
+          <w:szCs w:val="18"/>
+          <w:lang w:val="tr-TR"/>
+        </w:rPr>
+        <w:t>-</w:t>
+      </w:r>
+      <w:r>
+        <w:rPr>
+          <w:rFonts w:ascii="Times New Roman" w:hAnsi="Times New Roman" w:cs="Times New Roman"/>
+          <w:b/>
+          <w:bCs/>
+          <w:i/>
+          <w:iCs/>
+          <w:sz w:val="18"/>
+          <w:szCs w:val="18"/>
+          <w:lang w:val="tr-TR"/>
+        </w:rPr>
+        <w:t xml:space="preserve">test splitting, text feature extraction, and baseline model training, and baseline model evaluation using accuracy score </w:t>
       </w:r>
       <w:r>
         <w:rPr>
@@ -6488,7 +6514,7 @@
           <w:szCs w:val="22"/>
           <w:lang w:eastAsia="tr-TR"/>
         </w:rPr>
-        <w:t xml:space="preserve">remaining classes except Class 1, which are Class 0, 2, </w:t>
+        <w:t xml:space="preserve">remaining classes except Class 1, which are Class 0, </w:t>
       </w:r>
       <w:r>
         <w:rPr>
@@ -6497,7 +6523,34 @@
           <w:szCs w:val="22"/>
           <w:lang w:eastAsia="tr-TR"/>
         </w:rPr>
+        <w:t xml:space="preserve">Class </w:t>
+      </w:r>
+      <w:r>
+        <w:rPr>
+          <w:rFonts w:ascii="Times New Roman" w:eastAsia="Times New Roman" w:hAnsi="Times New Roman" w:cs="Times New Roman"/>
+          <w:sz w:val="22"/>
+          <w:szCs w:val="22"/>
+          <w:lang w:eastAsia="tr-TR"/>
+        </w:rPr>
+        <w:t xml:space="preserve">2, </w:t>
+      </w:r>
+      <w:r>
+        <w:rPr>
+          <w:rFonts w:ascii="Times New Roman" w:eastAsia="Times New Roman" w:hAnsi="Times New Roman" w:cs="Times New Roman"/>
+          <w:sz w:val="22"/>
+          <w:szCs w:val="22"/>
+          <w:lang w:eastAsia="tr-TR"/>
+        </w:rPr>
         <w:t xml:space="preserve">and </w:t>
+      </w:r>
+      <w:r>
+        <w:rPr>
+          <w:rFonts w:ascii="Times New Roman" w:eastAsia="Times New Roman" w:hAnsi="Times New Roman" w:cs="Times New Roman"/>
+          <w:sz w:val="22"/>
+          <w:szCs w:val="22"/>
+          <w:lang w:eastAsia="tr-TR"/>
+        </w:rPr>
+        <w:t xml:space="preserve">Class </w:t>
       </w:r>
       <w:r>
         <w:rPr>
@@ -6700,6 +6753,657 @@
         <w:jc w:val="both"/>
         <w:rPr>
           <w:rFonts w:ascii="Times New Roman" w:hAnsi="Times New Roman" w:cs="Times New Roman"/>
+          <w:sz w:val="22"/>
+          <w:szCs w:val="22"/>
+        </w:rPr>
+      </w:pPr>
+    </w:p>
+    <w:p>
+      <w:pPr>
+        <w:spacing w:after="0"/>
+        <w:jc w:val="both"/>
+        <w:rPr>
+          <w:rFonts w:ascii="Times New Roman" w:hAnsi="Times New Roman" w:cs="Times New Roman"/>
+          <w:b/>
+          <w:bCs/>
+          <w:sz w:val="22"/>
+          <w:szCs w:val="22"/>
+          <w:u w:val="single"/>
+        </w:rPr>
+      </w:pPr>
+      <w:r>
+        <w:rPr>
+          <w:rFonts w:ascii="Times New Roman" w:hAnsi="Times New Roman" w:cs="Times New Roman"/>
+          <w:b/>
+          <w:bCs/>
+          <w:sz w:val="22"/>
+          <w:szCs w:val="22"/>
+          <w:u w:val="single"/>
+        </w:rPr>
+        <w:t xml:space="preserve">Strengths </w:t>
+      </w:r>
+      <w:r>
+        <w:rPr>
+          <w:rFonts w:ascii="Times New Roman" w:hAnsi="Times New Roman" w:cs="Times New Roman"/>
+          <w:b/>
+          <w:bCs/>
+          <w:sz w:val="22"/>
+          <w:szCs w:val="22"/>
+          <w:u w:val="single"/>
+        </w:rPr>
+        <w:t xml:space="preserve">of </w:t>
+      </w:r>
+      <w:r>
+        <w:rPr>
+          <w:rFonts w:ascii="Times New Roman" w:hAnsi="Times New Roman" w:cs="Times New Roman"/>
+          <w:b/>
+          <w:bCs/>
+          <w:sz w:val="22"/>
+          <w:szCs w:val="22"/>
+          <w:u w:val="single"/>
+        </w:rPr>
+        <w:t>the Trained Baseline Classifier and Text Feature Extraction</w:t>
+      </w:r>
+    </w:p>
+    <w:p>
+      <w:pPr>
+        <w:spacing w:after="0"/>
+        <w:jc w:val="both"/>
+        <w:rPr>
+          <w:rFonts w:ascii="Times New Roman" w:hAnsi="Times New Roman" w:cs="Times New Roman"/>
+          <w:b/>
+          <w:bCs/>
+          <w:sz w:val="22"/>
+          <w:szCs w:val="22"/>
+          <w:u w:val="single"/>
+        </w:rPr>
+      </w:pPr>
+    </w:p>
+    <w:p>
+      <w:pPr>
+        <w:spacing w:after="0"/>
+        <w:jc w:val="both"/>
+        <w:rPr>
+          <w:rFonts w:ascii="Times New Roman" w:hAnsi="Times New Roman" w:cs="Times New Roman"/>
+          <w:sz w:val="22"/>
+          <w:szCs w:val="22"/>
+        </w:rPr>
+      </w:pPr>
+      <w:r>
+        <w:rPr>
+          <w:rFonts w:ascii="Times New Roman" w:hAnsi="Times New Roman" w:cs="Times New Roman"/>
+          <w:b/>
+          <w:bCs/>
+          <w:sz w:val="22"/>
+          <w:szCs w:val="22"/>
+        </w:rPr>
+        <w:t xml:space="preserve">1. </w:t>
+      </w:r>
+      <w:r>
+        <w:rPr>
+          <w:rFonts w:ascii="Times New Roman" w:hAnsi="Times New Roman" w:cs="Times New Roman"/>
+          <w:b/>
+          <w:bCs/>
+          <w:sz w:val="22"/>
+          <w:szCs w:val="22"/>
+        </w:rPr>
+        <w:t xml:space="preserve">English Stop Words Removal: </w:t>
+      </w:r>
+      <w:r>
+        <w:rPr>
+          <w:rFonts w:ascii="Times New Roman" w:hAnsi="Times New Roman" w:cs="Times New Roman"/>
+          <w:sz w:val="22"/>
+          <w:szCs w:val="22"/>
+        </w:rPr>
+        <w:t xml:space="preserve">The English stop words that </w:t>
+      </w:r>
+      <w:r>
+        <w:rPr>
+          <w:rFonts w:ascii="Times New Roman" w:hAnsi="Times New Roman" w:cs="Times New Roman"/>
+          <w:sz w:val="22"/>
+          <w:szCs w:val="22"/>
+        </w:rPr>
+        <w:t>do carry a little</w:t>
+      </w:r>
+      <w:r>
+        <w:rPr>
+          <w:rFonts w:ascii="Times New Roman" w:hAnsi="Times New Roman" w:cs="Times New Roman"/>
+          <w:sz w:val="22"/>
+          <w:szCs w:val="22"/>
+        </w:rPr>
+        <w:t xml:space="preserve"> significance are removed from the vocabulary and consideration of the TF-IDF Vectorizer algorithm. So that it can focus on the words that carry more importance in that specific sentence, which will bring </w:t>
+      </w:r>
+      <w:r>
+        <w:rPr>
+          <w:rFonts w:ascii="Times New Roman" w:hAnsi="Times New Roman" w:cs="Times New Roman"/>
+          <w:sz w:val="22"/>
+          <w:szCs w:val="22"/>
+        </w:rPr>
+        <w:t xml:space="preserve">a </w:t>
+      </w:r>
+      <w:r>
+        <w:rPr>
+          <w:rFonts w:ascii="Times New Roman" w:hAnsi="Times New Roman" w:cs="Times New Roman"/>
+          <w:sz w:val="22"/>
+          <w:szCs w:val="22"/>
+        </w:rPr>
+        <w:t xml:space="preserve">higher model accuracy score on the unseen test data. </w:t>
+      </w:r>
+    </w:p>
+    <w:p>
+      <w:pPr>
+        <w:spacing w:after="0"/>
+        <w:jc w:val="both"/>
+        <w:rPr>
+          <w:rFonts w:ascii="Times New Roman" w:hAnsi="Times New Roman" w:cs="Times New Roman"/>
+          <w:sz w:val="22"/>
+          <w:szCs w:val="22"/>
+        </w:rPr>
+      </w:pPr>
+    </w:p>
+    <w:p>
+      <w:pPr>
+        <w:spacing w:after="0"/>
+        <w:jc w:val="both"/>
+        <w:rPr>
+          <w:rFonts w:ascii="Times New Roman" w:hAnsi="Times New Roman" w:cs="Times New Roman"/>
+          <w:sz w:val="22"/>
+          <w:szCs w:val="22"/>
+        </w:rPr>
+      </w:pPr>
+      <w:r>
+        <w:rPr>
+          <w:rFonts w:ascii="Times New Roman" w:hAnsi="Times New Roman" w:cs="Times New Roman"/>
+          <w:sz w:val="22"/>
+          <w:szCs w:val="22"/>
+        </w:rPr>
+        <w:t xml:space="preserve">2. </w:t>
+      </w:r>
+      <w:r>
+        <w:rPr>
+          <w:rFonts w:ascii="Times New Roman" w:hAnsi="Times New Roman" w:cs="Times New Roman"/>
+          <w:b/>
+          <w:bCs/>
+          <w:sz w:val="22"/>
+          <w:szCs w:val="22"/>
+        </w:rPr>
+        <w:t xml:space="preserve">Overfitting Avoidance Level: </w:t>
+      </w:r>
+      <w:r>
+        <w:rPr>
+          <w:rFonts w:ascii="Times New Roman" w:hAnsi="Times New Roman" w:cs="Times New Roman"/>
+          <w:sz w:val="22"/>
+          <w:szCs w:val="22"/>
+        </w:rPr>
+        <w:t xml:space="preserve">The baseline classifier model that I used adequately prevents overfitting with the inverse of the regularization parameter set to 0.4 (C = 0.4), which will make the algorithm avoid overfitting and put higher levels of regularization penalties, and the maximum number of iterations (epochs) set to 200, which might prevent earlier convergence. </w:t>
+      </w:r>
+    </w:p>
+    <w:p>
+      <w:pPr>
+        <w:spacing w:after="0"/>
+        <w:jc w:val="both"/>
+        <w:rPr>
+          <w:rFonts w:ascii="Times New Roman" w:hAnsi="Times New Roman" w:cs="Times New Roman"/>
+          <w:sz w:val="22"/>
+          <w:szCs w:val="22"/>
+        </w:rPr>
+      </w:pPr>
+    </w:p>
+    <w:p>
+      <w:pPr>
+        <w:spacing w:after="0"/>
+        <w:jc w:val="both"/>
+        <w:rPr>
+          <w:rFonts w:ascii="Times New Roman" w:hAnsi="Times New Roman" w:cs="Times New Roman"/>
+          <w:sz w:val="22"/>
+          <w:szCs w:val="22"/>
+        </w:rPr>
+      </w:pPr>
+      <w:r>
+        <w:rPr>
+          <w:rFonts w:ascii="Times New Roman" w:hAnsi="Times New Roman" w:cs="Times New Roman"/>
+          <w:sz w:val="22"/>
+          <w:szCs w:val="22"/>
+        </w:rPr>
+        <w:t xml:space="preserve">3. </w:t>
+      </w:r>
+      <w:r>
+        <w:rPr>
+          <w:rFonts w:ascii="Times New Roman" w:hAnsi="Times New Roman" w:cs="Times New Roman"/>
+          <w:b/>
+          <w:bCs/>
+          <w:sz w:val="22"/>
+          <w:szCs w:val="22"/>
+        </w:rPr>
+        <w:t xml:space="preserve">Maximum Number of Text Features Limitation: </w:t>
+      </w:r>
+      <w:r>
+        <w:rPr>
+          <w:rFonts w:ascii="Times New Roman" w:hAnsi="Times New Roman" w:cs="Times New Roman"/>
+          <w:sz w:val="22"/>
+          <w:szCs w:val="22"/>
+        </w:rPr>
+        <w:t xml:space="preserve">In my implementation, I have set the </w:t>
+      </w:r>
+      <w:r>
+        <w:rPr>
+          <w:rFonts w:ascii="Times New Roman" w:hAnsi="Times New Roman" w:cs="Times New Roman"/>
+          <w:b/>
+          <w:bCs/>
+          <w:i/>
+          <w:iCs/>
+          <w:sz w:val="22"/>
+          <w:szCs w:val="22"/>
+        </w:rPr>
+        <w:t>“max_features”</w:t>
+      </w:r>
+      <w:r>
+        <w:rPr>
+          <w:rFonts w:ascii="Times New Roman" w:hAnsi="Times New Roman" w:cs="Times New Roman"/>
+          <w:sz w:val="22"/>
+          <w:szCs w:val="22"/>
+        </w:rPr>
+        <w:t xml:space="preserve"> parameter in the “TF-IDF Vectorizer” algorithm to </w:t>
+      </w:r>
+      <w:r>
+        <w:rPr>
+          <w:rFonts w:ascii="Times New Roman" w:hAnsi="Times New Roman" w:cs="Times New Roman"/>
+          <w:b/>
+          <w:bCs/>
+          <w:sz w:val="22"/>
+          <w:szCs w:val="22"/>
+        </w:rPr>
+        <w:t>5000,</w:t>
+      </w:r>
+      <w:r>
+        <w:rPr>
+          <w:rFonts w:ascii="Times New Roman" w:hAnsi="Times New Roman" w:cs="Times New Roman"/>
+          <w:sz w:val="22"/>
+          <w:szCs w:val="22"/>
+        </w:rPr>
+        <w:t xml:space="preserve"> which will discard words other than the top 5000 most frequent words in the unique words set. </w:t>
+      </w:r>
+      <w:r>
+        <w:rPr>
+          <w:rFonts w:ascii="Times New Roman" w:hAnsi="Times New Roman" w:cs="Times New Roman"/>
+          <w:sz w:val="22"/>
+          <w:szCs w:val="22"/>
+        </w:rPr>
+        <w:t xml:space="preserve">This </w:t>
+      </w:r>
+      <w:r>
+        <w:rPr>
+          <w:rFonts w:ascii="Times New Roman" w:hAnsi="Times New Roman" w:cs="Times New Roman"/>
+          <w:sz w:val="22"/>
+          <w:szCs w:val="22"/>
+        </w:rPr>
+        <w:t xml:space="preserve">might make the algorithm avoid overfitting more by avoiding less frequent and unimportant words such as </w:t>
+      </w:r>
+      <w:r>
+        <w:rPr>
+          <w:rFonts w:ascii="Times New Roman" w:hAnsi="Times New Roman" w:cs="Times New Roman"/>
+          <w:b/>
+          <w:bCs/>
+          <w:sz w:val="22"/>
+          <w:szCs w:val="22"/>
+        </w:rPr>
+        <w:t>“the”</w:t>
+      </w:r>
+      <w:r>
+        <w:rPr>
+          <w:rFonts w:ascii="Times New Roman" w:hAnsi="Times New Roman" w:cs="Times New Roman"/>
+          <w:sz w:val="22"/>
+          <w:szCs w:val="22"/>
+        </w:rPr>
+        <w:t xml:space="preserve"> and </w:t>
+      </w:r>
+      <w:r>
+        <w:rPr>
+          <w:rFonts w:ascii="Times New Roman" w:hAnsi="Times New Roman" w:cs="Times New Roman"/>
+          <w:b/>
+          <w:bCs/>
+          <w:sz w:val="22"/>
+          <w:szCs w:val="22"/>
+        </w:rPr>
+        <w:t>“and”</w:t>
+      </w:r>
+      <w:r>
+        <w:rPr>
+          <w:rFonts w:ascii="Times New Roman" w:hAnsi="Times New Roman" w:cs="Times New Roman"/>
+          <w:sz w:val="22"/>
+          <w:szCs w:val="22"/>
+        </w:rPr>
+        <w:t>.</w:t>
+      </w:r>
+    </w:p>
+    <w:p>
+      <w:pPr>
+        <w:spacing w:after="0"/>
+        <w:jc w:val="both"/>
+        <w:rPr>
+          <w:rFonts w:ascii="Times New Roman" w:hAnsi="Times New Roman" w:cs="Times New Roman"/>
+          <w:sz w:val="22"/>
+          <w:szCs w:val="22"/>
+        </w:rPr>
+      </w:pPr>
+    </w:p>
+    <w:p>
+      <w:pPr>
+        <w:spacing w:after="0"/>
+        <w:jc w:val="both"/>
+        <w:rPr>
+          <w:rFonts w:ascii="Times New Roman" w:hAnsi="Times New Roman" w:cs="Times New Roman"/>
+          <w:sz w:val="22"/>
+          <w:szCs w:val="22"/>
+        </w:rPr>
+      </w:pPr>
+    </w:p>
+    <w:p>
+      <w:pPr>
+        <w:spacing w:after="0"/>
+        <w:jc w:val="both"/>
+        <w:rPr>
+          <w:rFonts w:ascii="Times New Roman" w:hAnsi="Times New Roman" w:cs="Times New Roman"/>
+          <w:sz w:val="22"/>
+          <w:szCs w:val="22"/>
+        </w:rPr>
+      </w:pPr>
+    </w:p>
+    <w:p>
+      <w:pPr>
+        <w:spacing w:after="0"/>
+        <w:jc w:val="both"/>
+        <w:rPr>
+          <w:rFonts w:ascii="Times New Roman" w:hAnsi="Times New Roman" w:cs="Times New Roman"/>
+          <w:sz w:val="22"/>
+          <w:szCs w:val="22"/>
+        </w:rPr>
+      </w:pPr>
+    </w:p>
+    <w:p>
+      <w:pPr>
+        <w:spacing w:after="0"/>
+        <w:jc w:val="both"/>
+        <w:rPr>
+          <w:rFonts w:ascii="Times New Roman" w:hAnsi="Times New Roman" w:cs="Times New Roman"/>
+          <w:sz w:val="22"/>
+          <w:szCs w:val="22"/>
+        </w:rPr>
+      </w:pPr>
+    </w:p>
+    <w:p>
+      <w:pPr>
+        <w:spacing w:after="0"/>
+        <w:jc w:val="both"/>
+        <w:rPr>
+          <w:rFonts w:ascii="Times New Roman" w:hAnsi="Times New Roman" w:cs="Times New Roman"/>
+          <w:b/>
+          <w:bCs/>
+          <w:sz w:val="22"/>
+          <w:szCs w:val="22"/>
+          <w:u w:val="single"/>
+        </w:rPr>
+      </w:pPr>
+      <w:r>
+        <w:rPr>
+          <w:rFonts w:ascii="Times New Roman" w:hAnsi="Times New Roman" w:cs="Times New Roman"/>
+          <w:b/>
+          <w:bCs/>
+          <w:sz w:val="22"/>
+          <w:szCs w:val="22"/>
+          <w:u w:val="single"/>
+        </w:rPr>
+        <w:lastRenderedPageBreak/>
+        <w:t xml:space="preserve">Weaknesses </w:t>
+      </w:r>
+      <w:r>
+        <w:rPr>
+          <w:rFonts w:ascii="Times New Roman" w:hAnsi="Times New Roman" w:cs="Times New Roman"/>
+          <w:b/>
+          <w:bCs/>
+          <w:sz w:val="22"/>
+          <w:szCs w:val="22"/>
+          <w:u w:val="single"/>
+        </w:rPr>
+        <w:t>of</w:t>
+      </w:r>
+      <w:r>
+        <w:rPr>
+          <w:rFonts w:ascii="Times New Roman" w:hAnsi="Times New Roman" w:cs="Times New Roman"/>
+          <w:b/>
+          <w:bCs/>
+          <w:sz w:val="22"/>
+          <w:szCs w:val="22"/>
+          <w:u w:val="single"/>
+        </w:rPr>
+        <w:t xml:space="preserve"> the Trained Baseline Classifier and Text Feature Extraction</w:t>
+      </w:r>
+    </w:p>
+    <w:p>
+      <w:pPr>
+        <w:spacing w:after="0"/>
+        <w:jc w:val="both"/>
+        <w:rPr>
+          <w:rFonts w:ascii="Times New Roman" w:hAnsi="Times New Roman" w:cs="Times New Roman"/>
+          <w:b/>
+          <w:bCs/>
+          <w:sz w:val="22"/>
+          <w:szCs w:val="22"/>
+          <w:u w:val="single"/>
+        </w:rPr>
+      </w:pPr>
+    </w:p>
+    <w:p>
+      <w:pPr>
+        <w:spacing w:after="0"/>
+        <w:jc w:val="both"/>
+        <w:rPr>
+          <w:rFonts w:ascii="Times New Roman" w:hAnsi="Times New Roman" w:cs="Times New Roman"/>
+          <w:sz w:val="22"/>
+          <w:szCs w:val="22"/>
+        </w:rPr>
+      </w:pPr>
+      <w:r>
+        <w:rPr>
+          <w:rFonts w:ascii="Times New Roman" w:hAnsi="Times New Roman" w:cs="Times New Roman"/>
+          <w:b/>
+          <w:bCs/>
+          <w:sz w:val="22"/>
+          <w:szCs w:val="22"/>
+        </w:rPr>
+        <w:t xml:space="preserve">1. Context and Word Order Loss: </w:t>
+      </w:r>
+      <w:r>
+        <w:rPr>
+          <w:rFonts w:ascii="Times New Roman" w:hAnsi="Times New Roman" w:cs="Times New Roman"/>
+          <w:sz w:val="22"/>
+          <w:szCs w:val="22"/>
+        </w:rPr>
+        <w:t xml:space="preserve">I have used a TFIDF-Vectorizer algorithm to extract the text features, which only focuses on the unigrams (individual words). It does not focus on the order of the words in the sentence they are included in, or the context of that word in the sentence. </w:t>
+      </w:r>
+    </w:p>
+    <w:p>
+      <w:pPr>
+        <w:spacing w:after="0"/>
+        <w:jc w:val="both"/>
+        <w:rPr>
+          <w:rFonts w:ascii="Times New Roman" w:hAnsi="Times New Roman" w:cs="Times New Roman"/>
+          <w:sz w:val="22"/>
+          <w:szCs w:val="22"/>
+        </w:rPr>
+      </w:pPr>
+    </w:p>
+    <w:p>
+      <w:pPr>
+        <w:spacing w:after="0"/>
+        <w:jc w:val="both"/>
+        <w:rPr>
+          <w:rFonts w:ascii="Times New Roman" w:hAnsi="Times New Roman" w:cs="Times New Roman"/>
+          <w:sz w:val="22"/>
+          <w:szCs w:val="22"/>
+        </w:rPr>
+      </w:pPr>
+      <w:r>
+        <w:rPr>
+          <w:rFonts w:ascii="Times New Roman" w:hAnsi="Times New Roman" w:cs="Times New Roman"/>
+          <w:b/>
+          <w:bCs/>
+          <w:sz w:val="22"/>
+          <w:szCs w:val="22"/>
+        </w:rPr>
+        <w:t>2.</w:t>
+      </w:r>
+      <w:r>
+        <w:rPr>
+          <w:rFonts w:ascii="Times New Roman" w:hAnsi="Times New Roman" w:cs="Times New Roman"/>
+          <w:sz w:val="22"/>
+          <w:szCs w:val="22"/>
+        </w:rPr>
+        <w:t xml:space="preserve"> </w:t>
+      </w:r>
+      <w:r>
+        <w:rPr>
+          <w:rFonts w:ascii="Times New Roman" w:hAnsi="Times New Roman" w:cs="Times New Roman"/>
+          <w:b/>
+          <w:bCs/>
+          <w:sz w:val="22"/>
+          <w:szCs w:val="22"/>
+        </w:rPr>
+        <w:t xml:space="preserve">Semantic Meaning Loss: </w:t>
+      </w:r>
+      <w:r>
+        <w:rPr>
+          <w:rFonts w:ascii="Times New Roman" w:hAnsi="Times New Roman" w:cs="Times New Roman"/>
+          <w:sz w:val="22"/>
+          <w:szCs w:val="22"/>
+        </w:rPr>
+        <w:t xml:space="preserve">The “TF-IDF Vectorizer algorithm” </w:t>
+      </w:r>
+      <w:r>
+        <w:rPr>
+          <w:rFonts w:ascii="Times New Roman" w:hAnsi="Times New Roman" w:cs="Times New Roman"/>
+          <w:sz w:val="22"/>
+          <w:szCs w:val="22"/>
+        </w:rPr>
+        <w:t xml:space="preserve">loses the semantic meaning of the words, meaning they treat “great” and “greaaat” or “buy” and “purchase” as different words in a pair, which will lead to poorer model generalization capability and </w:t>
+      </w:r>
+      <w:r>
+        <w:rPr>
+          <w:rFonts w:ascii="Times New Roman" w:hAnsi="Times New Roman" w:cs="Times New Roman"/>
+          <w:sz w:val="22"/>
+          <w:szCs w:val="22"/>
+        </w:rPr>
+        <w:t xml:space="preserve">reduced performance on the unseen (out-of-the-vocabulary) data variations. </w:t>
+      </w:r>
+    </w:p>
+    <w:p>
+      <w:pPr>
+        <w:spacing w:after="0"/>
+        <w:jc w:val="both"/>
+        <w:rPr>
+          <w:rFonts w:ascii="Times New Roman" w:hAnsi="Times New Roman" w:cs="Times New Roman"/>
+          <w:sz w:val="22"/>
+          <w:szCs w:val="22"/>
+        </w:rPr>
+      </w:pPr>
+    </w:p>
+    <w:p>
+      <w:pPr>
+        <w:spacing w:after="0"/>
+        <w:jc w:val="both"/>
+        <w:rPr>
+          <w:rFonts w:ascii="Times New Roman" w:hAnsi="Times New Roman" w:cs="Times New Roman"/>
+          <w:sz w:val="22"/>
+          <w:szCs w:val="22"/>
+        </w:rPr>
+      </w:pPr>
+      <w:r>
+        <w:rPr>
+          <w:rFonts w:ascii="Times New Roman" w:hAnsi="Times New Roman" w:cs="Times New Roman"/>
+          <w:sz w:val="22"/>
+          <w:szCs w:val="22"/>
+        </w:rPr>
+        <w:t xml:space="preserve">3. </w:t>
+      </w:r>
+      <w:r>
+        <w:rPr>
+          <w:rFonts w:ascii="Times New Roman" w:hAnsi="Times New Roman" w:cs="Times New Roman"/>
+          <w:b/>
+          <w:bCs/>
+          <w:sz w:val="22"/>
+          <w:szCs w:val="22"/>
+        </w:rPr>
+        <w:t xml:space="preserve">Maximum Number of Text Features Limitation: </w:t>
+      </w:r>
+      <w:r>
+        <w:rPr>
+          <w:rFonts w:ascii="Times New Roman" w:hAnsi="Times New Roman" w:cs="Times New Roman"/>
+          <w:sz w:val="22"/>
+          <w:szCs w:val="22"/>
+        </w:rPr>
+        <w:t xml:space="preserve">In my implementation, I have set the </w:t>
+      </w:r>
+      <w:r>
+        <w:rPr>
+          <w:rFonts w:ascii="Times New Roman" w:hAnsi="Times New Roman" w:cs="Times New Roman"/>
+          <w:b/>
+          <w:bCs/>
+          <w:i/>
+          <w:iCs/>
+          <w:sz w:val="22"/>
+          <w:szCs w:val="22"/>
+        </w:rPr>
+        <w:t>“max_features”</w:t>
+      </w:r>
+      <w:r>
+        <w:rPr>
+          <w:rFonts w:ascii="Times New Roman" w:hAnsi="Times New Roman" w:cs="Times New Roman"/>
+          <w:sz w:val="22"/>
+          <w:szCs w:val="22"/>
+        </w:rPr>
+        <w:t xml:space="preserve"> parameter in the “TF-IDF Vectorizer” algorithm to </w:t>
+      </w:r>
+      <w:r>
+        <w:rPr>
+          <w:rFonts w:ascii="Times New Roman" w:hAnsi="Times New Roman" w:cs="Times New Roman"/>
+          <w:b/>
+          <w:bCs/>
+          <w:sz w:val="22"/>
+          <w:szCs w:val="22"/>
+        </w:rPr>
+        <w:t>5000,</w:t>
+      </w:r>
+      <w:r>
+        <w:rPr>
+          <w:rFonts w:ascii="Times New Roman" w:hAnsi="Times New Roman" w:cs="Times New Roman"/>
+          <w:sz w:val="22"/>
+          <w:szCs w:val="22"/>
+        </w:rPr>
+        <w:t xml:space="preserve"> which will discard words other than the top 5000 most frequent words in the unique words set. Thus, this might limit the performance of the vectorizer algorithm if the dataset used has more than 5000 unique words</w:t>
+      </w:r>
+      <w:r>
+        <w:rPr>
+          <w:rFonts w:ascii="Times New Roman" w:hAnsi="Times New Roman" w:cs="Times New Roman"/>
+          <w:sz w:val="22"/>
+          <w:szCs w:val="22"/>
+        </w:rPr>
+        <w:t xml:space="preserve"> and the words starting from the 5001st contain important words (which are not stop words) to be considered as well</w:t>
+      </w:r>
+      <w:r>
+        <w:rPr>
+          <w:rFonts w:ascii="Times New Roman" w:hAnsi="Times New Roman" w:cs="Times New Roman"/>
+          <w:sz w:val="22"/>
+          <w:szCs w:val="22"/>
+        </w:rPr>
+        <w:t xml:space="preserve">. </w:t>
+      </w:r>
+    </w:p>
+    <w:p>
+      <w:pPr>
+        <w:spacing w:after="0"/>
+        <w:jc w:val="both"/>
+        <w:rPr>
+          <w:rFonts w:ascii="Times New Roman" w:hAnsi="Times New Roman" w:cs="Times New Roman"/>
         </w:rPr>
       </w:pPr>
     </w:p>
@@ -6720,16 +7424,16 @@
           <w:lang w:eastAsia="tr-TR"/>
         </w:rPr>
         <w:drawing>
-          <wp:anchor distT="0" distB="0" distL="114300" distR="114300" simplePos="0" relativeHeight="251658240" behindDoc="0" locked="0" layoutInCell="1" allowOverlap="1" wp14:anchorId="2A88F9DB" wp14:editId="142AD083">
+          <wp:anchor distT="0" distB="0" distL="114300" distR="114300" simplePos="0" relativeHeight="251658240" behindDoc="0" locked="0" layoutInCell="1" allowOverlap="1" wp14:anchorId="2A88F9DB" wp14:editId="10A3D50B">
             <wp:simplePos x="0" y="0"/>
             <wp:positionH relativeFrom="column">
               <wp:posOffset>-192505</wp:posOffset>
             </wp:positionH>
             <wp:positionV relativeFrom="paragraph">
-              <wp:posOffset>302794</wp:posOffset>
+              <wp:posOffset>301090</wp:posOffset>
             </wp:positionV>
-            <wp:extent cx="6294120" cy="3497179"/>
-            <wp:effectExtent l="0" t="0" r="5080" b="0"/>
+            <wp:extent cx="6291279" cy="5082139"/>
+            <wp:effectExtent l="0" t="0" r="0" b="0"/>
             <wp:wrapNone/>
             <wp:docPr id="1248022986" name="Resim 1"/>
             <wp:cNvGraphicFramePr>
@@ -6758,7 +7462,7 @@
                   <pic:spPr bwMode="auto">
                     <a:xfrm>
                       <a:off x="0" y="0"/>
-                      <a:ext cx="6338311" cy="3521733"/>
+                      <a:ext cx="6408810" cy="5177082"/>
                     </a:xfrm>
                     <a:prstGeom prst="rect">
                       <a:avLst/>
@@ -6924,6 +7628,61 @@
           <w:lang w:val="tr-TR"/>
         </w:rPr>
       </w:pPr>
+    </w:p>
+    <w:p>
+      <w:pPr>
+        <w:rPr>
+          <w:rFonts w:ascii="Times New Roman" w:hAnsi="Times New Roman" w:cs="Times New Roman"/>
+          <w:b/>
+          <w:bCs/>
+          <w:u w:val="single"/>
+          <w:lang w:val="tr-TR"/>
+        </w:rPr>
+      </w:pPr>
+    </w:p>
+    <w:p>
+      <w:pPr>
+        <w:rPr>
+          <w:rFonts w:ascii="Times New Roman" w:hAnsi="Times New Roman" w:cs="Times New Roman"/>
+          <w:b/>
+          <w:bCs/>
+          <w:u w:val="single"/>
+          <w:lang w:val="tr-TR"/>
+        </w:rPr>
+      </w:pPr>
+    </w:p>
+    <w:p>
+      <w:pPr>
+        <w:rPr>
+          <w:rFonts w:ascii="Times New Roman" w:hAnsi="Times New Roman" w:cs="Times New Roman"/>
+          <w:b/>
+          <w:bCs/>
+          <w:u w:val="single"/>
+          <w:lang w:val="tr-TR"/>
+        </w:rPr>
+      </w:pPr>
+    </w:p>
+    <w:p>
+      <w:pPr>
+        <w:rPr>
+          <w:rFonts w:ascii="Times New Roman" w:hAnsi="Times New Roman" w:cs="Times New Roman"/>
+          <w:b/>
+          <w:bCs/>
+          <w:u w:val="single"/>
+          <w:lang w:val="tr-TR"/>
+        </w:rPr>
+      </w:pPr>
+    </w:p>
+    <w:p>
+      <w:pPr>
+        <w:rPr>
+          <w:rFonts w:ascii="Times New Roman" w:hAnsi="Times New Roman" w:cs="Times New Roman"/>
+          <w:b/>
+          <w:bCs/>
+          <w:u w:val="single"/>
+          <w:lang w:val="tr-TR"/>
+        </w:rPr>
+      </w:pPr>
       <w:r>
         <w:rPr>
           <w:noProof/>
@@ -6931,15 +7690,15 @@
         <mc:AlternateContent>
           <mc:Choice Requires="wps">
             <w:drawing>
-              <wp:anchor distT="0" distB="0" distL="114300" distR="114300" simplePos="0" relativeHeight="251682816" behindDoc="0" locked="0" layoutInCell="1" allowOverlap="1" wp14:anchorId="2B0C9FC1" wp14:editId="428EF971">
+              <wp:anchor distT="0" distB="0" distL="114300" distR="114300" simplePos="0" relativeHeight="251682816" behindDoc="0" locked="0" layoutInCell="1" allowOverlap="1" wp14:anchorId="2B0C9FC1" wp14:editId="1E10D832">
                 <wp:simplePos x="0" y="0"/>
                 <wp:positionH relativeFrom="column">
-                  <wp:posOffset>-192405</wp:posOffset>
+                  <wp:posOffset>-196850</wp:posOffset>
                 </wp:positionH>
                 <wp:positionV relativeFrom="paragraph">
-                  <wp:posOffset>184651</wp:posOffset>
+                  <wp:posOffset>252095</wp:posOffset>
                 </wp:positionV>
-                <wp:extent cx="6296025" cy="168442"/>
+                <wp:extent cx="6296025" cy="168275"/>
                 <wp:effectExtent l="0" t="0" r="3175" b="0"/>
                 <wp:wrapNone/>
                 <wp:docPr id="1333826341" name="Metin Kutusu 1"/>
@@ -6951,7 +7710,7 @@
                       <wps:spPr>
                         <a:xfrm>
                           <a:off x="0" y="0"/>
-                          <a:ext cx="6296025" cy="168442"/>
+                          <a:ext cx="6296025" cy="168275"/>
                         </a:xfrm>
                         <a:prstGeom prst="rect">
                           <a:avLst/>
@@ -7011,7 +7770,7 @@
           </mc:Choice>
           <mc:Fallback>
             <w:pict>
-              <v:shape w14:anchorId="2B0C9FC1" id="_x0000_s1027" type="#_x0000_t202" style="position:absolute;margin-left:-15.15pt;margin-top:14.55pt;width:495.75pt;height:13.25pt;z-index:251682816;visibility:visible;mso-wrap-style:square;mso-width-percent:0;mso-height-percent:0;mso-wrap-distance-left:9pt;mso-wrap-distance-top:0;mso-wrap-distance-right:9pt;mso-wrap-distance-bottom:0;mso-position-horizontal:absolute;mso-position-horizontal-relative:text;mso-position-vertical:absolute;mso-position-vertical-relative:text;mso-width-percent:0;mso-height-percent:0;mso-width-relative:margin;mso-height-relative:margin;v-text-anchor:top" o:gfxdata="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" stroked="f">
+              <v:shape w14:anchorId="2B0C9FC1" id="_x0000_s1027" type="#_x0000_t202" style="position:absolute;margin-left:-15.5pt;margin-top:19.85pt;width:495.75pt;height:13.25pt;z-index:251682816;visibility:visible;mso-wrap-style:square;mso-width-percent:0;mso-height-percent:0;mso-wrap-distance-left:9pt;mso-wrap-distance-top:0;mso-wrap-distance-right:9pt;mso-wrap-distance-bottom:0;mso-position-horizontal:absolute;mso-position-horizontal-relative:text;mso-position-vertical:absolute;mso-position-vertical-relative:text;mso-width-percent:0;mso-height-percent:0;mso-width-relative:margin;mso-height-relative:margin;v-text-anchor:top" o:gfxdata="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" stroked="f">
                 <v:textbox inset="0,0,0,0">
                   <w:txbxContent>
                     <w:p>
@@ -7067,16 +7826,16 @@
         </w:rPr>
         <w:lastRenderedPageBreak/>
         <w:drawing>
-          <wp:anchor distT="0" distB="0" distL="114300" distR="114300" simplePos="0" relativeHeight="251661312" behindDoc="0" locked="0" layoutInCell="1" allowOverlap="1" wp14:anchorId="586C122B" wp14:editId="116043F8">
+          <wp:anchor distT="0" distB="0" distL="114300" distR="114300" simplePos="0" relativeHeight="251661312" behindDoc="0" locked="0" layoutInCell="1" allowOverlap="1" wp14:anchorId="586C122B" wp14:editId="272459D6">
             <wp:simplePos x="0" y="0"/>
             <wp:positionH relativeFrom="column">
-              <wp:posOffset>-208280</wp:posOffset>
+              <wp:posOffset>-548640</wp:posOffset>
             </wp:positionH>
             <wp:positionV relativeFrom="paragraph">
-              <wp:posOffset>-793851</wp:posOffset>
+              <wp:posOffset>-625642</wp:posOffset>
             </wp:positionV>
-            <wp:extent cx="6280484" cy="2897587"/>
-            <wp:effectExtent l="0" t="0" r="6350" b="0"/>
+            <wp:extent cx="6862813" cy="5042535"/>
+            <wp:effectExtent l="0" t="0" r="0" b="0"/>
             <wp:wrapNone/>
             <wp:docPr id="1003897679" name="Resim 2"/>
             <wp:cNvGraphicFramePr>
@@ -7104,7 +7863,7 @@
                   <pic:spPr>
                     <a:xfrm>
                       <a:off x="0" y="0"/>
-                      <a:ext cx="6280484" cy="2897587"/>
+                      <a:ext cx="6924590" cy="5087927"/>
                     </a:xfrm>
                     <a:prstGeom prst="rect">
                       <a:avLst/>
@@ -7188,6 +7947,94 @@
           <w:lang w:val="tr-TR"/>
         </w:rPr>
       </w:pPr>
+    </w:p>
+    <w:p>
+      <w:pPr>
+        <w:rPr>
+          <w:rFonts w:ascii="Times New Roman" w:hAnsi="Times New Roman" w:cs="Times New Roman"/>
+          <w:b/>
+          <w:bCs/>
+          <w:u w:val="single"/>
+          <w:lang w:val="tr-TR"/>
+        </w:rPr>
+      </w:pPr>
+    </w:p>
+    <w:p>
+      <w:pPr>
+        <w:rPr>
+          <w:rFonts w:ascii="Times New Roman" w:hAnsi="Times New Roman" w:cs="Times New Roman"/>
+          <w:b/>
+          <w:bCs/>
+          <w:u w:val="single"/>
+          <w:lang w:val="tr-TR"/>
+        </w:rPr>
+      </w:pPr>
+    </w:p>
+    <w:p>
+      <w:pPr>
+        <w:rPr>
+          <w:rFonts w:ascii="Times New Roman" w:hAnsi="Times New Roman" w:cs="Times New Roman"/>
+          <w:b/>
+          <w:bCs/>
+          <w:u w:val="single"/>
+          <w:lang w:val="tr-TR"/>
+        </w:rPr>
+      </w:pPr>
+    </w:p>
+    <w:p>
+      <w:pPr>
+        <w:rPr>
+          <w:rFonts w:ascii="Times New Roman" w:hAnsi="Times New Roman" w:cs="Times New Roman"/>
+          <w:b/>
+          <w:bCs/>
+          <w:u w:val="single"/>
+          <w:lang w:val="tr-TR"/>
+        </w:rPr>
+      </w:pPr>
+    </w:p>
+    <w:p>
+      <w:pPr>
+        <w:rPr>
+          <w:rFonts w:ascii="Times New Roman" w:hAnsi="Times New Roman" w:cs="Times New Roman"/>
+          <w:b/>
+          <w:bCs/>
+          <w:u w:val="single"/>
+          <w:lang w:val="tr-TR"/>
+        </w:rPr>
+      </w:pPr>
+    </w:p>
+    <w:p>
+      <w:pPr>
+        <w:rPr>
+          <w:rFonts w:ascii="Times New Roman" w:hAnsi="Times New Roman" w:cs="Times New Roman"/>
+          <w:b/>
+          <w:bCs/>
+          <w:u w:val="single"/>
+          <w:lang w:val="tr-TR"/>
+        </w:rPr>
+      </w:pPr>
+    </w:p>
+    <w:p>
+      <w:pPr>
+        <w:rPr>
+          <w:rFonts w:ascii="Times New Roman" w:hAnsi="Times New Roman" w:cs="Times New Roman"/>
+          <w:b/>
+          <w:bCs/>
+          <w:u w:val="single"/>
+          <w:lang w:val="tr-TR"/>
+        </w:rPr>
+      </w:pPr>
+    </w:p>
+    <w:p>
+      <w:pPr>
+        <w:rPr>
+          <w:rFonts w:ascii="Times New Roman" w:hAnsi="Times New Roman" w:cs="Times New Roman"/>
+          <w:b/>
+          <w:bCs/>
+          <w:u w:val="single"/>
+          <w:lang w:val="tr-TR"/>
+        </w:rPr>
+      </w:pPr>
       <w:r>
         <w:rPr>
           <w:noProof/>
@@ -7195,16 +8042,16 @@
         <mc:AlternateContent>
           <mc:Choice Requires="wps">
             <w:drawing>
-              <wp:anchor distT="0" distB="0" distL="114300" distR="114300" simplePos="0" relativeHeight="251663360" behindDoc="0" locked="0" layoutInCell="1" allowOverlap="1" wp14:anchorId="13A9F1FA" wp14:editId="0BA85C1D">
+              <wp:anchor distT="0" distB="0" distL="114300" distR="114300" simplePos="0" relativeHeight="251663360" behindDoc="0" locked="0" layoutInCell="1" allowOverlap="1" wp14:anchorId="13A9F1FA" wp14:editId="2946B619">
                 <wp:simplePos x="0" y="0"/>
                 <wp:positionH relativeFrom="column">
-                  <wp:posOffset>-208280</wp:posOffset>
+                  <wp:posOffset>-433137</wp:posOffset>
                 </wp:positionH>
                 <wp:positionV relativeFrom="paragraph">
-                  <wp:posOffset>321912</wp:posOffset>
+                  <wp:posOffset>202097</wp:posOffset>
                 </wp:positionV>
-                <wp:extent cx="6280150" cy="200527"/>
-                <wp:effectExtent l="0" t="0" r="6350" b="3175"/>
+                <wp:extent cx="6746942" cy="200527"/>
+                <wp:effectExtent l="0" t="0" r="0" b="3175"/>
                 <wp:wrapNone/>
                 <wp:docPr id="341635747" name="Metin Kutusu 1"/>
                 <wp:cNvGraphicFramePr/>
@@ -7215,7 +8062,7 @@
                       <wps:spPr>
                         <a:xfrm>
                           <a:off x="0" y="0"/>
-                          <a:ext cx="6280150" cy="200527"/>
+                          <a:ext cx="6746942" cy="200527"/>
                         </a:xfrm>
                         <a:prstGeom prst="rect">
                           <a:avLst/>
@@ -7275,7 +8122,7 @@
           </mc:Choice>
           <mc:Fallback>
             <w:pict>
-              <v:shape w14:anchorId="13A9F1FA" id="_x0000_s1028" type="#_x0000_t202" style="position:absolute;margin-left:-16.4pt;margin-top:25.35pt;width:494.5pt;height:15.8pt;z-index:251663360;visibility:visible;mso-wrap-style:square;mso-width-percent:0;mso-height-percent:0;mso-wrap-distance-left:9pt;mso-wrap-distance-top:0;mso-wrap-distance-right:9pt;mso-wrap-distance-bottom:0;mso-position-horizontal:absolute;mso-position-horizontal-relative:text;mso-position-vertical:absolute;mso-position-vertical-relative:text;mso-width-percent:0;mso-height-percent:0;mso-width-relative:margin;mso-height-relative:margin;v-text-anchor:top" o:gfxdata="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" stroked="f">
+              <v:shape w14:anchorId="13A9F1FA" id="_x0000_s1028" type="#_x0000_t202" style="position:absolute;margin-left:-34.1pt;margin-top:15.9pt;width:531.25pt;height:15.8pt;z-index:251663360;visibility:visible;mso-wrap-style:square;mso-width-percent:0;mso-height-percent:0;mso-wrap-distance-left:9pt;mso-wrap-distance-top:0;mso-wrap-distance-right:9pt;mso-wrap-distance-bottom:0;mso-position-horizontal:absolute;mso-position-horizontal-relative:text;mso-position-vertical:absolute;mso-position-vertical-relative:text;mso-width-percent:0;mso-height-percent:0;mso-width-relative:margin;mso-height-relative:margin;v-text-anchor:top" o:gfxdata="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" stroked="f">
                 <v:textbox inset="0,0,0,0">
                   <w:txbxContent>
                     <w:p>
@@ -7320,17 +8167,6 @@
           <w:lang w:val="tr-TR"/>
         </w:rPr>
       </w:pPr>
-    </w:p>
-    <w:p>
-      <w:pPr>
-        <w:rPr>
-          <w:rFonts w:ascii="Times New Roman" w:hAnsi="Times New Roman" w:cs="Times New Roman"/>
-          <w:b/>
-          <w:bCs/>
-          <w:u w:val="single"/>
-          <w:lang w:val="tr-TR"/>
-        </w:rPr>
-      </w:pPr>
       <w:r>
         <w:rPr>
           <w:rFonts w:ascii="Times New Roman" w:eastAsia="Times New Roman" w:hAnsi="Times New Roman" w:cs="Times New Roman"/>
@@ -7340,15 +8176,15 @@
           <w:lang w:eastAsia="tr-TR"/>
         </w:rPr>
         <w:drawing>
-          <wp:anchor distT="0" distB="0" distL="114300" distR="114300" simplePos="0" relativeHeight="251664384" behindDoc="0" locked="0" layoutInCell="1" allowOverlap="1" wp14:anchorId="28EE7D3A" wp14:editId="4B3C4CD9">
+          <wp:anchor distT="0" distB="0" distL="114300" distR="114300" simplePos="0" relativeHeight="251664384" behindDoc="0" locked="0" layoutInCell="1" allowOverlap="1" wp14:anchorId="28EE7D3A" wp14:editId="398C6D2F">
             <wp:simplePos x="0" y="0"/>
             <wp:positionH relativeFrom="column">
-              <wp:posOffset>-232611</wp:posOffset>
+              <wp:posOffset>-548640</wp:posOffset>
             </wp:positionH>
             <wp:positionV relativeFrom="paragraph">
-              <wp:posOffset>90137</wp:posOffset>
+              <wp:posOffset>282308</wp:posOffset>
             </wp:positionV>
-            <wp:extent cx="6379371" cy="2846939"/>
+            <wp:extent cx="6861810" cy="4119612"/>
             <wp:effectExtent l="0" t="0" r="0" b="0"/>
             <wp:wrapNone/>
             <wp:docPr id="1943388553" name="Resim 3"/>
@@ -7377,7 +8213,7 @@
                   <pic:spPr>
                     <a:xfrm>
                       <a:off x="0" y="0"/>
-                      <a:ext cx="6405723" cy="2858699"/>
+                      <a:ext cx="6893622" cy="4138711"/>
                     </a:xfrm>
                     <a:prstGeom prst="rect">
                       <a:avLst/>
@@ -7494,6 +8330,50 @@
           <w:lang w:val="tr-TR"/>
         </w:rPr>
       </w:pPr>
+    </w:p>
+    <w:p>
+      <w:pPr>
+        <w:rPr>
+          <w:rFonts w:ascii="Times New Roman" w:hAnsi="Times New Roman" w:cs="Times New Roman"/>
+          <w:b/>
+          <w:bCs/>
+          <w:u w:val="single"/>
+          <w:lang w:val="tr-TR"/>
+        </w:rPr>
+      </w:pPr>
+    </w:p>
+    <w:p>
+      <w:pPr>
+        <w:rPr>
+          <w:rFonts w:ascii="Times New Roman" w:hAnsi="Times New Roman" w:cs="Times New Roman"/>
+          <w:b/>
+          <w:bCs/>
+          <w:u w:val="single"/>
+          <w:lang w:val="tr-TR"/>
+        </w:rPr>
+      </w:pPr>
+    </w:p>
+    <w:p>
+      <w:pPr>
+        <w:rPr>
+          <w:rFonts w:ascii="Times New Roman" w:hAnsi="Times New Roman" w:cs="Times New Roman"/>
+          <w:b/>
+          <w:bCs/>
+          <w:u w:val="single"/>
+          <w:lang w:val="tr-TR"/>
+        </w:rPr>
+      </w:pPr>
+    </w:p>
+    <w:p>
+      <w:pPr>
+        <w:rPr>
+          <w:rFonts w:ascii="Times New Roman" w:hAnsi="Times New Roman" w:cs="Times New Roman"/>
+          <w:b/>
+          <w:bCs/>
+          <w:u w:val="single"/>
+          <w:lang w:val="tr-TR"/>
+        </w:rPr>
+      </w:pPr>
       <w:r>
         <w:rPr>
           <w:noProof/>
@@ -7501,16 +8381,16 @@
         <mc:AlternateContent>
           <mc:Choice Requires="wps">
             <w:drawing>
-              <wp:anchor distT="0" distB="0" distL="114300" distR="114300" simplePos="0" relativeHeight="251684864" behindDoc="0" locked="0" layoutInCell="1" allowOverlap="1" wp14:anchorId="337D768B" wp14:editId="574FEA8B">
+              <wp:anchor distT="0" distB="0" distL="114300" distR="114300" simplePos="0" relativeHeight="251684864" behindDoc="0" locked="0" layoutInCell="1" allowOverlap="1" wp14:anchorId="337D768B" wp14:editId="6C7734D9">
                 <wp:simplePos x="0" y="0"/>
                 <wp:positionH relativeFrom="column">
-                  <wp:posOffset>-232611</wp:posOffset>
+                  <wp:posOffset>-539016</wp:posOffset>
                 </wp:positionH>
                 <wp:positionV relativeFrom="paragraph">
-                  <wp:posOffset>236422</wp:posOffset>
+                  <wp:posOffset>490187</wp:posOffset>
                 </wp:positionV>
-                <wp:extent cx="6384290" cy="168442"/>
-                <wp:effectExtent l="0" t="0" r="3810" b="0"/>
+                <wp:extent cx="6852185" cy="216402"/>
+                <wp:effectExtent l="0" t="0" r="6350" b="0"/>
                 <wp:wrapNone/>
                 <wp:docPr id="1185477184" name="Metin Kutusu 1"/>
                 <wp:cNvGraphicFramePr/>
@@ -7521,7 +8401,7 @@
                       <wps:spPr>
                         <a:xfrm>
                           <a:off x="0" y="0"/>
-                          <a:ext cx="6384290" cy="168442"/>
+                          <a:ext cx="6852185" cy="216402"/>
                         </a:xfrm>
                         <a:prstGeom prst="rect">
                           <a:avLst/>
@@ -7581,7 +8461,7 @@
           </mc:Choice>
           <mc:Fallback>
             <w:pict>
-              <v:shape w14:anchorId="337D768B" id="_x0000_s1029" type="#_x0000_t202" style="position:absolute;margin-left:-18.3pt;margin-top:18.6pt;width:502.7pt;height:13.25pt;z-index:251684864;visibility:visible;mso-wrap-style:square;mso-width-percent:0;mso-height-percent:0;mso-wrap-distance-left:9pt;mso-wrap-distance-top:0;mso-wrap-distance-right:9pt;mso-wrap-distance-bottom:0;mso-position-horizontal:absolute;mso-position-horizontal-relative:text;mso-position-vertical:absolute;mso-position-vertical-relative:text;mso-width-percent:0;mso-height-percent:0;mso-width-relative:margin;mso-height-relative:margin;v-text-anchor:top" o:gfxdata="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" stroked="f">
+              <v:shape w14:anchorId="337D768B" id="_x0000_s1029" type="#_x0000_t202" style="position:absolute;margin-left:-42.45pt;margin-top:38.6pt;width:539.55pt;height:17.05pt;z-index:251684864;visibility:visible;mso-wrap-style:square;mso-width-percent:0;mso-height-percent:0;mso-wrap-distance-left:9pt;mso-wrap-distance-top:0;mso-wrap-distance-right:9pt;mso-wrap-distance-bottom:0;mso-position-horizontal:absolute;mso-position-horizontal-relative:text;mso-position-vertical:absolute;mso-position-vertical-relative:text;mso-width-percent:0;mso-height-percent:0;mso-width-relative:margin;mso-height-relative:margin;v-text-anchor:top" o:gfxdata="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" stroked="f">
                 <v:textbox inset="0,0,0,0">
                   <w:txbxContent>
                     <w:p>
@@ -7635,17 +8515,18 @@
           <w:u w:val="single"/>
           <w:lang w:val="tr-TR"/>
         </w:rPr>
+        <w:lastRenderedPageBreak/>
         <w:drawing>
-          <wp:anchor distT="0" distB="0" distL="114300" distR="114300" simplePos="0" relativeHeight="251667456" behindDoc="0" locked="0" layoutInCell="1" allowOverlap="1" wp14:anchorId="5B641FDB" wp14:editId="3974266F">
+          <wp:anchor distT="0" distB="0" distL="114300" distR="114300" simplePos="0" relativeHeight="251667456" behindDoc="0" locked="0" layoutInCell="1" allowOverlap="1" wp14:anchorId="5B641FDB" wp14:editId="2EC40CD6">
             <wp:simplePos x="0" y="0"/>
             <wp:positionH relativeFrom="column">
-              <wp:posOffset>-232611</wp:posOffset>
+              <wp:posOffset>-423513</wp:posOffset>
             </wp:positionH>
             <wp:positionV relativeFrom="paragraph">
-              <wp:posOffset>316631</wp:posOffset>
+              <wp:posOffset>-760396</wp:posOffset>
             </wp:positionV>
-            <wp:extent cx="6384290" cy="3528962"/>
-            <wp:effectExtent l="0" t="0" r="3810" b="1905"/>
+            <wp:extent cx="6785811" cy="4436609"/>
+            <wp:effectExtent l="0" t="0" r="0" b="0"/>
             <wp:wrapNone/>
             <wp:docPr id="519262873" name="Resim 4"/>
             <wp:cNvGraphicFramePr>
@@ -7673,7 +8554,7 @@
                   <pic:spPr>
                     <a:xfrm>
                       <a:off x="0" y="0"/>
-                      <a:ext cx="6392390" cy="3533439"/>
+                      <a:ext cx="6830560" cy="4465866"/>
                     </a:xfrm>
                     <a:prstGeom prst="rect">
                       <a:avLst/>
@@ -7793,223 +8674,38 @@
     </w:p>
     <w:p>
       <w:pPr>
-        <w:rPr>
-          <w:rFonts w:ascii="Times New Roman" w:hAnsi="Times New Roman" w:cs="Times New Roman"/>
-          <w:b/>
-          <w:bCs/>
-          <w:u w:val="single"/>
-          <w:lang w:val="tr-TR"/>
-        </w:rPr>
-      </w:pPr>
-      <w:r>
-        <w:rPr>
-          <w:noProof/>
-        </w:rPr>
-        <mc:AlternateContent>
-          <mc:Choice Requires="wps">
-            <w:drawing>
-              <wp:anchor distT="0" distB="0" distL="114300" distR="114300" simplePos="0" relativeHeight="251669504" behindDoc="0" locked="0" layoutInCell="1" allowOverlap="1" wp14:anchorId="40724422" wp14:editId="6CEA60B7">
-                <wp:simplePos x="0" y="0"/>
-                <wp:positionH relativeFrom="column">
-                  <wp:posOffset>-232611</wp:posOffset>
-                </wp:positionH>
-                <wp:positionV relativeFrom="paragraph">
-                  <wp:posOffset>847926</wp:posOffset>
-                </wp:positionV>
-                <wp:extent cx="6384290" cy="176463"/>
-                <wp:effectExtent l="0" t="0" r="3810" b="1905"/>
-                <wp:wrapNone/>
-                <wp:docPr id="2069058256" name="Metin Kutusu 1"/>
-                <wp:cNvGraphicFramePr/>
-                <a:graphic xmlns:a="http://schemas.openxmlformats.org/drawingml/2006/main">
-                  <a:graphicData uri="http://schemas.microsoft.com/office/word/2010/wordprocessingShape">
-                    <wps:wsp>
-                      <wps:cNvSpPr txBox="1"/>
-                      <wps:spPr>
-                        <a:xfrm>
-                          <a:off x="0" y="0"/>
-                          <a:ext cx="6384290" cy="176463"/>
-                        </a:xfrm>
-                        <a:prstGeom prst="rect">
-                          <a:avLst/>
-                        </a:prstGeom>
-                        <a:solidFill>
-                          <a:prstClr val="white"/>
-                        </a:solidFill>
-                        <a:ln>
-                          <a:noFill/>
-                        </a:ln>
-                      </wps:spPr>
-                      <wps:txbx>
-                        <w:txbxContent>
-                          <w:p>
-                            <w:pPr>
-                              <w:pStyle w:val="ResimYazs"/>
-                              <w:rPr>
-                                <w:rFonts w:ascii="Times New Roman" w:hAnsi="Times New Roman" w:cs="Times New Roman"/>
-                                <w:b/>
-                                <w:bCs/>
-                                <w:noProof/>
-                                <w:color w:val="000000" w:themeColor="text1"/>
-                                <w:u w:val="single"/>
-                                <w:lang w:val="tr-TR"/>
-                              </w:rPr>
-                            </w:pPr>
-                            <w:r>
-                              <w:rPr>
-                                <w:rFonts w:ascii="Times New Roman" w:hAnsi="Times New Roman" w:cs="Times New Roman"/>
-                                <w:b/>
-                                <w:bCs/>
-                                <w:color w:val="000000" w:themeColor="text1"/>
-                                <w:lang w:val="tr-TR"/>
-                              </w:rPr>
-                              <w:t>Fi</w:t>
-                            </w:r>
-                            <w:r>
-                              <w:rPr>
-                                <w:rFonts w:ascii="Times New Roman" w:hAnsi="Times New Roman" w:cs="Times New Roman"/>
-                                <w:b/>
-                                <w:bCs/>
-                                <w:color w:val="000000" w:themeColor="text1"/>
-                                <w:lang w:val="tr-TR"/>
-                              </w:rPr>
-                              <w:t>g</w:t>
-                            </w:r>
-                            <w:r>
-                              <w:rPr>
-                                <w:rFonts w:ascii="Times New Roman" w:hAnsi="Times New Roman" w:cs="Times New Roman"/>
-                                <w:b/>
-                                <w:bCs/>
-                                <w:color w:val="000000" w:themeColor="text1"/>
-                                <w:lang w:val="tr-TR"/>
-                              </w:rPr>
-                              <w:t xml:space="preserve">ure </w:t>
-                            </w:r>
-                            <w:r>
-                              <w:rPr>
-                                <w:rFonts w:ascii="Times New Roman" w:hAnsi="Times New Roman" w:cs="Times New Roman"/>
-                                <w:b/>
-                                <w:bCs/>
-                                <w:color w:val="000000" w:themeColor="text1"/>
-                                <w:lang w:val="tr-TR"/>
-                              </w:rPr>
-                              <w:t>4</w:t>
-                            </w:r>
-                            <w:r>
-                              <w:rPr>
-                                <w:rFonts w:ascii="Times New Roman" w:hAnsi="Times New Roman" w:cs="Times New Roman"/>
-                                <w:b/>
-                                <w:bCs/>
-                                <w:color w:val="000000" w:themeColor="text1"/>
-                                <w:lang w:val="tr-TR"/>
-                              </w:rPr>
-                              <w:t>: Learning to Defer Strategy Evaluation When Confidence Threshold is 0.29</w:t>
-                            </w:r>
-                          </w:p>
-                        </w:txbxContent>
-                      </wps:txbx>
-                      <wps:bodyPr rot="0" spcFirstLastPara="0" vertOverflow="overflow" horzOverflow="overflow" vert="horz" wrap="square" lIns="0" tIns="0" rIns="0" bIns="0" numCol="1" spcCol="0" rtlCol="0" fromWordArt="0" anchor="t" anchorCtr="0" forceAA="0" compatLnSpc="1">
-                        <a:prstTxWarp prst="textNoShape">
-                          <a:avLst/>
-                        </a:prstTxWarp>
-                        <a:noAutofit/>
-                      </wps:bodyPr>
-                    </wps:wsp>
-                  </a:graphicData>
-                </a:graphic>
-                <wp14:sizeRelH relativeFrom="margin">
-                  <wp14:pctWidth>0</wp14:pctWidth>
-                </wp14:sizeRelH>
-                <wp14:sizeRelV relativeFrom="margin">
-                  <wp14:pctHeight>0</wp14:pctHeight>
-                </wp14:sizeRelV>
-              </wp:anchor>
-            </w:drawing>
-          </mc:Choice>
-          <mc:Fallback>
-            <w:pict>
-              <v:shape w14:anchorId="40724422" id="_x0000_s1030" type="#_x0000_t202" style="position:absolute;margin-left:-18.3pt;margin-top:66.75pt;width:502.7pt;height:13.9pt;z-index:251669504;visibility:visible;mso-wrap-style:square;mso-width-percent:0;mso-height-percent:0;mso-wrap-distance-left:9pt;mso-wrap-distance-top:0;mso-wrap-distance-right:9pt;mso-wrap-distance-bottom:0;mso-position-horizontal:absolute;mso-position-horizontal-relative:text;mso-position-vertical:absolute;mso-position-vertical-relative:text;mso-width-percent:0;mso-height-percent:0;mso-width-relative:margin;mso-height-relative:margin;v-text-anchor:top" o:gfxdata="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" stroked="f">
-                <v:textbox inset="0,0,0,0">
-                  <w:txbxContent>
-                    <w:p>
-                      <w:pPr>
-                        <w:pStyle w:val="ResimYazs"/>
-                        <w:rPr>
-                          <w:rFonts w:ascii="Times New Roman" w:hAnsi="Times New Roman" w:cs="Times New Roman"/>
-                          <w:b/>
-                          <w:bCs/>
-                          <w:noProof/>
-                          <w:color w:val="000000" w:themeColor="text1"/>
-                          <w:u w:val="single"/>
-                          <w:lang w:val="tr-TR"/>
-                        </w:rPr>
-                      </w:pPr>
-                      <w:r>
-                        <w:rPr>
-                          <w:rFonts w:ascii="Times New Roman" w:hAnsi="Times New Roman" w:cs="Times New Roman"/>
-                          <w:b/>
-                          <w:bCs/>
-                          <w:color w:val="000000" w:themeColor="text1"/>
-                          <w:lang w:val="tr-TR"/>
-                        </w:rPr>
-                        <w:t>Fi</w:t>
-                      </w:r>
-                      <w:r>
-                        <w:rPr>
-                          <w:rFonts w:ascii="Times New Roman" w:hAnsi="Times New Roman" w:cs="Times New Roman"/>
-                          <w:b/>
-                          <w:bCs/>
-                          <w:color w:val="000000" w:themeColor="text1"/>
-                          <w:lang w:val="tr-TR"/>
-                        </w:rPr>
-                        <w:t>g</w:t>
-                      </w:r>
-                      <w:r>
-                        <w:rPr>
-                          <w:rFonts w:ascii="Times New Roman" w:hAnsi="Times New Roman" w:cs="Times New Roman"/>
-                          <w:b/>
-                          <w:bCs/>
-                          <w:color w:val="000000" w:themeColor="text1"/>
-                          <w:lang w:val="tr-TR"/>
-                        </w:rPr>
-                        <w:t xml:space="preserve">ure </w:t>
-                      </w:r>
-                      <w:r>
-                        <w:rPr>
-                          <w:rFonts w:ascii="Times New Roman" w:hAnsi="Times New Roman" w:cs="Times New Roman"/>
-                          <w:b/>
-                          <w:bCs/>
-                          <w:color w:val="000000" w:themeColor="text1"/>
-                          <w:lang w:val="tr-TR"/>
-                        </w:rPr>
-                        <w:t>4</w:t>
-                      </w:r>
-                      <w:r>
-                        <w:rPr>
-                          <w:rFonts w:ascii="Times New Roman" w:hAnsi="Times New Roman" w:cs="Times New Roman"/>
-                          <w:b/>
-                          <w:bCs/>
-                          <w:color w:val="000000" w:themeColor="text1"/>
-                          <w:lang w:val="tr-TR"/>
-                        </w:rPr>
-                        <w:t>: Learning to Defer Strategy Evaluation When Confidence Threshold is 0.29</w:t>
-                      </w:r>
-                    </w:p>
-                  </w:txbxContent>
-                </v:textbox>
-              </v:shape>
-            </w:pict>
-          </mc:Fallback>
-        </mc:AlternateContent>
-      </w:r>
-    </w:p>
-    <w:p>
-      <w:pPr>
-        <w:rPr>
-          <w:rFonts w:ascii="Times New Roman" w:hAnsi="Times New Roman" w:cs="Times New Roman"/>
-          <w:b/>
-          <w:bCs/>
-          <w:u w:val="single"/>
+        <w:jc w:val="both"/>
+        <w:rPr>
+          <w:rFonts w:ascii="Times New Roman" w:hAnsi="Times New Roman" w:cs="Times New Roman"/>
+          <w:b/>
+          <w:bCs/>
+          <w:sz w:val="18"/>
+          <w:szCs w:val="18"/>
+          <w:lang w:val="tr-TR"/>
+        </w:rPr>
+      </w:pPr>
+    </w:p>
+    <w:p>
+      <w:pPr>
+        <w:jc w:val="both"/>
+        <w:rPr>
+          <w:rFonts w:ascii="Times New Roman" w:hAnsi="Times New Roman" w:cs="Times New Roman"/>
+          <w:lang w:val="tr-TR"/>
+        </w:rPr>
+      </w:pPr>
+      <w:r>
+        <w:rPr>
+          <w:rFonts w:ascii="Times New Roman" w:hAnsi="Times New Roman" w:cs="Times New Roman"/>
+          <w:lang w:val="tr-TR"/>
+        </w:rPr>
+        <w:tab/>
+      </w:r>
+    </w:p>
+    <w:p>
+      <w:pPr>
+        <w:jc w:val="both"/>
+        <w:rPr>
+          <w:rFonts w:ascii="Times New Roman" w:hAnsi="Times New Roman" w:cs="Times New Roman"/>
           <w:lang w:val="tr-TR"/>
         </w:rPr>
       </w:pPr>
@@ -8022,15 +8718,14 @@
           <w:u w:val="single"/>
           <w:lang w:val="tr-TR"/>
         </w:rPr>
-        <w:lastRenderedPageBreak/>
         <w:drawing>
-          <wp:anchor distT="0" distB="0" distL="114300" distR="114300" simplePos="0" relativeHeight="251670528" behindDoc="0" locked="0" layoutInCell="1" allowOverlap="1" wp14:anchorId="2FE1D6C2" wp14:editId="3BF73087">
+          <wp:anchor distT="0" distB="0" distL="114300" distR="114300" simplePos="0" relativeHeight="251670528" behindDoc="0" locked="0" layoutInCell="1" allowOverlap="1" wp14:anchorId="2FE1D6C2" wp14:editId="01E718B1">
             <wp:simplePos x="0" y="0"/>
             <wp:positionH relativeFrom="column">
-              <wp:posOffset>-232611</wp:posOffset>
+              <wp:posOffset>-423311</wp:posOffset>
             </wp:positionH>
             <wp:positionV relativeFrom="paragraph">
-              <wp:posOffset>-665747</wp:posOffset>
+              <wp:posOffset>392363</wp:posOffset>
             </wp:positionV>
             <wp:extent cx="6198870" cy="5045242"/>
             <wp:effectExtent l="0" t="0" r="0" b="0"/>
@@ -8061,7 +8756,7 @@
                   <pic:spPr>
                     <a:xfrm>
                       <a:off x="0" y="0"/>
-                      <a:ext cx="6277133" cy="5108940"/>
+                      <a:ext cx="6198870" cy="5045242"/>
                     </a:xfrm>
                     <a:prstGeom prst="rect">
                       <a:avLst/>
@@ -8079,160 +8774,6 @@
           </wp:anchor>
         </w:drawing>
       </w:r>
-    </w:p>
-    <w:p>
-      <w:pPr>
-        <w:rPr>
-          <w:rFonts w:ascii="Times New Roman" w:hAnsi="Times New Roman" w:cs="Times New Roman"/>
-          <w:b/>
-          <w:bCs/>
-          <w:u w:val="single"/>
-          <w:lang w:val="tr-TR"/>
-        </w:rPr>
-      </w:pPr>
-    </w:p>
-    <w:p>
-      <w:pPr>
-        <w:rPr>
-          <w:rFonts w:ascii="Times New Roman" w:hAnsi="Times New Roman" w:cs="Times New Roman"/>
-          <w:b/>
-          <w:bCs/>
-          <w:u w:val="single"/>
-          <w:lang w:val="tr-TR"/>
-        </w:rPr>
-      </w:pPr>
-    </w:p>
-    <w:p>
-      <w:pPr>
-        <w:rPr>
-          <w:rFonts w:ascii="Times New Roman" w:hAnsi="Times New Roman" w:cs="Times New Roman"/>
-          <w:b/>
-          <w:bCs/>
-          <w:u w:val="single"/>
-          <w:lang w:val="tr-TR"/>
-        </w:rPr>
-      </w:pPr>
-    </w:p>
-    <w:p>
-      <w:pPr>
-        <w:rPr>
-          <w:rFonts w:ascii="Times New Roman" w:hAnsi="Times New Roman" w:cs="Times New Roman"/>
-          <w:b/>
-          <w:bCs/>
-          <w:u w:val="single"/>
-          <w:lang w:val="tr-TR"/>
-        </w:rPr>
-      </w:pPr>
-    </w:p>
-    <w:p>
-      <w:pPr>
-        <w:rPr>
-          <w:rFonts w:ascii="Times New Roman" w:hAnsi="Times New Roman" w:cs="Times New Roman"/>
-          <w:b/>
-          <w:bCs/>
-          <w:u w:val="single"/>
-          <w:lang w:val="tr-TR"/>
-        </w:rPr>
-      </w:pPr>
-    </w:p>
-    <w:p>
-      <w:pPr>
-        <w:rPr>
-          <w:rFonts w:ascii="Times New Roman" w:hAnsi="Times New Roman" w:cs="Times New Roman"/>
-          <w:b/>
-          <w:bCs/>
-          <w:u w:val="single"/>
-          <w:lang w:val="tr-TR"/>
-        </w:rPr>
-      </w:pPr>
-    </w:p>
-    <w:p>
-      <w:pPr>
-        <w:rPr>
-          <w:rFonts w:ascii="Times New Roman" w:hAnsi="Times New Roman" w:cs="Times New Roman"/>
-          <w:b/>
-          <w:bCs/>
-          <w:u w:val="single"/>
-          <w:lang w:val="tr-TR"/>
-        </w:rPr>
-      </w:pPr>
-    </w:p>
-    <w:p>
-      <w:pPr>
-        <w:rPr>
-          <w:rFonts w:ascii="Times New Roman" w:hAnsi="Times New Roman" w:cs="Times New Roman"/>
-          <w:b/>
-          <w:bCs/>
-          <w:u w:val="single"/>
-          <w:lang w:val="tr-TR"/>
-        </w:rPr>
-      </w:pPr>
-    </w:p>
-    <w:p>
-      <w:pPr>
-        <w:rPr>
-          <w:rFonts w:ascii="Times New Roman" w:hAnsi="Times New Roman" w:cs="Times New Roman"/>
-          <w:b/>
-          <w:bCs/>
-          <w:u w:val="single"/>
-          <w:lang w:val="tr-TR"/>
-        </w:rPr>
-      </w:pPr>
-    </w:p>
-    <w:p>
-      <w:pPr>
-        <w:rPr>
-          <w:rFonts w:ascii="Times New Roman" w:hAnsi="Times New Roman" w:cs="Times New Roman"/>
-          <w:b/>
-          <w:bCs/>
-          <w:u w:val="single"/>
-          <w:lang w:val="tr-TR"/>
-        </w:rPr>
-      </w:pPr>
-    </w:p>
-    <w:p>
-      <w:pPr>
-        <w:rPr>
-          <w:rFonts w:ascii="Times New Roman" w:hAnsi="Times New Roman" w:cs="Times New Roman"/>
-          <w:b/>
-          <w:bCs/>
-          <w:u w:val="single"/>
-          <w:lang w:val="tr-TR"/>
-        </w:rPr>
-      </w:pPr>
-    </w:p>
-    <w:p>
-      <w:pPr>
-        <w:rPr>
-          <w:rFonts w:ascii="Times New Roman" w:hAnsi="Times New Roman" w:cs="Times New Roman"/>
-          <w:b/>
-          <w:bCs/>
-          <w:u w:val="single"/>
-          <w:lang w:val="tr-TR"/>
-        </w:rPr>
-      </w:pPr>
-    </w:p>
-    <w:p>
-      <w:pPr>
-        <w:rPr>
-          <w:rFonts w:ascii="Times New Roman" w:hAnsi="Times New Roman" w:cs="Times New Roman"/>
-          <w:b/>
-          <w:bCs/>
-          <w:u w:val="single"/>
-          <w:lang w:val="tr-TR"/>
-        </w:rPr>
-      </w:pPr>
-    </w:p>
-    <w:p>
-      <w:pPr>
-        <w:rPr>
-          <w:rFonts w:ascii="Times New Roman" w:hAnsi="Times New Roman" w:cs="Times New Roman"/>
-          <w:b/>
-          <w:bCs/>
-          <w:u w:val="single"/>
-          <w:lang w:val="tr-TR"/>
-        </w:rPr>
-      </w:pPr>
       <w:r>
         <w:rPr>
           <w:noProof/>
@@ -8240,16 +8781,375 @@
         <mc:AlternateContent>
           <mc:Choice Requires="wps">
             <w:drawing>
-              <wp:anchor distT="0" distB="0" distL="114300" distR="114300" simplePos="0" relativeHeight="251718656" behindDoc="0" locked="0" layoutInCell="1" allowOverlap="1" wp14:anchorId="6D09E82A" wp14:editId="3C3E9539">
+              <wp:anchor distT="0" distB="0" distL="114300" distR="114300" simplePos="0" relativeHeight="251669504" behindDoc="0" locked="0" layoutInCell="1" allowOverlap="1" wp14:anchorId="40724422" wp14:editId="1B0E009C">
                 <wp:simplePos x="0" y="0"/>
                 <wp:positionH relativeFrom="column">
-                  <wp:posOffset>-232611</wp:posOffset>
+                  <wp:posOffset>-423512</wp:posOffset>
                 </wp:positionH>
                 <wp:positionV relativeFrom="paragraph">
-                  <wp:posOffset>163596</wp:posOffset>
+                  <wp:posOffset>111092</wp:posOffset>
                 </wp:positionV>
-                <wp:extent cx="6198870" cy="200526"/>
-                <wp:effectExtent l="0" t="0" r="0" b="3175"/>
+                <wp:extent cx="6785610" cy="127635"/>
+                <wp:effectExtent l="0" t="0" r="0" b="0"/>
+                <wp:wrapNone/>
+                <wp:docPr id="2069058256" name="Metin Kutusu 1"/>
+                <wp:cNvGraphicFramePr/>
+                <a:graphic xmlns:a="http://schemas.openxmlformats.org/drawingml/2006/main">
+                  <a:graphicData uri="http://schemas.microsoft.com/office/word/2010/wordprocessingShape">
+                    <wps:wsp>
+                      <wps:cNvSpPr txBox="1"/>
+                      <wps:spPr>
+                        <a:xfrm>
+                          <a:off x="0" y="0"/>
+                          <a:ext cx="6785610" cy="127635"/>
+                        </a:xfrm>
+                        <a:prstGeom prst="rect">
+                          <a:avLst/>
+                        </a:prstGeom>
+                        <a:solidFill>
+                          <a:prstClr val="white"/>
+                        </a:solidFill>
+                        <a:ln>
+                          <a:noFill/>
+                        </a:ln>
+                      </wps:spPr>
+                      <wps:txbx>
+                        <w:txbxContent>
+                          <w:p>
+                            <w:pPr>
+                              <w:pStyle w:val="ResimYazs"/>
+                              <w:rPr>
+                                <w:rFonts w:ascii="Times New Roman" w:hAnsi="Times New Roman" w:cs="Times New Roman"/>
+                                <w:b/>
+                                <w:bCs/>
+                                <w:noProof/>
+                                <w:color w:val="000000" w:themeColor="text1"/>
+                                <w:u w:val="single"/>
+                                <w:lang w:val="tr-TR"/>
+                              </w:rPr>
+                            </w:pPr>
+                            <w:r>
+                              <w:rPr>
+                                <w:rFonts w:ascii="Times New Roman" w:hAnsi="Times New Roman" w:cs="Times New Roman"/>
+                                <w:b/>
+                                <w:bCs/>
+                                <w:color w:val="000000" w:themeColor="text1"/>
+                                <w:lang w:val="tr-TR"/>
+                              </w:rPr>
+                              <w:t>Fi</w:t>
+                            </w:r>
+                            <w:r>
+                              <w:rPr>
+                                <w:rFonts w:ascii="Times New Roman" w:hAnsi="Times New Roman" w:cs="Times New Roman"/>
+                                <w:b/>
+                                <w:bCs/>
+                                <w:color w:val="000000" w:themeColor="text1"/>
+                                <w:lang w:val="tr-TR"/>
+                              </w:rPr>
+                              <w:t>g</w:t>
+                            </w:r>
+                            <w:r>
+                              <w:rPr>
+                                <w:rFonts w:ascii="Times New Roman" w:hAnsi="Times New Roman" w:cs="Times New Roman"/>
+                                <w:b/>
+                                <w:bCs/>
+                                <w:color w:val="000000" w:themeColor="text1"/>
+                                <w:lang w:val="tr-TR"/>
+                              </w:rPr>
+                              <w:t xml:space="preserve">ure </w:t>
+                            </w:r>
+                            <w:r>
+                              <w:rPr>
+                                <w:rFonts w:ascii="Times New Roman" w:hAnsi="Times New Roman" w:cs="Times New Roman"/>
+                                <w:b/>
+                                <w:bCs/>
+                                <w:color w:val="000000" w:themeColor="text1"/>
+                                <w:lang w:val="tr-TR"/>
+                              </w:rPr>
+                              <w:t>4</w:t>
+                            </w:r>
+                            <w:r>
+                              <w:rPr>
+                                <w:rFonts w:ascii="Times New Roman" w:hAnsi="Times New Roman" w:cs="Times New Roman"/>
+                                <w:b/>
+                                <w:bCs/>
+                                <w:color w:val="000000" w:themeColor="text1"/>
+                                <w:lang w:val="tr-TR"/>
+                              </w:rPr>
+                              <w:t>: Learning to Defer Strategy Evaluation When Confidence Threshold is 0.29</w:t>
+                            </w:r>
+                          </w:p>
+                        </w:txbxContent>
+                      </wps:txbx>
+                      <wps:bodyPr rot="0" spcFirstLastPara="0" vertOverflow="overflow" horzOverflow="overflow" vert="horz" wrap="square" lIns="0" tIns="0" rIns="0" bIns="0" numCol="1" spcCol="0" rtlCol="0" fromWordArt="0" anchor="t" anchorCtr="0" forceAA="0" compatLnSpc="1">
+                        <a:prstTxWarp prst="textNoShape">
+                          <a:avLst/>
+                        </a:prstTxWarp>
+                        <a:noAutofit/>
+                      </wps:bodyPr>
+                    </wps:wsp>
+                  </a:graphicData>
+                </a:graphic>
+                <wp14:sizeRelH relativeFrom="margin">
+                  <wp14:pctWidth>0</wp14:pctWidth>
+                </wp14:sizeRelH>
+                <wp14:sizeRelV relativeFrom="margin">
+                  <wp14:pctHeight>0</wp14:pctHeight>
+                </wp14:sizeRelV>
+              </wp:anchor>
+            </w:drawing>
+          </mc:Choice>
+          <mc:Fallback>
+            <w:pict>
+              <v:shape w14:anchorId="40724422" id="_x0000_s1030" type="#_x0000_t202" style="position:absolute;left:0;text-align:left;margin-left:-33.35pt;margin-top:8.75pt;width:534.3pt;height:10.05pt;z-index:251669504;visibility:visible;mso-wrap-style:square;mso-width-percent:0;mso-height-percent:0;mso-wrap-distance-left:9pt;mso-wrap-distance-top:0;mso-wrap-distance-right:9pt;mso-wrap-distance-bottom:0;mso-position-horizontal:absolute;mso-position-horizontal-relative:text;mso-position-vertical:absolute;mso-position-vertical-relative:text;mso-width-percent:0;mso-height-percent:0;mso-width-relative:margin;mso-height-relative:margin;v-text-anchor:top" o:gfxdata="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" stroked="f">
+                <v:textbox inset="0,0,0,0">
+                  <w:txbxContent>
+                    <w:p>
+                      <w:pPr>
+                        <w:pStyle w:val="ResimYazs"/>
+                        <w:rPr>
+                          <w:rFonts w:ascii="Times New Roman" w:hAnsi="Times New Roman" w:cs="Times New Roman"/>
+                          <w:b/>
+                          <w:bCs/>
+                          <w:noProof/>
+                          <w:color w:val="000000" w:themeColor="text1"/>
+                          <w:u w:val="single"/>
+                          <w:lang w:val="tr-TR"/>
+                        </w:rPr>
+                      </w:pPr>
+                      <w:r>
+                        <w:rPr>
+                          <w:rFonts w:ascii="Times New Roman" w:hAnsi="Times New Roman" w:cs="Times New Roman"/>
+                          <w:b/>
+                          <w:bCs/>
+                          <w:color w:val="000000" w:themeColor="text1"/>
+                          <w:lang w:val="tr-TR"/>
+                        </w:rPr>
+                        <w:t>Fi</w:t>
+                      </w:r>
+                      <w:r>
+                        <w:rPr>
+                          <w:rFonts w:ascii="Times New Roman" w:hAnsi="Times New Roman" w:cs="Times New Roman"/>
+                          <w:b/>
+                          <w:bCs/>
+                          <w:color w:val="000000" w:themeColor="text1"/>
+                          <w:lang w:val="tr-TR"/>
+                        </w:rPr>
+                        <w:t>g</w:t>
+                      </w:r>
+                      <w:r>
+                        <w:rPr>
+                          <w:rFonts w:ascii="Times New Roman" w:hAnsi="Times New Roman" w:cs="Times New Roman"/>
+                          <w:b/>
+                          <w:bCs/>
+                          <w:color w:val="000000" w:themeColor="text1"/>
+                          <w:lang w:val="tr-TR"/>
+                        </w:rPr>
+                        <w:t xml:space="preserve">ure </w:t>
+                      </w:r>
+                      <w:r>
+                        <w:rPr>
+                          <w:rFonts w:ascii="Times New Roman" w:hAnsi="Times New Roman" w:cs="Times New Roman"/>
+                          <w:b/>
+                          <w:bCs/>
+                          <w:color w:val="000000" w:themeColor="text1"/>
+                          <w:lang w:val="tr-TR"/>
+                        </w:rPr>
+                        <w:t>4</w:t>
+                      </w:r>
+                      <w:r>
+                        <w:rPr>
+                          <w:rFonts w:ascii="Times New Roman" w:hAnsi="Times New Roman" w:cs="Times New Roman"/>
+                          <w:b/>
+                          <w:bCs/>
+                          <w:color w:val="000000" w:themeColor="text1"/>
+                          <w:lang w:val="tr-TR"/>
+                        </w:rPr>
+                        <w:t>: Learning to Defer Strategy Evaluation When Confidence Threshold is 0.29</w:t>
+                      </w:r>
+                    </w:p>
+                  </w:txbxContent>
+                </v:textbox>
+              </v:shape>
+            </w:pict>
+          </mc:Fallback>
+        </mc:AlternateContent>
+      </w:r>
+    </w:p>
+    <w:p>
+      <w:pPr>
+        <w:jc w:val="both"/>
+        <w:rPr>
+          <w:rFonts w:ascii="Times New Roman" w:hAnsi="Times New Roman" w:cs="Times New Roman"/>
+          <w:lang w:val="tr-TR"/>
+        </w:rPr>
+      </w:pPr>
+    </w:p>
+    <w:p>
+      <w:pPr>
+        <w:jc w:val="both"/>
+        <w:rPr>
+          <w:rFonts w:ascii="Times New Roman" w:hAnsi="Times New Roman" w:cs="Times New Roman"/>
+          <w:lang w:val="tr-TR"/>
+        </w:rPr>
+      </w:pPr>
+    </w:p>
+    <w:p>
+      <w:pPr>
+        <w:jc w:val="both"/>
+        <w:rPr>
+          <w:rFonts w:ascii="Times New Roman" w:hAnsi="Times New Roman" w:cs="Times New Roman"/>
+          <w:lang w:val="tr-TR"/>
+        </w:rPr>
+      </w:pPr>
+    </w:p>
+    <w:p>
+      <w:pPr>
+        <w:jc w:val="both"/>
+        <w:rPr>
+          <w:rFonts w:ascii="Times New Roman" w:hAnsi="Times New Roman" w:cs="Times New Roman"/>
+          <w:lang w:val="tr-TR"/>
+        </w:rPr>
+      </w:pPr>
+      <w:r>
+        <w:rPr>
+          <w:rFonts w:ascii="Times New Roman" w:hAnsi="Times New Roman" w:cs="Times New Roman"/>
+          <w:lang w:val="tr-TR"/>
+        </w:rPr>
+        <w:tab/>
+      </w:r>
+    </w:p>
+    <w:p>
+      <w:pPr>
+        <w:jc w:val="both"/>
+        <w:rPr>
+          <w:rFonts w:ascii="Times New Roman" w:hAnsi="Times New Roman" w:cs="Times New Roman"/>
+          <w:lang w:val="tr-TR"/>
+        </w:rPr>
+      </w:pPr>
+    </w:p>
+    <w:p>
+      <w:pPr>
+        <w:jc w:val="both"/>
+        <w:rPr>
+          <w:rFonts w:ascii="Times New Roman" w:hAnsi="Times New Roman" w:cs="Times New Roman"/>
+          <w:lang w:val="tr-TR"/>
+        </w:rPr>
+      </w:pPr>
+    </w:p>
+    <w:p>
+      <w:pPr>
+        <w:jc w:val="both"/>
+        <w:rPr>
+          <w:rFonts w:ascii="Times New Roman" w:hAnsi="Times New Roman" w:cs="Times New Roman"/>
+          <w:lang w:val="tr-TR"/>
+        </w:rPr>
+      </w:pPr>
+    </w:p>
+    <w:p>
+      <w:pPr>
+        <w:jc w:val="both"/>
+        <w:rPr>
+          <w:rFonts w:ascii="Times New Roman" w:hAnsi="Times New Roman" w:cs="Times New Roman"/>
+          <w:lang w:val="tr-TR"/>
+        </w:rPr>
+      </w:pPr>
+    </w:p>
+    <w:p>
+      <w:pPr>
+        <w:jc w:val="both"/>
+        <w:rPr>
+          <w:rFonts w:ascii="Times New Roman" w:hAnsi="Times New Roman" w:cs="Times New Roman"/>
+          <w:lang w:val="tr-TR"/>
+        </w:rPr>
+      </w:pPr>
+    </w:p>
+    <w:p>
+      <w:pPr>
+        <w:jc w:val="both"/>
+        <w:rPr>
+          <w:rFonts w:ascii="Times New Roman" w:hAnsi="Times New Roman" w:cs="Times New Roman"/>
+          <w:lang w:val="tr-TR"/>
+        </w:rPr>
+      </w:pPr>
+    </w:p>
+    <w:p>
+      <w:pPr>
+        <w:jc w:val="both"/>
+        <w:rPr>
+          <w:rFonts w:ascii="Times New Roman" w:hAnsi="Times New Roman" w:cs="Times New Roman"/>
+          <w:lang w:val="tr-TR"/>
+        </w:rPr>
+      </w:pPr>
+    </w:p>
+    <w:p>
+      <w:pPr>
+        <w:jc w:val="both"/>
+        <w:rPr>
+          <w:rFonts w:ascii="Times New Roman" w:hAnsi="Times New Roman" w:cs="Times New Roman"/>
+          <w:lang w:val="tr-TR"/>
+        </w:rPr>
+      </w:pPr>
+      <w:r>
+        <w:rPr>
+          <w:rFonts w:ascii="Times New Roman" w:hAnsi="Times New Roman" w:cs="Times New Roman"/>
+          <w:lang w:val="tr-TR"/>
+        </w:rPr>
+        <w:tab/>
+      </w:r>
+    </w:p>
+    <w:p>
+      <w:pPr>
+        <w:jc w:val="both"/>
+        <w:rPr>
+          <w:rFonts w:ascii="Times New Roman" w:hAnsi="Times New Roman" w:cs="Times New Roman"/>
+          <w:lang w:val="tr-TR"/>
+        </w:rPr>
+      </w:pPr>
+    </w:p>
+    <w:p>
+      <w:pPr>
+        <w:jc w:val="both"/>
+        <w:rPr>
+          <w:rFonts w:ascii="Times New Roman" w:hAnsi="Times New Roman" w:cs="Times New Roman"/>
+          <w:lang w:val="tr-TR"/>
+        </w:rPr>
+      </w:pPr>
+    </w:p>
+    <w:p>
+      <w:pPr>
+        <w:jc w:val="both"/>
+        <w:rPr>
+          <w:rFonts w:ascii="Times New Roman" w:hAnsi="Times New Roman" w:cs="Times New Roman"/>
+          <w:lang w:val="tr-TR"/>
+        </w:rPr>
+      </w:pPr>
+    </w:p>
+    <w:p>
+      <w:pPr>
+        <w:jc w:val="both"/>
+        <w:rPr>
+          <w:rFonts w:ascii="Times New Roman" w:hAnsi="Times New Roman" w:cs="Times New Roman"/>
+          <w:lang w:val="tr-TR"/>
+        </w:rPr>
+      </w:pPr>
+      <w:r>
+        <w:rPr>
+          <w:noProof/>
+        </w:rPr>
+        <mc:AlternateContent>
+          <mc:Choice Requires="wps">
+            <w:drawing>
+              <wp:anchor distT="0" distB="0" distL="114300" distR="114300" simplePos="0" relativeHeight="251718656" behindDoc="0" locked="0" layoutInCell="1" allowOverlap="1" wp14:anchorId="6D09E82A" wp14:editId="4C5E227F">
+                <wp:simplePos x="0" y="0"/>
+                <wp:positionH relativeFrom="column">
+                  <wp:posOffset>-441859</wp:posOffset>
+                </wp:positionH>
+                <wp:positionV relativeFrom="paragraph">
+                  <wp:posOffset>587275</wp:posOffset>
+                </wp:positionV>
+                <wp:extent cx="6699183" cy="144379"/>
+                <wp:effectExtent l="0" t="0" r="0" b="0"/>
                 <wp:wrapNone/>
                 <wp:docPr id="645999195" name="Metin Kutusu 1"/>
                 <wp:cNvGraphicFramePr/>
@@ -8260,7 +9160,7 @@
                       <wps:spPr>
                         <a:xfrm>
                           <a:off x="0" y="0"/>
-                          <a:ext cx="6198870" cy="200526"/>
+                          <a:ext cx="6699183" cy="144379"/>
                         </a:xfrm>
                         <a:prstGeom prst="rect">
                           <a:avLst/>
@@ -8334,7 +9234,7 @@
           </mc:Choice>
           <mc:Fallback>
             <w:pict>
-              <v:shape w14:anchorId="6D09E82A" id="_x0000_s1031" type="#_x0000_t202" style="position:absolute;margin-left:-18.3pt;margin-top:12.9pt;width:488.1pt;height:15.8pt;z-index:251718656;visibility:visible;mso-wrap-style:square;mso-width-percent:0;mso-height-percent:0;mso-wrap-distance-left:9pt;mso-wrap-distance-top:0;mso-wrap-distance-right:9pt;mso-wrap-distance-bottom:0;mso-position-horizontal:absolute;mso-position-horizontal-relative:text;mso-position-vertical:absolute;mso-position-vertical-relative:text;mso-width-percent:0;mso-height-percent:0;mso-width-relative:margin;mso-height-relative:margin;v-text-anchor:top" o:gfxdata="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" stroked="f">
+              <v:shape w14:anchorId="6D09E82A" id="_x0000_s1031" type="#_x0000_t202" style="position:absolute;left:0;text-align:left;margin-left:-34.8pt;margin-top:46.25pt;width:527.5pt;height:11.35pt;z-index:251718656;visibility:visible;mso-wrap-style:square;mso-width-percent:0;mso-height-percent:0;mso-wrap-distance-left:9pt;mso-wrap-distance-top:0;mso-wrap-distance-right:9pt;mso-wrap-distance-bottom:0;mso-position-horizontal:absolute;mso-position-horizontal-relative:text;mso-position-vertical:absolute;mso-position-vertical-relative:text;mso-width-percent:0;mso-height-percent:0;mso-width-relative:margin;mso-height-relative:margin;v-text-anchor:top" o:gfxdata="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" stroked="f">
                 <v:textbox inset="0,0,0,0">
                   <w:txbxContent>
                     <w:p>
@@ -8388,10 +9288,6 @@
         <w:jc w:val="both"/>
         <w:rPr>
           <w:rFonts w:ascii="Times New Roman" w:hAnsi="Times New Roman" w:cs="Times New Roman"/>
-          <w:b/>
-          <w:bCs/>
-          <w:sz w:val="18"/>
-          <w:szCs w:val="18"/>
           <w:lang w:val="tr-TR"/>
         </w:rPr>
       </w:pPr>
@@ -8401,17 +9297,18 @@
           <w:noProof/>
           <w:lang w:val="tr-TR"/>
         </w:rPr>
+        <w:lastRenderedPageBreak/>
         <w:drawing>
-          <wp:anchor distT="0" distB="0" distL="114300" distR="114300" simplePos="0" relativeHeight="251671552" behindDoc="0" locked="0" layoutInCell="1" allowOverlap="1" wp14:anchorId="723402BF" wp14:editId="7A45D56D">
+          <wp:anchor distT="0" distB="0" distL="114300" distR="114300" simplePos="0" relativeHeight="251671552" behindDoc="0" locked="0" layoutInCell="1" allowOverlap="1" wp14:anchorId="723402BF" wp14:editId="77772B11">
             <wp:simplePos x="0" y="0"/>
             <wp:positionH relativeFrom="column">
-              <wp:posOffset>-473075</wp:posOffset>
+              <wp:posOffset>-462013</wp:posOffset>
             </wp:positionH>
             <wp:positionV relativeFrom="paragraph">
-              <wp:posOffset>299653</wp:posOffset>
+              <wp:posOffset>-712270</wp:posOffset>
             </wp:positionV>
-            <wp:extent cx="6632173" cy="4200525"/>
-            <wp:effectExtent l="0" t="0" r="0" b="3175"/>
+            <wp:extent cx="6631010" cy="5573027"/>
+            <wp:effectExtent l="0" t="0" r="0" b="2540"/>
             <wp:wrapNone/>
             <wp:docPr id="939875268" name="Resim 8"/>
             <wp:cNvGraphicFramePr>
@@ -8439,7 +9336,7 @@
                   <pic:spPr>
                     <a:xfrm>
                       <a:off x="0" y="0"/>
-                      <a:ext cx="6632173" cy="4200525"/>
+                      <a:ext cx="6681051" cy="5615084"/>
                     </a:xfrm>
                     <a:prstGeom prst="rect">
                       <a:avLst/>
@@ -8466,13 +9363,6 @@
           <w:lang w:val="tr-TR"/>
         </w:rPr>
       </w:pPr>
-      <w:r>
-        <w:rPr>
-          <w:rFonts w:ascii="Times New Roman" w:hAnsi="Times New Roman" w:cs="Times New Roman"/>
-          <w:lang w:val="tr-TR"/>
-        </w:rPr>
-        <w:tab/>
-      </w:r>
     </w:p>
     <w:p>
       <w:pPr>
@@ -8518,13 +9408,6 @@
           <w:lang w:val="tr-TR"/>
         </w:rPr>
       </w:pPr>
-      <w:r>
-        <w:rPr>
-          <w:rFonts w:ascii="Times New Roman" w:hAnsi="Times New Roman" w:cs="Times New Roman"/>
-          <w:lang w:val="tr-TR"/>
-        </w:rPr>
-        <w:tab/>
-      </w:r>
     </w:p>
     <w:p>
       <w:pPr>
@@ -8585,6 +9468,28 @@
         <w:jc w:val="both"/>
         <w:rPr>
           <w:rFonts w:ascii="Times New Roman" w:hAnsi="Times New Roman" w:cs="Times New Roman"/>
+          <w:lang w:val="tr-TR"/>
+        </w:rPr>
+      </w:pPr>
+    </w:p>
+    <w:p>
+      <w:pPr>
+        <w:jc w:val="both"/>
+        <w:rPr>
+          <w:rFonts w:ascii="Times New Roman" w:hAnsi="Times New Roman" w:cs="Times New Roman"/>
+          <w:sz w:val="22"/>
+          <w:szCs w:val="22"/>
+          <w:lang w:val="tr-TR"/>
+        </w:rPr>
+      </w:pPr>
+    </w:p>
+    <w:p>
+      <w:pPr>
+        <w:jc w:val="both"/>
+        <w:rPr>
+          <w:rFonts w:ascii="Times New Roman" w:hAnsi="Times New Roman" w:cs="Times New Roman"/>
+          <w:sz w:val="22"/>
+          <w:szCs w:val="22"/>
           <w:lang w:val="tr-TR"/>
         </w:rPr>
       </w:pPr>
@@ -8595,15 +9500,15 @@
         <mc:AlternateContent>
           <mc:Choice Requires="wps">
             <w:drawing>
-              <wp:anchor distT="0" distB="0" distL="114300" distR="114300" simplePos="0" relativeHeight="251700224" behindDoc="0" locked="0" layoutInCell="1" allowOverlap="1" wp14:anchorId="5D3BF4BA" wp14:editId="5F266055">
+              <wp:anchor distT="0" distB="0" distL="114300" distR="114300" simplePos="0" relativeHeight="251700224" behindDoc="0" locked="0" layoutInCell="1" allowOverlap="1" wp14:anchorId="5D3BF4BA" wp14:editId="7F351EF7">
                 <wp:simplePos x="0" y="0"/>
                 <wp:positionH relativeFrom="column">
-                  <wp:posOffset>-425116</wp:posOffset>
+                  <wp:posOffset>-395605</wp:posOffset>
                 </wp:positionH>
                 <wp:positionV relativeFrom="paragraph">
-                  <wp:posOffset>674135</wp:posOffset>
+                  <wp:posOffset>354965</wp:posOffset>
                 </wp:positionV>
-                <wp:extent cx="6583814" cy="160421"/>
+                <wp:extent cx="6583680" cy="160020"/>
                 <wp:effectExtent l="0" t="0" r="0" b="5080"/>
                 <wp:wrapNone/>
                 <wp:docPr id="472233776" name="Metin Kutusu 1"/>
@@ -8615,7 +9520,7 @@
                       <wps:spPr>
                         <a:xfrm>
                           <a:off x="0" y="0"/>
-                          <a:ext cx="6583814" cy="160421"/>
+                          <a:ext cx="6583680" cy="160020"/>
                         </a:xfrm>
                         <a:prstGeom prst="rect">
                           <a:avLst/>
@@ -8689,7 +9594,7 @@
           </mc:Choice>
           <mc:Fallback>
             <w:pict>
-              <v:shape w14:anchorId="5D3BF4BA" id="_x0000_s1032" type="#_x0000_t202" style="position:absolute;left:0;text-align:left;margin-left:-33.45pt;margin-top:53.1pt;width:518.4pt;height:12.65pt;z-index:251700224;visibility:visible;mso-wrap-style:square;mso-width-percent:0;mso-height-percent:0;mso-wrap-distance-left:9pt;mso-wrap-distance-top:0;mso-wrap-distance-right:9pt;mso-wrap-distance-bottom:0;mso-position-horizontal:absolute;mso-position-horizontal-relative:text;mso-position-vertical:absolute;mso-position-vertical-relative:text;mso-width-percent:0;mso-height-percent:0;mso-width-relative:margin;mso-height-relative:margin;v-text-anchor:top" o:gfxdata="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" stroked="f">
+              <v:shape w14:anchorId="5D3BF4BA" id="_x0000_s1032" type="#_x0000_t202" style="position:absolute;left:0;text-align:left;margin-left:-31.15pt;margin-top:27.95pt;width:518.4pt;height:12.6pt;z-index:251700224;visibility:visible;mso-wrap-style:square;mso-width-percent:0;mso-height-percent:0;mso-wrap-distance-left:9pt;mso-wrap-distance-top:0;mso-wrap-distance-right:9pt;mso-wrap-distance-bottom:0;mso-position-horizontal:absolute;mso-position-horizontal-relative:text;mso-position-vertical:absolute;mso-position-vertical-relative:text;mso-width-percent:0;mso-height-percent:0;mso-width-relative:margin;mso-height-relative:margin;v-text-anchor:top" o:gfxdata="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" stroked="f">
                 <v:textbox inset="0,0,0,0">
                   <w:txbxContent>
                     <w:p>
@@ -8751,381 +9656,452 @@
       <w:r>
         <w:rPr>
           <w:rFonts w:ascii="Times New Roman" w:hAnsi="Times New Roman" w:cs="Times New Roman"/>
-          <w:lang w:val="tr-TR"/>
+          <w:sz w:val="22"/>
+          <w:szCs w:val="22"/>
+          <w:lang w:val="tr-TR"/>
+        </w:rPr>
+        <w:tab/>
+      </w:r>
+    </w:p>
+    <w:p>
+      <w:pPr>
+        <w:jc w:val="both"/>
+        <w:rPr>
+          <w:rFonts w:ascii="Times New Roman" w:hAnsi="Times New Roman" w:cs="Times New Roman"/>
+          <w:sz w:val="22"/>
+          <w:szCs w:val="22"/>
+          <w:lang w:val="tr-TR"/>
+        </w:rPr>
+      </w:pPr>
+    </w:p>
+    <w:p>
+      <w:pPr>
+        <w:jc w:val="both"/>
+        <w:rPr>
+          <w:rFonts w:ascii="Times New Roman" w:hAnsi="Times New Roman" w:cs="Times New Roman"/>
+          <w:sz w:val="22"/>
+          <w:szCs w:val="22"/>
+          <w:lang w:val="tr-TR"/>
+        </w:rPr>
+      </w:pPr>
+      <w:r>
+        <w:rPr>
+          <w:rFonts w:ascii="Times New Roman" w:hAnsi="Times New Roman" w:cs="Times New Roman"/>
+          <w:sz w:val="22"/>
+          <w:szCs w:val="22"/>
+          <w:lang w:val="tr-TR"/>
+        </w:rPr>
+        <w:tab/>
+      </w:r>
+      <w:r>
+        <w:rPr>
+          <w:rFonts w:ascii="Times New Roman" w:hAnsi="Times New Roman" w:cs="Times New Roman"/>
+          <w:sz w:val="22"/>
+          <w:szCs w:val="22"/>
+          <w:lang w:val="tr-TR"/>
+        </w:rPr>
+        <w:t xml:space="preserve">Here, the system accuracy calculated is a hybrid value. The accuracy value is calculated for the ground truth </w:t>
+      </w:r>
+      <w:r>
+        <w:rPr>
+          <w:rFonts w:ascii="Times New Roman" w:hAnsi="Times New Roman" w:cs="Times New Roman"/>
+          <w:sz w:val="22"/>
+          <w:szCs w:val="22"/>
+        </w:rPr>
+        <w:t>"</w:t>
+      </w:r>
+      <w:r>
+        <w:rPr>
+          <w:rFonts w:ascii="Times New Roman" w:hAnsi="Times New Roman" w:cs="Times New Roman"/>
+          <w:b/>
+          <w:bCs/>
+          <w:sz w:val="22"/>
+          <w:szCs w:val="22"/>
+          <w:lang w:val="tr-TR"/>
+        </w:rPr>
+        <w:t>y_test</w:t>
+      </w:r>
+      <w:r>
+        <w:rPr>
+          <w:rFonts w:ascii="Times New Roman" w:hAnsi="Times New Roman" w:cs="Times New Roman"/>
+          <w:sz w:val="22"/>
+          <w:szCs w:val="22"/>
+        </w:rPr>
+        <w:t xml:space="preserve">" values and final_predictions, which include both the expert predictions and baseline classifier predictions. </w:t>
+      </w:r>
+      <w:r>
+        <w:rPr>
+          <w:rFonts w:ascii="Times New Roman" w:hAnsi="Times New Roman" w:cs="Times New Roman"/>
+          <w:sz w:val="22"/>
+          <w:szCs w:val="22"/>
+        </w:rPr>
+        <w:t xml:space="preserve">To avoid a divide-by-zero error in the ratio values, we checked whether the denominator of each ratio value is greater than 0; if so, it is used as it is. Otherwise, the corresponding ratio </w:t>
+      </w:r>
+      <w:r>
+        <w:rPr>
+          <w:rFonts w:ascii="Times New Roman" w:hAnsi="Times New Roman" w:cs="Times New Roman"/>
+          <w:sz w:val="22"/>
+          <w:szCs w:val="22"/>
+        </w:rPr>
+        <w:t>is set to</w:t>
+      </w:r>
+      <w:r>
+        <w:rPr>
+          <w:rFonts w:ascii="Times New Roman" w:hAnsi="Times New Roman" w:cs="Times New Roman"/>
+          <w:sz w:val="22"/>
+          <w:szCs w:val="22"/>
+        </w:rPr>
+        <w:t xml:space="preserve"> 0.0.</w:t>
+      </w:r>
+    </w:p>
+    <w:p>
+      <w:pPr>
+        <w:jc w:val="both"/>
+        <w:rPr>
+          <w:rFonts w:ascii="Times New Roman" w:hAnsi="Times New Roman" w:cs="Times New Roman"/>
+          <w:sz w:val="22"/>
+          <w:szCs w:val="22"/>
+          <w:lang w:val="tr-TR"/>
+        </w:rPr>
+      </w:pPr>
+      <w:r>
+        <w:rPr>
+          <w:rFonts w:ascii="Times New Roman" w:hAnsi="Times New Roman" w:cs="Times New Roman"/>
+          <w:sz w:val="22"/>
+          <w:szCs w:val="22"/>
+          <w:lang w:val="tr-TR"/>
+        </w:rPr>
+        <w:tab/>
+      </w:r>
+      <w:r>
+        <w:rPr>
+          <w:rFonts w:ascii="Times New Roman" w:hAnsi="Times New Roman" w:cs="Times New Roman"/>
+          <w:sz w:val="22"/>
+          <w:szCs w:val="22"/>
+          <w:lang w:val="tr-TR"/>
+        </w:rPr>
+        <w:t>If t</w:t>
+      </w:r>
+      <w:r>
+        <w:rPr>
+          <w:rFonts w:ascii="Times New Roman" w:hAnsi="Times New Roman" w:cs="Times New Roman"/>
+          <w:sz w:val="22"/>
+          <w:szCs w:val="22"/>
+          <w:lang w:val="tr-TR"/>
+        </w:rPr>
+        <w:t xml:space="preserve">he max probability coming from the baseline model trained on the X input test dataset </w:t>
+      </w:r>
+      <w:r>
+        <w:rPr>
+          <w:rFonts w:ascii="Times New Roman" w:hAnsi="Times New Roman" w:cs="Times New Roman"/>
+          <w:sz w:val="22"/>
+          <w:szCs w:val="22"/>
+          <w:lang w:val="tr-TR"/>
+        </w:rPr>
+        <w:t>is below the threshold</w:t>
+      </w:r>
+      <w:r>
+        <w:rPr>
+          <w:rFonts w:ascii="Times New Roman" w:hAnsi="Times New Roman" w:cs="Times New Roman"/>
+          <w:sz w:val="22"/>
+          <w:szCs w:val="22"/>
+          <w:lang w:val="tr-TR"/>
+        </w:rPr>
+        <w:t xml:space="preserve"> </w:t>
+      </w:r>
+      <w:r>
+        <w:rPr>
+          <w:rFonts w:ascii="Times New Roman" w:hAnsi="Times New Roman" w:cs="Times New Roman"/>
+          <w:b/>
+          <w:bCs/>
+          <w:sz w:val="22"/>
+          <w:szCs w:val="22"/>
+          <w:lang w:val="tr-TR"/>
+        </w:rPr>
+        <w:t>(max_probs[i] &lt; threshold)</w:t>
+      </w:r>
+      <w:r>
+        <w:rPr>
+          <w:rFonts w:ascii="Times New Roman" w:hAnsi="Times New Roman" w:cs="Times New Roman"/>
+          <w:sz w:val="22"/>
+          <w:szCs w:val="22"/>
+          <w:lang w:val="tr-TR"/>
+        </w:rPr>
+        <w:t xml:space="preserve">, it means that we are deferring to the expert. </w:t>
+      </w:r>
+      <w:r>
+        <w:rPr>
+          <w:rFonts w:ascii="Times New Roman" w:hAnsi="Times New Roman" w:cs="Times New Roman"/>
+          <w:sz w:val="22"/>
+          <w:szCs w:val="22"/>
+          <w:lang w:val="tr-TR"/>
+        </w:rPr>
+        <w:t xml:space="preserve">However, in this scenario, if the baseline classifier is correct for the current index, it is </w:t>
+      </w:r>
+      <w:r>
+        <w:rPr>
+          <w:rFonts w:ascii="Times New Roman" w:hAnsi="Times New Roman" w:cs="Times New Roman"/>
+          <w:b/>
+          <w:bCs/>
+          <w:sz w:val="22"/>
+          <w:szCs w:val="22"/>
+          <w:lang w:val="tr-TR"/>
+        </w:rPr>
+        <w:t>a false deferral</w:t>
+      </w:r>
+      <w:r>
+        <w:rPr>
+          <w:rFonts w:ascii="Times New Roman" w:hAnsi="Times New Roman" w:cs="Times New Roman"/>
+          <w:sz w:val="22"/>
+          <w:szCs w:val="22"/>
+          <w:lang w:val="tr-TR"/>
+        </w:rPr>
+        <w:t xml:space="preserve"> </w:t>
+      </w:r>
+      <w:r>
+        <w:rPr>
+          <w:rFonts w:ascii="Times New Roman" w:hAnsi="Times New Roman" w:cs="Times New Roman"/>
+          <w:b/>
+          <w:bCs/>
+          <w:sz w:val="22"/>
+          <w:szCs w:val="22"/>
+          <w:lang w:val="tr-TR"/>
+        </w:rPr>
+        <w:t>(false positive)</w:t>
+      </w:r>
+      <w:r>
+        <w:rPr>
+          <w:rFonts w:ascii="Times New Roman" w:hAnsi="Times New Roman" w:cs="Times New Roman"/>
+          <w:sz w:val="22"/>
+          <w:szCs w:val="22"/>
+          <w:lang w:val="tr-TR"/>
+        </w:rPr>
+        <w:t xml:space="preserve"> of knowledge to the expert. Otherwise, it is a </w:t>
+      </w:r>
+      <w:r>
+        <w:rPr>
+          <w:rFonts w:ascii="Times New Roman" w:hAnsi="Times New Roman" w:cs="Times New Roman"/>
+          <w:b/>
+          <w:bCs/>
+          <w:sz w:val="22"/>
+          <w:szCs w:val="22"/>
+          <w:lang w:val="tr-TR"/>
+        </w:rPr>
+        <w:t>true deferral</w:t>
+      </w:r>
+      <w:r>
+        <w:rPr>
+          <w:rFonts w:ascii="Times New Roman" w:hAnsi="Times New Roman" w:cs="Times New Roman"/>
+          <w:sz w:val="22"/>
+          <w:szCs w:val="22"/>
+          <w:lang w:val="tr-TR"/>
+        </w:rPr>
+        <w:t xml:space="preserve"> </w:t>
+      </w:r>
+      <w:r>
+        <w:rPr>
+          <w:rFonts w:ascii="Times New Roman" w:hAnsi="Times New Roman" w:cs="Times New Roman"/>
+          <w:b/>
+          <w:bCs/>
+          <w:sz w:val="22"/>
+          <w:szCs w:val="22"/>
+          <w:lang w:val="tr-TR"/>
+        </w:rPr>
+        <w:t>(true positive)</w:t>
+      </w:r>
+      <w:r>
+        <w:rPr>
+          <w:rFonts w:ascii="Times New Roman" w:hAnsi="Times New Roman" w:cs="Times New Roman"/>
+          <w:sz w:val="22"/>
+          <w:szCs w:val="22"/>
+          <w:lang w:val="tr-TR"/>
+        </w:rPr>
+        <w:t xml:space="preserve"> case. </w:t>
+      </w:r>
+    </w:p>
+    <w:p>
+      <w:pPr>
+        <w:jc w:val="both"/>
+        <w:rPr>
+          <w:rFonts w:ascii="Times New Roman" w:hAnsi="Times New Roman" w:cs="Times New Roman"/>
+          <w:sz w:val="22"/>
+          <w:szCs w:val="22"/>
+          <w:lang w:val="tr-TR"/>
+        </w:rPr>
+      </w:pPr>
+      <w:r>
+        <w:rPr>
+          <w:rFonts w:ascii="Times New Roman" w:hAnsi="Times New Roman" w:cs="Times New Roman"/>
+          <w:sz w:val="22"/>
+          <w:szCs w:val="22"/>
+          <w:lang w:val="tr-TR"/>
+        </w:rPr>
+        <w:tab/>
+      </w:r>
+      <w:r>
+        <w:rPr>
+          <w:rFonts w:ascii="Times New Roman" w:hAnsi="Times New Roman" w:cs="Times New Roman"/>
+          <w:sz w:val="22"/>
+          <w:szCs w:val="22"/>
+          <w:lang w:val="tr-TR"/>
+        </w:rPr>
+        <w:t>If the max probability coming from the baseline model trained on the X input test dataset is above the threshold</w:t>
+      </w:r>
+      <w:r>
+        <w:rPr>
+          <w:rFonts w:ascii="Times New Roman" w:hAnsi="Times New Roman" w:cs="Times New Roman"/>
+          <w:sz w:val="22"/>
+          <w:szCs w:val="22"/>
+          <w:lang w:val="tr-TR"/>
+        </w:rPr>
+        <w:t xml:space="preserve"> </w:t>
+      </w:r>
+      <w:r>
+        <w:rPr>
+          <w:rFonts w:ascii="Times New Roman" w:hAnsi="Times New Roman" w:cs="Times New Roman"/>
+          <w:b/>
+          <w:bCs/>
+          <w:sz w:val="22"/>
+          <w:szCs w:val="22"/>
+          <w:lang w:val="tr-TR"/>
+        </w:rPr>
+        <w:t>(max_probs[i] &gt;= threshold)</w:t>
+      </w:r>
+      <w:r>
+        <w:rPr>
+          <w:rFonts w:ascii="Times New Roman" w:hAnsi="Times New Roman" w:cs="Times New Roman"/>
+          <w:sz w:val="22"/>
+          <w:szCs w:val="22"/>
+          <w:lang w:val="tr-TR"/>
+        </w:rPr>
+        <w:t xml:space="preserve">, it means that we </w:t>
+      </w:r>
+      <w:r>
+        <w:rPr>
+          <w:rFonts w:ascii="Times New Roman" w:hAnsi="Times New Roman" w:cs="Times New Roman"/>
+          <w:sz w:val="22"/>
+          <w:szCs w:val="22"/>
+          <w:lang w:val="tr-TR"/>
+        </w:rPr>
+        <w:t>do not defer to the expert, meaning the baseline model is confident enough in its prediction</w:t>
+      </w:r>
+      <w:r>
+        <w:rPr>
+          <w:rFonts w:ascii="Times New Roman" w:hAnsi="Times New Roman" w:cs="Times New Roman"/>
+          <w:sz w:val="22"/>
+          <w:szCs w:val="22"/>
+          <w:lang w:val="tr-TR"/>
+        </w:rPr>
+        <w:t xml:space="preserve">. However, in this scenario, if the baseline classifier is correct for the current index, it is </w:t>
+      </w:r>
+      <w:r>
+        <w:rPr>
+          <w:rFonts w:ascii="Times New Roman" w:hAnsi="Times New Roman" w:cs="Times New Roman"/>
+          <w:b/>
+          <w:bCs/>
+          <w:sz w:val="22"/>
+          <w:szCs w:val="22"/>
+          <w:lang w:val="tr-TR"/>
+        </w:rPr>
+        <w:t>a true undeferral</w:t>
+      </w:r>
+      <w:r>
+        <w:rPr>
+          <w:rFonts w:ascii="Times New Roman" w:hAnsi="Times New Roman" w:cs="Times New Roman"/>
+          <w:sz w:val="22"/>
+          <w:szCs w:val="22"/>
+          <w:lang w:val="tr-TR"/>
+        </w:rPr>
+        <w:t xml:space="preserve"> </w:t>
+      </w:r>
+      <w:r>
+        <w:rPr>
+          <w:rFonts w:ascii="Times New Roman" w:hAnsi="Times New Roman" w:cs="Times New Roman"/>
+          <w:b/>
+          <w:bCs/>
+          <w:sz w:val="22"/>
+          <w:szCs w:val="22"/>
+          <w:lang w:val="tr-TR"/>
+        </w:rPr>
+        <w:t>(true negative)</w:t>
+      </w:r>
+      <w:r>
+        <w:rPr>
+          <w:rFonts w:ascii="Times New Roman" w:hAnsi="Times New Roman" w:cs="Times New Roman"/>
+          <w:sz w:val="22"/>
+          <w:szCs w:val="22"/>
+          <w:lang w:val="tr-TR"/>
+        </w:rPr>
+        <w:t xml:space="preserve"> of knowledge to the expert. Otherwise, it is a </w:t>
+      </w:r>
+      <w:r>
+        <w:rPr>
+          <w:rFonts w:ascii="Times New Roman" w:hAnsi="Times New Roman" w:cs="Times New Roman"/>
+          <w:b/>
+          <w:bCs/>
+          <w:sz w:val="22"/>
+          <w:szCs w:val="22"/>
+          <w:lang w:val="tr-TR"/>
+        </w:rPr>
+        <w:t>false undeferral (false negative)</w:t>
+      </w:r>
+      <w:r>
+        <w:rPr>
+          <w:rFonts w:ascii="Times New Roman" w:hAnsi="Times New Roman" w:cs="Times New Roman"/>
+          <w:sz w:val="22"/>
+          <w:szCs w:val="22"/>
+          <w:lang w:val="tr-TR"/>
+        </w:rPr>
+        <w:t xml:space="preserve"> case. </w:t>
+      </w:r>
+    </w:p>
+    <w:p>
+      <w:pPr>
+        <w:rPr>
+          <w:rFonts w:ascii="Times New Roman" w:hAnsi="Times New Roman" w:cs="Times New Roman"/>
+          <w:b/>
+          <w:bCs/>
+          <w:u w:val="single"/>
+          <w:lang w:val="tr-TR"/>
+        </w:rPr>
+      </w:pPr>
+    </w:p>
+    <w:p>
+      <w:pPr>
+        <w:rPr>
+          <w:rFonts w:ascii="Times New Roman" w:hAnsi="Times New Roman" w:cs="Times New Roman"/>
+          <w:b/>
+          <w:bCs/>
+          <w:u w:val="single"/>
+          <w:lang w:val="tr-TR"/>
+        </w:rPr>
+      </w:pPr>
+    </w:p>
+    <w:p>
+      <w:pPr>
+        <w:rPr>
+          <w:rFonts w:ascii="Times New Roman" w:eastAsia="Times New Roman" w:hAnsi="Times New Roman" w:cs="Times New Roman"/>
+          <w:b/>
+          <w:bCs/>
+          <w:lang w:eastAsia="tr-TR"/>
+        </w:rPr>
+      </w:pPr>
+      <w:r>
+        <w:rPr>
+          <w:noProof/>
+          <w:lang w:eastAsia="tr-TR"/>
         </w:rPr>
         <w:lastRenderedPageBreak/>
-        <w:tab/>
-      </w:r>
-      <w:r>
-        <w:rPr>
-          <w:rFonts w:ascii="Times New Roman" w:hAnsi="Times New Roman" w:cs="Times New Roman"/>
-          <w:sz w:val="22"/>
-          <w:szCs w:val="22"/>
-          <w:lang w:val="tr-TR"/>
-        </w:rPr>
-        <w:t xml:space="preserve">Here, the system accuracy calculated is a hybrid value. The accuracy value is calculated for the ground truth </w:t>
-      </w:r>
-      <w:r>
-        <w:rPr>
-          <w:rFonts w:ascii="Times New Roman" w:hAnsi="Times New Roman" w:cs="Times New Roman"/>
-          <w:sz w:val="22"/>
-          <w:szCs w:val="22"/>
-        </w:rPr>
-        <w:t>"</w:t>
-      </w:r>
-      <w:r>
-        <w:rPr>
-          <w:rFonts w:ascii="Times New Roman" w:hAnsi="Times New Roman" w:cs="Times New Roman"/>
-          <w:b/>
-          <w:bCs/>
-          <w:sz w:val="22"/>
-          <w:szCs w:val="22"/>
-          <w:lang w:val="tr-TR"/>
-        </w:rPr>
-        <w:t>y_test</w:t>
-      </w:r>
-      <w:r>
-        <w:rPr>
-          <w:rFonts w:ascii="Times New Roman" w:hAnsi="Times New Roman" w:cs="Times New Roman"/>
-          <w:sz w:val="22"/>
-          <w:szCs w:val="22"/>
-        </w:rPr>
-        <w:t xml:space="preserve">" values and final_predictions, which include both the expert predictions and baseline classifier predictions. </w:t>
-      </w:r>
-      <w:r>
-        <w:rPr>
-          <w:rFonts w:ascii="Times New Roman" w:hAnsi="Times New Roman" w:cs="Times New Roman"/>
-          <w:sz w:val="22"/>
-          <w:szCs w:val="22"/>
-        </w:rPr>
-        <w:t>To avoid a divide-by-zero error in the ratio values, we checked whether the denominator of each ratio value is greater than 0; if so, it is used as it is. Otherwise, the corresponding ratio value is taken as 0.0.</w:t>
-      </w:r>
-    </w:p>
-    <w:p>
-      <w:pPr>
-        <w:jc w:val="both"/>
-        <w:rPr>
-          <w:rFonts w:ascii="Times New Roman" w:hAnsi="Times New Roman" w:cs="Times New Roman"/>
-          <w:sz w:val="22"/>
-          <w:szCs w:val="22"/>
-          <w:lang w:val="tr-TR"/>
-        </w:rPr>
-      </w:pPr>
-      <w:r>
-        <w:rPr>
-          <w:rFonts w:ascii="Times New Roman" w:hAnsi="Times New Roman" w:cs="Times New Roman"/>
-          <w:sz w:val="22"/>
-          <w:szCs w:val="22"/>
-          <w:lang w:val="tr-TR"/>
-        </w:rPr>
-        <w:tab/>
-      </w:r>
-      <w:r>
-        <w:rPr>
-          <w:rFonts w:ascii="Times New Roman" w:hAnsi="Times New Roman" w:cs="Times New Roman"/>
-          <w:sz w:val="22"/>
-          <w:szCs w:val="22"/>
-          <w:lang w:val="tr-TR"/>
-        </w:rPr>
-        <w:t>If t</w:t>
-      </w:r>
-      <w:r>
-        <w:rPr>
-          <w:rFonts w:ascii="Times New Roman" w:hAnsi="Times New Roman" w:cs="Times New Roman"/>
-          <w:sz w:val="22"/>
-          <w:szCs w:val="22"/>
-          <w:lang w:val="tr-TR"/>
-        </w:rPr>
-        <w:t xml:space="preserve">he max probability coming from the baseline model trained on the X input test dataset </w:t>
-      </w:r>
-      <w:r>
-        <w:rPr>
-          <w:rFonts w:ascii="Times New Roman" w:hAnsi="Times New Roman" w:cs="Times New Roman"/>
-          <w:sz w:val="22"/>
-          <w:szCs w:val="22"/>
-          <w:lang w:val="tr-TR"/>
-        </w:rPr>
-        <w:t>is below the threshold</w:t>
-      </w:r>
-      <w:r>
-        <w:rPr>
-          <w:rFonts w:ascii="Times New Roman" w:hAnsi="Times New Roman" w:cs="Times New Roman"/>
-          <w:sz w:val="22"/>
-          <w:szCs w:val="22"/>
-          <w:lang w:val="tr-TR"/>
-        </w:rPr>
-        <w:t xml:space="preserve"> </w:t>
-      </w:r>
-      <w:r>
-        <w:rPr>
-          <w:rFonts w:ascii="Times New Roman" w:hAnsi="Times New Roman" w:cs="Times New Roman"/>
-          <w:b/>
-          <w:bCs/>
-          <w:sz w:val="22"/>
-          <w:szCs w:val="22"/>
-          <w:lang w:val="tr-TR"/>
-        </w:rPr>
-        <w:t>(max_probs[i] &lt; threshold)</w:t>
-      </w:r>
-      <w:r>
-        <w:rPr>
-          <w:rFonts w:ascii="Times New Roman" w:hAnsi="Times New Roman" w:cs="Times New Roman"/>
-          <w:sz w:val="22"/>
-          <w:szCs w:val="22"/>
-          <w:lang w:val="tr-TR"/>
-        </w:rPr>
-        <w:t xml:space="preserve">, it means that we are deferring to the expert. </w:t>
-      </w:r>
-      <w:r>
-        <w:rPr>
-          <w:rFonts w:ascii="Times New Roman" w:hAnsi="Times New Roman" w:cs="Times New Roman"/>
-          <w:sz w:val="22"/>
-          <w:szCs w:val="22"/>
-          <w:lang w:val="tr-TR"/>
-        </w:rPr>
-        <w:t xml:space="preserve">However, in this scenario, if the baseline classifier is correct for the current index, it is </w:t>
-      </w:r>
-      <w:r>
-        <w:rPr>
-          <w:rFonts w:ascii="Times New Roman" w:hAnsi="Times New Roman" w:cs="Times New Roman"/>
-          <w:b/>
-          <w:bCs/>
-          <w:sz w:val="22"/>
-          <w:szCs w:val="22"/>
-          <w:lang w:val="tr-TR"/>
-        </w:rPr>
-        <w:t>a false deferral</w:t>
-      </w:r>
-      <w:r>
-        <w:rPr>
-          <w:rFonts w:ascii="Times New Roman" w:hAnsi="Times New Roman" w:cs="Times New Roman"/>
-          <w:sz w:val="22"/>
-          <w:szCs w:val="22"/>
-          <w:lang w:val="tr-TR"/>
-        </w:rPr>
-        <w:t xml:space="preserve"> </w:t>
-      </w:r>
-      <w:r>
-        <w:rPr>
-          <w:rFonts w:ascii="Times New Roman" w:hAnsi="Times New Roman" w:cs="Times New Roman"/>
-          <w:b/>
-          <w:bCs/>
-          <w:sz w:val="22"/>
-          <w:szCs w:val="22"/>
-          <w:lang w:val="tr-TR"/>
-        </w:rPr>
-        <w:t>(false positive)</w:t>
-      </w:r>
-      <w:r>
-        <w:rPr>
-          <w:rFonts w:ascii="Times New Roman" w:hAnsi="Times New Roman" w:cs="Times New Roman"/>
-          <w:sz w:val="22"/>
-          <w:szCs w:val="22"/>
-          <w:lang w:val="tr-TR"/>
-        </w:rPr>
-        <w:t xml:space="preserve"> of knowledge to the expert. Otherwise, it is a </w:t>
-      </w:r>
-      <w:r>
-        <w:rPr>
-          <w:rFonts w:ascii="Times New Roman" w:hAnsi="Times New Roman" w:cs="Times New Roman"/>
-          <w:b/>
-          <w:bCs/>
-          <w:sz w:val="22"/>
-          <w:szCs w:val="22"/>
-          <w:lang w:val="tr-TR"/>
-        </w:rPr>
-        <w:t>true deferral</w:t>
-      </w:r>
-      <w:r>
-        <w:rPr>
-          <w:rFonts w:ascii="Times New Roman" w:hAnsi="Times New Roman" w:cs="Times New Roman"/>
-          <w:sz w:val="22"/>
-          <w:szCs w:val="22"/>
-          <w:lang w:val="tr-TR"/>
-        </w:rPr>
-        <w:t xml:space="preserve"> </w:t>
-      </w:r>
-      <w:r>
-        <w:rPr>
-          <w:rFonts w:ascii="Times New Roman" w:hAnsi="Times New Roman" w:cs="Times New Roman"/>
-          <w:b/>
-          <w:bCs/>
-          <w:sz w:val="22"/>
-          <w:szCs w:val="22"/>
-          <w:lang w:val="tr-TR"/>
-        </w:rPr>
-        <w:t>(true positive)</w:t>
-      </w:r>
-      <w:r>
-        <w:rPr>
-          <w:rFonts w:ascii="Times New Roman" w:hAnsi="Times New Roman" w:cs="Times New Roman"/>
-          <w:sz w:val="22"/>
-          <w:szCs w:val="22"/>
-          <w:lang w:val="tr-TR"/>
-        </w:rPr>
-        <w:t xml:space="preserve"> case. </w:t>
-      </w:r>
-    </w:p>
-    <w:p>
-      <w:pPr>
-        <w:jc w:val="both"/>
-        <w:rPr>
-          <w:rFonts w:ascii="Times New Roman" w:hAnsi="Times New Roman" w:cs="Times New Roman"/>
-          <w:sz w:val="22"/>
-          <w:szCs w:val="22"/>
-          <w:lang w:val="tr-TR"/>
-        </w:rPr>
-      </w:pPr>
-      <w:r>
-        <w:rPr>
-          <w:rFonts w:ascii="Times New Roman" w:hAnsi="Times New Roman" w:cs="Times New Roman"/>
-          <w:sz w:val="22"/>
-          <w:szCs w:val="22"/>
-          <w:lang w:val="tr-TR"/>
-        </w:rPr>
-        <w:tab/>
-      </w:r>
-      <w:r>
-        <w:rPr>
-          <w:rFonts w:ascii="Times New Roman" w:hAnsi="Times New Roman" w:cs="Times New Roman"/>
-          <w:sz w:val="22"/>
-          <w:szCs w:val="22"/>
-          <w:lang w:val="tr-TR"/>
-        </w:rPr>
-        <w:t>If the max probability coming from the baseline model trained on the X input test dataset is above the threshold</w:t>
-      </w:r>
-      <w:r>
-        <w:rPr>
-          <w:rFonts w:ascii="Times New Roman" w:hAnsi="Times New Roman" w:cs="Times New Roman"/>
-          <w:sz w:val="22"/>
-          <w:szCs w:val="22"/>
-          <w:lang w:val="tr-TR"/>
-        </w:rPr>
-        <w:t xml:space="preserve"> </w:t>
-      </w:r>
-      <w:r>
-        <w:rPr>
-          <w:rFonts w:ascii="Times New Roman" w:hAnsi="Times New Roman" w:cs="Times New Roman"/>
-          <w:b/>
-          <w:bCs/>
-          <w:sz w:val="22"/>
-          <w:szCs w:val="22"/>
-          <w:lang w:val="tr-TR"/>
-        </w:rPr>
-        <w:t>(max_probs[i] &gt;= threshold)</w:t>
-      </w:r>
-      <w:r>
-        <w:rPr>
-          <w:rFonts w:ascii="Times New Roman" w:hAnsi="Times New Roman" w:cs="Times New Roman"/>
-          <w:sz w:val="22"/>
-          <w:szCs w:val="22"/>
-          <w:lang w:val="tr-TR"/>
-        </w:rPr>
-        <w:t xml:space="preserve">, it means that we </w:t>
-      </w:r>
-      <w:r>
-        <w:rPr>
-          <w:rFonts w:ascii="Times New Roman" w:hAnsi="Times New Roman" w:cs="Times New Roman"/>
-          <w:sz w:val="22"/>
-          <w:szCs w:val="22"/>
-          <w:lang w:val="tr-TR"/>
-        </w:rPr>
-        <w:t>do not defer to the expert, meaning the baseline model is confident enough in its prediction</w:t>
-      </w:r>
-      <w:r>
-        <w:rPr>
-          <w:rFonts w:ascii="Times New Roman" w:hAnsi="Times New Roman" w:cs="Times New Roman"/>
-          <w:sz w:val="22"/>
-          <w:szCs w:val="22"/>
-          <w:lang w:val="tr-TR"/>
-        </w:rPr>
-        <w:t xml:space="preserve">. However, in this scenario, if the baseline classifier is correct for the current index, it is </w:t>
-      </w:r>
-      <w:r>
-        <w:rPr>
-          <w:rFonts w:ascii="Times New Roman" w:hAnsi="Times New Roman" w:cs="Times New Roman"/>
-          <w:b/>
-          <w:bCs/>
-          <w:sz w:val="22"/>
-          <w:szCs w:val="22"/>
-          <w:lang w:val="tr-TR"/>
-        </w:rPr>
-        <w:t>a true undeferral</w:t>
-      </w:r>
-      <w:r>
-        <w:rPr>
-          <w:rFonts w:ascii="Times New Roman" w:hAnsi="Times New Roman" w:cs="Times New Roman"/>
-          <w:sz w:val="22"/>
-          <w:szCs w:val="22"/>
-          <w:lang w:val="tr-TR"/>
-        </w:rPr>
-        <w:t xml:space="preserve"> </w:t>
-      </w:r>
-      <w:r>
-        <w:rPr>
-          <w:rFonts w:ascii="Times New Roman" w:hAnsi="Times New Roman" w:cs="Times New Roman"/>
-          <w:b/>
-          <w:bCs/>
-          <w:sz w:val="22"/>
-          <w:szCs w:val="22"/>
-          <w:lang w:val="tr-TR"/>
-        </w:rPr>
-        <w:t>(true negative)</w:t>
-      </w:r>
-      <w:r>
-        <w:rPr>
-          <w:rFonts w:ascii="Times New Roman" w:hAnsi="Times New Roman" w:cs="Times New Roman"/>
-          <w:sz w:val="22"/>
-          <w:szCs w:val="22"/>
-          <w:lang w:val="tr-TR"/>
-        </w:rPr>
-        <w:t xml:space="preserve"> of knowledge to the expert. Otherwise, it is a </w:t>
-      </w:r>
-      <w:r>
-        <w:rPr>
-          <w:rFonts w:ascii="Times New Roman" w:hAnsi="Times New Roman" w:cs="Times New Roman"/>
-          <w:b/>
-          <w:bCs/>
-          <w:sz w:val="22"/>
-          <w:szCs w:val="22"/>
-          <w:lang w:val="tr-TR"/>
-        </w:rPr>
-        <w:t>false undeferral (false negative)</w:t>
-      </w:r>
-      <w:r>
-        <w:rPr>
-          <w:rFonts w:ascii="Times New Roman" w:hAnsi="Times New Roman" w:cs="Times New Roman"/>
-          <w:sz w:val="22"/>
-          <w:szCs w:val="22"/>
-          <w:lang w:val="tr-TR"/>
-        </w:rPr>
-        <w:t xml:space="preserve"> case. </w:t>
-      </w:r>
-    </w:p>
-    <w:p>
-      <w:pPr>
-        <w:rPr>
-          <w:rFonts w:ascii="Times New Roman" w:eastAsia="Times New Roman" w:hAnsi="Times New Roman" w:cs="Times New Roman"/>
-          <w:b/>
-          <w:bCs/>
-          <w:lang w:eastAsia="tr-TR"/>
-        </w:rPr>
-      </w:pPr>
-      <w:r>
-        <w:rPr>
-          <w:noProof/>
-          <w:lang w:eastAsia="tr-TR"/>
-        </w:rPr>
         <w:drawing>
-          <wp:anchor distT="0" distB="0" distL="114300" distR="114300" simplePos="0" relativeHeight="251692032" behindDoc="0" locked="0" layoutInCell="1" allowOverlap="1" wp14:anchorId="13945B0A" wp14:editId="0ED11288">
+          <wp:anchor distT="0" distB="0" distL="114300" distR="114300" simplePos="0" relativeHeight="251692032" behindDoc="0" locked="0" layoutInCell="1" allowOverlap="1" wp14:anchorId="13945B0A" wp14:editId="26B0A0CA">
             <wp:simplePos x="0" y="0"/>
             <wp:positionH relativeFrom="column">
-              <wp:posOffset>-72190</wp:posOffset>
+              <wp:posOffset>-240632</wp:posOffset>
             </wp:positionH>
             <wp:positionV relativeFrom="paragraph">
-              <wp:posOffset>266767</wp:posOffset>
+              <wp:posOffset>288758</wp:posOffset>
             </wp:positionV>
-            <wp:extent cx="5526405" cy="3553460"/>
+            <wp:extent cx="5871210" cy="4823460"/>
             <wp:effectExtent l="0" t="0" r="0" b="2540"/>
             <wp:wrapNone/>
             <wp:docPr id="1476777606" name="Resim 14"/>
@@ -9155,7 +10131,7 @@
                   <pic:spPr bwMode="auto">
                     <a:xfrm>
                       <a:off x="0" y="0"/>
-                      <a:ext cx="5527078" cy="3553893"/>
+                      <a:ext cx="5880639" cy="4831206"/>
                     </a:xfrm>
                     <a:prstGeom prst="rect">
                       <a:avLst/>
@@ -9260,15 +10236,134 @@
         <mc:AlternateContent>
           <mc:Choice Requires="wps">
             <w:drawing>
-              <wp:anchor distT="0" distB="0" distL="114300" distR="114300" simplePos="0" relativeHeight="251694080" behindDoc="0" locked="0" layoutInCell="1" allowOverlap="1" wp14:anchorId="53D3F867" wp14:editId="34CB8B69">
+              <wp:anchor distT="0" distB="0" distL="114300" distR="114300" simplePos="0" relativeHeight="251677696" behindDoc="0" locked="0" layoutInCell="1" allowOverlap="1" wp14:anchorId="6CF2C859" wp14:editId="170C3C72">
                 <wp:simplePos x="0" y="0"/>
                 <wp:positionH relativeFrom="column">
-                  <wp:posOffset>-72189</wp:posOffset>
+                  <wp:posOffset>-240632</wp:posOffset>
                 </wp:positionH>
                 <wp:positionV relativeFrom="paragraph">
-                  <wp:posOffset>2962476</wp:posOffset>
+                  <wp:posOffset>8259111</wp:posOffset>
                 </wp:positionV>
-                <wp:extent cx="5566610" cy="312821"/>
+                <wp:extent cx="5932638" cy="135890"/>
+                <wp:effectExtent l="0" t="0" r="0" b="3810"/>
+                <wp:wrapNone/>
+                <wp:docPr id="1320663255" name="Metin Kutusu 1"/>
+                <wp:cNvGraphicFramePr/>
+                <a:graphic xmlns:a="http://schemas.openxmlformats.org/drawingml/2006/main">
+                  <a:graphicData uri="http://schemas.microsoft.com/office/word/2010/wordprocessingShape">
+                    <wps:wsp>
+                      <wps:cNvSpPr txBox="1"/>
+                      <wps:spPr>
+                        <a:xfrm>
+                          <a:off x="0" y="0"/>
+                          <a:ext cx="5932638" cy="135890"/>
+                        </a:xfrm>
+                        <a:prstGeom prst="rect">
+                          <a:avLst/>
+                        </a:prstGeom>
+                        <a:solidFill>
+                          <a:prstClr val="white"/>
+                        </a:solidFill>
+                        <a:ln>
+                          <a:noFill/>
+                        </a:ln>
+                      </wps:spPr>
+                      <wps:txbx>
+                        <w:txbxContent>
+                          <w:p>
+                            <w:pPr>
+                              <w:pStyle w:val="ResimYazs"/>
+                              <w:rPr>
+                                <w:rFonts w:ascii="Times New Roman" w:eastAsia="Times New Roman" w:hAnsi="Times New Roman" w:cs="Times New Roman"/>
+                                <w:b/>
+                                <w:bCs/>
+                                <w:noProof/>
+                                <w:color w:val="000000" w:themeColor="text1"/>
+                                <w:lang w:val="tr-TR"/>
+                              </w:rPr>
+                            </w:pPr>
+                            <w:r>
+                              <w:rPr>
+                                <w:rFonts w:ascii="Times New Roman" w:hAnsi="Times New Roman" w:cs="Times New Roman"/>
+                                <w:b/>
+                                <w:bCs/>
+                                <w:color w:val="000000" w:themeColor="text1"/>
+                                <w:lang w:val="tr-TR"/>
+                              </w:rPr>
+                              <w:t xml:space="preserve">Figure 5: Number of Labeled Samples vs Model’s Test Accuracy Graph for 30 Active Learning Queries </w:t>
+                            </w:r>
+                          </w:p>
+                        </w:txbxContent>
+                      </wps:txbx>
+                      <wps:bodyPr rot="0" spcFirstLastPara="0" vertOverflow="overflow" horzOverflow="overflow" vert="horz" wrap="square" lIns="0" tIns="0" rIns="0" bIns="0" numCol="1" spcCol="0" rtlCol="0" fromWordArt="0" anchor="t" anchorCtr="0" forceAA="0" compatLnSpc="1">
+                        <a:prstTxWarp prst="textNoShape">
+                          <a:avLst/>
+                        </a:prstTxWarp>
+                        <a:noAutofit/>
+                      </wps:bodyPr>
+                    </wps:wsp>
+                  </a:graphicData>
+                </a:graphic>
+                <wp14:sizeRelH relativeFrom="margin">
+                  <wp14:pctWidth>0</wp14:pctWidth>
+                </wp14:sizeRelH>
+                <wp14:sizeRelV relativeFrom="margin">
+                  <wp14:pctHeight>0</wp14:pctHeight>
+                </wp14:sizeRelV>
+              </wp:anchor>
+            </w:drawing>
+          </mc:Choice>
+          <mc:Fallback>
+            <w:pict>
+              <v:shape w14:anchorId="6CF2C859" id="_x0000_s1033" type="#_x0000_t202" style="position:absolute;margin-left:-18.95pt;margin-top:650.3pt;width:467.15pt;height:10.7pt;z-index:251677696;visibility:visible;mso-wrap-style:square;mso-width-percent:0;mso-height-percent:0;mso-wrap-distance-left:9pt;mso-wrap-distance-top:0;mso-wrap-distance-right:9pt;mso-wrap-distance-bottom:0;mso-position-horizontal:absolute;mso-position-horizontal-relative:text;mso-position-vertical:absolute;mso-position-vertical-relative:text;mso-width-percent:0;mso-height-percent:0;mso-width-relative:margin;mso-height-relative:margin;v-text-anchor:top" o:gfxdata="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" stroked="f">
+                <v:textbox inset="0,0,0,0">
+                  <w:txbxContent>
+                    <w:p>
+                      <w:pPr>
+                        <w:pStyle w:val="ResimYazs"/>
+                        <w:rPr>
+                          <w:rFonts w:ascii="Times New Roman" w:eastAsia="Times New Roman" w:hAnsi="Times New Roman" w:cs="Times New Roman"/>
+                          <w:b/>
+                          <w:bCs/>
+                          <w:noProof/>
+                          <w:color w:val="000000" w:themeColor="text1"/>
+                          <w:lang w:val="tr-TR"/>
+                        </w:rPr>
+                      </w:pPr>
+                      <w:r>
+                        <w:rPr>
+                          <w:rFonts w:ascii="Times New Roman" w:hAnsi="Times New Roman" w:cs="Times New Roman"/>
+                          <w:b/>
+                          <w:bCs/>
+                          <w:color w:val="000000" w:themeColor="text1"/>
+                          <w:lang w:val="tr-TR"/>
+                        </w:rPr>
+                        <w:t xml:space="preserve">Figure 5: Number of Labeled Samples vs Model’s Test Accuracy Graph for 30 Active Learning Queries </w:t>
+                      </w:r>
+                    </w:p>
+                  </w:txbxContent>
+                </v:textbox>
+              </v:shape>
+            </w:pict>
+          </mc:Fallback>
+        </mc:AlternateContent>
+      </w:r>
+      <w:r>
+        <w:rPr>
+          <w:noProof/>
+        </w:rPr>
+        <mc:AlternateContent>
+          <mc:Choice Requires="wps">
+            <w:drawing>
+              <wp:anchor distT="0" distB="0" distL="114300" distR="114300" simplePos="0" relativeHeight="251694080" behindDoc="0" locked="0" layoutInCell="1" allowOverlap="1" wp14:anchorId="53D3F867" wp14:editId="2812750B">
+                <wp:simplePos x="0" y="0"/>
+                <wp:positionH relativeFrom="column">
+                  <wp:posOffset>-240633</wp:posOffset>
+                </wp:positionH>
+                <wp:positionV relativeFrom="paragraph">
+                  <wp:posOffset>4274252</wp:posOffset>
+                </wp:positionV>
+                <wp:extent cx="5871411" cy="312821"/>
                 <wp:effectExtent l="0" t="0" r="0" b="5080"/>
                 <wp:wrapNone/>
                 <wp:docPr id="1115993652" name="Metin Kutusu 1"/>
@@ -9280,7 +10375,7 @@
                       <wps:spPr>
                         <a:xfrm>
                           <a:off x="0" y="0"/>
-                          <a:ext cx="5566610" cy="312821"/>
+                          <a:ext cx="5871411" cy="312821"/>
                         </a:xfrm>
                         <a:prstGeom prst="rect">
                           <a:avLst/>
@@ -9386,7 +10481,7 @@
           </mc:Choice>
           <mc:Fallback>
             <w:pict>
-              <v:shape w14:anchorId="53D3F867" id="_x0000_s1033" type="#_x0000_t202" style="position:absolute;margin-left:-5.7pt;margin-top:233.25pt;width:438.3pt;height:24.65pt;z-index:251694080;visibility:visible;mso-wrap-style:square;mso-width-percent:0;mso-height-percent:0;mso-wrap-distance-left:9pt;mso-wrap-distance-top:0;mso-wrap-distance-right:9pt;mso-wrap-distance-bottom:0;mso-position-horizontal:absolute;mso-position-horizontal-relative:text;mso-position-vertical:absolute;mso-position-vertical-relative:text;mso-width-percent:0;mso-height-percent:0;mso-width-relative:margin;mso-height-relative:margin;v-text-anchor:top" o:gfxdata="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" stroked="f">
+              <v:shape w14:anchorId="53D3F867" id="_x0000_s1034" type="#_x0000_t202" style="position:absolute;margin-left:-18.95pt;margin-top:336.55pt;width:462.3pt;height:24.65pt;z-index:251694080;visibility:visible;mso-wrap-style:square;mso-width-percent:0;mso-height-percent:0;mso-wrap-distance-left:9pt;mso-wrap-distance-top:0;mso-wrap-distance-right:9pt;mso-wrap-distance-bottom:0;mso-position-horizontal:absolute;mso-position-horizontal-relative:text;mso-position-vertical:absolute;mso-position-vertical-relative:text;mso-width-percent:0;mso-height-percent:0;mso-width-relative:margin;mso-height-relative:margin;v-text-anchor:top" o:gfxdata="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" stroked="f">
                 <v:textbox inset="0,0,0,0">
                   <w:txbxContent>
                     <w:p>
@@ -9475,16 +10570,16 @@
           <w:lang w:eastAsia="tr-TR"/>
         </w:rPr>
         <w:drawing>
-          <wp:anchor distT="0" distB="0" distL="114300" distR="114300" simplePos="0" relativeHeight="251675648" behindDoc="0" locked="0" layoutInCell="1" allowOverlap="1" wp14:anchorId="0423A870" wp14:editId="0F40DF08">
+          <wp:anchor distT="0" distB="0" distL="114300" distR="114300" simplePos="0" relativeHeight="251675648" behindDoc="0" locked="0" layoutInCell="1" allowOverlap="1" wp14:anchorId="0423A870" wp14:editId="5725C39B">
             <wp:simplePos x="0" y="0"/>
             <wp:positionH relativeFrom="column">
-              <wp:posOffset>-240632</wp:posOffset>
+              <wp:posOffset>-317634</wp:posOffset>
             </wp:positionH>
             <wp:positionV relativeFrom="paragraph">
-              <wp:posOffset>3379570</wp:posOffset>
+              <wp:posOffset>4948020</wp:posOffset>
             </wp:positionV>
-            <wp:extent cx="6011475" cy="2309362"/>
-            <wp:effectExtent l="0" t="0" r="0" b="2540"/>
+            <wp:extent cx="6010168" cy="3165509"/>
+            <wp:effectExtent l="0" t="0" r="0" b="0"/>
             <wp:wrapNone/>
             <wp:docPr id="204514653" name="Resim 11"/>
             <wp:cNvGraphicFramePr>
@@ -9512,7 +10607,7 @@
                   <pic:spPr>
                     <a:xfrm>
                       <a:off x="0" y="0"/>
-                      <a:ext cx="6016526" cy="2311302"/>
+                      <a:ext cx="6050436" cy="3186718"/>
                     </a:xfrm>
                     <a:prstGeom prst="rect">
                       <a:avLst/>
@@ -9532,125 +10627,6 @@
       </w:r>
       <w:r>
         <w:rPr>
-          <w:noProof/>
-        </w:rPr>
-        <mc:AlternateContent>
-          <mc:Choice Requires="wps">
-            <w:drawing>
-              <wp:anchor distT="0" distB="0" distL="114300" distR="114300" simplePos="0" relativeHeight="251677696" behindDoc="0" locked="0" layoutInCell="1" allowOverlap="1" wp14:anchorId="6CF2C859" wp14:editId="3C3C0F87">
-                <wp:simplePos x="0" y="0"/>
-                <wp:positionH relativeFrom="column">
-                  <wp:posOffset>-238760</wp:posOffset>
-                </wp:positionH>
-                <wp:positionV relativeFrom="paragraph">
-                  <wp:posOffset>5744077</wp:posOffset>
-                </wp:positionV>
-                <wp:extent cx="6014720" cy="136358"/>
-                <wp:effectExtent l="0" t="0" r="5080" b="3810"/>
-                <wp:wrapNone/>
-                <wp:docPr id="1320663255" name="Metin Kutusu 1"/>
-                <wp:cNvGraphicFramePr/>
-                <a:graphic xmlns:a="http://schemas.openxmlformats.org/drawingml/2006/main">
-                  <a:graphicData uri="http://schemas.microsoft.com/office/word/2010/wordprocessingShape">
-                    <wps:wsp>
-                      <wps:cNvSpPr txBox="1"/>
-                      <wps:spPr>
-                        <a:xfrm>
-                          <a:off x="0" y="0"/>
-                          <a:ext cx="6014720" cy="136358"/>
-                        </a:xfrm>
-                        <a:prstGeom prst="rect">
-                          <a:avLst/>
-                        </a:prstGeom>
-                        <a:solidFill>
-                          <a:prstClr val="white"/>
-                        </a:solidFill>
-                        <a:ln>
-                          <a:noFill/>
-                        </a:ln>
-                      </wps:spPr>
-                      <wps:txbx>
-                        <w:txbxContent>
-                          <w:p>
-                            <w:pPr>
-                              <w:pStyle w:val="ResimYazs"/>
-                              <w:rPr>
-                                <w:rFonts w:ascii="Times New Roman" w:eastAsia="Times New Roman" w:hAnsi="Times New Roman" w:cs="Times New Roman"/>
-                                <w:b/>
-                                <w:bCs/>
-                                <w:noProof/>
-                                <w:color w:val="000000" w:themeColor="text1"/>
-                                <w:lang w:val="tr-TR"/>
-                              </w:rPr>
-                            </w:pPr>
-                            <w:r>
-                              <w:rPr>
-                                <w:rFonts w:ascii="Times New Roman" w:hAnsi="Times New Roman" w:cs="Times New Roman"/>
-                                <w:b/>
-                                <w:bCs/>
-                                <w:color w:val="000000" w:themeColor="text1"/>
-                                <w:lang w:val="tr-TR"/>
-                              </w:rPr>
-                              <w:t xml:space="preserve">Figure 5: Number of Labeled Samples vs Model’s Test Accuracy Graph for 30 Active Learning Queries </w:t>
-                            </w:r>
-                          </w:p>
-                        </w:txbxContent>
-                      </wps:txbx>
-                      <wps:bodyPr rot="0" spcFirstLastPara="0" vertOverflow="overflow" horzOverflow="overflow" vert="horz" wrap="square" lIns="0" tIns="0" rIns="0" bIns="0" numCol="1" spcCol="0" rtlCol="0" fromWordArt="0" anchor="t" anchorCtr="0" forceAA="0" compatLnSpc="1">
-                        <a:prstTxWarp prst="textNoShape">
-                          <a:avLst/>
-                        </a:prstTxWarp>
-                        <a:noAutofit/>
-                      </wps:bodyPr>
-                    </wps:wsp>
-                  </a:graphicData>
-                </a:graphic>
-                <wp14:sizeRelH relativeFrom="margin">
-                  <wp14:pctWidth>0</wp14:pctWidth>
-                </wp14:sizeRelH>
-                <wp14:sizeRelV relativeFrom="margin">
-                  <wp14:pctHeight>0</wp14:pctHeight>
-                </wp14:sizeRelV>
-              </wp:anchor>
-            </w:drawing>
-          </mc:Choice>
-          <mc:Fallback>
-            <w:pict>
-              <v:shape w14:anchorId="6CF2C859" id="_x0000_s1034" type="#_x0000_t202" style="position:absolute;margin-left:-18.8pt;margin-top:452.3pt;width:473.6pt;height:10.75pt;z-index:251677696;visibility:visible;mso-wrap-style:square;mso-width-percent:0;mso-height-percent:0;mso-wrap-distance-left:9pt;mso-wrap-distance-top:0;mso-wrap-distance-right:9pt;mso-wrap-distance-bottom:0;mso-position-horizontal:absolute;mso-position-horizontal-relative:text;mso-position-vertical:absolute;mso-position-vertical-relative:text;mso-width-percent:0;mso-height-percent:0;mso-width-relative:margin;mso-height-relative:margin;v-text-anchor:top" o:gfxdata="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" stroked="f">
-                <v:textbox inset="0,0,0,0">
-                  <w:txbxContent>
-                    <w:p>
-                      <w:pPr>
-                        <w:pStyle w:val="ResimYazs"/>
-                        <w:rPr>
-                          <w:rFonts w:ascii="Times New Roman" w:eastAsia="Times New Roman" w:hAnsi="Times New Roman" w:cs="Times New Roman"/>
-                          <w:b/>
-                          <w:bCs/>
-                          <w:noProof/>
-                          <w:color w:val="000000" w:themeColor="text1"/>
-                          <w:lang w:val="tr-TR"/>
-                        </w:rPr>
-                      </w:pPr>
-                      <w:r>
-                        <w:rPr>
-                          <w:rFonts w:ascii="Times New Roman" w:hAnsi="Times New Roman" w:cs="Times New Roman"/>
-                          <w:b/>
-                          <w:bCs/>
-                          <w:color w:val="000000" w:themeColor="text1"/>
-                          <w:lang w:val="tr-TR"/>
-                        </w:rPr>
-                        <w:t xml:space="preserve">Figure 5: Number of Labeled Samples vs Model’s Test Accuracy Graph for 30 Active Learning Queries </w:t>
-                      </w:r>
-                    </w:p>
-                  </w:txbxContent>
-                </v:textbox>
-              </v:shape>
-            </w:pict>
-          </mc:Fallback>
-        </mc:AlternateContent>
-      </w:r>
-      <w:r>
-        <w:rPr>
           <w:rFonts w:ascii="Times New Roman" w:eastAsia="Times New Roman" w:hAnsi="Times New Roman" w:cs="Times New Roman"/>
           <w:b/>
           <w:bCs/>
@@ -9675,16 +10651,16 @@
         </w:rPr>
         <w:lastRenderedPageBreak/>
         <w:drawing>
-          <wp:anchor distT="0" distB="0" distL="114300" distR="114300" simplePos="0" relativeHeight="251691008" behindDoc="0" locked="0" layoutInCell="1" allowOverlap="1" wp14:anchorId="50AC3C16" wp14:editId="5EE301C6">
+          <wp:anchor distT="0" distB="0" distL="114300" distR="114300" simplePos="0" relativeHeight="251691008" behindDoc="0" locked="0" layoutInCell="1" allowOverlap="1" wp14:anchorId="50AC3C16" wp14:editId="351DAAE8">
             <wp:simplePos x="0" y="0"/>
             <wp:positionH relativeFrom="column">
-              <wp:posOffset>368968</wp:posOffset>
+              <wp:posOffset>28876</wp:posOffset>
             </wp:positionH>
             <wp:positionV relativeFrom="paragraph">
-              <wp:posOffset>-649705</wp:posOffset>
+              <wp:posOffset>-818147</wp:posOffset>
             </wp:positionV>
-            <wp:extent cx="4347210" cy="4202430"/>
-            <wp:effectExtent l="0" t="0" r="0" b="1270"/>
+            <wp:extent cx="5620491" cy="4649002"/>
+            <wp:effectExtent l="0" t="0" r="5715" b="0"/>
             <wp:wrapNone/>
             <wp:docPr id="892816661" name="Resim 13"/>
             <wp:cNvGraphicFramePr>
@@ -9712,7 +10688,7 @@
                   <pic:spPr>
                     <a:xfrm>
                       <a:off x="0" y="0"/>
-                      <a:ext cx="4366676" cy="4221248"/>
+                      <a:ext cx="5626655" cy="4654100"/>
                     </a:xfrm>
                     <a:prstGeom prst="rect">
                       <a:avLst/>
@@ -9824,6 +10800,13 @@
           <w:lang w:eastAsia="tr-TR"/>
         </w:rPr>
       </w:pPr>
+    </w:p>
+    <w:p>
+      <w:pPr>
+        <w:rPr>
+          <w:lang w:eastAsia="tr-TR"/>
+        </w:rPr>
+      </w:pPr>
       <w:r>
         <w:rPr>
           <w:noProof/>
@@ -9831,16 +10814,16 @@
         <mc:AlternateContent>
           <mc:Choice Requires="wps">
             <w:drawing>
-              <wp:anchor distT="0" distB="0" distL="114300" distR="114300" simplePos="0" relativeHeight="251679744" behindDoc="0" locked="0" layoutInCell="1" allowOverlap="1" wp14:anchorId="6ADF8B2A" wp14:editId="408C43D0">
+              <wp:anchor distT="0" distB="0" distL="114300" distR="114300" simplePos="0" relativeHeight="251679744" behindDoc="0" locked="0" layoutInCell="1" allowOverlap="1" wp14:anchorId="6ADF8B2A" wp14:editId="5B1E77DB">
                 <wp:simplePos x="0" y="0"/>
                 <wp:positionH relativeFrom="column">
-                  <wp:posOffset>368968</wp:posOffset>
+                  <wp:posOffset>0</wp:posOffset>
                 </wp:positionH>
                 <wp:positionV relativeFrom="paragraph">
-                  <wp:posOffset>242236</wp:posOffset>
+                  <wp:posOffset>197217</wp:posOffset>
                 </wp:positionV>
-                <wp:extent cx="4347411" cy="176463"/>
-                <wp:effectExtent l="0" t="0" r="0" b="1905"/>
+                <wp:extent cx="5649729" cy="163629"/>
+                <wp:effectExtent l="0" t="0" r="1905" b="1905"/>
                 <wp:wrapNone/>
                 <wp:docPr id="718488957" name="Metin Kutusu 1"/>
                 <wp:cNvGraphicFramePr/>
@@ -9851,7 +10834,7 @@
                       <wps:spPr>
                         <a:xfrm>
                           <a:off x="0" y="0"/>
-                          <a:ext cx="4347411" cy="176463"/>
+                          <a:ext cx="5649729" cy="163629"/>
                         </a:xfrm>
                         <a:prstGeom prst="rect">
                           <a:avLst/>
@@ -9932,7 +10915,7 @@
           </mc:Choice>
           <mc:Fallback>
             <w:pict>
-              <v:shape w14:anchorId="6ADF8B2A" id="_x0000_s1035" type="#_x0000_t202" style="position:absolute;margin-left:29.05pt;margin-top:19.05pt;width:342.3pt;height:13.9pt;z-index:251679744;visibility:visible;mso-wrap-style:square;mso-width-percent:0;mso-height-percent:0;mso-wrap-distance-left:9pt;mso-wrap-distance-top:0;mso-wrap-distance-right:9pt;mso-wrap-distance-bottom:0;mso-position-horizontal:absolute;mso-position-horizontal-relative:text;mso-position-vertical:absolute;mso-position-vertical-relative:text;mso-width-percent:0;mso-height-percent:0;mso-width-relative:margin;mso-height-relative:margin;v-text-anchor:top" o:gfxdata="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" stroked="f">
+              <v:shape w14:anchorId="6ADF8B2A" id="_x0000_s1035" type="#_x0000_t202" style="position:absolute;margin-left:0;margin-top:15.55pt;width:444.85pt;height:12.9pt;z-index:251679744;visibility:visible;mso-wrap-style:square;mso-width-percent:0;mso-height-percent:0;mso-wrap-distance-left:9pt;mso-wrap-distance-top:0;mso-wrap-distance-right:9pt;mso-wrap-distance-bottom:0;mso-position-horizontal:absolute;mso-position-horizontal-relative:text;mso-position-vertical:absolute;mso-position-vertical-relative:text;mso-width-percent:0;mso-height-percent:0;mso-width-relative:margin;mso-height-relative:margin;v-text-anchor:top" o:gfxdata="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" stroked="f">
                 <v:textbox inset="0,0,0,0">
                   <w:txbxContent>
                     <w:p>
@@ -9994,28 +10977,21 @@
           <w:lang w:eastAsia="tr-TR"/>
         </w:rPr>
       </w:pPr>
-    </w:p>
-    <w:p>
-      <w:pPr>
-        <w:rPr>
-          <w:lang w:eastAsia="tr-TR"/>
-        </w:rPr>
-      </w:pPr>
       <w:r>
         <w:rPr>
           <w:noProof/>
         </w:rPr>
         <w:drawing>
-          <wp:anchor distT="0" distB="0" distL="114300" distR="114300" simplePos="0" relativeHeight="251695104" behindDoc="0" locked="0" layoutInCell="1" allowOverlap="1" wp14:anchorId="7D61ECF8" wp14:editId="240D1E73">
+          <wp:anchor distT="0" distB="0" distL="114300" distR="114300" simplePos="0" relativeHeight="251695104" behindDoc="0" locked="0" layoutInCell="1" allowOverlap="1" wp14:anchorId="7D61ECF8" wp14:editId="4C24BAF7">
             <wp:simplePos x="0" y="0"/>
             <wp:positionH relativeFrom="column">
-              <wp:posOffset>-721895</wp:posOffset>
+              <wp:posOffset>-432603</wp:posOffset>
             </wp:positionH>
             <wp:positionV relativeFrom="paragraph">
-              <wp:posOffset>137260</wp:posOffset>
+              <wp:posOffset>140335</wp:posOffset>
             </wp:positionV>
-            <wp:extent cx="6905625" cy="5261610"/>
-            <wp:effectExtent l="0" t="0" r="3175" b="0"/>
+            <wp:extent cx="6439301" cy="5261610"/>
+            <wp:effectExtent l="0" t="0" r="0" b="0"/>
             <wp:wrapNone/>
             <wp:docPr id="526208837" name="Resim 16"/>
             <wp:cNvGraphicFramePr>
@@ -10044,7 +11020,7 @@
                   <pic:spPr bwMode="auto">
                     <a:xfrm>
                       <a:off x="0" y="0"/>
-                      <a:ext cx="6906253" cy="5262088"/>
+                      <a:ext cx="6439301" cy="5261610"/>
                     </a:xfrm>
                     <a:prstGeom prst="rect">
                       <a:avLst/>
@@ -10187,16 +11163,16 @@
         <mc:AlternateContent>
           <mc:Choice Requires="wps">
             <w:drawing>
-              <wp:anchor distT="0" distB="0" distL="114300" distR="114300" simplePos="0" relativeHeight="251698176" behindDoc="0" locked="0" layoutInCell="1" allowOverlap="1" wp14:anchorId="578FFC31" wp14:editId="62E6D439">
+              <wp:anchor distT="0" distB="0" distL="114300" distR="114300" simplePos="0" relativeHeight="251698176" behindDoc="0" locked="0" layoutInCell="1" allowOverlap="1" wp14:anchorId="578FFC31" wp14:editId="7F90A119">
                 <wp:simplePos x="0" y="0"/>
                 <wp:positionH relativeFrom="column">
-                  <wp:posOffset>-721294</wp:posOffset>
+                  <wp:posOffset>-539015</wp:posOffset>
                 </wp:positionH>
                 <wp:positionV relativeFrom="paragraph">
-                  <wp:posOffset>2637355</wp:posOffset>
+                  <wp:posOffset>2640865</wp:posOffset>
                 </wp:positionV>
-                <wp:extent cx="6906126" cy="152400"/>
-                <wp:effectExtent l="0" t="0" r="3175" b="0"/>
+                <wp:extent cx="6544778" cy="152400"/>
+                <wp:effectExtent l="0" t="0" r="0" b="0"/>
                 <wp:wrapNone/>
                 <wp:docPr id="487180056" name="Metin Kutusu 1"/>
                 <wp:cNvGraphicFramePr/>
@@ -10207,7 +11183,7 @@
                       <wps:spPr>
                         <a:xfrm>
                           <a:off x="0" y="0"/>
-                          <a:ext cx="6906126" cy="152400"/>
+                          <a:ext cx="6544778" cy="152400"/>
                         </a:xfrm>
                         <a:prstGeom prst="rect">
                           <a:avLst/>
@@ -10303,7 +11279,7 @@
           </mc:Choice>
           <mc:Fallback>
             <w:pict>
-              <v:shape w14:anchorId="578FFC31" id="_x0000_s1036" type="#_x0000_t202" style="position:absolute;margin-left:-56.8pt;margin-top:207.65pt;width:543.8pt;height:12pt;z-index:251698176;visibility:visible;mso-wrap-style:square;mso-width-percent:0;mso-height-percent:0;mso-wrap-distance-left:9pt;mso-wrap-distance-top:0;mso-wrap-distance-right:9pt;mso-wrap-distance-bottom:0;mso-position-horizontal:absolute;mso-position-horizontal-relative:text;mso-position-vertical:absolute;mso-position-vertical-relative:text;mso-width-percent:0;mso-height-percent:0;mso-width-relative:margin;mso-height-relative:margin;v-text-anchor:top" o:gfxdata="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" stroked="f">
+              <v:shape w14:anchorId="578FFC31" id="_x0000_s1036" type="#_x0000_t202" style="position:absolute;margin-left:-42.45pt;margin-top:207.95pt;width:515.35pt;height:12pt;z-index:251698176;visibility:visible;mso-wrap-style:square;mso-width-percent:0;mso-height-percent:0;mso-wrap-distance-left:9pt;mso-wrap-distance-top:0;mso-wrap-distance-right:9pt;mso-wrap-distance-bottom:0;mso-position-horizontal:absolute;mso-position-horizontal-relative:text;mso-position-vertical:absolute;mso-position-vertical-relative:text;mso-width-percent:0;mso-height-percent:0;mso-width-relative:margin;mso-height-relative:margin;v-text-anchor:top" o:gfxdata="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" stroked="f">
                 <v:textbox inset="0,0,0,0">
                   <w:txbxContent>
                     <w:p>
@@ -10403,16 +11379,16 @@
         </w:rPr>
         <w:lastRenderedPageBreak/>
         <w:drawing>
-          <wp:anchor distT="0" distB="0" distL="114300" distR="114300" simplePos="0" relativeHeight="251696128" behindDoc="0" locked="0" layoutInCell="1" allowOverlap="1" wp14:anchorId="718374DE" wp14:editId="25D226E8">
+          <wp:anchor distT="0" distB="0" distL="114300" distR="114300" simplePos="0" relativeHeight="251696128" behindDoc="0" locked="0" layoutInCell="1" allowOverlap="1" wp14:anchorId="718374DE" wp14:editId="3B3BC70D">
             <wp:simplePos x="0" y="0"/>
             <wp:positionH relativeFrom="column">
-              <wp:posOffset>-689811</wp:posOffset>
+              <wp:posOffset>-693019</wp:posOffset>
             </wp:positionH>
             <wp:positionV relativeFrom="paragraph">
-              <wp:posOffset>-633663</wp:posOffset>
+              <wp:posOffset>-770021</wp:posOffset>
             </wp:positionV>
-            <wp:extent cx="6905197" cy="4860490"/>
-            <wp:effectExtent l="0" t="0" r="3810" b="3810"/>
+            <wp:extent cx="6904305" cy="5052829"/>
+            <wp:effectExtent l="0" t="0" r="5080" b="1905"/>
             <wp:wrapNone/>
             <wp:docPr id="1685495282" name="Resim 17"/>
             <wp:cNvGraphicFramePr>
@@ -10440,7 +11416,7 @@
                   <pic:spPr>
                     <a:xfrm>
                       <a:off x="0" y="0"/>
-                      <a:ext cx="6915665" cy="4867858"/>
+                      <a:ext cx="6933117" cy="5073915"/>
                     </a:xfrm>
                     <a:prstGeom prst="rect">
                       <a:avLst/>
@@ -10843,13 +11819,13 @@
         <mc:AlternateContent>
           <mc:Choice Requires="wps">
             <w:drawing>
-              <wp:anchor distT="0" distB="0" distL="114300" distR="114300" simplePos="0" relativeHeight="251720704" behindDoc="0" locked="0" layoutInCell="1" allowOverlap="1" wp14:anchorId="3654F393" wp14:editId="0B0D468D">
+              <wp:anchor distT="0" distB="0" distL="114300" distR="114300" simplePos="0" relativeHeight="251720704" behindDoc="0" locked="0" layoutInCell="1" allowOverlap="1" wp14:anchorId="3654F393" wp14:editId="6248BF59">
                 <wp:simplePos x="0" y="0"/>
                 <wp:positionH relativeFrom="column">
-                  <wp:posOffset>-617186</wp:posOffset>
+                  <wp:posOffset>-693587</wp:posOffset>
                 </wp:positionH>
                 <wp:positionV relativeFrom="paragraph">
-                  <wp:posOffset>180507</wp:posOffset>
+                  <wp:posOffset>238092</wp:posOffset>
                 </wp:positionV>
                 <wp:extent cx="6906126" cy="144379"/>
                 <wp:effectExtent l="0" t="0" r="3175" b="0"/>
@@ -10955,7 +11931,7 @@
           </mc:Choice>
           <mc:Fallback>
             <w:pict>
-              <v:shape w14:anchorId="3654F393" id="_x0000_s1037" type="#_x0000_t202" style="position:absolute;margin-left:-48.6pt;margin-top:14.2pt;width:543.8pt;height:11.35pt;z-index:251720704;visibility:visible;mso-wrap-style:square;mso-width-percent:0;mso-height-percent:0;mso-wrap-distance-left:9pt;mso-wrap-distance-top:0;mso-wrap-distance-right:9pt;mso-wrap-distance-bottom:0;mso-position-horizontal:absolute;mso-position-horizontal-relative:text;mso-position-vertical:absolute;mso-position-vertical-relative:text;mso-width-percent:0;mso-height-percent:0;mso-width-relative:margin;mso-height-relative:margin;v-text-anchor:top" o:gfxdata="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" stroked="f">
+              <v:shape w14:anchorId="3654F393" id="_x0000_s1037" type="#_x0000_t202" style="position:absolute;margin-left:-54.6pt;margin-top:18.75pt;width:543.8pt;height:11.35pt;z-index:251720704;visibility:visible;mso-wrap-style:square;mso-width-percent:0;mso-height-percent:0;mso-wrap-distance-left:9pt;mso-wrap-distance-top:0;mso-wrap-distance-right:9pt;mso-wrap-distance-bottom:0;mso-position-horizontal:absolute;mso-position-horizontal-relative:text;mso-position-vertical:absolute;mso-position-vertical-relative:text;mso-width-percent:0;mso-height-percent:0;mso-width-relative:margin;mso-height-relative:margin;v-text-anchor:top" o:gfxdata="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" stroked="f">
                 <v:textbox inset="0,0,0,0">
                   <w:txbxContent>
                     <w:p>
@@ -13038,7 +14014,25 @@
                                 <w:szCs w:val="22"/>
                                 <w:lang w:val="tr-TR"/>
                               </w:rPr>
-                              <w:t xml:space="preserve">I have kept track of the current test accuracies of the active learner in </w:t>
+                              <w:t>I have kept track of the current test accurac</w:t>
+                            </w:r>
+                            <w:r>
+                              <w:rPr>
+                                <w:rFonts w:ascii="Times New Roman" w:hAnsi="Times New Roman" w:cs="Times New Roman"/>
+                                <w:sz w:val="22"/>
+                                <w:szCs w:val="22"/>
+                                <w:lang w:val="tr-TR"/>
+                              </w:rPr>
+                              <w:t xml:space="preserve">y scores </w:t>
+                            </w:r>
+                            <w:r>
+                              <w:rPr>
+                                <w:rFonts w:ascii="Times New Roman" w:hAnsi="Times New Roman" w:cs="Times New Roman"/>
+                                <w:sz w:val="22"/>
+                                <w:szCs w:val="22"/>
+                                <w:lang w:val="tr-TR"/>
+                              </w:rPr>
+                              <w:t xml:space="preserve">of the active learner in </w:t>
                             </w:r>
                             <w:r>
                               <w:rPr>
@@ -14231,7 +15225,25 @@
                           <w:szCs w:val="22"/>
                           <w:lang w:val="tr-TR"/>
                         </w:rPr>
-                        <w:t xml:space="preserve">I have kept track of the current test accuracies of the active learner in </w:t>
+                        <w:t>I have kept track of the current test accurac</w:t>
+                      </w:r>
+                      <w:r>
+                        <w:rPr>
+                          <w:rFonts w:ascii="Times New Roman" w:hAnsi="Times New Roman" w:cs="Times New Roman"/>
+                          <w:sz w:val="22"/>
+                          <w:szCs w:val="22"/>
+                          <w:lang w:val="tr-TR"/>
+                        </w:rPr>
+                        <w:t xml:space="preserve">y scores </w:t>
+                      </w:r>
+                      <w:r>
+                        <w:rPr>
+                          <w:rFonts w:ascii="Times New Roman" w:hAnsi="Times New Roman" w:cs="Times New Roman"/>
+                          <w:sz w:val="22"/>
+                          <w:szCs w:val="22"/>
+                          <w:lang w:val="tr-TR"/>
+                        </w:rPr>
+                        <w:t xml:space="preserve">of the active learner in </w:t>
                       </w:r>
                       <w:r>
                         <w:rPr>

</xml_diff>